<commit_message>
Complete UI system and pass test cases 01-10
</commit_message>
<xml_diff>
--- a/docs/TicTacToe_Project_Log.docx
+++ b/docs/TicTacToe_Project_Log.docx
@@ -542,130 +542,7 @@
           </w:p>
         </w:tc>
       </w:tr>
-      <w:tr>
-        <w:tc>
-          <w:tcPr>
-            <w:tcW w:w="2500" w:type="dxa"/>
-            <w:tcBorders>
-              <w:top w:val="single" w:sz="1" w:space="0" w:color="CCCCCC"/>
-              <w:left w:val="single" w:sz="1" w:space="0" w:color="CCCCCC"/>
-              <w:bottom w:val="single" w:sz="1" w:space="0" w:color="CCCCCC"/>
-              <w:right w:val="single" w:sz="1" w:space="0" w:color="CCCCCC"/>
-            </w:tcBorders>
-            <w:shd w:val="clear" w:color="auto" w:fill="F2F7FC"/>
-            <w:tcMar>
-              <w:top w:w="80" w:type="dxa"/>
-              <w:left w:w="120" w:type="dxa"/>
-              <w:bottom w:w="80" w:type="dxa"/>
-              <w:right w:w="120" w:type="dxa"/>
-            </w:tcMar>
-          </w:tcPr>
-          <w:p>
-            <w:r>
-              <w:rPr>
-                <w:sz w:val="20"/>
-                <w:szCs w:val="20"/>
-              </w:rPr>
-              <w:t>Start Date</w:t>
-            </w:r>
-          </w:p>
-        </w:tc>
-        <w:tc>
-          <w:tcPr>
-            <w:tcW w:w="6526" w:type="dxa"/>
-            <w:tcBorders>
-              <w:top w:val="single" w:sz="1" w:space="0" w:color="CCCCCC"/>
-              <w:left w:val="single" w:sz="1" w:space="0" w:color="CCCCCC"/>
-              <w:bottom w:val="single" w:sz="1" w:space="0" w:color="CCCCCC"/>
-              <w:right w:val="single" w:sz="1" w:space="0" w:color="CCCCCC"/>
-            </w:tcBorders>
-            <w:shd w:val="clear" w:color="auto" w:fill="F2F7FC"/>
-            <w:tcMar>
-              <w:top w:w="80" w:type="dxa"/>
-              <w:left w:w="120" w:type="dxa"/>
-              <w:bottom w:w="80" w:type="dxa"/>
-              <w:right w:w="120" w:type="dxa"/>
-            </w:tcMar>
-          </w:tcPr>
-          <w:p>
-            <w:r>
-              <w:rPr>
-                <w:i/>
-                <w:iCs/>
-                <w:color w:val="999999"/>
-                <w:sz w:val="20"/>
-                <w:szCs w:val="20"/>
-              </w:rPr>
-              <w:t>[Date]</w:t>
-            </w:r>
-          </w:p>
-        </w:tc>
-      </w:tr>
-      <w:tr>
-        <w:tc>
-          <w:tcPr>
-            <w:tcW w:w="2500" w:type="dxa"/>
-            <w:tcBorders>
-              <w:top w:val="single" w:sz="1" w:space="0" w:color="CCCCCC"/>
-              <w:left w:val="single" w:sz="1" w:space="0" w:color="CCCCCC"/>
-              <w:bottom w:val="single" w:sz="1" w:space="0" w:color="CCCCCC"/>
-              <w:right w:val="single" w:sz="1" w:space="0" w:color="CCCCCC"/>
-            </w:tcBorders>
-            <w:shd w:val="clear" w:color="auto" w:fill="FFFFFF"/>
-            <w:tcMar>
-              <w:top w:w="80" w:type="dxa"/>
-              <w:left w:w="120" w:type="dxa"/>
-              <w:bottom w:w="80" w:type="dxa"/>
-              <w:right w:w="120" w:type="dxa"/>
-            </w:tcMar>
-          </w:tcPr>
-          <w:p>
-            <w:r>
-              <w:rPr>
-                <w:sz w:val="20"/>
-                <w:szCs w:val="20"/>
-              </w:rPr>
-              <w:t>Target Completion</w:t>
-            </w:r>
-          </w:p>
-        </w:tc>
-        <w:tc>
-          <w:tcPr>
-            <w:tcW w:w="6526" w:type="dxa"/>
-            <w:tcBorders>
-              <w:top w:val="single" w:sz="1" w:space="0" w:color="CCCCCC"/>
-              <w:left w:val="single" w:sz="1" w:space="0" w:color="CCCCCC"/>
-              <w:bottom w:val="single" w:sz="1" w:space="0" w:color="CCCCCC"/>
-              <w:right w:val="single" w:sz="1" w:space="0" w:color="CCCCCC"/>
-            </w:tcBorders>
-            <w:shd w:val="clear" w:color="auto" w:fill="FFFFFF"/>
-            <w:tcMar>
-              <w:top w:w="80" w:type="dxa"/>
-              <w:left w:w="120" w:type="dxa"/>
-              <w:bottom w:w="80" w:type="dxa"/>
-              <w:right w:w="120" w:type="dxa"/>
-            </w:tcMar>
-          </w:tcPr>
-          <w:p>
-            <w:r>
-              <w:rPr>
-                <w:i/>
-                <w:iCs/>
-                <w:color w:val="999999"/>
-                <w:sz w:val="20"/>
-                <w:szCs w:val="20"/>
-              </w:rPr>
-              <w:t>[Date]</w:t>
-            </w:r>
-          </w:p>
-        </w:tc>
-      </w:tr>
     </w:tbl>
-    <w:p>
-      <w:pPr>
-        <w:spacing w:after="160"/>
-      </w:pPr>
-    </w:p>
     <w:p>
       <w:pPr>
         <w:pStyle w:val="Heading2"/>
@@ -679,7 +556,15 @@
         <w:spacing w:after="120"/>
       </w:pPr>
       <w:r>
-        <w:t>Tic Tac Toe is a two-player abstract strategy game played on a 3x3 grid. Players alternate placing their marker (X or O) with the goal of placing three of their markers in a horizontal, vertical, or diagonal line. The game ends when one player achieves this or all nine squares are filled resulting in a draw.</w:t>
+        <w:t xml:space="preserve">Tic Tac Toe is a two-player abstract strategy game played on a 3x3 grid. </w:t>
+      </w:r>
+      <w:proofErr w:type="gramStart"/>
+      <w:r>
+        <w:t>Players</w:t>
+      </w:r>
+      <w:proofErr w:type="gramEnd"/>
+      <w:r>
+        <w:t xml:space="preserve"> alternate placing their marker (X or O) with the goal of placing three of their markers in a horizontal, vertical, or diagonal line. The game ends when one player achieves this or all nine squares are filled resulting in a draw.</w:t>
       </w:r>
     </w:p>
     <w:p>
@@ -851,7 +736,6 @@
         <w:pStyle w:val="Heading2"/>
       </w:pPr>
       <w:r>
-        <w:lastRenderedPageBreak/>
         <w:t>1.4 Game Rules</w:t>
       </w:r>
     </w:p>
@@ -876,6 +760,7 @@
         </w:numPr>
       </w:pPr>
       <w:r>
+        <w:lastRenderedPageBreak/>
         <w:t>Player 1 is X, Player 2 is O.</w:t>
       </w:r>
     </w:p>
@@ -1103,15 +988,9 @@
         <w:gridCol w:w="2942"/>
       </w:tblGrid>
       <w:tr>
-        <w:tblPrEx>
-          <w:tblCellMar>
-            <w:top w:w="0" w:type="dxa"/>
-            <w:bottom w:w="0" w:type="dxa"/>
-          </w:tblCellMar>
-        </w:tblPrEx>
-        <w:tc>
-          <w:tcPr>
-            <w:tcW w:w="1400" w:type="dxa"/>
+        <w:tc>
+          <w:tcPr>
+            <w:tcW w:w="1392" w:type="dxa"/>
             <w:tcBorders>
               <w:top w:val="single" w:sz="1" w:space="0" w:color="CCCCCC"/>
               <w:left w:val="single" w:sz="1" w:space="0" w:color="CCCCCC"/>
@@ -1141,7 +1020,7 @@
         </w:tc>
         <w:tc>
           <w:tcPr>
-            <w:tcW w:w="4713" w:type="dxa"/>
+            <w:tcW w:w="4692" w:type="dxa"/>
             <w:tcBorders>
               <w:top w:val="single" w:sz="1" w:space="0" w:color="CCCCCC"/>
               <w:left w:val="single" w:sz="1" w:space="0" w:color="CCCCCC"/>
@@ -1171,7 +1050,7 @@
         </w:tc>
         <w:tc>
           <w:tcPr>
-            <w:tcW w:w="2913" w:type="dxa"/>
+            <w:tcW w:w="2942" w:type="dxa"/>
             <w:tcBorders>
               <w:top w:val="single" w:sz="1" w:space="0" w:color="CCCCCC"/>
               <w:left w:val="single" w:sz="1" w:space="0" w:color="CCCCCC"/>
@@ -1201,15 +1080,9 @@
         </w:tc>
       </w:tr>
       <w:tr>
-        <w:tblPrEx>
-          <w:tblCellMar>
-            <w:top w:w="0" w:type="dxa"/>
-            <w:bottom w:w="0" w:type="dxa"/>
-          </w:tblCellMar>
-        </w:tblPrEx>
-        <w:tc>
-          <w:tcPr>
-            <w:tcW w:w="1400" w:type="dxa"/>
+        <w:tc>
+          <w:tcPr>
+            <w:tcW w:w="1392" w:type="dxa"/>
             <w:tcBorders>
               <w:top w:val="single" w:sz="1" w:space="0" w:color="CCCCCC"/>
               <w:left w:val="single" w:sz="1" w:space="0" w:color="CCCCCC"/>
@@ -1236,28 +1109,36 @@
         </w:tc>
         <w:tc>
           <w:tcPr>
-            <w:tcW w:w="4713" w:type="dxa"/>
-            <w:tcBorders>
-              <w:top w:val="single" w:sz="1" w:space="0" w:color="CCCCCC"/>
-              <w:left w:val="single" w:sz="1" w:space="0" w:color="CCCCCC"/>
-              <w:bottom w:val="single" w:sz="1" w:space="0" w:color="CCCCCC"/>
-              <w:right w:val="single" w:sz="1" w:space="0" w:color="CCCCCC"/>
-            </w:tcBorders>
-            <w:shd w:val="clear" w:color="auto" w:fill="F2F7FC"/>
-            <w:tcMar>
-              <w:top w:w="80" w:type="dxa"/>
-              <w:left w:w="120" w:type="dxa"/>
-              <w:bottom w:w="80" w:type="dxa"/>
-              <w:right w:w="120" w:type="dxa"/>
-            </w:tcMar>
-          </w:tcPr>
-          <w:p>
-            <w:r>
-              <w:rPr>
-                <w:sz w:val="20"/>
-                <w:szCs w:val="20"/>
-              </w:rPr>
-              <w:t>Project setup. Created UE5 C++ project. Set up GitHub repository with Unreal .</w:t>
+            <w:tcW w:w="4692" w:type="dxa"/>
+            <w:tcBorders>
+              <w:top w:val="single" w:sz="1" w:space="0" w:color="CCCCCC"/>
+              <w:left w:val="single" w:sz="1" w:space="0" w:color="CCCCCC"/>
+              <w:bottom w:val="single" w:sz="1" w:space="0" w:color="CCCCCC"/>
+              <w:right w:val="single" w:sz="1" w:space="0" w:color="CCCCCC"/>
+            </w:tcBorders>
+            <w:shd w:val="clear" w:color="auto" w:fill="F2F7FC"/>
+            <w:tcMar>
+              <w:top w:w="80" w:type="dxa"/>
+              <w:left w:w="120" w:type="dxa"/>
+              <w:bottom w:w="80" w:type="dxa"/>
+              <w:right w:w="120" w:type="dxa"/>
+            </w:tcMar>
+          </w:tcPr>
+          <w:p>
+            <w:r>
+              <w:rPr>
+                <w:sz w:val="20"/>
+                <w:szCs w:val="20"/>
+              </w:rPr>
+              <w:t xml:space="preserve">Project setup. Created UE5 C++ project. Set up GitHub repository with </w:t>
+            </w:r>
+            <w:proofErr w:type="gramStart"/>
+            <w:r>
+              <w:rPr>
+                <w:sz w:val="20"/>
+                <w:szCs w:val="20"/>
+              </w:rPr>
+              <w:t>Unreal .</w:t>
             </w:r>
             <w:proofErr w:type="spellStart"/>
             <w:r>
@@ -1268,6 +1149,7 @@
               <w:t>gitignore</w:t>
             </w:r>
             <w:proofErr w:type="spellEnd"/>
+            <w:proofErr w:type="gramEnd"/>
             <w:r>
               <w:rPr>
                 <w:sz w:val="20"/>
@@ -1279,7 +1161,7 @@
         </w:tc>
         <w:tc>
           <w:tcPr>
-            <w:tcW w:w="2913" w:type="dxa"/>
+            <w:tcW w:w="2942" w:type="dxa"/>
             <w:tcBorders>
               <w:top w:val="single" w:sz="1" w:space="0" w:color="CCCCCC"/>
               <w:left w:val="single" w:sz="1" w:space="0" w:color="CCCCCC"/>
@@ -1306,15 +1188,9 @@
         </w:tc>
       </w:tr>
       <w:tr>
-        <w:tblPrEx>
-          <w:tblCellMar>
-            <w:top w:w="0" w:type="dxa"/>
-            <w:bottom w:w="0" w:type="dxa"/>
-          </w:tblCellMar>
-        </w:tblPrEx>
-        <w:tc>
-          <w:tcPr>
-            <w:tcW w:w="1400" w:type="dxa"/>
+        <w:tc>
+          <w:tcPr>
+            <w:tcW w:w="1392" w:type="dxa"/>
             <w:tcBorders>
               <w:top w:val="single" w:sz="1" w:space="0" w:color="CCCCCC"/>
               <w:left w:val="single" w:sz="1" w:space="0" w:color="CCCCCC"/>
@@ -1341,7 +1217,7 @@
         </w:tc>
         <w:tc>
           <w:tcPr>
-            <w:tcW w:w="4713" w:type="dxa"/>
+            <w:tcW w:w="4692" w:type="dxa"/>
             <w:tcBorders>
               <w:top w:val="single" w:sz="1" w:space="0" w:color="CCCCCC"/>
               <w:left w:val="single" w:sz="1" w:space="0" w:color="CCCCCC"/>
@@ -1416,7 +1292,7 @@
         </w:tc>
         <w:tc>
           <w:tcPr>
-            <w:tcW w:w="2913" w:type="dxa"/>
+            <w:tcW w:w="2942" w:type="dxa"/>
             <w:tcBorders>
               <w:top w:val="single" w:sz="1" w:space="0" w:color="CCCCCC"/>
               <w:left w:val="single" w:sz="1" w:space="0" w:color="CCCCCC"/>
@@ -1443,15 +1319,9 @@
         </w:tc>
       </w:tr>
       <w:tr>
-        <w:tblPrEx>
-          <w:tblCellMar>
-            <w:top w:w="0" w:type="dxa"/>
-            <w:bottom w:w="0" w:type="dxa"/>
-          </w:tblCellMar>
-        </w:tblPrEx>
-        <w:tc>
-          <w:tcPr>
-            <w:tcW w:w="1400" w:type="dxa"/>
+        <w:tc>
+          <w:tcPr>
+            <w:tcW w:w="1392" w:type="dxa"/>
             <w:tcBorders>
               <w:top w:val="single" w:sz="1" w:space="0" w:color="CCCCCC"/>
               <w:left w:val="single" w:sz="1" w:space="0" w:color="CCCCCC"/>
@@ -1478,7 +1348,7 @@
         </w:tc>
         <w:tc>
           <w:tcPr>
-            <w:tcW w:w="4713" w:type="dxa"/>
+            <w:tcW w:w="4692" w:type="dxa"/>
             <w:tcBorders>
               <w:top w:val="single" w:sz="1" w:space="0" w:color="CCCCCC"/>
               <w:left w:val="single" w:sz="1" w:space="0" w:color="CCCCCC"/>
@@ -1553,42 +1423,68 @@
         </w:tc>
         <w:tc>
           <w:tcPr>
-            <w:tcW w:w="2913" w:type="dxa"/>
-            <w:tcBorders>
-              <w:top w:val="single" w:sz="1" w:space="0" w:color="CCCCCC"/>
-              <w:left w:val="single" w:sz="1" w:space="0" w:color="CCCCCC"/>
-              <w:bottom w:val="single" w:sz="1" w:space="0" w:color="CCCCCC"/>
-              <w:right w:val="single" w:sz="1" w:space="0" w:color="CCCCCC"/>
-            </w:tcBorders>
-            <w:shd w:val="clear" w:color="auto" w:fill="F2F7FC"/>
-            <w:tcMar>
-              <w:top w:w="80" w:type="dxa"/>
-              <w:left w:w="120" w:type="dxa"/>
-              <w:bottom w:w="80" w:type="dxa"/>
-              <w:right w:w="120" w:type="dxa"/>
-            </w:tcMar>
-          </w:tcPr>
-          <w:p>
-            <w:r>
-              <w:rPr>
-                <w:sz w:val="20"/>
-                <w:szCs w:val="20"/>
-              </w:rPr>
-              <w:t>UE_LOG TEXT() macro typed incorrectly as Text() causing compile error. Cascade errors in engine files were false positives. Resolved by clean rebuild after deleting Binaries and Intermediate folders.</w:t>
-            </w:r>
-          </w:p>
-        </w:tc>
-      </w:tr>
-      <w:tr>
-        <w:tblPrEx>
-          <w:tblCellMar>
-            <w:top w:w="0" w:type="dxa"/>
-            <w:bottom w:w="0" w:type="dxa"/>
-          </w:tblCellMar>
-        </w:tblPrEx>
-        <w:tc>
-          <w:tcPr>
-            <w:tcW w:w="1400" w:type="dxa"/>
+            <w:tcW w:w="2942" w:type="dxa"/>
+            <w:tcBorders>
+              <w:top w:val="single" w:sz="1" w:space="0" w:color="CCCCCC"/>
+              <w:left w:val="single" w:sz="1" w:space="0" w:color="CCCCCC"/>
+              <w:bottom w:val="single" w:sz="1" w:space="0" w:color="CCCCCC"/>
+              <w:right w:val="single" w:sz="1" w:space="0" w:color="CCCCCC"/>
+            </w:tcBorders>
+            <w:shd w:val="clear" w:color="auto" w:fill="F2F7FC"/>
+            <w:tcMar>
+              <w:top w:w="80" w:type="dxa"/>
+              <w:left w:w="120" w:type="dxa"/>
+              <w:bottom w:w="80" w:type="dxa"/>
+              <w:right w:w="120" w:type="dxa"/>
+            </w:tcMar>
+          </w:tcPr>
+          <w:p>
+            <w:r>
+              <w:rPr>
+                <w:sz w:val="20"/>
+                <w:szCs w:val="20"/>
+              </w:rPr>
+              <w:t xml:space="preserve">UE_LOG </w:t>
+            </w:r>
+            <w:proofErr w:type="gramStart"/>
+            <w:r>
+              <w:rPr>
+                <w:sz w:val="20"/>
+                <w:szCs w:val="20"/>
+              </w:rPr>
+              <w:t>TEXT(</w:t>
+            </w:r>
+            <w:proofErr w:type="gramEnd"/>
+            <w:r>
+              <w:rPr>
+                <w:sz w:val="20"/>
+                <w:szCs w:val="20"/>
+              </w:rPr>
+              <w:t xml:space="preserve">) macro typed incorrectly as </w:t>
+            </w:r>
+            <w:proofErr w:type="gramStart"/>
+            <w:r>
+              <w:rPr>
+                <w:sz w:val="20"/>
+                <w:szCs w:val="20"/>
+              </w:rPr>
+              <w:t>Text(</w:t>
+            </w:r>
+            <w:proofErr w:type="gramEnd"/>
+            <w:r>
+              <w:rPr>
+                <w:sz w:val="20"/>
+                <w:szCs w:val="20"/>
+              </w:rPr>
+              <w:t>) causing compile error. Cascade errors in engine files were false positives. Resolved by clean rebuild after deleting Binaries and Intermediate folders.</w:t>
+            </w:r>
+          </w:p>
+        </w:tc>
+      </w:tr>
+      <w:tr>
+        <w:tc>
+          <w:tcPr>
+            <w:tcW w:w="1392" w:type="dxa"/>
             <w:tcBorders>
               <w:top w:val="single" w:sz="1" w:space="0" w:color="CCCCCC"/>
               <w:left w:val="single" w:sz="1" w:space="0" w:color="CCCCCC"/>
@@ -1615,7 +1511,7 @@
         </w:tc>
         <w:tc>
           <w:tcPr>
-            <w:tcW w:w="4713" w:type="dxa"/>
+            <w:tcW w:w="4692" w:type="dxa"/>
             <w:tcBorders>
               <w:top w:val="single" w:sz="1" w:space="0" w:color="CCCCCC"/>
               <w:left w:val="single" w:sz="1" w:space="0" w:color="CCCCCC"/>
@@ -1655,6 +1551,7 @@
               <w:t xml:space="preserve"> C++ class. Implemented </w:t>
             </w:r>
             <w:proofErr w:type="spellStart"/>
+            <w:proofErr w:type="gramStart"/>
             <w:r>
               <w:rPr>
                 <w:sz w:val="20"/>
@@ -1668,9 +1565,18 @@
                 <w:sz w:val="20"/>
                 <w:szCs w:val="20"/>
               </w:rPr>
-              <w:t xml:space="preserve">() to find and sort all 9 Static Mesh Components alphabetically, ensuring Element0=index 0 through Element8=index 8. Implemented </w:t>
+              <w:t>(</w:t>
+            </w:r>
+            <w:proofErr w:type="gramEnd"/>
+            <w:r>
+              <w:rPr>
+                <w:sz w:val="20"/>
+                <w:szCs w:val="20"/>
+              </w:rPr>
+              <w:t xml:space="preserve">) to find and sort all 9 Static Mesh Components alphabetically, ensuring Element0=index 0 through Element8=index 8. Implemented </w:t>
             </w:r>
             <w:proofErr w:type="spellStart"/>
+            <w:proofErr w:type="gramStart"/>
             <w:r>
               <w:rPr>
                 <w:sz w:val="20"/>
@@ -1684,9 +1590,18 @@
                 <w:sz w:val="20"/>
                 <w:szCs w:val="20"/>
               </w:rPr>
-              <w:t xml:space="preserve">(), </w:t>
+              <w:t>(</w:t>
+            </w:r>
+            <w:proofErr w:type="gramEnd"/>
+            <w:r>
+              <w:rPr>
+                <w:sz w:val="20"/>
+                <w:szCs w:val="20"/>
+              </w:rPr>
+              <w:t xml:space="preserve">), </w:t>
             </w:r>
             <w:proofErr w:type="spellStart"/>
+            <w:proofErr w:type="gramStart"/>
             <w:r>
               <w:rPr>
                 <w:sz w:val="20"/>
@@ -1700,9 +1615,18 @@
                 <w:sz w:val="20"/>
                 <w:szCs w:val="20"/>
               </w:rPr>
-              <w:t xml:space="preserve">(), </w:t>
+              <w:t>(</w:t>
+            </w:r>
+            <w:proofErr w:type="gramEnd"/>
+            <w:r>
+              <w:rPr>
+                <w:sz w:val="20"/>
+                <w:szCs w:val="20"/>
+              </w:rPr>
+              <w:t xml:space="preserve">), </w:t>
             </w:r>
             <w:proofErr w:type="spellStart"/>
+            <w:proofErr w:type="gramStart"/>
             <w:r>
               <w:rPr>
                 <w:sz w:val="20"/>
@@ -1716,7 +1640,15 @@
                 <w:sz w:val="20"/>
                 <w:szCs w:val="20"/>
               </w:rPr>
-              <w:t xml:space="preserve">(), and </w:t>
+              <w:t>(</w:t>
+            </w:r>
+            <w:proofErr w:type="gramEnd"/>
+            <w:r>
+              <w:rPr>
+                <w:sz w:val="20"/>
+                <w:szCs w:val="20"/>
+              </w:rPr>
+              <w:t xml:space="preserve">), and </w:t>
             </w:r>
             <w:proofErr w:type="spellStart"/>
             <w:r>
@@ -1738,7 +1670,7 @@
         </w:tc>
         <w:tc>
           <w:tcPr>
-            <w:tcW w:w="2913" w:type="dxa"/>
+            <w:tcW w:w="2942" w:type="dxa"/>
             <w:tcBorders>
               <w:top w:val="single" w:sz="1" w:space="0" w:color="CCCCCC"/>
               <w:left w:val="single" w:sz="1" w:space="0" w:color="CCCCCC"/>
@@ -1755,6 +1687,7 @@
           </w:tcPr>
           <w:p>
             <w:proofErr w:type="spellStart"/>
+            <w:proofErr w:type="gramStart"/>
             <w:r>
               <w:rPr>
                 <w:sz w:val="20"/>
@@ -1768,7 +1701,15 @@
                 <w:sz w:val="20"/>
                 <w:szCs w:val="20"/>
               </w:rPr>
-              <w:t xml:space="preserve">() returned components in wrong order. Fixed using </w:t>
+              <w:t>(</w:t>
+            </w:r>
+            <w:proofErr w:type="gramEnd"/>
+            <w:r>
+              <w:rPr>
+                <w:sz w:val="20"/>
+                <w:szCs w:val="20"/>
+              </w:rPr>
+              <w:t xml:space="preserve">) returned components in wrong order. Fixed using </w:t>
             </w:r>
             <w:proofErr w:type="spellStart"/>
             <w:r>
@@ -1806,15 +1747,9 @@
         </w:tc>
       </w:tr>
       <w:tr>
-        <w:tblPrEx>
-          <w:tblCellMar>
-            <w:top w:w="0" w:type="dxa"/>
-            <w:bottom w:w="0" w:type="dxa"/>
-          </w:tblCellMar>
-        </w:tblPrEx>
-        <w:tc>
-          <w:tcPr>
-            <w:tcW w:w="1400" w:type="dxa"/>
+        <w:tc>
+          <w:tcPr>
+            <w:tcW w:w="1392" w:type="dxa"/>
             <w:tcBorders>
               <w:top w:val="single" w:sz="1" w:space="0" w:color="CCCCCC"/>
               <w:left w:val="single" w:sz="1" w:space="0" w:color="CCCCCC"/>
@@ -1841,7 +1776,7 @@
         </w:tc>
         <w:tc>
           <w:tcPr>
-            <w:tcW w:w="4713" w:type="dxa"/>
+            <w:tcW w:w="4692" w:type="dxa"/>
             <w:tcBorders>
               <w:top w:val="single" w:sz="1" w:space="0" w:color="CCCCCC"/>
               <w:left w:val="single" w:sz="1" w:space="0" w:color="CCCCCC"/>
@@ -1932,7 +1867,7 @@
         </w:tc>
         <w:tc>
           <w:tcPr>
-            <w:tcW w:w="2913" w:type="dxa"/>
+            <w:tcW w:w="2942" w:type="dxa"/>
             <w:tcBorders>
               <w:top w:val="single" w:sz="1" w:space="0" w:color="CCCCCC"/>
               <w:left w:val="single" w:sz="1" w:space="0" w:color="CCCCCC"/>
@@ -2039,15 +1974,9 @@
         </w:tc>
       </w:tr>
       <w:tr>
-        <w:tblPrEx>
-          <w:tblCellMar>
-            <w:top w:w="0" w:type="dxa"/>
-            <w:bottom w:w="0" w:type="dxa"/>
-          </w:tblCellMar>
-        </w:tblPrEx>
-        <w:tc>
-          <w:tcPr>
-            <w:tcW w:w="1400" w:type="dxa"/>
+        <w:tc>
+          <w:tcPr>
+            <w:tcW w:w="1392" w:type="dxa"/>
             <w:tcBorders>
               <w:top w:val="single" w:sz="1" w:space="0" w:color="CCCCCC"/>
               <w:left w:val="single" w:sz="1" w:space="0" w:color="CCCCCC"/>
@@ -2074,7 +2003,7 @@
         </w:tc>
         <w:tc>
           <w:tcPr>
-            <w:tcW w:w="4713" w:type="dxa"/>
+            <w:tcW w:w="4692" w:type="dxa"/>
             <w:tcBorders>
               <w:top w:val="single" w:sz="1" w:space="0" w:color="CCCCCC"/>
               <w:left w:val="single" w:sz="1" w:space="0" w:color="CCCCCC"/>
@@ -2114,6 +2043,7 @@
               <w:t xml:space="preserve"> in level at -90 pitch. Added </w:t>
             </w:r>
             <w:proofErr w:type="spellStart"/>
+            <w:proofErr w:type="gramStart"/>
             <w:r>
               <w:rPr>
                 <w:sz w:val="20"/>
@@ -2127,7 +2057,15 @@
                 <w:sz w:val="20"/>
                 <w:szCs w:val="20"/>
               </w:rPr>
-              <w:t xml:space="preserve">() to </w:t>
+              <w:t>(</w:t>
+            </w:r>
+            <w:proofErr w:type="gramEnd"/>
+            <w:r>
+              <w:rPr>
+                <w:sz w:val="20"/>
+                <w:szCs w:val="20"/>
+              </w:rPr>
+              <w:t xml:space="preserve">) to </w:t>
             </w:r>
             <w:proofErr w:type="spellStart"/>
             <w:r>
@@ -2165,7 +2103,7 @@
         </w:tc>
         <w:tc>
           <w:tcPr>
-            <w:tcW w:w="2913" w:type="dxa"/>
+            <w:tcW w:w="2942" w:type="dxa"/>
             <w:tcBorders>
               <w:top w:val="single" w:sz="1" w:space="0" w:color="CCCCCC"/>
               <w:left w:val="single" w:sz="1" w:space="0" w:color="CCCCCC"/>
@@ -2192,15 +2130,9 @@
         </w:tc>
       </w:tr>
       <w:tr>
-        <w:tblPrEx>
-          <w:tblCellMar>
-            <w:top w:w="0" w:type="dxa"/>
-            <w:bottom w:w="0" w:type="dxa"/>
-          </w:tblCellMar>
-        </w:tblPrEx>
-        <w:tc>
-          <w:tcPr>
-            <w:tcW w:w="1400" w:type="dxa"/>
+        <w:tc>
+          <w:tcPr>
+            <w:tcW w:w="1392" w:type="dxa"/>
             <w:tcBorders>
               <w:top w:val="single" w:sz="1" w:space="0" w:color="CCCCCC"/>
               <w:left w:val="single" w:sz="1" w:space="0" w:color="CCCCCC"/>
@@ -2227,7 +2159,7 @@
         </w:tc>
         <w:tc>
           <w:tcPr>
-            <w:tcW w:w="4713" w:type="dxa"/>
+            <w:tcW w:w="4692" w:type="dxa"/>
             <w:tcBorders>
               <w:top w:val="single" w:sz="1" w:space="0" w:color="CCCCCC"/>
               <w:left w:val="single" w:sz="1" w:space="0" w:color="CCCCCC"/>
@@ -2358,7 +2290,7 @@
         </w:tc>
         <w:tc>
           <w:tcPr>
-            <w:tcW w:w="2913" w:type="dxa"/>
+            <w:tcW w:w="2942" w:type="dxa"/>
             <w:tcBorders>
               <w:top w:val="single" w:sz="1" w:space="0" w:color="CCCCCC"/>
               <w:left w:val="single" w:sz="1" w:space="0" w:color="CCCCCC"/>
@@ -2394,15 +2326,9 @@
         </w:tc>
       </w:tr>
       <w:tr>
-        <w:tblPrEx>
-          <w:tblCellMar>
-            <w:top w:w="0" w:type="dxa"/>
-            <w:bottom w:w="0" w:type="dxa"/>
-          </w:tblCellMar>
-        </w:tblPrEx>
-        <w:tc>
-          <w:tcPr>
-            <w:tcW w:w="1400" w:type="dxa"/>
+        <w:tc>
+          <w:tcPr>
+            <w:tcW w:w="1392" w:type="dxa"/>
             <w:tcBorders>
               <w:top w:val="single" w:sz="1" w:space="0" w:color="CCCCCC"/>
               <w:left w:val="single" w:sz="1" w:space="0" w:color="CCCCCC"/>
@@ -2430,7 +2356,7 @@
         </w:tc>
         <w:tc>
           <w:tcPr>
-            <w:tcW w:w="4713" w:type="dxa"/>
+            <w:tcW w:w="4692" w:type="dxa"/>
             <w:tcBorders>
               <w:top w:val="single" w:sz="1" w:space="0" w:color="CCCCCC"/>
               <w:left w:val="single" w:sz="1" w:space="0" w:color="CCCCCC"/>
@@ -2582,6 +2508,7 @@
               <w:t xml:space="preserve"> header. Implemented </w:t>
             </w:r>
             <w:proofErr w:type="spellStart"/>
+            <w:proofErr w:type="gramStart"/>
             <w:r>
               <w:rPr>
                 <w:sz w:val="20"/>
@@ -2595,13 +2522,21 @@
                 <w:sz w:val="20"/>
                 <w:szCs w:val="20"/>
               </w:rPr>
-              <w:t>() in C++ to create and add widget to viewport.</w:t>
-            </w:r>
-          </w:p>
-        </w:tc>
-        <w:tc>
-          <w:tcPr>
-            <w:tcW w:w="2913" w:type="dxa"/>
+              <w:t>(</w:t>
+            </w:r>
+            <w:proofErr w:type="gramEnd"/>
+            <w:r>
+              <w:rPr>
+                <w:sz w:val="20"/>
+                <w:szCs w:val="20"/>
+              </w:rPr>
+              <w:t>) in C++ to create and add widget to viewport.</w:t>
+            </w:r>
+          </w:p>
+        </w:tc>
+        <w:tc>
+          <w:tcPr>
+            <w:tcW w:w="2942" w:type="dxa"/>
             <w:tcBorders>
               <w:top w:val="single" w:sz="1" w:space="0" w:color="CCCCCC"/>
               <w:left w:val="single" w:sz="1" w:space="0" w:color="CCCCCC"/>
@@ -2724,15 +2659,9 @@
         </w:tc>
       </w:tr>
       <w:tr>
-        <w:tblPrEx>
-          <w:tblCellMar>
-            <w:top w:w="0" w:type="dxa"/>
-            <w:bottom w:w="0" w:type="dxa"/>
-          </w:tblCellMar>
-        </w:tblPrEx>
-        <w:tc>
-          <w:tcPr>
-            <w:tcW w:w="1400" w:type="dxa"/>
+        <w:tc>
+          <w:tcPr>
+            <w:tcW w:w="1392" w:type="dxa"/>
             <w:tcBorders>
               <w:top w:val="single" w:sz="1" w:space="0" w:color="CCCCCC"/>
               <w:left w:val="single" w:sz="1" w:space="0" w:color="CCCCCC"/>
@@ -2759,7 +2688,7 @@
         </w:tc>
         <w:tc>
           <w:tcPr>
-            <w:tcW w:w="4713" w:type="dxa"/>
+            <w:tcW w:w="4692" w:type="dxa"/>
             <w:tcBorders>
               <w:top w:val="single" w:sz="1" w:space="0" w:color="CCCCCC"/>
               <w:left w:val="single" w:sz="1" w:space="0" w:color="CCCCCC"/>
@@ -2850,7 +2779,7 @@
         </w:tc>
         <w:tc>
           <w:tcPr>
-            <w:tcW w:w="2913" w:type="dxa"/>
+            <w:tcW w:w="2942" w:type="dxa"/>
             <w:tcBorders>
               <w:top w:val="single" w:sz="1" w:space="0" w:color="CCCCCC"/>
               <w:left w:val="single" w:sz="1" w:space="0" w:color="CCCCCC"/>
@@ -2941,15 +2870,9 @@
         </w:tc>
       </w:tr>
       <w:tr>
-        <w:tblPrEx>
-          <w:tblCellMar>
-            <w:top w:w="0" w:type="dxa"/>
-            <w:bottom w:w="0" w:type="dxa"/>
-          </w:tblCellMar>
-        </w:tblPrEx>
-        <w:tc>
-          <w:tcPr>
-            <w:tcW w:w="1400" w:type="dxa"/>
+        <w:tc>
+          <w:tcPr>
+            <w:tcW w:w="1392" w:type="dxa"/>
             <w:tcBorders>
               <w:top w:val="single" w:sz="1" w:space="0" w:color="CCCCCC"/>
               <w:left w:val="single" w:sz="1" w:space="0" w:color="CCCCCC"/>
@@ -2976,7 +2899,7 @@
         </w:tc>
         <w:tc>
           <w:tcPr>
-            <w:tcW w:w="4713" w:type="dxa"/>
+            <w:tcW w:w="4692" w:type="dxa"/>
             <w:tcBorders>
               <w:top w:val="single" w:sz="1" w:space="0" w:color="CCCCCC"/>
               <w:left w:val="single" w:sz="1" w:space="0" w:color="CCCCCC"/>
@@ -3032,6 +2955,7 @@
               <w:t xml:space="preserve">: </w:t>
             </w:r>
             <w:proofErr w:type="spellStart"/>
+            <w:proofErr w:type="gramStart"/>
             <w:r>
               <w:rPr>
                 <w:sz w:val="20"/>
@@ -3045,9 +2969,18 @@
                 <w:sz w:val="20"/>
                 <w:szCs w:val="20"/>
               </w:rPr>
-              <w:t xml:space="preserve">(Player), </w:t>
+              <w:t>(</w:t>
+            </w:r>
+            <w:proofErr w:type="gramEnd"/>
+            <w:r>
+              <w:rPr>
+                <w:sz w:val="20"/>
+                <w:szCs w:val="20"/>
+              </w:rPr>
+              <w:t xml:space="preserve">Player), </w:t>
             </w:r>
             <w:proofErr w:type="spellStart"/>
+            <w:proofErr w:type="gramStart"/>
             <w:r>
               <w:rPr>
                 <w:sz w:val="20"/>
@@ -3064,6 +2997,7 @@
               <w:t>(</w:t>
             </w:r>
             <w:proofErr w:type="spellStart"/>
+            <w:proofErr w:type="gramEnd"/>
             <w:r>
               <w:rPr>
                 <w:sz w:val="20"/>
@@ -3080,6 +3014,7 @@
               <w:t xml:space="preserve">), </w:t>
             </w:r>
             <w:proofErr w:type="spellStart"/>
+            <w:proofErr w:type="gramStart"/>
             <w:r>
               <w:rPr>
                 <w:sz w:val="20"/>
@@ -3093,7 +3028,15 @@
                 <w:sz w:val="20"/>
                 <w:szCs w:val="20"/>
               </w:rPr>
-              <w:t xml:space="preserve">(). These replace the earlier </w:t>
+              <w:t>(</w:t>
+            </w:r>
+            <w:proofErr w:type="gramEnd"/>
+            <w:r>
+              <w:rPr>
+                <w:sz w:val="20"/>
+                <w:szCs w:val="20"/>
+              </w:rPr>
+              <w:t xml:space="preserve">). These replace the earlier </w:t>
             </w:r>
             <w:proofErr w:type="spellStart"/>
             <w:r>
@@ -3115,7 +3058,7 @@
         </w:tc>
         <w:tc>
           <w:tcPr>
-            <w:tcW w:w="2913" w:type="dxa"/>
+            <w:tcW w:w="2942" w:type="dxa"/>
             <w:tcBorders>
               <w:top w:val="single" w:sz="1" w:space="0" w:color="CCCCCC"/>
               <w:left w:val="single" w:sz="1" w:space="0" w:color="CCCCCC"/>
@@ -3167,15 +3110,9 @@
         </w:tc>
       </w:tr>
       <w:tr>
-        <w:tblPrEx>
-          <w:tblCellMar>
-            <w:top w:w="0" w:type="dxa"/>
-            <w:bottom w:w="0" w:type="dxa"/>
-          </w:tblCellMar>
-        </w:tblPrEx>
-        <w:tc>
-          <w:tcPr>
-            <w:tcW w:w="1400" w:type="dxa"/>
+        <w:tc>
+          <w:tcPr>
+            <w:tcW w:w="1392" w:type="dxa"/>
             <w:tcBorders>
               <w:top w:val="single" w:sz="1" w:space="0" w:color="CCCCCC"/>
               <w:left w:val="single" w:sz="1" w:space="0" w:color="CCCCCC"/>
@@ -3202,7 +3139,7 @@
         </w:tc>
         <w:tc>
           <w:tcPr>
-            <w:tcW w:w="4713" w:type="dxa"/>
+            <w:tcW w:w="4692" w:type="dxa"/>
             <w:tcBorders>
               <w:top w:val="single" w:sz="1" w:space="0" w:color="CCCCCC"/>
               <w:left w:val="single" w:sz="1" w:space="0" w:color="CCCCCC"/>
@@ -3242,6 +3179,7 @@
               <w:t xml:space="preserve">: </w:t>
             </w:r>
             <w:proofErr w:type="spellStart"/>
+            <w:proofErr w:type="gramStart"/>
             <w:r>
               <w:rPr>
                 <w:sz w:val="20"/>
@@ -3255,9 +3193,18 @@
                 <w:sz w:val="20"/>
                 <w:szCs w:val="20"/>
               </w:rPr>
-              <w:t xml:space="preserve">(Player), </w:t>
+              <w:t>(</w:t>
+            </w:r>
+            <w:proofErr w:type="gramEnd"/>
+            <w:r>
+              <w:rPr>
+                <w:sz w:val="20"/>
+                <w:szCs w:val="20"/>
+              </w:rPr>
+              <w:t xml:space="preserve">Player), </w:t>
             </w:r>
             <w:proofErr w:type="spellStart"/>
+            <w:proofErr w:type="gramStart"/>
             <w:r>
               <w:rPr>
                 <w:sz w:val="20"/>
@@ -3271,7 +3218,31 @@
                 <w:sz w:val="20"/>
                 <w:szCs w:val="20"/>
               </w:rPr>
-              <w:t xml:space="preserve">(Winner), ResetDisplay(). Each function encapsulates widget element updates, keeping internal variables private. Implemented </w:t>
+              <w:t>(</w:t>
+            </w:r>
+            <w:proofErr w:type="gramEnd"/>
+            <w:r>
+              <w:rPr>
+                <w:sz w:val="20"/>
+                <w:szCs w:val="20"/>
+              </w:rPr>
+              <w:t xml:space="preserve">Winner), </w:t>
+            </w:r>
+            <w:proofErr w:type="gramStart"/>
+            <w:r>
+              <w:rPr>
+                <w:sz w:val="20"/>
+                <w:szCs w:val="20"/>
+              </w:rPr>
+              <w:t>ResetDisplay(</w:t>
+            </w:r>
+            <w:proofErr w:type="gramEnd"/>
+            <w:r>
+              <w:rPr>
+                <w:sz w:val="20"/>
+                <w:szCs w:val="20"/>
+              </w:rPr>
+              <w:t xml:space="preserve">). Each function encapsulates widget element updates, keeping internal variables private. Implemented </w:t>
             </w:r>
             <w:proofErr w:type="spellStart"/>
             <w:r>
@@ -3357,7 +3328,7 @@
         </w:tc>
         <w:tc>
           <w:tcPr>
-            <w:tcW w:w="2913" w:type="dxa"/>
+            <w:tcW w:w="2942" w:type="dxa"/>
             <w:tcBorders>
               <w:top w:val="single" w:sz="1" w:space="0" w:color="CCCCCC"/>
               <w:left w:val="single" w:sz="1" w:space="0" w:color="CCCCCC"/>
@@ -3431,15 +3402,288 @@
           </w:p>
         </w:tc>
       </w:tr>
+      <w:tr>
+        <w:tc>
+          <w:tcPr>
+            <w:tcW w:w="1392" w:type="dxa"/>
+            <w:tcBorders>
+              <w:top w:val="single" w:sz="1" w:space="0" w:color="CCCCCC"/>
+              <w:left w:val="single" w:sz="1" w:space="0" w:color="CCCCCC"/>
+              <w:bottom w:val="single" w:sz="1" w:space="0" w:color="CCCCCC"/>
+              <w:right w:val="single" w:sz="1" w:space="0" w:color="CCCCCC"/>
+            </w:tcBorders>
+            <w:tcMar>
+              <w:top w:w="80" w:type="dxa"/>
+              <w:left w:w="120" w:type="dxa"/>
+              <w:bottom w:w="80" w:type="dxa"/>
+              <w:right w:w="120" w:type="dxa"/>
+            </w:tcMar>
+          </w:tcPr>
+          <w:p>
+            <w:pPr>
+              <w:rPr>
+                <w:sz w:val="20"/>
+                <w:szCs w:val="20"/>
+              </w:rPr>
+            </w:pPr>
+            <w:r>
+              <w:rPr>
+                <w:sz w:val="20"/>
+                <w:szCs w:val="20"/>
+              </w:rPr>
+              <w:t>03/08</w:t>
+            </w:r>
+            <w:r>
+              <w:rPr>
+                <w:sz w:val="20"/>
+                <w:szCs w:val="20"/>
+              </w:rPr>
+              <w:t>/26</w:t>
+            </w:r>
+          </w:p>
+        </w:tc>
+        <w:tc>
+          <w:tcPr>
+            <w:tcW w:w="4692" w:type="dxa"/>
+            <w:tcBorders>
+              <w:top w:val="single" w:sz="1" w:space="0" w:color="CCCCCC"/>
+              <w:left w:val="single" w:sz="1" w:space="0" w:color="CCCCCC"/>
+              <w:bottom w:val="single" w:sz="1" w:space="0" w:color="CCCCCC"/>
+              <w:right w:val="single" w:sz="1" w:space="0" w:color="CCCCCC"/>
+            </w:tcBorders>
+            <w:tcMar>
+              <w:top w:w="80" w:type="dxa"/>
+              <w:left w:w="120" w:type="dxa"/>
+              <w:bottom w:w="80" w:type="dxa"/>
+              <w:right w:w="120" w:type="dxa"/>
+            </w:tcMar>
+          </w:tcPr>
+          <w:p>
+            <w:pPr>
+              <w:rPr>
+                <w:sz w:val="20"/>
+                <w:szCs w:val="20"/>
+              </w:rPr>
+            </w:pPr>
+            <w:r>
+              <w:rPr>
+                <w:sz w:val="20"/>
+                <w:szCs w:val="20"/>
+              </w:rPr>
+              <w:t xml:space="preserve">Completed UI system. Implemented </w:t>
+            </w:r>
+            <w:proofErr w:type="spellStart"/>
+            <w:r>
+              <w:rPr>
+                <w:sz w:val="20"/>
+                <w:szCs w:val="20"/>
+              </w:rPr>
+              <w:t>ShowGameOver</w:t>
+            </w:r>
+            <w:proofErr w:type="spellEnd"/>
+            <w:r>
+              <w:rPr>
+                <w:sz w:val="20"/>
+                <w:szCs w:val="20"/>
+              </w:rPr>
+              <w:t xml:space="preserve"> and ResetDisplay functions in </w:t>
+            </w:r>
+            <w:proofErr w:type="spellStart"/>
+            <w:r>
+              <w:rPr>
+                <w:sz w:val="20"/>
+                <w:szCs w:val="20"/>
+              </w:rPr>
+              <w:t>WBP_GameUI</w:t>
+            </w:r>
+            <w:proofErr w:type="spellEnd"/>
+            <w:r>
+              <w:rPr>
+                <w:sz w:val="20"/>
+                <w:szCs w:val="20"/>
+              </w:rPr>
+              <w:t xml:space="preserve">. Wired </w:t>
+            </w:r>
+            <w:proofErr w:type="spellStart"/>
+            <w:r>
+              <w:rPr>
+                <w:sz w:val="20"/>
+                <w:szCs w:val="20"/>
+              </w:rPr>
+              <w:t>UpdateGameOverDisplay</w:t>
+            </w:r>
+            <w:proofErr w:type="spellEnd"/>
+            <w:r>
+              <w:rPr>
+                <w:sz w:val="20"/>
+                <w:szCs w:val="20"/>
+              </w:rPr>
+              <w:t xml:space="preserve"> and </w:t>
+            </w:r>
+            <w:proofErr w:type="spellStart"/>
+            <w:r>
+              <w:rPr>
+                <w:sz w:val="20"/>
+                <w:szCs w:val="20"/>
+              </w:rPr>
+              <w:t>UpdateRestartDisplay</w:t>
+            </w:r>
+            <w:proofErr w:type="spellEnd"/>
+            <w:r>
+              <w:rPr>
+                <w:sz w:val="20"/>
+                <w:szCs w:val="20"/>
+              </w:rPr>
+              <w:t xml:space="preserve"> events in </w:t>
+            </w:r>
+            <w:proofErr w:type="spellStart"/>
+            <w:r>
+              <w:rPr>
+                <w:sz w:val="20"/>
+                <w:szCs w:val="20"/>
+              </w:rPr>
+              <w:t>BP_TicTacToeGameMode</w:t>
+            </w:r>
+            <w:proofErr w:type="spellEnd"/>
+            <w:r>
+              <w:rPr>
+                <w:sz w:val="20"/>
+                <w:szCs w:val="20"/>
+              </w:rPr>
+              <w:t xml:space="preserve">. Added </w:t>
+            </w:r>
+            <w:proofErr w:type="spellStart"/>
+            <w:r>
+              <w:rPr>
+                <w:sz w:val="20"/>
+                <w:szCs w:val="20"/>
+              </w:rPr>
+              <w:t>RestartButton</w:t>
+            </w:r>
+            <w:proofErr w:type="spellEnd"/>
+            <w:r>
+              <w:rPr>
+                <w:sz w:val="20"/>
+                <w:szCs w:val="20"/>
+              </w:rPr>
+              <w:t xml:space="preserve"> </w:t>
+            </w:r>
+            <w:proofErr w:type="spellStart"/>
+            <w:r>
+              <w:rPr>
+                <w:sz w:val="20"/>
+                <w:szCs w:val="20"/>
+              </w:rPr>
+              <w:t>OnClicked</w:t>
+            </w:r>
+            <w:proofErr w:type="spellEnd"/>
+            <w:r>
+              <w:rPr>
+                <w:sz w:val="20"/>
+                <w:szCs w:val="20"/>
+              </w:rPr>
+              <w:t xml:space="preserve"> calling </w:t>
+            </w:r>
+            <w:proofErr w:type="spellStart"/>
+            <w:r>
+              <w:rPr>
+                <w:sz w:val="20"/>
+                <w:szCs w:val="20"/>
+              </w:rPr>
+              <w:t>RestartGame</w:t>
+            </w:r>
+            <w:proofErr w:type="spellEnd"/>
+            <w:r>
+              <w:rPr>
+                <w:sz w:val="20"/>
+                <w:szCs w:val="20"/>
+              </w:rPr>
+              <w:t xml:space="preserve">. Renamed </w:t>
+            </w:r>
+            <w:proofErr w:type="spellStart"/>
+            <w:r>
+              <w:rPr>
+                <w:sz w:val="20"/>
+                <w:szCs w:val="20"/>
+              </w:rPr>
+              <w:t>SetTurnText</w:t>
+            </w:r>
+            <w:proofErr w:type="spellEnd"/>
+            <w:r>
+              <w:rPr>
+                <w:sz w:val="20"/>
+                <w:szCs w:val="20"/>
+              </w:rPr>
+              <w:t xml:space="preserve"> to </w:t>
+            </w:r>
+            <w:proofErr w:type="spellStart"/>
+            <w:r>
+              <w:rPr>
+                <w:sz w:val="20"/>
+                <w:szCs w:val="20"/>
+              </w:rPr>
+              <w:t>SetTurnTextCurrentPlayer</w:t>
+            </w:r>
+            <w:proofErr w:type="spellEnd"/>
+            <w:r>
+              <w:rPr>
+                <w:sz w:val="20"/>
+                <w:szCs w:val="20"/>
+              </w:rPr>
+              <w:t xml:space="preserve"> and added </w:t>
+            </w:r>
+            <w:proofErr w:type="spellStart"/>
+            <w:r>
+              <w:rPr>
+                <w:sz w:val="20"/>
+                <w:szCs w:val="20"/>
+              </w:rPr>
+              <w:t>SetTurnTextRestartGame</w:t>
+            </w:r>
+            <w:proofErr w:type="spellEnd"/>
+            <w:r>
+              <w:rPr>
+                <w:sz w:val="20"/>
+                <w:szCs w:val="20"/>
+              </w:rPr>
+              <w:t xml:space="preserve"> showing "Another Round?" on game over. Full end to end game loop tested.</w:t>
+            </w:r>
+          </w:p>
+        </w:tc>
+        <w:tc>
+          <w:tcPr>
+            <w:tcW w:w="2942" w:type="dxa"/>
+            <w:tcBorders>
+              <w:top w:val="single" w:sz="1" w:space="0" w:color="CCCCCC"/>
+              <w:left w:val="single" w:sz="1" w:space="0" w:color="CCCCCC"/>
+              <w:bottom w:val="single" w:sz="1" w:space="0" w:color="CCCCCC"/>
+              <w:right w:val="single" w:sz="1" w:space="0" w:color="CCCCCC"/>
+            </w:tcBorders>
+            <w:tcMar>
+              <w:top w:w="80" w:type="dxa"/>
+              <w:left w:w="120" w:type="dxa"/>
+              <w:bottom w:w="80" w:type="dxa"/>
+              <w:right w:w="120" w:type="dxa"/>
+            </w:tcMar>
+          </w:tcPr>
+          <w:p>
+            <w:pPr>
+              <w:rPr>
+                <w:sz w:val="20"/>
+                <w:szCs w:val="20"/>
+              </w:rPr>
+            </w:pPr>
+            <w:r>
+              <w:rPr>
+                <w:sz w:val="20"/>
+                <w:szCs w:val="20"/>
+              </w:rPr>
+              <w:t>No bugs found. All test cases TC_TTT_001 through TC_TTT_010 passed.</w:t>
+            </w:r>
+          </w:p>
+        </w:tc>
+      </w:tr>
     </w:tbl>
-    <w:p>
-      <w:pPr>
-        <w:pStyle w:val="Heading1"/>
-      </w:pPr>
-      <w:r>
-        <w:t>3. Test Plan</w:t>
-      </w:r>
-    </w:p>
     <w:p>
       <w:pPr>
         <w:pBdr>
@@ -3453,6 +3697,7 @@
         <w:pStyle w:val="Heading2"/>
       </w:pPr>
       <w:r>
+        <w:lastRenderedPageBreak/>
         <w:t>3.1 Scope</w:t>
       </w:r>
     </w:p>
@@ -3585,9 +3830,24 @@
     </w:p>
     <w:p>
       <w:pPr>
+        <w:rPr>
+          <w:b/>
+          <w:bCs/>
+          <w:color w:val="2E75B6"/>
+          <w:sz w:val="26"/>
+          <w:szCs w:val="26"/>
+        </w:rPr>
+      </w:pPr>
+      <w:r>
+        <w:br w:type="page"/>
+      </w:r>
+    </w:p>
+    <w:p>
+      <w:pPr>
         <w:pStyle w:val="Heading2"/>
       </w:pPr>
       <w:r>
+        <w:lastRenderedPageBreak/>
         <w:t>3.4 Test Cases</w:t>
       </w:r>
     </w:p>
@@ -4131,13 +4391,11 @@
           <w:p>
             <w:r>
               <w:rPr>
-                <w:i/>
-                <w:iCs/>
-                <w:color w:val="999999"/>
-                <w:sz w:val="20"/>
-                <w:szCs w:val="20"/>
-              </w:rPr>
-              <w:t>Not Run / Pass / Fail / Blocked</w:t>
+                <w:color w:val="EE0000"/>
+                <w:sz w:val="20"/>
+                <w:szCs w:val="20"/>
+              </w:rPr>
+              <w:t>Pass</w:t>
             </w:r>
           </w:p>
         </w:tc>
@@ -4187,18 +4445,7 @@
               <w:right w:w="120" w:type="dxa"/>
             </w:tcMar>
           </w:tcPr>
-          <w:p>
-            <w:r>
-              <w:rPr>
-                <w:i/>
-                <w:iCs/>
-                <w:color w:val="999999"/>
-                <w:sz w:val="20"/>
-                <w:szCs w:val="20"/>
-              </w:rPr>
-              <w:t>[Any additional observations]</w:t>
-            </w:r>
-          </w:p>
+          <w:p/>
         </w:tc>
       </w:tr>
     </w:tbl>
@@ -4555,7 +4802,6 @@
                 <w:sz w:val="20"/>
                 <w:szCs w:val="20"/>
               </w:rPr>
-              <w:lastRenderedPageBreak/>
               <w:t>Expected Result</w:t>
             </w:r>
           </w:p>
@@ -4748,13 +4994,11 @@
           <w:p>
             <w:r>
               <w:rPr>
-                <w:i/>
-                <w:iCs/>
-                <w:color w:val="999999"/>
-                <w:sz w:val="20"/>
-                <w:szCs w:val="20"/>
-              </w:rPr>
-              <w:t>Not Run / Pass / Fail / Blocked</w:t>
+                <w:color w:val="EE0000"/>
+                <w:sz w:val="20"/>
+                <w:szCs w:val="20"/>
+              </w:rPr>
+              <w:t>Pass</w:t>
             </w:r>
           </w:p>
         </w:tc>
@@ -4804,18 +5048,7 @@
               <w:right w:w="120" w:type="dxa"/>
             </w:tcMar>
           </w:tcPr>
-          <w:p>
-            <w:r>
-              <w:rPr>
-                <w:i/>
-                <w:iCs/>
-                <w:color w:val="999999"/>
-                <w:sz w:val="20"/>
-                <w:szCs w:val="20"/>
-              </w:rPr>
-              <w:t>[Any additional observations]</w:t>
-            </w:r>
-          </w:p>
+          <w:p/>
         </w:tc>
       </w:tr>
     </w:tbl>
@@ -5228,6 +5461,7 @@
                 <w:sz w:val="20"/>
                 <w:szCs w:val="20"/>
               </w:rPr>
+              <w:lastRenderedPageBreak/>
               <w:t>Platform</w:t>
             </w:r>
           </w:p>
@@ -5364,13 +5598,11 @@
           <w:p>
             <w:r>
               <w:rPr>
-                <w:i/>
-                <w:iCs/>
-                <w:color w:val="999999"/>
-                <w:sz w:val="20"/>
-                <w:szCs w:val="20"/>
-              </w:rPr>
-              <w:t>Not Run / Pass / Fail / Blocked</w:t>
+                <w:color w:val="EE0000"/>
+                <w:sz w:val="20"/>
+                <w:szCs w:val="20"/>
+              </w:rPr>
+              <w:t>Pass</w:t>
             </w:r>
           </w:p>
         </w:tc>
@@ -5420,18 +5652,7 @@
               <w:right w:w="120" w:type="dxa"/>
             </w:tcMar>
           </w:tcPr>
-          <w:p>
-            <w:r>
-              <w:rPr>
-                <w:i/>
-                <w:iCs/>
-                <w:color w:val="999999"/>
-                <w:sz w:val="20"/>
-                <w:szCs w:val="20"/>
-              </w:rPr>
-              <w:t>[Any additional observations]</w:t>
-            </w:r>
-          </w:p>
+          <w:p/>
         </w:tc>
       </w:tr>
     </w:tbl>
@@ -5980,13 +6201,11 @@
           <w:p>
             <w:r>
               <w:rPr>
-                <w:i/>
-                <w:iCs/>
-                <w:color w:val="999999"/>
-                <w:sz w:val="20"/>
-                <w:szCs w:val="20"/>
-              </w:rPr>
-              <w:t>Not Run / Pass / Fail / Blocked</w:t>
+                <w:color w:val="EE0000"/>
+                <w:sz w:val="20"/>
+                <w:szCs w:val="20"/>
+              </w:rPr>
+              <w:t>Pass</w:t>
             </w:r>
           </w:p>
         </w:tc>
@@ -6036,18 +6255,7 @@
               <w:right w:w="120" w:type="dxa"/>
             </w:tcMar>
           </w:tcPr>
-          <w:p>
-            <w:r>
-              <w:rPr>
-                <w:i/>
-                <w:iCs/>
-                <w:color w:val="999999"/>
-                <w:sz w:val="20"/>
-                <w:szCs w:val="20"/>
-              </w:rPr>
-              <w:t>[Any additional observations]</w:t>
-            </w:r>
-          </w:p>
+          <w:p/>
         </w:tc>
       </w:tr>
     </w:tbl>
@@ -6236,7 +6444,6 @@
                 <w:sz w:val="20"/>
                 <w:szCs w:val="20"/>
               </w:rPr>
-              <w:lastRenderedPageBreak/>
               <w:t>Title</w:t>
             </w:r>
           </w:p>
@@ -6597,13 +6804,11 @@
           <w:p>
             <w:r>
               <w:rPr>
-                <w:i/>
-                <w:iCs/>
-                <w:color w:val="999999"/>
-                <w:sz w:val="20"/>
-                <w:szCs w:val="20"/>
-              </w:rPr>
-              <w:t>Not Run / Pass / Fail / Blocked</w:t>
+                <w:color w:val="EE0000"/>
+                <w:sz w:val="20"/>
+                <w:szCs w:val="20"/>
+              </w:rPr>
+              <w:t>Pass</w:t>
             </w:r>
           </w:p>
         </w:tc>
@@ -6653,18 +6858,7 @@
               <w:right w:w="120" w:type="dxa"/>
             </w:tcMar>
           </w:tcPr>
-          <w:p>
-            <w:r>
-              <w:rPr>
-                <w:i/>
-                <w:iCs/>
-                <w:color w:val="999999"/>
-                <w:sz w:val="20"/>
-                <w:szCs w:val="20"/>
-              </w:rPr>
-              <w:t>[Any additional observations]</w:t>
-            </w:r>
-          </w:p>
+          <w:p/>
         </w:tc>
       </w:tr>
     </w:tbl>
@@ -6909,6 +7103,7 @@
                 <w:sz w:val="20"/>
                 <w:szCs w:val="20"/>
               </w:rPr>
+              <w:lastRenderedPageBreak/>
               <w:t>Preconditions</w:t>
             </w:r>
           </w:p>
@@ -7213,13 +7408,11 @@
           <w:p>
             <w:r>
               <w:rPr>
-                <w:i/>
-                <w:iCs/>
-                <w:color w:val="999999"/>
-                <w:sz w:val="20"/>
-                <w:szCs w:val="20"/>
-              </w:rPr>
-              <w:t>Not Run / Pass / Fail / Blocked</w:t>
+                <w:color w:val="EE0000"/>
+                <w:sz w:val="20"/>
+                <w:szCs w:val="20"/>
+              </w:rPr>
+              <w:t>Pass</w:t>
             </w:r>
           </w:p>
         </w:tc>
@@ -7269,18 +7462,7 @@
               <w:right w:w="120" w:type="dxa"/>
             </w:tcMar>
           </w:tcPr>
-          <w:p>
-            <w:r>
-              <w:rPr>
-                <w:i/>
-                <w:iCs/>
-                <w:color w:val="999999"/>
-                <w:sz w:val="20"/>
-                <w:szCs w:val="20"/>
-              </w:rPr>
-              <w:t>[Any additional observations]</w:t>
-            </w:r>
-          </w:p>
+          <w:p/>
         </w:tc>
       </w:tr>
     </w:tbl>
@@ -7829,18 +8011,19 @@
           <w:p>
             <w:r>
               <w:rPr>
-                <w:i/>
-                <w:iCs/>
-                <w:color w:val="999999"/>
-                <w:sz w:val="20"/>
-                <w:szCs w:val="20"/>
-              </w:rPr>
-              <w:t>Not Run / Pass / Fail / Blocked</w:t>
-            </w:r>
-          </w:p>
-        </w:tc>
-      </w:tr>
-      <w:tr>
+                <w:color w:val="EE0000"/>
+                <w:sz w:val="20"/>
+                <w:szCs w:val="20"/>
+              </w:rPr>
+              <w:t>Pass</w:t>
+            </w:r>
+          </w:p>
+        </w:tc>
+      </w:tr>
+      <w:tr>
+        <w:trPr>
+          <w:trHeight w:val="97"/>
+        </w:trPr>
         <w:tc>
           <w:tcPr>
             <w:tcW w:w="2200" w:type="dxa"/>
@@ -7885,18 +8068,7 @@
               <w:right w:w="120" w:type="dxa"/>
             </w:tcMar>
           </w:tcPr>
-          <w:p>
-            <w:r>
-              <w:rPr>
-                <w:i/>
-                <w:iCs/>
-                <w:color w:val="999999"/>
-                <w:sz w:val="20"/>
-                <w:szCs w:val="20"/>
-              </w:rPr>
-              <w:t>[Any additional observations]</w:t>
-            </w:r>
-          </w:p>
+          <w:p/>
         </w:tc>
       </w:tr>
     </w:tbl>
@@ -7917,7 +8089,6 @@
           <w:sz w:val="24"/>
           <w:szCs w:val="24"/>
         </w:rPr>
-        <w:lastRenderedPageBreak/>
         <w:t>TC_TTT_008 - Turn alternation</w:t>
       </w:r>
     </w:p>
@@ -8501,18 +8672,7 @@
               <w:right w:w="120" w:type="dxa"/>
             </w:tcMar>
           </w:tcPr>
-          <w:p>
-            <w:r>
-              <w:rPr>
-                <w:i/>
-                <w:iCs/>
-                <w:color w:val="999999"/>
-                <w:sz w:val="20"/>
-                <w:szCs w:val="20"/>
-              </w:rPr>
-              <w:t>[Any additional observations]</w:t>
-            </w:r>
-          </w:p>
+          <w:p/>
         </w:tc>
       </w:tr>
     </w:tbl>
@@ -8533,6 +8693,7 @@
           <w:sz w:val="24"/>
           <w:szCs w:val="24"/>
         </w:rPr>
+        <w:lastRenderedPageBreak/>
         <w:t>TC_TTT_009 - Restart resets board</w:t>
       </w:r>
     </w:p>
@@ -9061,13 +9222,11 @@
           <w:p>
             <w:r>
               <w:rPr>
-                <w:i/>
-                <w:iCs/>
-                <w:color w:val="999999"/>
-                <w:sz w:val="20"/>
-                <w:szCs w:val="20"/>
-              </w:rPr>
-              <w:t>Not Run / Pass / Fail / Blocked</w:t>
+                <w:color w:val="EE0000"/>
+                <w:sz w:val="20"/>
+                <w:szCs w:val="20"/>
+              </w:rPr>
+              <w:t>Pass</w:t>
             </w:r>
           </w:p>
         </w:tc>
@@ -9117,18 +9276,7 @@
               <w:right w:w="120" w:type="dxa"/>
             </w:tcMar>
           </w:tcPr>
-          <w:p>
-            <w:r>
-              <w:rPr>
-                <w:i/>
-                <w:iCs/>
-                <w:color w:val="999999"/>
-                <w:sz w:val="20"/>
-                <w:szCs w:val="20"/>
-              </w:rPr>
-              <w:t>[Any additional observations]</w:t>
-            </w:r>
-          </w:p>
+          <w:p/>
         </w:tc>
       </w:tr>
     </w:tbl>
@@ -9485,7 +9633,6 @@
                 <w:sz w:val="20"/>
                 <w:szCs w:val="20"/>
               </w:rPr>
-              <w:lastRenderedPageBreak/>
               <w:t>Expected Result</w:t>
             </w:r>
           </w:p>
@@ -9678,13 +9825,11 @@
           <w:p>
             <w:r>
               <w:rPr>
-                <w:i/>
-                <w:iCs/>
-                <w:color w:val="999999"/>
-                <w:sz w:val="20"/>
-                <w:szCs w:val="20"/>
-              </w:rPr>
-              <w:t>Not Run / Pass / Fail / Blocked</w:t>
+                <w:color w:val="EE0000"/>
+                <w:sz w:val="20"/>
+                <w:szCs w:val="20"/>
+              </w:rPr>
+              <w:t>Pass</w:t>
             </w:r>
           </w:p>
         </w:tc>
@@ -9734,18 +9879,7 @@
               <w:right w:w="120" w:type="dxa"/>
             </w:tcMar>
           </w:tcPr>
-          <w:p>
-            <w:r>
-              <w:rPr>
-                <w:i/>
-                <w:iCs/>
-                <w:color w:val="999999"/>
-                <w:sz w:val="20"/>
-                <w:szCs w:val="20"/>
-              </w:rPr>
-              <w:t>[Any additional observations]</w:t>
-            </w:r>
-          </w:p>
+          <w:p/>
         </w:tc>
       </w:tr>
     </w:tbl>
@@ -10503,7 +10637,29 @@
                 <w:sz w:val="20"/>
                 <w:szCs w:val="20"/>
               </w:rPr>
-              <w:t>[What actually happened]</w:t>
+              <w:t xml:space="preserve">[What </w:t>
+            </w:r>
+            <w:proofErr w:type="gramStart"/>
+            <w:r>
+              <w:rPr>
+                <w:i/>
+                <w:iCs/>
+                <w:color w:val="999999"/>
+                <w:sz w:val="20"/>
+                <w:szCs w:val="20"/>
+              </w:rPr>
+              <w:t>actually happened</w:t>
+            </w:r>
+            <w:proofErr w:type="gramEnd"/>
+            <w:r>
+              <w:rPr>
+                <w:i/>
+                <w:iCs/>
+                <w:color w:val="999999"/>
+                <w:sz w:val="20"/>
+                <w:szCs w:val="20"/>
+              </w:rPr>
+              <w:t>]</w:t>
             </w:r>
           </w:p>
         </w:tc>
@@ -12611,7 +12767,6 @@
   <w:style w:type="character" w:default="1" w:styleId="DefaultParagraphFont">
     <w:name w:val="Default Paragraph Font"/>
     <w:uiPriority w:val="1"/>
-    <w:semiHidden/>
     <w:unhideWhenUsed/>
   </w:style>
   <w:style w:type="table" w:default="1" w:styleId="TableNormal">

</xml_diff>

<commit_message>
Refactor scores to GameState and add GameInstance reference
</commit_message>
<xml_diff>
--- a/docs/TicTacToe_Project_Log.docx
+++ b/docs/TicTacToe_Project_Log.docx
@@ -834,23 +834,7 @@
         <w:spacing w:after="120"/>
       </w:pPr>
       <w:r>
-        <w:t xml:space="preserve">Core game logic (grid state, win/draw detection, turn management) will be implemented in C++ Actor and </w:t>
-      </w:r>
-      <w:proofErr w:type="spellStart"/>
-      <w:r>
-        <w:t>GameMode</w:t>
-      </w:r>
-      <w:proofErr w:type="spellEnd"/>
-      <w:r>
-        <w:t xml:space="preserve"> classes. UI elements (board display, turn indicator, result screen) will be handled using </w:t>
-      </w:r>
-      <w:proofErr w:type="spellStart"/>
-      <w:r>
-        <w:t>Unreal's</w:t>
-      </w:r>
-      <w:proofErr w:type="spellEnd"/>
-      <w:r>
-        <w:t xml:space="preserve"> UMG system via Blueprints, with Blueprint-to-C++ communication via exposed UPROPERTY and UFUNCTION macros.</w:t>
+        <w:t>Core game logic (grid state, win/draw detection, turn management) will be implemented in C++ Actor and GameMode classes. UI elements (board display, turn indicator, result screen) will be handled using Unreal's UMG system via Blueprints, with Blueprint-to-C++ communication via exposed UPROPERTY and UFUNCTION macros.</w:t>
       </w:r>
     </w:p>
     <w:p>
@@ -975,9 +959,9 @@
         <w:tblLook w:val="0000" w:firstRow="0" w:lastRow="0" w:firstColumn="0" w:lastColumn="0" w:noHBand="0" w:noVBand="0"/>
       </w:tblPr>
       <w:tblGrid>
-        <w:gridCol w:w="1392"/>
-        <w:gridCol w:w="4692"/>
-        <w:gridCol w:w="2942"/>
+        <w:gridCol w:w="1304"/>
+        <w:gridCol w:w="4458"/>
+        <w:gridCol w:w="3264"/>
       </w:tblGrid>
       <w:tr>
         <w:tc>
@@ -1122,23 +1106,7 @@
                 <w:sz w:val="20"/>
                 <w:szCs w:val="20"/>
               </w:rPr>
-              <w:t>Project setup. Created UE5 C++ project. Set up GitHub repository with Unreal .</w:t>
-            </w:r>
-            <w:proofErr w:type="spellStart"/>
-            <w:r>
-              <w:rPr>
-                <w:sz w:val="20"/>
-                <w:szCs w:val="20"/>
-              </w:rPr>
-              <w:t>gitignore</w:t>
-            </w:r>
-            <w:proofErr w:type="spellEnd"/>
-            <w:r>
-              <w:rPr>
-                <w:sz w:val="20"/>
-                <w:szCs w:val="20"/>
-              </w:rPr>
-              <w:t>. Cleaned default level, deleted landscape. Set up Content folder structure (Maps, Blueprints, UI, Assets, Materials).</w:t>
+              <w:t>Project setup. Created UE5 C++ project. Set up GitHub repository with Unreal .gitignore. Cleaned default level, deleted landscape. Set up Content folder structure (Maps, Blueprints, UI, Assets, Materials).</w:t>
             </w:r>
           </w:p>
         </w:tc>
@@ -1221,55 +1189,7 @@
                 <w:sz w:val="20"/>
                 <w:szCs w:val="20"/>
               </w:rPr>
-              <w:t>Built board visuals using basic shapes. Created 9-square board blueprint (</w:t>
-            </w:r>
-            <w:proofErr w:type="spellStart"/>
-            <w:r>
-              <w:rPr>
-                <w:sz w:val="20"/>
-                <w:szCs w:val="20"/>
-              </w:rPr>
-              <w:t>BP_BoardPiece</w:t>
-            </w:r>
-            <w:proofErr w:type="spellEnd"/>
-            <w:r>
-              <w:rPr>
-                <w:sz w:val="20"/>
-                <w:szCs w:val="20"/>
-              </w:rPr>
-              <w:t xml:space="preserve">) with Element0-Element8 as individual cuboid Static Mesh Components in a 3x3 grid. Created </w:t>
-            </w:r>
-            <w:proofErr w:type="spellStart"/>
-            <w:r>
-              <w:rPr>
-                <w:sz w:val="20"/>
-                <w:szCs w:val="20"/>
-              </w:rPr>
-              <w:t>BP_PieceX</w:t>
-            </w:r>
-            <w:proofErr w:type="spellEnd"/>
-            <w:r>
-              <w:rPr>
-                <w:sz w:val="20"/>
-                <w:szCs w:val="20"/>
-              </w:rPr>
-              <w:t xml:space="preserve"> (blue cross, two scaled cuboids) and </w:t>
-            </w:r>
-            <w:proofErr w:type="spellStart"/>
-            <w:r>
-              <w:rPr>
-                <w:sz w:val="20"/>
-                <w:szCs w:val="20"/>
-              </w:rPr>
-              <w:t>BP_PieceO</w:t>
-            </w:r>
-            <w:proofErr w:type="spellEnd"/>
-            <w:r>
-              <w:rPr>
-                <w:sz w:val="20"/>
-                <w:szCs w:val="20"/>
-              </w:rPr>
-              <w:t xml:space="preserve"> (red cylinder).</w:t>
+              <w:t>Built board visuals using basic shapes. Created 9-square board blueprint (BP_BoardPiece) with Element0-Element8 as individual cuboid Static Mesh Components in a 3x3 grid. Created BP_PieceX (blue cross, two scaled cuboids) and BP_PieceO (red cylinder).</w:t>
             </w:r>
           </w:p>
         </w:tc>
@@ -1352,55 +1272,7 @@
                 <w:sz w:val="20"/>
                 <w:szCs w:val="20"/>
               </w:rPr>
-              <w:t xml:space="preserve">Created </w:t>
-            </w:r>
-            <w:proofErr w:type="spellStart"/>
-            <w:r>
-              <w:rPr>
-                <w:sz w:val="20"/>
-                <w:szCs w:val="20"/>
-              </w:rPr>
-              <w:t>TicTacToeGameMode</w:t>
-            </w:r>
-            <w:proofErr w:type="spellEnd"/>
-            <w:r>
-              <w:rPr>
-                <w:sz w:val="20"/>
-                <w:szCs w:val="20"/>
-              </w:rPr>
-              <w:t xml:space="preserve"> C++ class. Implemented full game logic: 9-element </w:t>
-            </w:r>
-            <w:proofErr w:type="spellStart"/>
-            <w:r>
-              <w:rPr>
-                <w:sz w:val="20"/>
-                <w:szCs w:val="20"/>
-              </w:rPr>
-              <w:t>TArray</w:t>
-            </w:r>
-            <w:proofErr w:type="spellEnd"/>
-            <w:r>
-              <w:rPr>
-                <w:sz w:val="20"/>
-                <w:szCs w:val="20"/>
-              </w:rPr>
-              <w:t xml:space="preserve"> grid, turn management, win condition detection across all 8 patterns (3 rows, 3 columns, 2 diagonals), draw detection, </w:t>
-            </w:r>
-            <w:proofErr w:type="spellStart"/>
-            <w:r>
-              <w:rPr>
-                <w:sz w:val="20"/>
-                <w:szCs w:val="20"/>
-              </w:rPr>
-              <w:t>RestartGame</w:t>
-            </w:r>
-            <w:proofErr w:type="spellEnd"/>
-            <w:r>
-              <w:rPr>
-                <w:sz w:val="20"/>
-                <w:szCs w:val="20"/>
-              </w:rPr>
-              <w:t xml:space="preserve"> function.</w:t>
+              <w:t>Created TicTacToeGameMode C++ class. Implemented full game logic: 9-element TArray grid, turn management, win condition detection across all 8 patterns (3 rows, 3 columns, 2 diagonals), draw detection, RestartGame function.</w:t>
             </w:r>
           </w:p>
         </w:tc>
@@ -1483,103 +1355,7 @@
                 <w:sz w:val="20"/>
                 <w:szCs w:val="20"/>
               </w:rPr>
-              <w:t xml:space="preserve">Created </w:t>
-            </w:r>
-            <w:proofErr w:type="spellStart"/>
-            <w:r>
-              <w:rPr>
-                <w:sz w:val="20"/>
-                <w:szCs w:val="20"/>
-              </w:rPr>
-              <w:t>BoardActor</w:t>
-            </w:r>
-            <w:proofErr w:type="spellEnd"/>
-            <w:r>
-              <w:rPr>
-                <w:sz w:val="20"/>
-                <w:szCs w:val="20"/>
-              </w:rPr>
-              <w:t xml:space="preserve"> C++ class. Implemented </w:t>
-            </w:r>
-            <w:proofErr w:type="spellStart"/>
-            <w:r>
-              <w:rPr>
-                <w:sz w:val="20"/>
-                <w:szCs w:val="20"/>
-              </w:rPr>
-              <w:t>GetBoardSpaces</w:t>
-            </w:r>
-            <w:proofErr w:type="spellEnd"/>
-            <w:r>
-              <w:rPr>
-                <w:sz w:val="20"/>
-                <w:szCs w:val="20"/>
-              </w:rPr>
-              <w:t xml:space="preserve">() to find and sort all 9 Static Mesh Components alphabetically, ensuring Element0=index 0 through Element8=index 8. Implemented </w:t>
-            </w:r>
-            <w:proofErr w:type="spellStart"/>
-            <w:r>
-              <w:rPr>
-                <w:sz w:val="20"/>
-                <w:szCs w:val="20"/>
-              </w:rPr>
-              <w:t>GetSquareLocation</w:t>
-            </w:r>
-            <w:proofErr w:type="spellEnd"/>
-            <w:r>
-              <w:rPr>
-                <w:sz w:val="20"/>
-                <w:szCs w:val="20"/>
-              </w:rPr>
-              <w:t xml:space="preserve">(), </w:t>
-            </w:r>
-            <w:proofErr w:type="spellStart"/>
-            <w:r>
-              <w:rPr>
-                <w:sz w:val="20"/>
-                <w:szCs w:val="20"/>
-              </w:rPr>
-              <w:t>SpawnPieceAtSquare</w:t>
-            </w:r>
-            <w:proofErr w:type="spellEnd"/>
-            <w:r>
-              <w:rPr>
-                <w:sz w:val="20"/>
-                <w:szCs w:val="20"/>
-              </w:rPr>
-              <w:t xml:space="preserve">(), </w:t>
-            </w:r>
-            <w:proofErr w:type="spellStart"/>
-            <w:r>
-              <w:rPr>
-                <w:sz w:val="20"/>
-                <w:szCs w:val="20"/>
-              </w:rPr>
-              <w:t>ClearBoard</w:t>
-            </w:r>
-            <w:proofErr w:type="spellEnd"/>
-            <w:r>
-              <w:rPr>
-                <w:sz w:val="20"/>
-                <w:szCs w:val="20"/>
-              </w:rPr>
-              <w:t xml:space="preserve">(), and </w:t>
-            </w:r>
-            <w:proofErr w:type="spellStart"/>
-            <w:r>
-              <w:rPr>
-                <w:sz w:val="20"/>
-                <w:szCs w:val="20"/>
-              </w:rPr>
-              <w:t>GameMode</w:t>
-            </w:r>
-            <w:proofErr w:type="spellEnd"/>
-            <w:r>
-              <w:rPr>
-                <w:sz w:val="20"/>
-                <w:szCs w:val="20"/>
-              </w:rPr>
-              <w:t xml:space="preserve"> reference caching.</w:t>
+              <w:t>Created BoardActor C++ class. Implemented GetBoardSpaces() to find and sort all 9 Static Mesh Components alphabetically, ensuring Element0=index 0 through Element8=index 8. Implemented GetSquareLocation(), SpawnPieceAtSquare(), ClearBoard(), and GameMode reference caching.</w:t>
             </w:r>
           </w:p>
         </w:tc>
@@ -1601,53 +1377,12 @@
             </w:tcMar>
           </w:tcPr>
           <w:p>
-            <w:proofErr w:type="spellStart"/>
-            <w:r>
-              <w:rPr>
-                <w:sz w:val="20"/>
-                <w:szCs w:val="20"/>
-              </w:rPr>
-              <w:t>GetComponents</w:t>
-            </w:r>
-            <w:proofErr w:type="spellEnd"/>
-            <w:r>
-              <w:rPr>
-                <w:sz w:val="20"/>
-                <w:szCs w:val="20"/>
-              </w:rPr>
-              <w:t xml:space="preserve">() returned components in wrong order. Fixed using </w:t>
-            </w:r>
-            <w:proofErr w:type="spellStart"/>
-            <w:r>
-              <w:rPr>
-                <w:sz w:val="20"/>
-                <w:szCs w:val="20"/>
-              </w:rPr>
-              <w:t>TArray</w:t>
-            </w:r>
-            <w:proofErr w:type="spellEnd"/>
-            <w:r>
-              <w:rPr>
-                <w:sz w:val="20"/>
-                <w:szCs w:val="20"/>
-              </w:rPr>
-              <w:t xml:space="preserve"> Sort with a lambda comparing component names alphabetically. Circular dependency error fixed using forward declaration in </w:t>
-            </w:r>
-            <w:proofErr w:type="spellStart"/>
-            <w:r>
-              <w:rPr>
-                <w:sz w:val="20"/>
-                <w:szCs w:val="20"/>
-              </w:rPr>
-              <w:t>GameMode</w:t>
-            </w:r>
-            <w:proofErr w:type="spellEnd"/>
-            <w:r>
-              <w:rPr>
-                <w:sz w:val="20"/>
-                <w:szCs w:val="20"/>
-              </w:rPr>
-              <w:t xml:space="preserve"> header.</w:t>
+            <w:r>
+              <w:rPr>
+                <w:sz w:val="20"/>
+                <w:szCs w:val="20"/>
+              </w:rPr>
+              <w:t>GetComponents() returned components in wrong order. Fixed using TArray Sort with a lambda comparing component names alphabetically. Circular dependency error fixed using forward declaration in GameMode header.</w:t>
             </w:r>
           </w:p>
         </w:tc>
@@ -1703,71 +1438,7 @@
                 <w:sz w:val="20"/>
                 <w:szCs w:val="20"/>
               </w:rPr>
-              <w:t xml:space="preserve">Wired up Blueprint input on </w:t>
-            </w:r>
-            <w:proofErr w:type="spellStart"/>
-            <w:r>
-              <w:rPr>
-                <w:sz w:val="20"/>
-                <w:szCs w:val="20"/>
-              </w:rPr>
-              <w:t>BP_BoardPiece</w:t>
-            </w:r>
-            <w:proofErr w:type="spellEnd"/>
-            <w:r>
-              <w:rPr>
-                <w:sz w:val="20"/>
-                <w:szCs w:val="20"/>
-              </w:rPr>
-              <w:t xml:space="preserve">. Added </w:t>
-            </w:r>
-            <w:proofErr w:type="spellStart"/>
-            <w:r>
-              <w:rPr>
-                <w:sz w:val="20"/>
-                <w:szCs w:val="20"/>
-              </w:rPr>
-              <w:t>OnClicked</w:t>
-            </w:r>
-            <w:proofErr w:type="spellEnd"/>
-            <w:r>
-              <w:rPr>
-                <w:sz w:val="20"/>
-                <w:szCs w:val="20"/>
-              </w:rPr>
-              <w:t xml:space="preserve"> events for all 9 elements, each calling </w:t>
-            </w:r>
-            <w:proofErr w:type="spellStart"/>
-            <w:r>
-              <w:rPr>
-                <w:sz w:val="20"/>
-                <w:szCs w:val="20"/>
-              </w:rPr>
-              <w:t>OnSquareClicked</w:t>
-            </w:r>
-            <w:proofErr w:type="spellEnd"/>
-            <w:r>
-              <w:rPr>
-                <w:sz w:val="20"/>
-                <w:szCs w:val="20"/>
-              </w:rPr>
-              <w:t xml:space="preserve"> with the correct index. Enabled click and touch events on </w:t>
-            </w:r>
-            <w:proofErr w:type="spellStart"/>
-            <w:r>
-              <w:rPr>
-                <w:sz w:val="20"/>
-                <w:szCs w:val="20"/>
-              </w:rPr>
-              <w:t>PlayerController</w:t>
-            </w:r>
-            <w:proofErr w:type="spellEnd"/>
-            <w:r>
-              <w:rPr>
-                <w:sz w:val="20"/>
-                <w:szCs w:val="20"/>
-              </w:rPr>
-              <w:t xml:space="preserve"> via C++.</w:t>
+              <w:t>Wired up Blueprint input on BP_BoardPiece. Added OnClicked events for all 9 elements, each calling OnSquareClicked with the correct index. Enabled click and touch events on PlayerController via C++.</w:t>
             </w:r>
           </w:p>
         </w:tc>
@@ -1794,87 +1465,7 @@
                 <w:sz w:val="20"/>
                 <w:szCs w:val="20"/>
               </w:rPr>
-              <w:t xml:space="preserve">Mouse was moving camera instead of registering clicks. Fixed by setting input mode to </w:t>
-            </w:r>
-            <w:proofErr w:type="spellStart"/>
-            <w:r>
-              <w:rPr>
-                <w:sz w:val="20"/>
-                <w:szCs w:val="20"/>
-              </w:rPr>
-              <w:t>GameAndUI</w:t>
-            </w:r>
-            <w:proofErr w:type="spellEnd"/>
-            <w:r>
-              <w:rPr>
-                <w:sz w:val="20"/>
-                <w:szCs w:val="20"/>
-              </w:rPr>
-              <w:t xml:space="preserve"> and enabling </w:t>
-            </w:r>
-            <w:proofErr w:type="spellStart"/>
-            <w:r>
-              <w:rPr>
-                <w:sz w:val="20"/>
-                <w:szCs w:val="20"/>
-              </w:rPr>
-              <w:t>bEnableClickEvents</w:t>
-            </w:r>
-            <w:proofErr w:type="spellEnd"/>
-            <w:r>
-              <w:rPr>
-                <w:sz w:val="20"/>
-                <w:szCs w:val="20"/>
-              </w:rPr>
-              <w:t xml:space="preserve">, </w:t>
-            </w:r>
-            <w:proofErr w:type="spellStart"/>
-            <w:r>
-              <w:rPr>
-                <w:sz w:val="20"/>
-                <w:szCs w:val="20"/>
-              </w:rPr>
-              <w:t>bEnableTouchEvents</w:t>
-            </w:r>
-            <w:proofErr w:type="spellEnd"/>
-            <w:r>
-              <w:rPr>
-                <w:sz w:val="20"/>
-                <w:szCs w:val="20"/>
-              </w:rPr>
-              <w:t xml:space="preserve">, </w:t>
-            </w:r>
-            <w:proofErr w:type="spellStart"/>
-            <w:r>
-              <w:rPr>
-                <w:sz w:val="20"/>
-                <w:szCs w:val="20"/>
-              </w:rPr>
-              <w:t>bEnableMouseOverEvents</w:t>
-            </w:r>
-            <w:proofErr w:type="spellEnd"/>
-            <w:r>
-              <w:rPr>
-                <w:sz w:val="20"/>
-                <w:szCs w:val="20"/>
-              </w:rPr>
-              <w:t xml:space="preserve"> on the </w:t>
-            </w:r>
-            <w:proofErr w:type="spellStart"/>
-            <w:r>
-              <w:rPr>
-                <w:sz w:val="20"/>
-                <w:szCs w:val="20"/>
-              </w:rPr>
-              <w:t>PlayerController</w:t>
-            </w:r>
-            <w:proofErr w:type="spellEnd"/>
-            <w:r>
-              <w:rPr>
-                <w:sz w:val="20"/>
-                <w:szCs w:val="20"/>
-              </w:rPr>
-              <w:t>.</w:t>
+              <w:t>Mouse was moving camera instead of registering clicks. Fixed by setting input mode to GameAndUI and enabling bEnableClickEvents, bEnableTouchEvents, bEnableMouseOverEvents on the PlayerController.</w:t>
             </w:r>
           </w:p>
         </w:tc>
@@ -1930,71 +1521,7 @@
                 <w:sz w:val="20"/>
                 <w:szCs w:val="20"/>
               </w:rPr>
-              <w:t xml:space="preserve">Set up fixed top-down camera. Placed </w:t>
-            </w:r>
-            <w:proofErr w:type="spellStart"/>
-            <w:r>
-              <w:rPr>
-                <w:sz w:val="20"/>
-                <w:szCs w:val="20"/>
-              </w:rPr>
-              <w:t>CameraActor</w:t>
-            </w:r>
-            <w:proofErr w:type="spellEnd"/>
-            <w:r>
-              <w:rPr>
-                <w:sz w:val="20"/>
-                <w:szCs w:val="20"/>
-              </w:rPr>
-              <w:t xml:space="preserve"> in level at -90 pitch. Added </w:t>
-            </w:r>
-            <w:proofErr w:type="spellStart"/>
-            <w:r>
-              <w:rPr>
-                <w:sz w:val="20"/>
-                <w:szCs w:val="20"/>
-              </w:rPr>
-              <w:t>SetCameraSettings</w:t>
-            </w:r>
-            <w:proofErr w:type="spellEnd"/>
-            <w:r>
-              <w:rPr>
-                <w:sz w:val="20"/>
-                <w:szCs w:val="20"/>
-              </w:rPr>
-              <w:t xml:space="preserve">() to </w:t>
-            </w:r>
-            <w:proofErr w:type="spellStart"/>
-            <w:r>
-              <w:rPr>
-                <w:sz w:val="20"/>
-                <w:szCs w:val="20"/>
-              </w:rPr>
-              <w:t>GameMode</w:t>
-            </w:r>
-            <w:proofErr w:type="spellEnd"/>
-            <w:r>
-              <w:rPr>
-                <w:sz w:val="20"/>
-                <w:szCs w:val="20"/>
-              </w:rPr>
-              <w:t xml:space="preserve">. Refactored </w:t>
-            </w:r>
-            <w:proofErr w:type="spellStart"/>
-            <w:r>
-              <w:rPr>
-                <w:sz w:val="20"/>
-                <w:szCs w:val="20"/>
-              </w:rPr>
-              <w:t>BeginPlay</w:t>
-            </w:r>
-            <w:proofErr w:type="spellEnd"/>
-            <w:r>
-              <w:rPr>
-                <w:sz w:val="20"/>
-                <w:szCs w:val="20"/>
-              </w:rPr>
-              <w:t xml:space="preserve"> into separate functions for cleaner code. Verified win and draw conditions working correctly end to end.</w:t>
+              <w:t>Set up fixed top-down camera. Placed CameraActor in level at -90 pitch. Added SetCameraSettings() to GameMode. Refactored BeginPlay into separate functions for cleaner code. Verified win and draw conditions working correctly end to end.</w:t>
             </w:r>
           </w:p>
         </w:tc>
@@ -2077,111 +1604,7 @@
                 <w:sz w:val="20"/>
                 <w:szCs w:val="20"/>
               </w:rPr>
-              <w:t xml:space="preserve">Created </w:t>
-            </w:r>
-            <w:proofErr w:type="spellStart"/>
-            <w:r>
-              <w:rPr>
-                <w:sz w:val="20"/>
-                <w:szCs w:val="20"/>
-              </w:rPr>
-              <w:t>WBP_GameUI</w:t>
-            </w:r>
-            <w:proofErr w:type="spellEnd"/>
-            <w:r>
-              <w:rPr>
-                <w:sz w:val="20"/>
-                <w:szCs w:val="20"/>
-              </w:rPr>
-              <w:t xml:space="preserve"> widget. Added </w:t>
-            </w:r>
-            <w:proofErr w:type="spellStart"/>
-            <w:r>
-              <w:rPr>
-                <w:sz w:val="20"/>
-                <w:szCs w:val="20"/>
-              </w:rPr>
-              <w:t>TurnText</w:t>
-            </w:r>
-            <w:proofErr w:type="spellEnd"/>
-            <w:r>
-              <w:rPr>
-                <w:sz w:val="20"/>
-                <w:szCs w:val="20"/>
-              </w:rPr>
-              <w:t xml:space="preserve"> (top), </w:t>
-            </w:r>
-            <w:proofErr w:type="spellStart"/>
-            <w:r>
-              <w:rPr>
-                <w:sz w:val="20"/>
-                <w:szCs w:val="20"/>
-              </w:rPr>
-              <w:t>ResultText</w:t>
-            </w:r>
-            <w:proofErr w:type="spellEnd"/>
-            <w:r>
-              <w:rPr>
-                <w:sz w:val="20"/>
-                <w:szCs w:val="20"/>
-              </w:rPr>
-              <w:t xml:space="preserve"> (centre), and </w:t>
-            </w:r>
-            <w:proofErr w:type="spellStart"/>
-            <w:r>
-              <w:rPr>
-                <w:sz w:val="20"/>
-                <w:szCs w:val="20"/>
-              </w:rPr>
-              <w:t>RestartButton</w:t>
-            </w:r>
-            <w:proofErr w:type="spellEnd"/>
-            <w:r>
-              <w:rPr>
-                <w:sz w:val="20"/>
-                <w:szCs w:val="20"/>
-              </w:rPr>
-              <w:t xml:space="preserve"> (bottom). Set </w:t>
-            </w:r>
-            <w:proofErr w:type="spellStart"/>
-            <w:r>
-              <w:rPr>
-                <w:sz w:val="20"/>
-                <w:szCs w:val="20"/>
-              </w:rPr>
-              <w:t>ResultText</w:t>
-            </w:r>
-            <w:proofErr w:type="spellEnd"/>
-            <w:r>
-              <w:rPr>
-                <w:sz w:val="20"/>
-                <w:szCs w:val="20"/>
-              </w:rPr>
-              <w:t xml:space="preserve"> and </w:t>
-            </w:r>
-            <w:proofErr w:type="spellStart"/>
-            <w:r>
-              <w:rPr>
-                <w:sz w:val="20"/>
-                <w:szCs w:val="20"/>
-              </w:rPr>
-              <w:t>RestartButton</w:t>
-            </w:r>
-            <w:proofErr w:type="spellEnd"/>
-            <w:r>
-              <w:rPr>
-                <w:sz w:val="20"/>
-                <w:szCs w:val="20"/>
-              </w:rPr>
-              <w:t xml:space="preserve"> visibility to Hidden by </w:t>
-            </w:r>
-            <w:r>
-              <w:rPr>
-                <w:sz w:val="20"/>
-                <w:szCs w:val="20"/>
-              </w:rPr>
-              <w:lastRenderedPageBreak/>
-              <w:t>default. Began wiring UI logic in Blueprint Event Graph.</w:t>
+              <w:t>Created WBP_GameUI widget. Added TurnText (top), ResultText (centre), and RestartButton (bottom). Set ResultText and RestartButton visibility to Hidden by default. Began wiring UI logic in Blueprint Event Graph.</w:t>
             </w:r>
           </w:p>
         </w:tc>
@@ -2208,16 +1631,7 @@
                 <w:sz w:val="20"/>
                 <w:szCs w:val="20"/>
               </w:rPr>
-              <w:lastRenderedPageBreak/>
-              <w:t xml:space="preserve">UI elements could not be positioned or anchored when nested inside layout containers. </w:t>
-            </w:r>
-            <w:r>
-              <w:rPr>
-                <w:sz w:val="20"/>
-                <w:szCs w:val="20"/>
-              </w:rPr>
-              <w:lastRenderedPageBreak/>
-              <w:t>Fixed by placing all elements directly on the Canvas Panel root.</w:t>
+              <w:t>UI elements could not be positioned or anchored when nested inside layout containers. Fixed by placing all elements directly on the Canvas Panel root.</w:t>
             </w:r>
           </w:p>
         </w:tc>
@@ -2274,151 +1688,7 @@
                 <w:sz w:val="20"/>
                 <w:szCs w:val="20"/>
               </w:rPr>
-              <w:t xml:space="preserve">Resumed project after a break. Added UMG module dependency to </w:t>
-            </w:r>
-            <w:proofErr w:type="spellStart"/>
-            <w:r>
-              <w:rPr>
-                <w:sz w:val="20"/>
-                <w:szCs w:val="20"/>
-              </w:rPr>
-              <w:t>TicTacToe.Build.cs</w:t>
-            </w:r>
-            <w:proofErr w:type="spellEnd"/>
-            <w:r>
-              <w:rPr>
-                <w:sz w:val="20"/>
-                <w:szCs w:val="20"/>
-              </w:rPr>
-              <w:t xml:space="preserve"> to resolve linker errors for </w:t>
-            </w:r>
-            <w:proofErr w:type="spellStart"/>
-            <w:r>
-              <w:rPr>
-                <w:sz w:val="20"/>
-                <w:szCs w:val="20"/>
-              </w:rPr>
-              <w:t>UUserWidget</w:t>
-            </w:r>
-            <w:proofErr w:type="spellEnd"/>
-            <w:r>
-              <w:rPr>
-                <w:sz w:val="20"/>
-                <w:szCs w:val="20"/>
-              </w:rPr>
-              <w:t xml:space="preserve">. Added </w:t>
-            </w:r>
-            <w:proofErr w:type="spellStart"/>
-            <w:r>
-              <w:rPr>
-                <w:sz w:val="20"/>
-                <w:szCs w:val="20"/>
-              </w:rPr>
-              <w:t>GameUIClass</w:t>
-            </w:r>
-            <w:proofErr w:type="spellEnd"/>
-            <w:r>
-              <w:rPr>
-                <w:sz w:val="20"/>
-                <w:szCs w:val="20"/>
-              </w:rPr>
-              <w:t xml:space="preserve"> (</w:t>
-            </w:r>
-            <w:proofErr w:type="spellStart"/>
-            <w:r>
-              <w:rPr>
-                <w:sz w:val="20"/>
-                <w:szCs w:val="20"/>
-              </w:rPr>
-              <w:t>TSubclassOf</w:t>
-            </w:r>
-            <w:proofErr w:type="spellEnd"/>
-            <w:r>
-              <w:rPr>
-                <w:sz w:val="20"/>
-                <w:szCs w:val="20"/>
-              </w:rPr>
-              <w:t>&lt;</w:t>
-            </w:r>
-            <w:proofErr w:type="spellStart"/>
-            <w:r>
-              <w:rPr>
-                <w:sz w:val="20"/>
-                <w:szCs w:val="20"/>
-              </w:rPr>
-              <w:t>UUserWidget</w:t>
-            </w:r>
-            <w:proofErr w:type="spellEnd"/>
-            <w:r>
-              <w:rPr>
-                <w:sz w:val="20"/>
-                <w:szCs w:val="20"/>
-              </w:rPr>
-              <w:t xml:space="preserve">&gt;) and </w:t>
-            </w:r>
-            <w:proofErr w:type="spellStart"/>
-            <w:r>
-              <w:rPr>
-                <w:sz w:val="20"/>
-                <w:szCs w:val="20"/>
-              </w:rPr>
-              <w:t>GameUIInstance</w:t>
-            </w:r>
-            <w:proofErr w:type="spellEnd"/>
-            <w:r>
-              <w:rPr>
-                <w:sz w:val="20"/>
-                <w:szCs w:val="20"/>
-              </w:rPr>
-              <w:t xml:space="preserve"> (</w:t>
-            </w:r>
-            <w:proofErr w:type="spellStart"/>
-            <w:r>
-              <w:rPr>
-                <w:sz w:val="20"/>
-                <w:szCs w:val="20"/>
-              </w:rPr>
-              <w:t>UUserWidget</w:t>
-            </w:r>
-            <w:proofErr w:type="spellEnd"/>
-            <w:r>
-              <w:rPr>
-                <w:sz w:val="20"/>
-                <w:szCs w:val="20"/>
-              </w:rPr>
-              <w:t xml:space="preserve">*) to </w:t>
-            </w:r>
-            <w:proofErr w:type="spellStart"/>
-            <w:r>
-              <w:rPr>
-                <w:sz w:val="20"/>
-                <w:szCs w:val="20"/>
-              </w:rPr>
-              <w:t>GameMode</w:t>
-            </w:r>
-            <w:proofErr w:type="spellEnd"/>
-            <w:r>
-              <w:rPr>
-                <w:sz w:val="20"/>
-                <w:szCs w:val="20"/>
-              </w:rPr>
-              <w:t xml:space="preserve"> header. Implemented </w:t>
-            </w:r>
-            <w:proofErr w:type="spellStart"/>
-            <w:r>
-              <w:rPr>
-                <w:sz w:val="20"/>
-                <w:szCs w:val="20"/>
-              </w:rPr>
-              <w:t>SetupUI</w:t>
-            </w:r>
-            <w:proofErr w:type="spellEnd"/>
-            <w:r>
-              <w:rPr>
-                <w:sz w:val="20"/>
-                <w:szCs w:val="20"/>
-              </w:rPr>
-              <w:t>() in C++ to create and add widget to viewport.</w:t>
+              <w:t>Resumed project after a break. Added UMG module dependency to TicTacToe.Build.cs to resolve linker errors for UUserWidget. Added GameUIClass (TSubclassOf&lt;UUserWidget&gt;) and GameUIInstance (UUserWidget*) to GameMode header. Implemented SetupUI() in C++ to create and add widget to viewport.</w:t>
             </w:r>
           </w:p>
         </w:tc>
@@ -2445,103 +1715,7 @@
                 <w:sz w:val="20"/>
                 <w:szCs w:val="20"/>
               </w:rPr>
-              <w:t xml:space="preserve">LNK2019 linker errors for </w:t>
-            </w:r>
-            <w:proofErr w:type="spellStart"/>
-            <w:r>
-              <w:rPr>
-                <w:sz w:val="20"/>
-                <w:szCs w:val="20"/>
-              </w:rPr>
-              <w:t>UUserWidget</w:t>
-            </w:r>
-            <w:proofErr w:type="spellEnd"/>
-            <w:r>
-              <w:rPr>
-                <w:sz w:val="20"/>
-                <w:szCs w:val="20"/>
-              </w:rPr>
-              <w:t xml:space="preserve"> — fixed by adding UMG to </w:t>
-            </w:r>
-            <w:proofErr w:type="spellStart"/>
-            <w:r>
-              <w:rPr>
-                <w:sz w:val="20"/>
-                <w:szCs w:val="20"/>
-              </w:rPr>
-              <w:t>PublicDependencyModuleNames</w:t>
-            </w:r>
-            <w:proofErr w:type="spellEnd"/>
-            <w:r>
-              <w:rPr>
-                <w:sz w:val="20"/>
-                <w:szCs w:val="20"/>
-              </w:rPr>
-              <w:t xml:space="preserve"> in </w:t>
-            </w:r>
-            <w:proofErr w:type="spellStart"/>
-            <w:r>
-              <w:rPr>
-                <w:sz w:val="20"/>
-                <w:szCs w:val="20"/>
-              </w:rPr>
-              <w:t>Build.cs</w:t>
-            </w:r>
-            <w:proofErr w:type="spellEnd"/>
-            <w:r>
-              <w:rPr>
-                <w:sz w:val="20"/>
-                <w:szCs w:val="20"/>
-              </w:rPr>
-              <w:t xml:space="preserve">. </w:t>
-            </w:r>
-            <w:proofErr w:type="spellStart"/>
-            <w:r>
-              <w:rPr>
-                <w:sz w:val="20"/>
-                <w:szCs w:val="20"/>
-              </w:rPr>
-              <w:t>GameUIClass</w:t>
-            </w:r>
-            <w:proofErr w:type="spellEnd"/>
-            <w:r>
-              <w:rPr>
-                <w:sz w:val="20"/>
-                <w:szCs w:val="20"/>
-              </w:rPr>
-              <w:t xml:space="preserve"> not visible in Project Settings — resolved by creating </w:t>
-            </w:r>
-            <w:proofErr w:type="spellStart"/>
-            <w:r>
-              <w:rPr>
-                <w:sz w:val="20"/>
-                <w:szCs w:val="20"/>
-              </w:rPr>
-              <w:t>BP_TicTacToeGameMode</w:t>
-            </w:r>
-            <w:proofErr w:type="spellEnd"/>
-            <w:r>
-              <w:rPr>
-                <w:sz w:val="20"/>
-                <w:szCs w:val="20"/>
-              </w:rPr>
-              <w:t xml:space="preserve"> Blueprint and setting it as default </w:t>
-            </w:r>
-            <w:proofErr w:type="spellStart"/>
-            <w:r>
-              <w:rPr>
-                <w:sz w:val="20"/>
-                <w:szCs w:val="20"/>
-              </w:rPr>
-              <w:t>GameMode</w:t>
-            </w:r>
-            <w:proofErr w:type="spellEnd"/>
-            <w:r>
-              <w:rPr>
-                <w:sz w:val="20"/>
-                <w:szCs w:val="20"/>
-              </w:rPr>
-              <w:t>.</w:t>
+              <w:t>LNK2019 linker errors for UUserWidget — fixed by adding UMG to PublicDependencyModuleNames in Build.cs. GameUIClass not visible in Project Settings — resolved by creating BP_TicTacToeGameMode Blueprint and setting it as default GameMode.</w:t>
             </w:r>
           </w:p>
         </w:tc>
@@ -2597,71 +1771,7 @@
                 <w:sz w:val="20"/>
                 <w:szCs w:val="20"/>
               </w:rPr>
-              <w:t xml:space="preserve">Refactored widget creation from C++ to Blueprint. Widget now created entirely in </w:t>
-            </w:r>
-            <w:proofErr w:type="spellStart"/>
-            <w:r>
-              <w:rPr>
-                <w:sz w:val="20"/>
-                <w:szCs w:val="20"/>
-              </w:rPr>
-              <w:t>BP_TicTacToeGameMode</w:t>
-            </w:r>
-            <w:proofErr w:type="spellEnd"/>
-            <w:r>
-              <w:rPr>
-                <w:sz w:val="20"/>
-                <w:szCs w:val="20"/>
-              </w:rPr>
-              <w:t xml:space="preserve"> </w:t>
-            </w:r>
-            <w:proofErr w:type="spellStart"/>
-            <w:r>
-              <w:rPr>
-                <w:sz w:val="20"/>
-                <w:szCs w:val="20"/>
-              </w:rPr>
-              <w:t>BeginPlay</w:t>
-            </w:r>
-            <w:proofErr w:type="spellEnd"/>
-            <w:r>
-              <w:rPr>
-                <w:sz w:val="20"/>
-                <w:szCs w:val="20"/>
-              </w:rPr>
-              <w:t xml:space="preserve"> using Create Widget node, added to viewport, and stored as typed </w:t>
-            </w:r>
-            <w:proofErr w:type="spellStart"/>
-            <w:r>
-              <w:rPr>
-                <w:sz w:val="20"/>
-                <w:szCs w:val="20"/>
-              </w:rPr>
-              <w:t>GameUI</w:t>
-            </w:r>
-            <w:proofErr w:type="spellEnd"/>
-            <w:r>
-              <w:rPr>
-                <w:sz w:val="20"/>
-                <w:szCs w:val="20"/>
-              </w:rPr>
-              <w:t xml:space="preserve"> variable. This eliminated timing issues with </w:t>
-            </w:r>
-            <w:proofErr w:type="spellStart"/>
-            <w:r>
-              <w:rPr>
-                <w:sz w:val="20"/>
-                <w:szCs w:val="20"/>
-              </w:rPr>
-              <w:t>GameUIInstance</w:t>
-            </w:r>
-            <w:proofErr w:type="spellEnd"/>
-            <w:r>
-              <w:rPr>
-                <w:sz w:val="20"/>
-                <w:szCs w:val="20"/>
-              </w:rPr>
-              <w:t xml:space="preserve"> being null when Blueprint tried to access it.</w:t>
+              <w:t>Refactored widget creation from C++ to Blueprint. Widget now created entirely in BP_TicTacToeGameMode BeginPlay using Create Widget node, added to viewport, and stored as typed GameUI variable. This eliminated timing issues with GameUIInstance being null when Blueprint tried to access it.</w:t>
             </w:r>
           </w:p>
         </w:tc>
@@ -2688,71 +1798,7 @@
                 <w:sz w:val="20"/>
                 <w:szCs w:val="20"/>
               </w:rPr>
-              <w:t xml:space="preserve">Cast from </w:t>
-            </w:r>
-            <w:proofErr w:type="spellStart"/>
-            <w:r>
-              <w:rPr>
-                <w:sz w:val="20"/>
-                <w:szCs w:val="20"/>
-              </w:rPr>
-              <w:t>GameUIInstance</w:t>
-            </w:r>
-            <w:proofErr w:type="spellEnd"/>
-            <w:r>
-              <w:rPr>
-                <w:sz w:val="20"/>
-                <w:szCs w:val="20"/>
-              </w:rPr>
-              <w:t xml:space="preserve"> to </w:t>
-            </w:r>
-            <w:proofErr w:type="spellStart"/>
-            <w:r>
-              <w:rPr>
-                <w:sz w:val="20"/>
-                <w:szCs w:val="20"/>
-              </w:rPr>
-              <w:t>WBP_GameUI</w:t>
-            </w:r>
-            <w:proofErr w:type="spellEnd"/>
-            <w:r>
-              <w:rPr>
-                <w:sz w:val="20"/>
-                <w:szCs w:val="20"/>
-              </w:rPr>
-              <w:t xml:space="preserve"> was failing due to timing — C++ </w:t>
-            </w:r>
-            <w:proofErr w:type="spellStart"/>
-            <w:r>
-              <w:rPr>
-                <w:sz w:val="20"/>
-                <w:szCs w:val="20"/>
-              </w:rPr>
-              <w:t>SetupUI</w:t>
-            </w:r>
-            <w:proofErr w:type="spellEnd"/>
-            <w:r>
-              <w:rPr>
-                <w:sz w:val="20"/>
-                <w:szCs w:val="20"/>
-              </w:rPr>
-              <w:t xml:space="preserve"> had not yet run when Blueprint </w:t>
-            </w:r>
-            <w:proofErr w:type="spellStart"/>
-            <w:r>
-              <w:rPr>
-                <w:sz w:val="20"/>
-                <w:szCs w:val="20"/>
-              </w:rPr>
-              <w:t>BeginPlay</w:t>
-            </w:r>
-            <w:proofErr w:type="spellEnd"/>
-            <w:r>
-              <w:rPr>
-                <w:sz w:val="20"/>
-                <w:szCs w:val="20"/>
-              </w:rPr>
-              <w:t xml:space="preserve"> tried to access it. Solved by moving widget creation entirely to Blueprint, removing the C++ dependency.</w:t>
+              <w:t>Cast from GameUIInstance to WBP_GameUI was failing due to timing — C++ SetupUI had not yet run when Blueprint BeginPlay tried to access it. Solved by moving widget creation entirely to Blueprint, removing the C++ dependency.</w:t>
             </w:r>
           </w:p>
         </w:tc>
@@ -2808,119 +1854,7 @@
                 <w:sz w:val="20"/>
                 <w:szCs w:val="20"/>
               </w:rPr>
-              <w:t xml:space="preserve">Implemented </w:t>
-            </w:r>
-            <w:proofErr w:type="spellStart"/>
-            <w:r>
-              <w:rPr>
-                <w:sz w:val="20"/>
-                <w:szCs w:val="20"/>
-              </w:rPr>
-              <w:t>BlueprintImplementableEvent</w:t>
-            </w:r>
-            <w:proofErr w:type="spellEnd"/>
-            <w:r>
-              <w:rPr>
-                <w:sz w:val="20"/>
-                <w:szCs w:val="20"/>
-              </w:rPr>
-              <w:t xml:space="preserve"> functions in </w:t>
-            </w:r>
-            <w:proofErr w:type="spellStart"/>
-            <w:r>
-              <w:rPr>
-                <w:sz w:val="20"/>
-                <w:szCs w:val="20"/>
-              </w:rPr>
-              <w:t>GameMode</w:t>
-            </w:r>
-            <w:proofErr w:type="spellEnd"/>
-            <w:r>
-              <w:rPr>
-                <w:sz w:val="20"/>
-                <w:szCs w:val="20"/>
-              </w:rPr>
-              <w:t xml:space="preserve">: </w:t>
-            </w:r>
-            <w:proofErr w:type="spellStart"/>
-            <w:r>
-              <w:rPr>
-                <w:sz w:val="20"/>
-                <w:szCs w:val="20"/>
-              </w:rPr>
-              <w:t>UpdateTurnDisplay</w:t>
-            </w:r>
-            <w:proofErr w:type="spellEnd"/>
-            <w:r>
-              <w:rPr>
-                <w:sz w:val="20"/>
-                <w:szCs w:val="20"/>
-              </w:rPr>
-              <w:t xml:space="preserve">(Player), </w:t>
-            </w:r>
-            <w:proofErr w:type="spellStart"/>
-            <w:r>
-              <w:rPr>
-                <w:sz w:val="20"/>
-                <w:szCs w:val="20"/>
-              </w:rPr>
-              <w:t>UpdateGameOverDisplay</w:t>
-            </w:r>
-            <w:proofErr w:type="spellEnd"/>
-            <w:r>
-              <w:rPr>
-                <w:sz w:val="20"/>
-                <w:szCs w:val="20"/>
-              </w:rPr>
-              <w:t>(</w:t>
-            </w:r>
-            <w:proofErr w:type="spellStart"/>
-            <w:r>
-              <w:rPr>
-                <w:sz w:val="20"/>
-                <w:szCs w:val="20"/>
-              </w:rPr>
-              <w:t>WinningPlayer</w:t>
-            </w:r>
-            <w:proofErr w:type="spellEnd"/>
-            <w:r>
-              <w:rPr>
-                <w:sz w:val="20"/>
-                <w:szCs w:val="20"/>
-              </w:rPr>
-              <w:t xml:space="preserve">), </w:t>
-            </w:r>
-            <w:proofErr w:type="spellStart"/>
-            <w:r>
-              <w:rPr>
-                <w:sz w:val="20"/>
-                <w:szCs w:val="20"/>
-              </w:rPr>
-              <w:t>UpdateRestartDisplay</w:t>
-            </w:r>
-            <w:proofErr w:type="spellEnd"/>
-            <w:r>
-              <w:rPr>
-                <w:sz w:val="20"/>
-                <w:szCs w:val="20"/>
-              </w:rPr>
-              <w:t xml:space="preserve">(). These replace the earlier </w:t>
-            </w:r>
-            <w:proofErr w:type="spellStart"/>
-            <w:r>
-              <w:rPr>
-                <w:sz w:val="20"/>
-                <w:szCs w:val="20"/>
-              </w:rPr>
-              <w:t>OnGameStateChanged</w:t>
-            </w:r>
-            <w:proofErr w:type="spellEnd"/>
-            <w:r>
-              <w:rPr>
-                <w:sz w:val="20"/>
-                <w:szCs w:val="20"/>
-              </w:rPr>
-              <w:t xml:space="preserve"> approach with more specific, data-driven events. </w:t>
+              <w:t xml:space="preserve">Implemented BlueprintImplementableEvent functions in GameMode: UpdateTurnDisplay(Player), UpdateGameOverDisplay(WinningPlayer), UpdateRestartDisplay(). These replace the earlier OnGameStateChanged approach with more specific, data-driven events. </w:t>
             </w:r>
           </w:p>
         </w:tc>
@@ -2942,37 +1876,12 @@
             </w:tcMar>
           </w:tcPr>
           <w:p>
-            <w:proofErr w:type="spellStart"/>
-            <w:r>
-              <w:rPr>
-                <w:sz w:val="20"/>
-                <w:szCs w:val="20"/>
-              </w:rPr>
-              <w:t>OnGameStateChanged</w:t>
-            </w:r>
-            <w:proofErr w:type="spellEnd"/>
-            <w:r>
-              <w:rPr>
-                <w:sz w:val="20"/>
-                <w:szCs w:val="20"/>
-              </w:rPr>
-              <w:t xml:space="preserve"> approach was too generic and caused confusion about where to implement it. Replaced with three specific functions that push data directly to the widget rather than having the widget pull from the </w:t>
-            </w:r>
-            <w:proofErr w:type="spellStart"/>
-            <w:r>
-              <w:rPr>
-                <w:sz w:val="20"/>
-                <w:szCs w:val="20"/>
-              </w:rPr>
-              <w:t>GameMode</w:t>
-            </w:r>
-            <w:proofErr w:type="spellEnd"/>
-            <w:r>
-              <w:rPr>
-                <w:sz w:val="20"/>
-                <w:szCs w:val="20"/>
-              </w:rPr>
-              <w:t>.</w:t>
+            <w:r>
+              <w:rPr>
+                <w:sz w:val="20"/>
+                <w:szCs w:val="20"/>
+              </w:rPr>
+              <w:t>OnGameStateChanged approach was too generic and caused confusion about where to implement it. Replaced with three specific functions that push data directly to the widget rather than having the widget pull from the GameMode.</w:t>
             </w:r>
           </w:p>
         </w:tc>
@@ -3028,135 +1937,7 @@
                 <w:sz w:val="20"/>
                 <w:szCs w:val="20"/>
               </w:rPr>
-              <w:t xml:space="preserve">Created public functions in </w:t>
-            </w:r>
-            <w:proofErr w:type="spellStart"/>
-            <w:r>
-              <w:rPr>
-                <w:sz w:val="20"/>
-                <w:szCs w:val="20"/>
-              </w:rPr>
-              <w:t>WBP_GameUI</w:t>
-            </w:r>
-            <w:proofErr w:type="spellEnd"/>
-            <w:r>
-              <w:rPr>
-                <w:sz w:val="20"/>
-                <w:szCs w:val="20"/>
-              </w:rPr>
-              <w:t xml:space="preserve">: </w:t>
-            </w:r>
-            <w:proofErr w:type="spellStart"/>
-            <w:r>
-              <w:rPr>
-                <w:sz w:val="20"/>
-                <w:szCs w:val="20"/>
-              </w:rPr>
-              <w:t>SetTurnText</w:t>
-            </w:r>
-            <w:proofErr w:type="spellEnd"/>
-            <w:r>
-              <w:rPr>
-                <w:sz w:val="20"/>
-                <w:szCs w:val="20"/>
-              </w:rPr>
-              <w:t xml:space="preserve">(Player), </w:t>
-            </w:r>
-            <w:proofErr w:type="spellStart"/>
-            <w:r>
-              <w:rPr>
-                <w:sz w:val="20"/>
-                <w:szCs w:val="20"/>
-              </w:rPr>
-              <w:t>ShowGameOver</w:t>
-            </w:r>
-            <w:proofErr w:type="spellEnd"/>
-            <w:r>
-              <w:rPr>
-                <w:sz w:val="20"/>
-                <w:szCs w:val="20"/>
-              </w:rPr>
-              <w:t xml:space="preserve">(Winner), ResetDisplay(). Each function encapsulates widget element updates, keeping internal variables private. Implemented </w:t>
-            </w:r>
-            <w:proofErr w:type="spellStart"/>
-            <w:r>
-              <w:rPr>
-                <w:sz w:val="20"/>
-                <w:szCs w:val="20"/>
-              </w:rPr>
-              <w:t>UpdateTurnDisplay</w:t>
-            </w:r>
-            <w:proofErr w:type="spellEnd"/>
-            <w:r>
-              <w:rPr>
-                <w:sz w:val="20"/>
-                <w:szCs w:val="20"/>
-              </w:rPr>
-              <w:t xml:space="preserve"> in </w:t>
-            </w:r>
-            <w:proofErr w:type="spellStart"/>
-            <w:r>
-              <w:rPr>
-                <w:sz w:val="20"/>
-                <w:szCs w:val="20"/>
-              </w:rPr>
-              <w:t>BP_TicTacToeGameMode</w:t>
-            </w:r>
-            <w:proofErr w:type="spellEnd"/>
-            <w:r>
-              <w:rPr>
-                <w:sz w:val="20"/>
-                <w:szCs w:val="20"/>
-              </w:rPr>
-              <w:t xml:space="preserve">, wiring it to call </w:t>
-            </w:r>
-            <w:proofErr w:type="spellStart"/>
-            <w:r>
-              <w:rPr>
-                <w:sz w:val="20"/>
-                <w:szCs w:val="20"/>
-              </w:rPr>
-              <w:t>SetTurnText</w:t>
-            </w:r>
-            <w:proofErr w:type="spellEnd"/>
-            <w:r>
-              <w:rPr>
-                <w:sz w:val="20"/>
-                <w:szCs w:val="20"/>
-              </w:rPr>
-              <w:t xml:space="preserve"> on the </w:t>
-            </w:r>
-            <w:proofErr w:type="spellStart"/>
-            <w:r>
-              <w:rPr>
-                <w:sz w:val="20"/>
-                <w:szCs w:val="20"/>
-              </w:rPr>
-              <w:t>GameUI</w:t>
-            </w:r>
-            <w:proofErr w:type="spellEnd"/>
-            <w:r>
-              <w:rPr>
-                <w:sz w:val="20"/>
-                <w:szCs w:val="20"/>
-              </w:rPr>
-              <w:t xml:space="preserve"> variable. Verified </w:t>
-            </w:r>
-            <w:proofErr w:type="spellStart"/>
-            <w:r>
-              <w:rPr>
-                <w:sz w:val="20"/>
-                <w:szCs w:val="20"/>
-              </w:rPr>
-              <w:t>TurnText</w:t>
-            </w:r>
-            <w:proofErr w:type="spellEnd"/>
-            <w:r>
-              <w:rPr>
-                <w:sz w:val="20"/>
-                <w:szCs w:val="20"/>
-              </w:rPr>
-              <w:t xml:space="preserve"> updates correctly when squares are clicked and on game start. TC_TTT_008 passed.</w:t>
+              <w:t>Created public functions in WBP_GameUI: SetTurnText(Player), ShowGameOver(Winner), ResetDisplay(). Each function encapsulates widget element updates, keeping internal variables private. Implemented UpdateTurnDisplay in BP_TicTacToeGameMode, wiring it to call SetTurnText on the GameUI variable. Verified TurnText updates correctly when squares are clicked and on game start. TC_TTT_008 passed.</w:t>
             </w:r>
           </w:p>
         </w:tc>
@@ -3183,55 +1964,7 @@
                 <w:sz w:val="20"/>
                 <w:szCs w:val="20"/>
               </w:rPr>
-              <w:t>Text element in UMG was a simple Text widget rather than Text Block, causing Set Text node to be unavailable initially. Resolved by dragging off the variable pin directly rather than searching from empty graph space. Widget variables (</w:t>
-            </w:r>
-            <w:proofErr w:type="spellStart"/>
-            <w:r>
-              <w:rPr>
-                <w:sz w:val="20"/>
-                <w:szCs w:val="20"/>
-              </w:rPr>
-              <w:t>TurnText</w:t>
-            </w:r>
-            <w:proofErr w:type="spellEnd"/>
-            <w:r>
-              <w:rPr>
-                <w:sz w:val="20"/>
-                <w:szCs w:val="20"/>
-              </w:rPr>
-              <w:t xml:space="preserve">, </w:t>
-            </w:r>
-            <w:proofErr w:type="spellStart"/>
-            <w:r>
-              <w:rPr>
-                <w:sz w:val="20"/>
-                <w:szCs w:val="20"/>
-              </w:rPr>
-              <w:t>ResultText</w:t>
-            </w:r>
-            <w:proofErr w:type="spellEnd"/>
-            <w:r>
-              <w:rPr>
-                <w:sz w:val="20"/>
-                <w:szCs w:val="20"/>
-              </w:rPr>
-              <w:t xml:space="preserve">, </w:t>
-            </w:r>
-            <w:proofErr w:type="spellStart"/>
-            <w:r>
-              <w:rPr>
-                <w:sz w:val="20"/>
-                <w:szCs w:val="20"/>
-              </w:rPr>
-              <w:t>RestartButton</w:t>
-            </w:r>
-            <w:proofErr w:type="spellEnd"/>
-            <w:r>
-              <w:rPr>
-                <w:sz w:val="20"/>
-                <w:szCs w:val="20"/>
-              </w:rPr>
-              <w:t>) needed to be accessed via public functions rather than direct variable access from outside the widget.</w:t>
+              <w:t>Text element in UMG was a simple Text widget rather than Text Block, causing Set Text node to be unavailable initially. Resolved by dragging off the variable pin directly rather than searching from empty graph space. Widget variables (TurnText, ResultText, RestartButton) needed to be accessed via public functions rather than direct variable access from outside the widget.</w:t>
             </w:r>
           </w:p>
         </w:tc>
@@ -3297,183 +2030,7 @@
                 <w:sz w:val="20"/>
                 <w:szCs w:val="20"/>
               </w:rPr>
-              <w:t xml:space="preserve">Completed UI system. Implemented </w:t>
-            </w:r>
-            <w:proofErr w:type="spellStart"/>
-            <w:r>
-              <w:rPr>
-                <w:sz w:val="20"/>
-                <w:szCs w:val="20"/>
-              </w:rPr>
-              <w:t>ShowGameOver</w:t>
-            </w:r>
-            <w:proofErr w:type="spellEnd"/>
-            <w:r>
-              <w:rPr>
-                <w:sz w:val="20"/>
-                <w:szCs w:val="20"/>
-              </w:rPr>
-              <w:t xml:space="preserve"> and ResetDisplay functions in </w:t>
-            </w:r>
-            <w:proofErr w:type="spellStart"/>
-            <w:r>
-              <w:rPr>
-                <w:sz w:val="20"/>
-                <w:szCs w:val="20"/>
-              </w:rPr>
-              <w:t>WBP_GameUI</w:t>
-            </w:r>
-            <w:proofErr w:type="spellEnd"/>
-            <w:r>
-              <w:rPr>
-                <w:sz w:val="20"/>
-                <w:szCs w:val="20"/>
-              </w:rPr>
-              <w:t xml:space="preserve">. Wired </w:t>
-            </w:r>
-            <w:proofErr w:type="spellStart"/>
-            <w:r>
-              <w:rPr>
-                <w:sz w:val="20"/>
-                <w:szCs w:val="20"/>
-              </w:rPr>
-              <w:t>UpdateGameOverDisplay</w:t>
-            </w:r>
-            <w:proofErr w:type="spellEnd"/>
-            <w:r>
-              <w:rPr>
-                <w:sz w:val="20"/>
-                <w:szCs w:val="20"/>
-              </w:rPr>
-              <w:t xml:space="preserve"> and </w:t>
-            </w:r>
-            <w:proofErr w:type="spellStart"/>
-            <w:r>
-              <w:rPr>
-                <w:sz w:val="20"/>
-                <w:szCs w:val="20"/>
-              </w:rPr>
-              <w:t>UpdateRestartDisplay</w:t>
-            </w:r>
-            <w:proofErr w:type="spellEnd"/>
-            <w:r>
-              <w:rPr>
-                <w:sz w:val="20"/>
-                <w:szCs w:val="20"/>
-              </w:rPr>
-              <w:t xml:space="preserve"> events in </w:t>
-            </w:r>
-            <w:proofErr w:type="spellStart"/>
-            <w:r>
-              <w:rPr>
-                <w:sz w:val="20"/>
-                <w:szCs w:val="20"/>
-              </w:rPr>
-              <w:t>BP_TicTacToeGameMode</w:t>
-            </w:r>
-            <w:proofErr w:type="spellEnd"/>
-            <w:r>
-              <w:rPr>
-                <w:sz w:val="20"/>
-                <w:szCs w:val="20"/>
-              </w:rPr>
-              <w:t xml:space="preserve">. Added </w:t>
-            </w:r>
-            <w:proofErr w:type="spellStart"/>
-            <w:r>
-              <w:rPr>
-                <w:sz w:val="20"/>
-                <w:szCs w:val="20"/>
-              </w:rPr>
-              <w:t>RestartButton</w:t>
-            </w:r>
-            <w:proofErr w:type="spellEnd"/>
-            <w:r>
-              <w:rPr>
-                <w:sz w:val="20"/>
-                <w:szCs w:val="20"/>
-              </w:rPr>
-              <w:t xml:space="preserve"> </w:t>
-            </w:r>
-            <w:proofErr w:type="spellStart"/>
-            <w:r>
-              <w:rPr>
-                <w:sz w:val="20"/>
-                <w:szCs w:val="20"/>
-              </w:rPr>
-              <w:t>OnClicked</w:t>
-            </w:r>
-            <w:proofErr w:type="spellEnd"/>
-            <w:r>
-              <w:rPr>
-                <w:sz w:val="20"/>
-                <w:szCs w:val="20"/>
-              </w:rPr>
-              <w:t xml:space="preserve"> calling </w:t>
-            </w:r>
-            <w:proofErr w:type="spellStart"/>
-            <w:r>
-              <w:rPr>
-                <w:sz w:val="20"/>
-                <w:szCs w:val="20"/>
-              </w:rPr>
-              <w:t>RestartGame</w:t>
-            </w:r>
-            <w:proofErr w:type="spellEnd"/>
-            <w:r>
-              <w:rPr>
-                <w:sz w:val="20"/>
-                <w:szCs w:val="20"/>
-              </w:rPr>
-              <w:t xml:space="preserve">. Renamed </w:t>
-            </w:r>
-            <w:proofErr w:type="spellStart"/>
-            <w:r>
-              <w:rPr>
-                <w:sz w:val="20"/>
-                <w:szCs w:val="20"/>
-              </w:rPr>
-              <w:t>SetTurnText</w:t>
-            </w:r>
-            <w:proofErr w:type="spellEnd"/>
-            <w:r>
-              <w:rPr>
-                <w:sz w:val="20"/>
-                <w:szCs w:val="20"/>
-              </w:rPr>
-              <w:t xml:space="preserve"> to </w:t>
-            </w:r>
-            <w:proofErr w:type="spellStart"/>
-            <w:r>
-              <w:rPr>
-                <w:sz w:val="20"/>
-                <w:szCs w:val="20"/>
-              </w:rPr>
-              <w:t>SetTurnTextCurrentPlayer</w:t>
-            </w:r>
-            <w:proofErr w:type="spellEnd"/>
-            <w:r>
-              <w:rPr>
-                <w:sz w:val="20"/>
-                <w:szCs w:val="20"/>
-              </w:rPr>
-              <w:t xml:space="preserve"> and added </w:t>
-            </w:r>
-            <w:proofErr w:type="spellStart"/>
-            <w:r>
-              <w:rPr>
-                <w:sz w:val="20"/>
-                <w:szCs w:val="20"/>
-              </w:rPr>
-              <w:t>SetTurnTextRestartGame</w:t>
-            </w:r>
-            <w:proofErr w:type="spellEnd"/>
-            <w:r>
-              <w:rPr>
-                <w:sz w:val="20"/>
-                <w:szCs w:val="20"/>
-              </w:rPr>
-              <w:t xml:space="preserve"> showing "Another Round?" on game over. Full end to end game loop tested.</w:t>
+              <w:t>Completed UI system. Implemented ShowGameOver and ResetDisplay functions in WBP_GameUI. Wired UpdateGameOverDisplay and UpdateRestartDisplay events in BP_TicTacToeGameMode. Added RestartButton OnClicked calling RestartGame. Renamed SetTurnText to SetTurnTextCurrentPlayer and added SetTurnTextRestartGame showing "Another Round?" on game over. Full end to end game loop tested.</w:t>
             </w:r>
           </w:p>
         </w:tc>
@@ -3540,8 +2097,108 @@
                 <w:sz w:val="20"/>
                 <w:szCs w:val="20"/>
               </w:rPr>
+              <w:t>03/08/26</w:t>
+            </w:r>
+          </w:p>
+        </w:tc>
+        <w:tc>
+          <w:tcPr>
+            <w:tcW w:w="4692" w:type="dxa"/>
+            <w:tcBorders>
+              <w:top w:val="single" w:sz="1" w:space="0" w:color="CCCCCC"/>
+              <w:left w:val="single" w:sz="1" w:space="0" w:color="CCCCCC"/>
+              <w:bottom w:val="single" w:sz="1" w:space="0" w:color="CCCCCC"/>
+              <w:right w:val="single" w:sz="1" w:space="0" w:color="CCCCCC"/>
+            </w:tcBorders>
+            <w:shd w:val="clear" w:color="auto" w:fill="DAE9F7" w:themeFill="text2" w:themeFillTint="1A"/>
+            <w:tcMar>
+              <w:top w:w="80" w:type="dxa"/>
+              <w:left w:w="120" w:type="dxa"/>
+              <w:bottom w:w="80" w:type="dxa"/>
+              <w:right w:w="120" w:type="dxa"/>
+            </w:tcMar>
+          </w:tcPr>
+          <w:p>
+            <w:pPr>
+              <w:rPr>
+                <w:sz w:val="20"/>
+                <w:szCs w:val="20"/>
+              </w:rPr>
+            </w:pPr>
+            <w:r>
+              <w:rPr>
+                <w:sz w:val="20"/>
+                <w:szCs w:val="20"/>
+              </w:rPr>
+              <w:t>Refactored UI text update logic into a reusable SetTextAndColour function in WBP_GameUI, taking a string, text widget reference, and colour as parameters. Applied across ShowGameOver, SetTurnTextCurrentPlayer, and SetTurnTextRestartGame to eliminate duplicated nodes.</w:t>
+            </w:r>
+          </w:p>
+        </w:tc>
+        <w:tc>
+          <w:tcPr>
+            <w:tcW w:w="2942" w:type="dxa"/>
+            <w:tcBorders>
+              <w:top w:val="single" w:sz="1" w:space="0" w:color="CCCCCC"/>
+              <w:left w:val="single" w:sz="1" w:space="0" w:color="CCCCCC"/>
+              <w:bottom w:val="single" w:sz="1" w:space="0" w:color="CCCCCC"/>
+              <w:right w:val="single" w:sz="1" w:space="0" w:color="CCCCCC"/>
+            </w:tcBorders>
+            <w:shd w:val="clear" w:color="auto" w:fill="DAE9F7" w:themeFill="text2" w:themeFillTint="1A"/>
+            <w:tcMar>
+              <w:top w:w="80" w:type="dxa"/>
+              <w:left w:w="120" w:type="dxa"/>
+              <w:bottom w:w="80" w:type="dxa"/>
+              <w:right w:w="120" w:type="dxa"/>
+            </w:tcMar>
+          </w:tcPr>
+          <w:p>
+            <w:pPr>
+              <w:rPr>
+                <w:sz w:val="20"/>
+                <w:szCs w:val="20"/>
+              </w:rPr>
+            </w:pPr>
+            <w:r>
+              <w:rPr>
+                <w:sz w:val="20"/>
+                <w:szCs w:val="20"/>
+              </w:rPr>
+              <w:t>No bugs introduced by refactor. All UI behaviour unchanged.</w:t>
+            </w:r>
+          </w:p>
+        </w:tc>
+      </w:tr>
+      <w:tr>
+        <w:tc>
+          <w:tcPr>
+            <w:tcW w:w="1392" w:type="dxa"/>
+            <w:tcBorders>
+              <w:top w:val="single" w:sz="1" w:space="0" w:color="CCCCCC"/>
+              <w:left w:val="single" w:sz="1" w:space="0" w:color="CCCCCC"/>
+              <w:bottom w:val="single" w:sz="1" w:space="0" w:color="CCCCCC"/>
+              <w:right w:val="single" w:sz="1" w:space="0" w:color="CCCCCC"/>
+            </w:tcBorders>
+            <w:tcMar>
+              <w:top w:w="80" w:type="dxa"/>
+              <w:left w:w="120" w:type="dxa"/>
+              <w:bottom w:w="80" w:type="dxa"/>
+              <w:right w:w="120" w:type="dxa"/>
+            </w:tcMar>
+          </w:tcPr>
+          <w:p>
+            <w:pPr>
+              <w:rPr>
+                <w:sz w:val="20"/>
+                <w:szCs w:val="20"/>
+              </w:rPr>
+            </w:pPr>
+            <w:r>
+              <w:rPr>
+                <w:sz w:val="20"/>
+                <w:szCs w:val="20"/>
+              </w:rPr>
               <w:lastRenderedPageBreak/>
-              <w:t>03/08/26</w:t>
+              <w:t>6/08/26</w:t>
             </w:r>
           </w:p>
         </w:tc>
@@ -3554,6 +2211,72 @@
               <w:bottom w:val="single" w:sz="1" w:space="0" w:color="CCCCCC"/>
               <w:right w:val="single" w:sz="1" w:space="0" w:color="CCCCCC"/>
             </w:tcBorders>
+            <w:tcMar>
+              <w:top w:w="80" w:type="dxa"/>
+              <w:left w:w="120" w:type="dxa"/>
+              <w:bottom w:w="80" w:type="dxa"/>
+              <w:right w:w="120" w:type="dxa"/>
+            </w:tcMar>
+          </w:tcPr>
+          <w:p>
+            <w:pPr>
+              <w:rPr>
+                <w:sz w:val="20"/>
+                <w:szCs w:val="20"/>
+              </w:rPr>
+            </w:pPr>
+            <w:r>
+              <w:rPr>
+                <w:sz w:val="20"/>
+                <w:szCs w:val="20"/>
+              </w:rPr>
+              <w:t>Added score tracking system to TicTacToeGameMode. Implemented PlayerOneScore and PlayerTwoScore as BlueprintReadOnly int32 variables. Added UpdatePlayersScore(winner), ResetPlayerScores(), and DetermineStartingPlayer() functions. Score increments correctly on win, unchanged on draw. Implemented UpdateScoreDisplay BlueprintImplementableEvent to update UI on score change.</w:t>
+            </w:r>
+          </w:p>
+        </w:tc>
+        <w:tc>
+          <w:tcPr>
+            <w:tcW w:w="2942" w:type="dxa"/>
+            <w:tcBorders>
+              <w:top w:val="single" w:sz="1" w:space="0" w:color="CCCCCC"/>
+              <w:left w:val="single" w:sz="1" w:space="0" w:color="CCCCCC"/>
+              <w:bottom w:val="single" w:sz="1" w:space="0" w:color="CCCCCC"/>
+              <w:right w:val="single" w:sz="1" w:space="0" w:color="CCCCCC"/>
+            </w:tcBorders>
+            <w:tcMar>
+              <w:top w:w="80" w:type="dxa"/>
+              <w:left w:w="120" w:type="dxa"/>
+              <w:bottom w:w="80" w:type="dxa"/>
+              <w:right w:w="120" w:type="dxa"/>
+            </w:tcMar>
+          </w:tcPr>
+          <w:p>
+            <w:pPr>
+              <w:rPr>
+                <w:sz w:val="20"/>
+                <w:szCs w:val="20"/>
+              </w:rPr>
+            </w:pPr>
+            <w:r>
+              <w:rPr>
+                <w:sz w:val="20"/>
+                <w:szCs w:val="20"/>
+              </w:rPr>
+              <w:t>n/a</w:t>
+            </w:r>
+          </w:p>
+        </w:tc>
+      </w:tr>
+      <w:tr>
+        <w:tc>
+          <w:tcPr>
+            <w:tcW w:w="1392" w:type="dxa"/>
+            <w:tcBorders>
+              <w:top w:val="single" w:sz="1" w:space="0" w:color="CCCCCC"/>
+              <w:left w:val="single" w:sz="1" w:space="0" w:color="CCCCCC"/>
+              <w:bottom w:val="single" w:sz="1" w:space="0" w:color="CCCCCC"/>
+              <w:right w:val="single" w:sz="1" w:space="0" w:color="CCCCCC"/>
+            </w:tcBorders>
             <w:shd w:val="clear" w:color="auto" w:fill="DAE9F7" w:themeFill="text2" w:themeFillTint="1A"/>
             <w:tcMar>
               <w:top w:w="80" w:type="dxa"/>
@@ -3574,87 +2297,40 @@
                 <w:sz w:val="20"/>
                 <w:szCs w:val="20"/>
               </w:rPr>
-              <w:t xml:space="preserve">Refactored UI text update logic into a reusable </w:t>
-            </w:r>
-            <w:proofErr w:type="spellStart"/>
-            <w:r>
-              <w:rPr>
-                <w:sz w:val="20"/>
-                <w:szCs w:val="20"/>
-              </w:rPr>
-              <w:t>SetTextAndColour</w:t>
-            </w:r>
-            <w:proofErr w:type="spellEnd"/>
-            <w:r>
-              <w:rPr>
-                <w:sz w:val="20"/>
-                <w:szCs w:val="20"/>
-              </w:rPr>
-              <w:t xml:space="preserve"> function in </w:t>
-            </w:r>
-            <w:proofErr w:type="spellStart"/>
-            <w:r>
-              <w:rPr>
-                <w:sz w:val="20"/>
-                <w:szCs w:val="20"/>
-              </w:rPr>
-              <w:t>WBP_GameUI</w:t>
-            </w:r>
-            <w:proofErr w:type="spellEnd"/>
-            <w:r>
-              <w:rPr>
-                <w:sz w:val="20"/>
-                <w:szCs w:val="20"/>
-              </w:rPr>
-              <w:t xml:space="preserve">, taking a string, text widget reference, and colour as parameters. Applied across </w:t>
-            </w:r>
-            <w:proofErr w:type="spellStart"/>
-            <w:r>
-              <w:rPr>
-                <w:sz w:val="20"/>
-                <w:szCs w:val="20"/>
-              </w:rPr>
-              <w:t>ShowGameOver</w:t>
-            </w:r>
-            <w:proofErr w:type="spellEnd"/>
-            <w:r>
-              <w:rPr>
-                <w:sz w:val="20"/>
-                <w:szCs w:val="20"/>
-              </w:rPr>
-              <w:t xml:space="preserve">, </w:t>
-            </w:r>
-            <w:proofErr w:type="spellStart"/>
-            <w:r>
-              <w:rPr>
-                <w:sz w:val="20"/>
-                <w:szCs w:val="20"/>
-              </w:rPr>
-              <w:t>SetTurnTextCurrentPlayer</w:t>
-            </w:r>
-            <w:proofErr w:type="spellEnd"/>
-            <w:r>
-              <w:rPr>
-                <w:sz w:val="20"/>
-                <w:szCs w:val="20"/>
-              </w:rPr>
-              <w:t xml:space="preserve">, and </w:t>
-            </w:r>
-            <w:proofErr w:type="spellStart"/>
-            <w:r>
-              <w:rPr>
-                <w:sz w:val="20"/>
-                <w:szCs w:val="20"/>
-              </w:rPr>
-              <w:t>SetTurnTextRestartGame</w:t>
-            </w:r>
-            <w:proofErr w:type="spellEnd"/>
-            <w:r>
-              <w:rPr>
-                <w:sz w:val="20"/>
-                <w:szCs w:val="20"/>
-              </w:rPr>
-              <w:t xml:space="preserve"> to eliminate duplicated nodes.</w:t>
+              <w:t>6/08/26</w:t>
+            </w:r>
+          </w:p>
+        </w:tc>
+        <w:tc>
+          <w:tcPr>
+            <w:tcW w:w="4692" w:type="dxa"/>
+            <w:tcBorders>
+              <w:top w:val="single" w:sz="1" w:space="0" w:color="CCCCCC"/>
+              <w:left w:val="single" w:sz="1" w:space="0" w:color="CCCCCC"/>
+              <w:bottom w:val="single" w:sz="1" w:space="0" w:color="CCCCCC"/>
+              <w:right w:val="single" w:sz="1" w:space="0" w:color="CCCCCC"/>
+            </w:tcBorders>
+            <w:shd w:val="clear" w:color="auto" w:fill="DAE9F7" w:themeFill="text2" w:themeFillTint="1A"/>
+            <w:tcMar>
+              <w:top w:w="80" w:type="dxa"/>
+              <w:left w:w="120" w:type="dxa"/>
+              <w:bottom w:w="80" w:type="dxa"/>
+              <w:right w:w="120" w:type="dxa"/>
+            </w:tcMar>
+          </w:tcPr>
+          <w:p>
+            <w:pPr>
+              <w:rPr>
+                <w:sz w:val="20"/>
+                <w:szCs w:val="20"/>
+              </w:rPr>
+            </w:pPr>
+            <w:r>
+              <w:rPr>
+                <w:sz w:val="20"/>
+                <w:szCs w:val="20"/>
+              </w:rPr>
+              <w:t>Implemented alternating starting player logic. Loser of previous round goes first next round. Draw or first round uses FMath::RandRange(1,2) for random starting player. DetermineStartingPlayer() called inside InitialiseGrid(). Fixed RestartGame() passing DetermineStartingPlayer() twice — simplified to pass CurrentPlayer since InitialiseGrid already sets it correctly.</w:t>
             </w:r>
           </w:p>
         </w:tc>
@@ -3687,7 +2363,7 @@
                 <w:sz w:val="20"/>
                 <w:szCs w:val="20"/>
               </w:rPr>
-              <w:t>No bugs introduced by refactor. All UI behaviour unchanged.</w:t>
+              <w:t>TurnText showing 0 on game start instead of correct starting player. Root cause identified as Super::BeginPlay() triggering Blueprint BeginPlay before InitialiseGrid() had run. Fixed by moving Winner = 0 and InitialiseGrid() to before Super::BeginPlay() in C++ BeginPlay, ensuring CurrentPlayer is correctly set before Blueprint reads it. Delay node removed from Blueprint BeginPlay.</w:t>
             </w:r>
           </w:p>
         </w:tc>
@@ -3721,7 +2397,7 @@
                 <w:sz w:val="20"/>
                 <w:szCs w:val="20"/>
               </w:rPr>
-              <w:t>6/08/26</w:t>
+              <w:t>16/08/26</w:t>
             </w:r>
           </w:p>
         </w:tc>
@@ -3753,151 +2429,7 @@
                 <w:sz w:val="20"/>
                 <w:szCs w:val="20"/>
               </w:rPr>
-              <w:t xml:space="preserve">Added score tracking system to </w:t>
-            </w:r>
-            <w:proofErr w:type="spellStart"/>
-            <w:r>
-              <w:rPr>
-                <w:sz w:val="20"/>
-                <w:szCs w:val="20"/>
-              </w:rPr>
-              <w:t>TicTacToeGameMode</w:t>
-            </w:r>
-            <w:proofErr w:type="spellEnd"/>
-            <w:r>
-              <w:rPr>
-                <w:sz w:val="20"/>
-                <w:szCs w:val="20"/>
-              </w:rPr>
-              <w:t xml:space="preserve">. Implemented </w:t>
-            </w:r>
-            <w:proofErr w:type="spellStart"/>
-            <w:r>
-              <w:rPr>
-                <w:sz w:val="20"/>
-                <w:szCs w:val="20"/>
-              </w:rPr>
-              <w:t>PlayerOneScore</w:t>
-            </w:r>
-            <w:proofErr w:type="spellEnd"/>
-            <w:r>
-              <w:rPr>
-                <w:sz w:val="20"/>
-                <w:szCs w:val="20"/>
-              </w:rPr>
-              <w:t xml:space="preserve"> and </w:t>
-            </w:r>
-            <w:proofErr w:type="spellStart"/>
-            <w:r>
-              <w:rPr>
-                <w:sz w:val="20"/>
-                <w:szCs w:val="20"/>
-              </w:rPr>
-              <w:t>PlayerTwoScore</w:t>
-            </w:r>
-            <w:proofErr w:type="spellEnd"/>
-            <w:r>
-              <w:rPr>
-                <w:sz w:val="20"/>
-                <w:szCs w:val="20"/>
-              </w:rPr>
-              <w:t xml:space="preserve"> as </w:t>
-            </w:r>
-            <w:proofErr w:type="spellStart"/>
-            <w:r>
-              <w:rPr>
-                <w:sz w:val="20"/>
-                <w:szCs w:val="20"/>
-              </w:rPr>
-              <w:t>BlueprintReadOnly</w:t>
-            </w:r>
-            <w:proofErr w:type="spellEnd"/>
-            <w:r>
-              <w:rPr>
-                <w:sz w:val="20"/>
-                <w:szCs w:val="20"/>
-              </w:rPr>
-              <w:t xml:space="preserve"> int32 variables. Added </w:t>
-            </w:r>
-            <w:proofErr w:type="spellStart"/>
-            <w:r>
-              <w:rPr>
-                <w:sz w:val="20"/>
-                <w:szCs w:val="20"/>
-              </w:rPr>
-              <w:t>UpdatePlayersScore</w:t>
-            </w:r>
-            <w:proofErr w:type="spellEnd"/>
-            <w:r>
-              <w:rPr>
-                <w:sz w:val="20"/>
-                <w:szCs w:val="20"/>
-              </w:rPr>
-              <w:t xml:space="preserve">(winner), </w:t>
-            </w:r>
-            <w:proofErr w:type="spellStart"/>
-            <w:r>
-              <w:rPr>
-                <w:sz w:val="20"/>
-                <w:szCs w:val="20"/>
-              </w:rPr>
-              <w:t>ResetPlayerScores</w:t>
-            </w:r>
-            <w:proofErr w:type="spellEnd"/>
-            <w:r>
-              <w:rPr>
-                <w:sz w:val="20"/>
-                <w:szCs w:val="20"/>
-              </w:rPr>
-              <w:t xml:space="preserve">(), and </w:t>
-            </w:r>
-            <w:proofErr w:type="spellStart"/>
-            <w:r>
-              <w:rPr>
-                <w:sz w:val="20"/>
-                <w:szCs w:val="20"/>
-              </w:rPr>
-              <w:t>DetermineStartingPlayer</w:t>
-            </w:r>
-            <w:proofErr w:type="spellEnd"/>
-            <w:r>
-              <w:rPr>
-                <w:sz w:val="20"/>
-                <w:szCs w:val="20"/>
-              </w:rPr>
-              <w:t xml:space="preserve">() functions. Score increments correctly on win, unchanged on draw. Implemented </w:t>
-            </w:r>
-            <w:proofErr w:type="spellStart"/>
-            <w:r>
-              <w:rPr>
-                <w:sz w:val="20"/>
-                <w:szCs w:val="20"/>
-              </w:rPr>
-              <w:t>UpdateScoreDisplay</w:t>
-            </w:r>
-            <w:proofErr w:type="spellEnd"/>
-            <w:r>
-              <w:rPr>
-                <w:sz w:val="20"/>
-                <w:szCs w:val="20"/>
-              </w:rPr>
-              <w:t xml:space="preserve"> </w:t>
-            </w:r>
-            <w:proofErr w:type="spellStart"/>
-            <w:r>
-              <w:rPr>
-                <w:sz w:val="20"/>
-                <w:szCs w:val="20"/>
-              </w:rPr>
-              <w:t>BlueprintImplementableEvent</w:t>
-            </w:r>
-            <w:proofErr w:type="spellEnd"/>
-            <w:r>
-              <w:rPr>
-                <w:sz w:val="20"/>
-                <w:szCs w:val="20"/>
-              </w:rPr>
-              <w:t xml:space="preserve"> to update UI on score change.</w:t>
+              <w:t>Created three new C++ classes as part of architecture refactor: UTTTGameInstance (inheriting UGameInstance), ATTTGameStateBase (inheriting AGameStateBase), and ATTTPlayerState (inheriting APlayerState). Added EGameModeChoice enum to TTTGameInstance with TwoPlayer and VsAI options. TTTGameInstance stores PlayerOneName, PlayerTwoName, SeriesLength and GameModeChoice. TTTGameStateBase stores PlayerOneScore and PlayerTwoScore with UpdateScore(PlayerNumber) and ResetPlayerScores() functions. TTTPlayerState stores DisplayName with SetName() function</w:t>
             </w:r>
           </w:p>
         </w:tc>
@@ -3964,7 +2496,7 @@
                 <w:sz w:val="20"/>
                 <w:szCs w:val="20"/>
               </w:rPr>
-              <w:t>6/08/26</w:t>
+              <w:t>16/08/26</w:t>
             </w:r>
           </w:p>
         </w:tc>
@@ -3997,135 +2529,7 @@
                 <w:sz w:val="20"/>
                 <w:szCs w:val="20"/>
               </w:rPr>
-              <w:t xml:space="preserve">Implemented alternating starting player logic. Loser of previous round goes first next round. Draw or first round uses </w:t>
-            </w:r>
-            <w:proofErr w:type="spellStart"/>
-            <w:r>
-              <w:rPr>
-                <w:sz w:val="20"/>
-                <w:szCs w:val="20"/>
-              </w:rPr>
-              <w:t>FMath</w:t>
-            </w:r>
-            <w:proofErr w:type="spellEnd"/>
-            <w:r>
-              <w:rPr>
-                <w:sz w:val="20"/>
-                <w:szCs w:val="20"/>
-              </w:rPr>
-              <w:t>::</w:t>
-            </w:r>
-            <w:proofErr w:type="spellStart"/>
-            <w:r>
-              <w:rPr>
-                <w:sz w:val="20"/>
-                <w:szCs w:val="20"/>
-              </w:rPr>
-              <w:t>RandRange</w:t>
-            </w:r>
-            <w:proofErr w:type="spellEnd"/>
-            <w:r>
-              <w:rPr>
-                <w:sz w:val="20"/>
-                <w:szCs w:val="20"/>
-              </w:rPr>
-              <w:t xml:space="preserve">(1,2) for random starting player. </w:t>
-            </w:r>
-            <w:proofErr w:type="spellStart"/>
-            <w:r>
-              <w:rPr>
-                <w:sz w:val="20"/>
-                <w:szCs w:val="20"/>
-              </w:rPr>
-              <w:t>DetermineStartingPlayer</w:t>
-            </w:r>
-            <w:proofErr w:type="spellEnd"/>
-            <w:r>
-              <w:rPr>
-                <w:sz w:val="20"/>
-                <w:szCs w:val="20"/>
-              </w:rPr>
-              <w:t xml:space="preserve">() called inside </w:t>
-            </w:r>
-            <w:proofErr w:type="spellStart"/>
-            <w:r>
-              <w:rPr>
-                <w:sz w:val="20"/>
-                <w:szCs w:val="20"/>
-              </w:rPr>
-              <w:t>InitialiseGrid</w:t>
-            </w:r>
-            <w:proofErr w:type="spellEnd"/>
-            <w:r>
-              <w:rPr>
-                <w:sz w:val="20"/>
-                <w:szCs w:val="20"/>
-              </w:rPr>
-              <w:t xml:space="preserve">(). Fixed </w:t>
-            </w:r>
-            <w:proofErr w:type="spellStart"/>
-            <w:r>
-              <w:rPr>
-                <w:sz w:val="20"/>
-                <w:szCs w:val="20"/>
-              </w:rPr>
-              <w:t>RestartGame</w:t>
-            </w:r>
-            <w:proofErr w:type="spellEnd"/>
-            <w:r>
-              <w:rPr>
-                <w:sz w:val="20"/>
-                <w:szCs w:val="20"/>
-              </w:rPr>
-              <w:t xml:space="preserve">() passing </w:t>
-            </w:r>
-            <w:proofErr w:type="spellStart"/>
-            <w:r>
-              <w:rPr>
-                <w:sz w:val="20"/>
-                <w:szCs w:val="20"/>
-              </w:rPr>
-              <w:t>DetermineStartingPlayer</w:t>
-            </w:r>
-            <w:proofErr w:type="spellEnd"/>
-            <w:r>
-              <w:rPr>
-                <w:sz w:val="20"/>
-                <w:szCs w:val="20"/>
-              </w:rPr>
-              <w:t xml:space="preserve">() twice — simplified to pass </w:t>
-            </w:r>
-            <w:proofErr w:type="spellStart"/>
-            <w:r>
-              <w:rPr>
-                <w:sz w:val="20"/>
-                <w:szCs w:val="20"/>
-              </w:rPr>
-              <w:t>CurrentPlayer</w:t>
-            </w:r>
-            <w:proofErr w:type="spellEnd"/>
-            <w:r>
-              <w:rPr>
-                <w:sz w:val="20"/>
-                <w:szCs w:val="20"/>
-              </w:rPr>
-              <w:t xml:space="preserve"> since </w:t>
-            </w:r>
-            <w:proofErr w:type="spellStart"/>
-            <w:r>
-              <w:rPr>
-                <w:sz w:val="20"/>
-                <w:szCs w:val="20"/>
-              </w:rPr>
-              <w:t>InitialiseGrid</w:t>
-            </w:r>
-            <w:proofErr w:type="spellEnd"/>
-            <w:r>
-              <w:rPr>
-                <w:sz w:val="20"/>
-                <w:szCs w:val="20"/>
-              </w:rPr>
-              <w:t xml:space="preserve"> already sets it correctly.</w:t>
+              <w:t>Refactored score logic out of TicTacToeGameMode into TTTGameStateBase. Removed PlayerOneScore, PlayerTwoScore, UpdatePlayersScore() and ResetPlayerScores() from GameMode. Added TTTGameState cached pointer to GameMode, populated via SetGameState() called after Super::BeginPlay(). Updated UpdatePlayersScore() to call TTTGameState-&gt;UpdateScore(winner) and pass scores directly to UpdateScoreDisplay BlueprintImplementableEvent. Updated UpdateScoreDisplay signature to take P1Score and P2Score as parameters.</w:t>
             </w:r>
           </w:p>
         </w:tc>
@@ -4153,149 +2557,111 @@
                 <w:szCs w:val="20"/>
               </w:rPr>
             </w:pPr>
-            <w:proofErr w:type="spellStart"/>
-            <w:r>
-              <w:rPr>
-                <w:sz w:val="20"/>
-                <w:szCs w:val="20"/>
-              </w:rPr>
-              <w:t>TurnText</w:t>
-            </w:r>
-            <w:proofErr w:type="spellEnd"/>
-            <w:r>
-              <w:rPr>
-                <w:sz w:val="20"/>
-                <w:szCs w:val="20"/>
-              </w:rPr>
-              <w:t xml:space="preserve"> showing 0 on game start instead of correct starting player. Root cause identified as Super::</w:t>
-            </w:r>
-            <w:proofErr w:type="spellStart"/>
-            <w:r>
-              <w:rPr>
-                <w:sz w:val="20"/>
-                <w:szCs w:val="20"/>
-              </w:rPr>
-              <w:t>BeginPlay</w:t>
-            </w:r>
-            <w:proofErr w:type="spellEnd"/>
-            <w:r>
-              <w:rPr>
-                <w:sz w:val="20"/>
-                <w:szCs w:val="20"/>
-              </w:rPr>
-              <w:t xml:space="preserve">() triggering Blueprint </w:t>
-            </w:r>
-            <w:proofErr w:type="spellStart"/>
-            <w:r>
-              <w:rPr>
-                <w:sz w:val="20"/>
-                <w:szCs w:val="20"/>
-              </w:rPr>
-              <w:t>BeginPlay</w:t>
-            </w:r>
-            <w:proofErr w:type="spellEnd"/>
-            <w:r>
-              <w:rPr>
-                <w:sz w:val="20"/>
-                <w:szCs w:val="20"/>
-              </w:rPr>
-              <w:t xml:space="preserve"> before </w:t>
-            </w:r>
-            <w:proofErr w:type="spellStart"/>
-            <w:r>
-              <w:rPr>
-                <w:sz w:val="20"/>
-                <w:szCs w:val="20"/>
-              </w:rPr>
-              <w:t>InitialiseGrid</w:t>
-            </w:r>
-            <w:proofErr w:type="spellEnd"/>
-            <w:r>
-              <w:rPr>
-                <w:sz w:val="20"/>
-                <w:szCs w:val="20"/>
-              </w:rPr>
-              <w:t xml:space="preserve">() had run. Fixed by moving Winner = 0 and </w:t>
-            </w:r>
-            <w:proofErr w:type="spellStart"/>
-            <w:r>
-              <w:rPr>
-                <w:sz w:val="20"/>
-                <w:szCs w:val="20"/>
-              </w:rPr>
-              <w:t>InitialiseGrid</w:t>
-            </w:r>
-            <w:proofErr w:type="spellEnd"/>
-            <w:r>
-              <w:rPr>
-                <w:sz w:val="20"/>
-                <w:szCs w:val="20"/>
-              </w:rPr>
-              <w:t>() to before Super::</w:t>
-            </w:r>
-            <w:proofErr w:type="spellStart"/>
-            <w:r>
-              <w:rPr>
-                <w:sz w:val="20"/>
-                <w:szCs w:val="20"/>
-              </w:rPr>
-              <w:t>BeginPlay</w:t>
-            </w:r>
-            <w:proofErr w:type="spellEnd"/>
-            <w:r>
-              <w:rPr>
-                <w:sz w:val="20"/>
-                <w:szCs w:val="20"/>
-              </w:rPr>
-              <w:t xml:space="preserve">() in C++ </w:t>
-            </w:r>
-            <w:proofErr w:type="spellStart"/>
-            <w:r>
-              <w:rPr>
-                <w:sz w:val="20"/>
-                <w:szCs w:val="20"/>
-              </w:rPr>
-              <w:t>BeginPlay</w:t>
-            </w:r>
-            <w:proofErr w:type="spellEnd"/>
-            <w:r>
-              <w:rPr>
-                <w:sz w:val="20"/>
-                <w:szCs w:val="20"/>
-              </w:rPr>
-              <w:t xml:space="preserve">, ensuring </w:t>
-            </w:r>
-            <w:proofErr w:type="spellStart"/>
-            <w:r>
-              <w:rPr>
-                <w:sz w:val="20"/>
-                <w:szCs w:val="20"/>
-              </w:rPr>
-              <w:t>CurrentPlayer</w:t>
-            </w:r>
-            <w:proofErr w:type="spellEnd"/>
-            <w:r>
-              <w:rPr>
-                <w:sz w:val="20"/>
-                <w:szCs w:val="20"/>
-              </w:rPr>
-              <w:t xml:space="preserve"> is correctly set before Blueprint reads it. Delay node removed from Blueprint </w:t>
-            </w:r>
-            <w:proofErr w:type="spellStart"/>
-            <w:r>
-              <w:rPr>
-                <w:sz w:val="20"/>
-                <w:szCs w:val="20"/>
-              </w:rPr>
-              <w:t>BeginPlay</w:t>
-            </w:r>
-            <w:proofErr w:type="spellEnd"/>
-            <w:r>
-              <w:rPr>
-                <w:sz w:val="20"/>
-                <w:szCs w:val="20"/>
-              </w:rPr>
-              <w:t>.</w:t>
+            <w:r>
+              <w:rPr>
+                <w:sz w:val="20"/>
+                <w:szCs w:val="20"/>
+              </w:rPr>
+              <w:t>Unreal crash on game over — EXCEPTION_ACCESS_VIOLATION in ATTTGameStateBase::UpdateScore(). Root cause: SetGameState() was implemented but never called in BeginPlay, leaving TTTGameState as null. Fixed by adding SetGameState() call after Super::BeginPlay(). BP_TicTacToeGameMode Game State Class and Player State Class settings reset to defaults after recompile — manually reassigned TTTGameStateBase and TTTPlayerState in Class Defaults. Noted as recurring issue to check after significant compiles.</w:t>
+            </w:r>
+          </w:p>
+        </w:tc>
+      </w:tr>
+      <w:tr>
+        <w:tc>
+          <w:tcPr>
+            <w:tcW w:w="1392" w:type="dxa"/>
+            <w:tcBorders>
+              <w:top w:val="single" w:sz="1" w:space="0" w:color="CCCCCC"/>
+              <w:left w:val="single" w:sz="1" w:space="0" w:color="CCCCCC"/>
+              <w:bottom w:val="single" w:sz="1" w:space="0" w:color="CCCCCC"/>
+              <w:right w:val="single" w:sz="1" w:space="0" w:color="CCCCCC"/>
+            </w:tcBorders>
+            <w:tcMar>
+              <w:top w:w="80" w:type="dxa"/>
+              <w:left w:w="120" w:type="dxa"/>
+              <w:bottom w:w="80" w:type="dxa"/>
+              <w:right w:w="120" w:type="dxa"/>
+            </w:tcMar>
+          </w:tcPr>
+          <w:p>
+            <w:pPr>
+              <w:rPr>
+                <w:sz w:val="20"/>
+                <w:szCs w:val="20"/>
+              </w:rPr>
+            </w:pPr>
+            <w:r>
+              <w:rPr>
+                <w:sz w:val="20"/>
+                <w:szCs w:val="20"/>
+              </w:rPr>
+              <w:lastRenderedPageBreak/>
+              <w:t>16/08/26</w:t>
+            </w:r>
+          </w:p>
+        </w:tc>
+        <w:tc>
+          <w:tcPr>
+            <w:tcW w:w="4692" w:type="dxa"/>
+            <w:tcBorders>
+              <w:top w:val="single" w:sz="1" w:space="0" w:color="CCCCCC"/>
+              <w:left w:val="single" w:sz="1" w:space="0" w:color="CCCCCC"/>
+              <w:bottom w:val="single" w:sz="1" w:space="0" w:color="CCCCCC"/>
+              <w:right w:val="single" w:sz="1" w:space="0" w:color="CCCCCC"/>
+            </w:tcBorders>
+            <w:tcMar>
+              <w:top w:w="80" w:type="dxa"/>
+              <w:left w:w="120" w:type="dxa"/>
+              <w:bottom w:w="80" w:type="dxa"/>
+              <w:right w:w="120" w:type="dxa"/>
+            </w:tcMar>
+          </w:tcPr>
+          <w:p>
+            <w:pPr>
+              <w:rPr>
+                <w:sz w:val="20"/>
+                <w:szCs w:val="20"/>
+              </w:rPr>
+            </w:pPr>
+            <w:r>
+              <w:rPr>
+                <w:sz w:val="20"/>
+                <w:szCs w:val="20"/>
+              </w:rPr>
+              <w:t>Added UTTTGameInstance cached pointer to GameMode, populated via SetGameInstance() called before Super::BeginPlay() since GameInstance exists for the entire application lifetime. Added UPROPERTY() to both TTTGameState and TTTGameInstance cached pointers to prevent Unreal garbage collector destroying objects while pointers still held references. Registered TTTGameInstance as Game Instance Class in Project Settings Maps and Modes.</w:t>
+            </w:r>
+          </w:p>
+        </w:tc>
+        <w:tc>
+          <w:tcPr>
+            <w:tcW w:w="2942" w:type="dxa"/>
+            <w:tcBorders>
+              <w:top w:val="single" w:sz="1" w:space="0" w:color="CCCCCC"/>
+              <w:left w:val="single" w:sz="1" w:space="0" w:color="CCCCCC"/>
+              <w:bottom w:val="single" w:sz="1" w:space="0" w:color="CCCCCC"/>
+              <w:right w:val="single" w:sz="1" w:space="0" w:color="CCCCCC"/>
+            </w:tcBorders>
+            <w:tcMar>
+              <w:top w:w="80" w:type="dxa"/>
+              <w:left w:w="120" w:type="dxa"/>
+              <w:bottom w:w="80" w:type="dxa"/>
+              <w:right w:w="120" w:type="dxa"/>
+            </w:tcMar>
+          </w:tcPr>
+          <w:p>
+            <w:pPr>
+              <w:rPr>
+                <w:sz w:val="20"/>
+                <w:szCs w:val="20"/>
+              </w:rPr>
+            </w:pPr>
+            <w:r>
+              <w:rPr>
+                <w:sz w:val="20"/>
+                <w:szCs w:val="20"/>
+              </w:rPr>
+              <w:t>n/a</w:t>
             </w:r>
           </w:p>
         </w:tc>
@@ -4436,7 +2802,6 @@
         <w:spacing w:after="120"/>
       </w:pPr>
       <w:r>
-        <w:lastRenderedPageBreak/>
         <w:t>A test case FAILS if any deviation is observed, however minor, and a corresponding bug report must be raised.</w:t>
       </w:r>
     </w:p>
@@ -4505,12 +2870,6 @@
         <w:gridCol w:w="6826"/>
       </w:tblGrid>
       <w:tr>
-        <w:tblPrEx>
-          <w:tblCellMar>
-            <w:top w:w="0" w:type="dxa"/>
-            <w:bottom w:w="0" w:type="dxa"/>
-          </w:tblCellMar>
-        </w:tblPrEx>
         <w:tc>
           <w:tcPr>
             <w:tcW w:w="2200" w:type="dxa"/>
@@ -4573,12 +2932,6 @@
         </w:tc>
       </w:tr>
       <w:tr>
-        <w:tblPrEx>
-          <w:tblCellMar>
-            <w:top w:w="0" w:type="dxa"/>
-            <w:bottom w:w="0" w:type="dxa"/>
-          </w:tblCellMar>
-        </w:tblPrEx>
         <w:tc>
           <w:tcPr>
             <w:tcW w:w="2200" w:type="dxa"/>
@@ -4635,12 +2988,6 @@
         </w:tc>
       </w:tr>
       <w:tr>
-        <w:tblPrEx>
-          <w:tblCellMar>
-            <w:top w:w="0" w:type="dxa"/>
-            <w:bottom w:w="0" w:type="dxa"/>
-          </w:tblCellMar>
-        </w:tblPrEx>
         <w:tc>
           <w:tcPr>
             <w:tcW w:w="2200" w:type="dxa"/>
@@ -4697,12 +3044,6 @@
         </w:tc>
       </w:tr>
       <w:tr>
-        <w:tblPrEx>
-          <w:tblCellMar>
-            <w:top w:w="0" w:type="dxa"/>
-            <w:bottom w:w="0" w:type="dxa"/>
-          </w:tblCellMar>
-        </w:tblPrEx>
         <w:tc>
           <w:tcPr>
             <w:tcW w:w="2200" w:type="dxa"/>
@@ -4759,12 +3100,6 @@
         </w:tc>
       </w:tr>
       <w:tr>
-        <w:tblPrEx>
-          <w:tblCellMar>
-            <w:top w:w="0" w:type="dxa"/>
-            <w:bottom w:w="0" w:type="dxa"/>
-          </w:tblCellMar>
-        </w:tblPrEx>
         <w:tc>
           <w:tcPr>
             <w:tcW w:w="2200" w:type="dxa"/>
@@ -4821,12 +3156,6 @@
         </w:tc>
       </w:tr>
       <w:tr>
-        <w:tblPrEx>
-          <w:tblCellMar>
-            <w:top w:w="0" w:type="dxa"/>
-            <w:bottom w:w="0" w:type="dxa"/>
-          </w:tblCellMar>
-        </w:tblPrEx>
         <w:tc>
           <w:tcPr>
             <w:tcW w:w="2200" w:type="dxa"/>
@@ -4883,12 +3212,6 @@
         </w:tc>
       </w:tr>
       <w:tr>
-        <w:tblPrEx>
-          <w:tblCellMar>
-            <w:top w:w="0" w:type="dxa"/>
-            <w:bottom w:w="0" w:type="dxa"/>
-          </w:tblCellMar>
-        </w:tblPrEx>
         <w:tc>
           <w:tcPr>
             <w:tcW w:w="2200" w:type="dxa"/>
@@ -4945,12 +3268,6 @@
         </w:tc>
       </w:tr>
       <w:tr>
-        <w:tblPrEx>
-          <w:tblCellMar>
-            <w:top w:w="0" w:type="dxa"/>
-            <w:bottom w:w="0" w:type="dxa"/>
-          </w:tblCellMar>
-        </w:tblPrEx>
         <w:tc>
           <w:tcPr>
             <w:tcW w:w="2200" w:type="dxa"/>
@@ -5007,12 +3324,6 @@
         </w:tc>
       </w:tr>
       <w:tr>
-        <w:tblPrEx>
-          <w:tblCellMar>
-            <w:top w:w="0" w:type="dxa"/>
-            <w:bottom w:w="0" w:type="dxa"/>
-          </w:tblCellMar>
-        </w:tblPrEx>
         <w:tc>
           <w:tcPr>
             <w:tcW w:w="2200" w:type="dxa"/>
@@ -5069,12 +3380,6 @@
         </w:tc>
       </w:tr>
       <w:tr>
-        <w:tblPrEx>
-          <w:tblCellMar>
-            <w:top w:w="0" w:type="dxa"/>
-            <w:bottom w:w="0" w:type="dxa"/>
-          </w:tblCellMar>
-        </w:tblPrEx>
         <w:tc>
           <w:tcPr>
             <w:tcW w:w="2200" w:type="dxa"/>
@@ -5165,12 +3470,6 @@
         <w:gridCol w:w="6826"/>
       </w:tblGrid>
       <w:tr>
-        <w:tblPrEx>
-          <w:tblCellMar>
-            <w:top w:w="0" w:type="dxa"/>
-            <w:bottom w:w="0" w:type="dxa"/>
-          </w:tblCellMar>
-        </w:tblPrEx>
         <w:tc>
           <w:tcPr>
             <w:tcW w:w="2200" w:type="dxa"/>
@@ -5233,12 +3532,6 @@
         </w:tc>
       </w:tr>
       <w:tr>
-        <w:tblPrEx>
-          <w:tblCellMar>
-            <w:top w:w="0" w:type="dxa"/>
-            <w:bottom w:w="0" w:type="dxa"/>
-          </w:tblCellMar>
-        </w:tblPrEx>
         <w:tc>
           <w:tcPr>
             <w:tcW w:w="2200" w:type="dxa"/>
@@ -5295,12 +3588,6 @@
         </w:tc>
       </w:tr>
       <w:tr>
-        <w:tblPrEx>
-          <w:tblCellMar>
-            <w:top w:w="0" w:type="dxa"/>
-            <w:bottom w:w="0" w:type="dxa"/>
-          </w:tblCellMar>
-        </w:tblPrEx>
         <w:tc>
           <w:tcPr>
             <w:tcW w:w="2200" w:type="dxa"/>
@@ -5357,12 +3644,6 @@
         </w:tc>
       </w:tr>
       <w:tr>
-        <w:tblPrEx>
-          <w:tblCellMar>
-            <w:top w:w="0" w:type="dxa"/>
-            <w:bottom w:w="0" w:type="dxa"/>
-          </w:tblCellMar>
-        </w:tblPrEx>
         <w:tc>
           <w:tcPr>
             <w:tcW w:w="2200" w:type="dxa"/>
@@ -5419,12 +3700,6 @@
         </w:tc>
       </w:tr>
       <w:tr>
-        <w:tblPrEx>
-          <w:tblCellMar>
-            <w:top w:w="0" w:type="dxa"/>
-            <w:bottom w:w="0" w:type="dxa"/>
-          </w:tblCellMar>
-        </w:tblPrEx>
         <w:tc>
           <w:tcPr>
             <w:tcW w:w="2200" w:type="dxa"/>
@@ -5481,12 +3756,6 @@
         </w:tc>
       </w:tr>
       <w:tr>
-        <w:tblPrEx>
-          <w:tblCellMar>
-            <w:top w:w="0" w:type="dxa"/>
-            <w:bottom w:w="0" w:type="dxa"/>
-          </w:tblCellMar>
-        </w:tblPrEx>
         <w:tc>
           <w:tcPr>
             <w:tcW w:w="2200" w:type="dxa"/>
@@ -5543,12 +3812,6 @@
         </w:tc>
       </w:tr>
       <w:tr>
-        <w:tblPrEx>
-          <w:tblCellMar>
-            <w:top w:w="0" w:type="dxa"/>
-            <w:bottom w:w="0" w:type="dxa"/>
-          </w:tblCellMar>
-        </w:tblPrEx>
         <w:tc>
           <w:tcPr>
             <w:tcW w:w="2200" w:type="dxa"/>
@@ -5605,12 +3868,6 @@
         </w:tc>
       </w:tr>
       <w:tr>
-        <w:tblPrEx>
-          <w:tblCellMar>
-            <w:top w:w="0" w:type="dxa"/>
-            <w:bottom w:w="0" w:type="dxa"/>
-          </w:tblCellMar>
-        </w:tblPrEx>
         <w:tc>
           <w:tcPr>
             <w:tcW w:w="2200" w:type="dxa"/>
@@ -5667,12 +3924,6 @@
         </w:tc>
       </w:tr>
       <w:tr>
-        <w:tblPrEx>
-          <w:tblCellMar>
-            <w:top w:w="0" w:type="dxa"/>
-            <w:bottom w:w="0" w:type="dxa"/>
-          </w:tblCellMar>
-        </w:tblPrEx>
         <w:tc>
           <w:tcPr>
             <w:tcW w:w="2200" w:type="dxa"/>
@@ -5729,12 +3980,6 @@
         </w:tc>
       </w:tr>
       <w:tr>
-        <w:tblPrEx>
-          <w:tblCellMar>
-            <w:top w:w="0" w:type="dxa"/>
-            <w:bottom w:w="0" w:type="dxa"/>
-          </w:tblCellMar>
-        </w:tblPrEx>
         <w:tc>
           <w:tcPr>
             <w:tcW w:w="2200" w:type="dxa"/>
@@ -5825,12 +4070,6 @@
         <w:gridCol w:w="6826"/>
       </w:tblGrid>
       <w:tr>
-        <w:tblPrEx>
-          <w:tblCellMar>
-            <w:top w:w="0" w:type="dxa"/>
-            <w:bottom w:w="0" w:type="dxa"/>
-          </w:tblCellMar>
-        </w:tblPrEx>
         <w:tc>
           <w:tcPr>
             <w:tcW w:w="2200" w:type="dxa"/>
@@ -5893,12 +4132,6 @@
         </w:tc>
       </w:tr>
       <w:tr>
-        <w:tblPrEx>
-          <w:tblCellMar>
-            <w:top w:w="0" w:type="dxa"/>
-            <w:bottom w:w="0" w:type="dxa"/>
-          </w:tblCellMar>
-        </w:tblPrEx>
         <w:tc>
           <w:tcPr>
             <w:tcW w:w="2200" w:type="dxa"/>
@@ -5955,12 +4188,6 @@
         </w:tc>
       </w:tr>
       <w:tr>
-        <w:tblPrEx>
-          <w:tblCellMar>
-            <w:top w:w="0" w:type="dxa"/>
-            <w:bottom w:w="0" w:type="dxa"/>
-          </w:tblCellMar>
-        </w:tblPrEx>
         <w:tc>
           <w:tcPr>
             <w:tcW w:w="2200" w:type="dxa"/>
@@ -6017,12 +4244,6 @@
         </w:tc>
       </w:tr>
       <w:tr>
-        <w:tblPrEx>
-          <w:tblCellMar>
-            <w:top w:w="0" w:type="dxa"/>
-            <w:bottom w:w="0" w:type="dxa"/>
-          </w:tblCellMar>
-        </w:tblPrEx>
         <w:tc>
           <w:tcPr>
             <w:tcW w:w="2200" w:type="dxa"/>
@@ -6079,12 +4300,6 @@
         </w:tc>
       </w:tr>
       <w:tr>
-        <w:tblPrEx>
-          <w:tblCellMar>
-            <w:top w:w="0" w:type="dxa"/>
-            <w:bottom w:w="0" w:type="dxa"/>
-          </w:tblCellMar>
-        </w:tblPrEx>
         <w:tc>
           <w:tcPr>
             <w:tcW w:w="2200" w:type="dxa"/>
@@ -6141,12 +4356,6 @@
         </w:tc>
       </w:tr>
       <w:tr>
-        <w:tblPrEx>
-          <w:tblCellMar>
-            <w:top w:w="0" w:type="dxa"/>
-            <w:bottom w:w="0" w:type="dxa"/>
-          </w:tblCellMar>
-        </w:tblPrEx>
         <w:tc>
           <w:tcPr>
             <w:tcW w:w="2200" w:type="dxa"/>
@@ -6204,12 +4413,6 @@
         </w:tc>
       </w:tr>
       <w:tr>
-        <w:tblPrEx>
-          <w:tblCellMar>
-            <w:top w:w="0" w:type="dxa"/>
-            <w:bottom w:w="0" w:type="dxa"/>
-          </w:tblCellMar>
-        </w:tblPrEx>
         <w:tc>
           <w:tcPr>
             <w:tcW w:w="2200" w:type="dxa"/>
@@ -6266,12 +4469,6 @@
         </w:tc>
       </w:tr>
       <w:tr>
-        <w:tblPrEx>
-          <w:tblCellMar>
-            <w:top w:w="0" w:type="dxa"/>
-            <w:bottom w:w="0" w:type="dxa"/>
-          </w:tblCellMar>
-        </w:tblPrEx>
         <w:tc>
           <w:tcPr>
             <w:tcW w:w="2200" w:type="dxa"/>
@@ -6328,12 +4525,6 @@
         </w:tc>
       </w:tr>
       <w:tr>
-        <w:tblPrEx>
-          <w:tblCellMar>
-            <w:top w:w="0" w:type="dxa"/>
-            <w:bottom w:w="0" w:type="dxa"/>
-          </w:tblCellMar>
-        </w:tblPrEx>
         <w:tc>
           <w:tcPr>
             <w:tcW w:w="2200" w:type="dxa"/>
@@ -6390,12 +4581,6 @@
         </w:tc>
       </w:tr>
       <w:tr>
-        <w:tblPrEx>
-          <w:tblCellMar>
-            <w:top w:w="0" w:type="dxa"/>
-            <w:bottom w:w="0" w:type="dxa"/>
-          </w:tblCellMar>
-        </w:tblPrEx>
         <w:tc>
           <w:tcPr>
             <w:tcW w:w="2200" w:type="dxa"/>
@@ -6486,12 +4671,6 @@
         <w:gridCol w:w="6826"/>
       </w:tblGrid>
       <w:tr>
-        <w:tblPrEx>
-          <w:tblCellMar>
-            <w:top w:w="0" w:type="dxa"/>
-            <w:bottom w:w="0" w:type="dxa"/>
-          </w:tblCellMar>
-        </w:tblPrEx>
         <w:tc>
           <w:tcPr>
             <w:tcW w:w="2200" w:type="dxa"/>
@@ -6554,12 +4733,6 @@
         </w:tc>
       </w:tr>
       <w:tr>
-        <w:tblPrEx>
-          <w:tblCellMar>
-            <w:top w:w="0" w:type="dxa"/>
-            <w:bottom w:w="0" w:type="dxa"/>
-          </w:tblCellMar>
-        </w:tblPrEx>
         <w:tc>
           <w:tcPr>
             <w:tcW w:w="2200" w:type="dxa"/>
@@ -6616,12 +4789,6 @@
         </w:tc>
       </w:tr>
       <w:tr>
-        <w:tblPrEx>
-          <w:tblCellMar>
-            <w:top w:w="0" w:type="dxa"/>
-            <w:bottom w:w="0" w:type="dxa"/>
-          </w:tblCellMar>
-        </w:tblPrEx>
         <w:tc>
           <w:tcPr>
             <w:tcW w:w="2200" w:type="dxa"/>
@@ -6678,12 +4845,6 @@
         </w:tc>
       </w:tr>
       <w:tr>
-        <w:tblPrEx>
-          <w:tblCellMar>
-            <w:top w:w="0" w:type="dxa"/>
-            <w:bottom w:w="0" w:type="dxa"/>
-          </w:tblCellMar>
-        </w:tblPrEx>
         <w:tc>
           <w:tcPr>
             <w:tcW w:w="2200" w:type="dxa"/>
@@ -6740,12 +4901,6 @@
         </w:tc>
       </w:tr>
       <w:tr>
-        <w:tblPrEx>
-          <w:tblCellMar>
-            <w:top w:w="0" w:type="dxa"/>
-            <w:bottom w:w="0" w:type="dxa"/>
-          </w:tblCellMar>
-        </w:tblPrEx>
         <w:tc>
           <w:tcPr>
             <w:tcW w:w="2200" w:type="dxa"/>
@@ -6802,12 +4957,6 @@
         </w:tc>
       </w:tr>
       <w:tr>
-        <w:tblPrEx>
-          <w:tblCellMar>
-            <w:top w:w="0" w:type="dxa"/>
-            <w:bottom w:w="0" w:type="dxa"/>
-          </w:tblCellMar>
-        </w:tblPrEx>
         <w:tc>
           <w:tcPr>
             <w:tcW w:w="2200" w:type="dxa"/>
@@ -6864,12 +5013,6 @@
         </w:tc>
       </w:tr>
       <w:tr>
-        <w:tblPrEx>
-          <w:tblCellMar>
-            <w:top w:w="0" w:type="dxa"/>
-            <w:bottom w:w="0" w:type="dxa"/>
-          </w:tblCellMar>
-        </w:tblPrEx>
         <w:tc>
           <w:tcPr>
             <w:tcW w:w="2200" w:type="dxa"/>
@@ -6926,12 +5069,6 @@
         </w:tc>
       </w:tr>
       <w:tr>
-        <w:tblPrEx>
-          <w:tblCellMar>
-            <w:top w:w="0" w:type="dxa"/>
-            <w:bottom w:w="0" w:type="dxa"/>
-          </w:tblCellMar>
-        </w:tblPrEx>
         <w:tc>
           <w:tcPr>
             <w:tcW w:w="2200" w:type="dxa"/>
@@ -6988,12 +5125,6 @@
         </w:tc>
       </w:tr>
       <w:tr>
-        <w:tblPrEx>
-          <w:tblCellMar>
-            <w:top w:w="0" w:type="dxa"/>
-            <w:bottom w:w="0" w:type="dxa"/>
-          </w:tblCellMar>
-        </w:tblPrEx>
         <w:tc>
           <w:tcPr>
             <w:tcW w:w="2200" w:type="dxa"/>
@@ -7050,12 +5181,6 @@
         </w:tc>
       </w:tr>
       <w:tr>
-        <w:tblPrEx>
-          <w:tblCellMar>
-            <w:top w:w="0" w:type="dxa"/>
-            <w:bottom w:w="0" w:type="dxa"/>
-          </w:tblCellMar>
-        </w:tblPrEx>
         <w:tc>
           <w:tcPr>
             <w:tcW w:w="2200" w:type="dxa"/>
@@ -7146,12 +5271,6 @@
         <w:gridCol w:w="6826"/>
       </w:tblGrid>
       <w:tr>
-        <w:tblPrEx>
-          <w:tblCellMar>
-            <w:top w:w="0" w:type="dxa"/>
-            <w:bottom w:w="0" w:type="dxa"/>
-          </w:tblCellMar>
-        </w:tblPrEx>
         <w:tc>
           <w:tcPr>
             <w:tcW w:w="2200" w:type="dxa"/>
@@ -7214,12 +5333,6 @@
         </w:tc>
       </w:tr>
       <w:tr>
-        <w:tblPrEx>
-          <w:tblCellMar>
-            <w:top w:w="0" w:type="dxa"/>
-            <w:bottom w:w="0" w:type="dxa"/>
-          </w:tblCellMar>
-        </w:tblPrEx>
         <w:tc>
           <w:tcPr>
             <w:tcW w:w="2200" w:type="dxa"/>
@@ -7276,12 +5389,6 @@
         </w:tc>
       </w:tr>
       <w:tr>
-        <w:tblPrEx>
-          <w:tblCellMar>
-            <w:top w:w="0" w:type="dxa"/>
-            <w:bottom w:w="0" w:type="dxa"/>
-          </w:tblCellMar>
-        </w:tblPrEx>
         <w:tc>
           <w:tcPr>
             <w:tcW w:w="2200" w:type="dxa"/>
@@ -7338,12 +5445,6 @@
         </w:tc>
       </w:tr>
       <w:tr>
-        <w:tblPrEx>
-          <w:tblCellMar>
-            <w:top w:w="0" w:type="dxa"/>
-            <w:bottom w:w="0" w:type="dxa"/>
-          </w:tblCellMar>
-        </w:tblPrEx>
         <w:tc>
           <w:tcPr>
             <w:tcW w:w="2200" w:type="dxa"/>
@@ -7400,12 +5501,6 @@
         </w:tc>
       </w:tr>
       <w:tr>
-        <w:tblPrEx>
-          <w:tblCellMar>
-            <w:top w:w="0" w:type="dxa"/>
-            <w:bottom w:w="0" w:type="dxa"/>
-          </w:tblCellMar>
-        </w:tblPrEx>
         <w:tc>
           <w:tcPr>
             <w:tcW w:w="2200" w:type="dxa"/>
@@ -7462,12 +5557,6 @@
         </w:tc>
       </w:tr>
       <w:tr>
-        <w:tblPrEx>
-          <w:tblCellMar>
-            <w:top w:w="0" w:type="dxa"/>
-            <w:bottom w:w="0" w:type="dxa"/>
-          </w:tblCellMar>
-        </w:tblPrEx>
         <w:tc>
           <w:tcPr>
             <w:tcW w:w="2200" w:type="dxa"/>
@@ -7524,12 +5613,6 @@
         </w:tc>
       </w:tr>
       <w:tr>
-        <w:tblPrEx>
-          <w:tblCellMar>
-            <w:top w:w="0" w:type="dxa"/>
-            <w:bottom w:w="0" w:type="dxa"/>
-          </w:tblCellMar>
-        </w:tblPrEx>
         <w:tc>
           <w:tcPr>
             <w:tcW w:w="2200" w:type="dxa"/>
@@ -7586,12 +5669,6 @@
         </w:tc>
       </w:tr>
       <w:tr>
-        <w:tblPrEx>
-          <w:tblCellMar>
-            <w:top w:w="0" w:type="dxa"/>
-            <w:bottom w:w="0" w:type="dxa"/>
-          </w:tblCellMar>
-        </w:tblPrEx>
         <w:tc>
           <w:tcPr>
             <w:tcW w:w="2200" w:type="dxa"/>
@@ -7648,12 +5725,6 @@
         </w:tc>
       </w:tr>
       <w:tr>
-        <w:tblPrEx>
-          <w:tblCellMar>
-            <w:top w:w="0" w:type="dxa"/>
-            <w:bottom w:w="0" w:type="dxa"/>
-          </w:tblCellMar>
-        </w:tblPrEx>
         <w:tc>
           <w:tcPr>
             <w:tcW w:w="2200" w:type="dxa"/>
@@ -7710,12 +5781,6 @@
         </w:tc>
       </w:tr>
       <w:tr>
-        <w:tblPrEx>
-          <w:tblCellMar>
-            <w:top w:w="0" w:type="dxa"/>
-            <w:bottom w:w="0" w:type="dxa"/>
-          </w:tblCellMar>
-        </w:tblPrEx>
         <w:tc>
           <w:tcPr>
             <w:tcW w:w="2200" w:type="dxa"/>
@@ -7806,12 +5871,6 @@
         <w:gridCol w:w="6826"/>
       </w:tblGrid>
       <w:tr>
-        <w:tblPrEx>
-          <w:tblCellMar>
-            <w:top w:w="0" w:type="dxa"/>
-            <w:bottom w:w="0" w:type="dxa"/>
-          </w:tblCellMar>
-        </w:tblPrEx>
         <w:tc>
           <w:tcPr>
             <w:tcW w:w="2200" w:type="dxa"/>
@@ -7874,12 +5933,6 @@
         </w:tc>
       </w:tr>
       <w:tr>
-        <w:tblPrEx>
-          <w:tblCellMar>
-            <w:top w:w="0" w:type="dxa"/>
-            <w:bottom w:w="0" w:type="dxa"/>
-          </w:tblCellMar>
-        </w:tblPrEx>
         <w:tc>
           <w:tcPr>
             <w:tcW w:w="2200" w:type="dxa"/>
@@ -7937,12 +5990,6 @@
         </w:tc>
       </w:tr>
       <w:tr>
-        <w:tblPrEx>
-          <w:tblCellMar>
-            <w:top w:w="0" w:type="dxa"/>
-            <w:bottom w:w="0" w:type="dxa"/>
-          </w:tblCellMar>
-        </w:tblPrEx>
         <w:tc>
           <w:tcPr>
             <w:tcW w:w="2200" w:type="dxa"/>
@@ -7999,12 +6046,6 @@
         </w:tc>
       </w:tr>
       <w:tr>
-        <w:tblPrEx>
-          <w:tblCellMar>
-            <w:top w:w="0" w:type="dxa"/>
-            <w:bottom w:w="0" w:type="dxa"/>
-          </w:tblCellMar>
-        </w:tblPrEx>
         <w:tc>
           <w:tcPr>
             <w:tcW w:w="2200" w:type="dxa"/>
@@ -8061,12 +6102,6 @@
         </w:tc>
       </w:tr>
       <w:tr>
-        <w:tblPrEx>
-          <w:tblCellMar>
-            <w:top w:w="0" w:type="dxa"/>
-            <w:bottom w:w="0" w:type="dxa"/>
-          </w:tblCellMar>
-        </w:tblPrEx>
         <w:tc>
           <w:tcPr>
             <w:tcW w:w="2200" w:type="dxa"/>
@@ -8123,12 +6158,6 @@
         </w:tc>
       </w:tr>
       <w:tr>
-        <w:tblPrEx>
-          <w:tblCellMar>
-            <w:top w:w="0" w:type="dxa"/>
-            <w:bottom w:w="0" w:type="dxa"/>
-          </w:tblCellMar>
-        </w:tblPrEx>
         <w:tc>
           <w:tcPr>
             <w:tcW w:w="2200" w:type="dxa"/>
@@ -8185,12 +6214,6 @@
         </w:tc>
       </w:tr>
       <w:tr>
-        <w:tblPrEx>
-          <w:tblCellMar>
-            <w:top w:w="0" w:type="dxa"/>
-            <w:bottom w:w="0" w:type="dxa"/>
-          </w:tblCellMar>
-        </w:tblPrEx>
         <w:tc>
           <w:tcPr>
             <w:tcW w:w="2200" w:type="dxa"/>
@@ -8247,12 +6270,6 @@
         </w:tc>
       </w:tr>
       <w:tr>
-        <w:tblPrEx>
-          <w:tblCellMar>
-            <w:top w:w="0" w:type="dxa"/>
-            <w:bottom w:w="0" w:type="dxa"/>
-          </w:tblCellMar>
-        </w:tblPrEx>
         <w:tc>
           <w:tcPr>
             <w:tcW w:w="2200" w:type="dxa"/>
@@ -8309,12 +6326,6 @@
         </w:tc>
       </w:tr>
       <w:tr>
-        <w:tblPrEx>
-          <w:tblCellMar>
-            <w:top w:w="0" w:type="dxa"/>
-            <w:bottom w:w="0" w:type="dxa"/>
-          </w:tblCellMar>
-        </w:tblPrEx>
         <w:tc>
           <w:tcPr>
             <w:tcW w:w="2200" w:type="dxa"/>
@@ -8371,12 +6382,6 @@
         </w:tc>
       </w:tr>
       <w:tr>
-        <w:tblPrEx>
-          <w:tblCellMar>
-            <w:top w:w="0" w:type="dxa"/>
-            <w:bottom w:w="0" w:type="dxa"/>
-          </w:tblCellMar>
-        </w:tblPrEx>
         <w:tc>
           <w:tcPr>
             <w:tcW w:w="2200" w:type="dxa"/>
@@ -8467,12 +6472,6 @@
         <w:gridCol w:w="6826"/>
       </w:tblGrid>
       <w:tr>
-        <w:tblPrEx>
-          <w:tblCellMar>
-            <w:top w:w="0" w:type="dxa"/>
-            <w:bottom w:w="0" w:type="dxa"/>
-          </w:tblCellMar>
-        </w:tblPrEx>
         <w:tc>
           <w:tcPr>
             <w:tcW w:w="2200" w:type="dxa"/>
@@ -8535,12 +6534,6 @@
         </w:tc>
       </w:tr>
       <w:tr>
-        <w:tblPrEx>
-          <w:tblCellMar>
-            <w:top w:w="0" w:type="dxa"/>
-            <w:bottom w:w="0" w:type="dxa"/>
-          </w:tblCellMar>
-        </w:tblPrEx>
         <w:tc>
           <w:tcPr>
             <w:tcW w:w="2200" w:type="dxa"/>
@@ -8597,12 +6590,6 @@
         </w:tc>
       </w:tr>
       <w:tr>
-        <w:tblPrEx>
-          <w:tblCellMar>
-            <w:top w:w="0" w:type="dxa"/>
-            <w:bottom w:w="0" w:type="dxa"/>
-          </w:tblCellMar>
-        </w:tblPrEx>
         <w:tc>
           <w:tcPr>
             <w:tcW w:w="2200" w:type="dxa"/>
@@ -8659,12 +6646,6 @@
         </w:tc>
       </w:tr>
       <w:tr>
-        <w:tblPrEx>
-          <w:tblCellMar>
-            <w:top w:w="0" w:type="dxa"/>
-            <w:bottom w:w="0" w:type="dxa"/>
-          </w:tblCellMar>
-        </w:tblPrEx>
         <w:tc>
           <w:tcPr>
             <w:tcW w:w="2200" w:type="dxa"/>
@@ -8721,12 +6702,6 @@
         </w:tc>
       </w:tr>
       <w:tr>
-        <w:tblPrEx>
-          <w:tblCellMar>
-            <w:top w:w="0" w:type="dxa"/>
-            <w:bottom w:w="0" w:type="dxa"/>
-          </w:tblCellMar>
-        </w:tblPrEx>
         <w:tc>
           <w:tcPr>
             <w:tcW w:w="2200" w:type="dxa"/>
@@ -8783,12 +6758,6 @@
         </w:tc>
       </w:tr>
       <w:tr>
-        <w:tblPrEx>
-          <w:tblCellMar>
-            <w:top w:w="0" w:type="dxa"/>
-            <w:bottom w:w="0" w:type="dxa"/>
-          </w:tblCellMar>
-        </w:tblPrEx>
         <w:tc>
           <w:tcPr>
             <w:tcW w:w="2200" w:type="dxa"/>
@@ -8845,12 +6814,6 @@
         </w:tc>
       </w:tr>
       <w:tr>
-        <w:tblPrEx>
-          <w:tblCellMar>
-            <w:top w:w="0" w:type="dxa"/>
-            <w:bottom w:w="0" w:type="dxa"/>
-          </w:tblCellMar>
-        </w:tblPrEx>
         <w:tc>
           <w:tcPr>
             <w:tcW w:w="2200" w:type="dxa"/>
@@ -8907,12 +6870,6 @@
         </w:tc>
       </w:tr>
       <w:tr>
-        <w:tblPrEx>
-          <w:tblCellMar>
-            <w:top w:w="0" w:type="dxa"/>
-            <w:bottom w:w="0" w:type="dxa"/>
-          </w:tblCellMar>
-        </w:tblPrEx>
         <w:tc>
           <w:tcPr>
             <w:tcW w:w="2200" w:type="dxa"/>
@@ -8969,12 +6926,6 @@
         </w:tc>
       </w:tr>
       <w:tr>
-        <w:tblPrEx>
-          <w:tblCellMar>
-            <w:top w:w="0" w:type="dxa"/>
-            <w:bottom w:w="0" w:type="dxa"/>
-          </w:tblCellMar>
-        </w:tblPrEx>
         <w:tc>
           <w:tcPr>
             <w:tcW w:w="2200" w:type="dxa"/>
@@ -9031,12 +6982,6 @@
         </w:tc>
       </w:tr>
       <w:tr>
-        <w:tblPrEx>
-          <w:tblCellMar>
-            <w:top w:w="0" w:type="dxa"/>
-            <w:bottom w:w="0" w:type="dxa"/>
-          </w:tblCellMar>
-        </w:tblPrEx>
         <w:tc>
           <w:tcPr>
             <w:tcW w:w="2200" w:type="dxa"/>
@@ -9127,12 +7072,6 @@
         <w:gridCol w:w="6826"/>
       </w:tblGrid>
       <w:tr>
-        <w:tblPrEx>
-          <w:tblCellMar>
-            <w:top w:w="0" w:type="dxa"/>
-            <w:bottom w:w="0" w:type="dxa"/>
-          </w:tblCellMar>
-        </w:tblPrEx>
         <w:tc>
           <w:tcPr>
             <w:tcW w:w="2200" w:type="dxa"/>
@@ -9195,12 +7134,6 @@
         </w:tc>
       </w:tr>
       <w:tr>
-        <w:tblPrEx>
-          <w:tblCellMar>
-            <w:top w:w="0" w:type="dxa"/>
-            <w:bottom w:w="0" w:type="dxa"/>
-          </w:tblCellMar>
-        </w:tblPrEx>
         <w:tc>
           <w:tcPr>
             <w:tcW w:w="2200" w:type="dxa"/>
@@ -9257,12 +7190,6 @@
         </w:tc>
       </w:tr>
       <w:tr>
-        <w:tblPrEx>
-          <w:tblCellMar>
-            <w:top w:w="0" w:type="dxa"/>
-            <w:bottom w:w="0" w:type="dxa"/>
-          </w:tblCellMar>
-        </w:tblPrEx>
         <w:tc>
           <w:tcPr>
             <w:tcW w:w="2200" w:type="dxa"/>
@@ -9319,12 +7246,6 @@
         </w:tc>
       </w:tr>
       <w:tr>
-        <w:tblPrEx>
-          <w:tblCellMar>
-            <w:top w:w="0" w:type="dxa"/>
-            <w:bottom w:w="0" w:type="dxa"/>
-          </w:tblCellMar>
-        </w:tblPrEx>
         <w:tc>
           <w:tcPr>
             <w:tcW w:w="2200" w:type="dxa"/>
@@ -9381,12 +7302,6 @@
         </w:tc>
       </w:tr>
       <w:tr>
-        <w:tblPrEx>
-          <w:tblCellMar>
-            <w:top w:w="0" w:type="dxa"/>
-            <w:bottom w:w="0" w:type="dxa"/>
-          </w:tblCellMar>
-        </w:tblPrEx>
         <w:tc>
           <w:tcPr>
             <w:tcW w:w="2200" w:type="dxa"/>
@@ -9443,12 +7358,6 @@
         </w:tc>
       </w:tr>
       <w:tr>
-        <w:tblPrEx>
-          <w:tblCellMar>
-            <w:top w:w="0" w:type="dxa"/>
-            <w:bottom w:w="0" w:type="dxa"/>
-          </w:tblCellMar>
-        </w:tblPrEx>
         <w:tc>
           <w:tcPr>
             <w:tcW w:w="2200" w:type="dxa"/>
@@ -9505,12 +7414,6 @@
         </w:tc>
       </w:tr>
       <w:tr>
-        <w:tblPrEx>
-          <w:tblCellMar>
-            <w:top w:w="0" w:type="dxa"/>
-            <w:bottom w:w="0" w:type="dxa"/>
-          </w:tblCellMar>
-        </w:tblPrEx>
         <w:tc>
           <w:tcPr>
             <w:tcW w:w="2200" w:type="dxa"/>
@@ -9567,12 +7470,6 @@
         </w:tc>
       </w:tr>
       <w:tr>
-        <w:tblPrEx>
-          <w:tblCellMar>
-            <w:top w:w="0" w:type="dxa"/>
-            <w:bottom w:w="0" w:type="dxa"/>
-          </w:tblCellMar>
-        </w:tblPrEx>
         <w:tc>
           <w:tcPr>
             <w:tcW w:w="2200" w:type="dxa"/>
@@ -9629,12 +7526,6 @@
         </w:tc>
       </w:tr>
       <w:tr>
-        <w:tblPrEx>
-          <w:tblCellMar>
-            <w:top w:w="0" w:type="dxa"/>
-            <w:bottom w:w="0" w:type="dxa"/>
-          </w:tblCellMar>
-        </w:tblPrEx>
         <w:tc>
           <w:tcPr>
             <w:tcW w:w="2200" w:type="dxa"/>
@@ -9692,12 +7583,6 @@
         </w:tc>
       </w:tr>
       <w:tr>
-        <w:tblPrEx>
-          <w:tblCellMar>
-            <w:top w:w="0" w:type="dxa"/>
-            <w:bottom w:w="0" w:type="dxa"/>
-          </w:tblCellMar>
-        </w:tblPrEx>
         <w:tc>
           <w:tcPr>
             <w:tcW w:w="2200" w:type="dxa"/>
@@ -9788,12 +7673,6 @@
         <w:gridCol w:w="6826"/>
       </w:tblGrid>
       <w:tr>
-        <w:tblPrEx>
-          <w:tblCellMar>
-            <w:top w:w="0" w:type="dxa"/>
-            <w:bottom w:w="0" w:type="dxa"/>
-          </w:tblCellMar>
-        </w:tblPrEx>
         <w:tc>
           <w:tcPr>
             <w:tcW w:w="2200" w:type="dxa"/>
@@ -9856,12 +7735,6 @@
         </w:tc>
       </w:tr>
       <w:tr>
-        <w:tblPrEx>
-          <w:tblCellMar>
-            <w:top w:w="0" w:type="dxa"/>
-            <w:bottom w:w="0" w:type="dxa"/>
-          </w:tblCellMar>
-        </w:tblPrEx>
         <w:tc>
           <w:tcPr>
             <w:tcW w:w="2200" w:type="dxa"/>
@@ -9918,12 +7791,6 @@
         </w:tc>
       </w:tr>
       <w:tr>
-        <w:tblPrEx>
-          <w:tblCellMar>
-            <w:top w:w="0" w:type="dxa"/>
-            <w:bottom w:w="0" w:type="dxa"/>
-          </w:tblCellMar>
-        </w:tblPrEx>
         <w:tc>
           <w:tcPr>
             <w:tcW w:w="2200" w:type="dxa"/>
@@ -9980,12 +7847,6 @@
         </w:tc>
       </w:tr>
       <w:tr>
-        <w:tblPrEx>
-          <w:tblCellMar>
-            <w:top w:w="0" w:type="dxa"/>
-            <w:bottom w:w="0" w:type="dxa"/>
-          </w:tblCellMar>
-        </w:tblPrEx>
         <w:tc>
           <w:tcPr>
             <w:tcW w:w="2200" w:type="dxa"/>
@@ -10042,12 +7903,6 @@
         </w:tc>
       </w:tr>
       <w:tr>
-        <w:tblPrEx>
-          <w:tblCellMar>
-            <w:top w:w="0" w:type="dxa"/>
-            <w:bottom w:w="0" w:type="dxa"/>
-          </w:tblCellMar>
-        </w:tblPrEx>
         <w:tc>
           <w:tcPr>
             <w:tcW w:w="2200" w:type="dxa"/>
@@ -10104,12 +7959,6 @@
         </w:tc>
       </w:tr>
       <w:tr>
-        <w:tblPrEx>
-          <w:tblCellMar>
-            <w:top w:w="0" w:type="dxa"/>
-            <w:bottom w:w="0" w:type="dxa"/>
-          </w:tblCellMar>
-        </w:tblPrEx>
         <w:tc>
           <w:tcPr>
             <w:tcW w:w="2200" w:type="dxa"/>
@@ -10166,12 +8015,6 @@
         </w:tc>
       </w:tr>
       <w:tr>
-        <w:tblPrEx>
-          <w:tblCellMar>
-            <w:top w:w="0" w:type="dxa"/>
-            <w:bottom w:w="0" w:type="dxa"/>
-          </w:tblCellMar>
-        </w:tblPrEx>
         <w:tc>
           <w:tcPr>
             <w:tcW w:w="2200" w:type="dxa"/>
@@ -10228,12 +8071,6 @@
         </w:tc>
       </w:tr>
       <w:tr>
-        <w:tblPrEx>
-          <w:tblCellMar>
-            <w:top w:w="0" w:type="dxa"/>
-            <w:bottom w:w="0" w:type="dxa"/>
-          </w:tblCellMar>
-        </w:tblPrEx>
         <w:tc>
           <w:tcPr>
             <w:tcW w:w="2200" w:type="dxa"/>
@@ -10290,12 +8127,6 @@
         </w:tc>
       </w:tr>
       <w:tr>
-        <w:tblPrEx>
-          <w:tblCellMar>
-            <w:top w:w="0" w:type="dxa"/>
-            <w:bottom w:w="0" w:type="dxa"/>
-          </w:tblCellMar>
-        </w:tblPrEx>
         <w:tc>
           <w:tcPr>
             <w:tcW w:w="2200" w:type="dxa"/>
@@ -10352,12 +8183,6 @@
         </w:tc>
       </w:tr>
       <w:tr>
-        <w:tblPrEx>
-          <w:tblCellMar>
-            <w:top w:w="0" w:type="dxa"/>
-            <w:bottom w:w="0" w:type="dxa"/>
-          </w:tblCellMar>
-        </w:tblPrEx>
         <w:tc>
           <w:tcPr>
             <w:tcW w:w="2200" w:type="dxa"/>
@@ -10448,12 +8273,6 @@
         <w:gridCol w:w="6826"/>
       </w:tblGrid>
       <w:tr>
-        <w:tblPrEx>
-          <w:tblCellMar>
-            <w:top w:w="0" w:type="dxa"/>
-            <w:bottom w:w="0" w:type="dxa"/>
-          </w:tblCellMar>
-        </w:tblPrEx>
         <w:tc>
           <w:tcPr>
             <w:tcW w:w="2200" w:type="dxa"/>
@@ -10516,12 +8335,6 @@
         </w:tc>
       </w:tr>
       <w:tr>
-        <w:tblPrEx>
-          <w:tblCellMar>
-            <w:top w:w="0" w:type="dxa"/>
-            <w:bottom w:w="0" w:type="dxa"/>
-          </w:tblCellMar>
-        </w:tblPrEx>
         <w:tc>
           <w:tcPr>
             <w:tcW w:w="2200" w:type="dxa"/>
@@ -10578,12 +8391,6 @@
         </w:tc>
       </w:tr>
       <w:tr>
-        <w:tblPrEx>
-          <w:tblCellMar>
-            <w:top w:w="0" w:type="dxa"/>
-            <w:bottom w:w="0" w:type="dxa"/>
-          </w:tblCellMar>
-        </w:tblPrEx>
         <w:tc>
           <w:tcPr>
             <w:tcW w:w="2200" w:type="dxa"/>
@@ -10640,12 +8447,6 @@
         </w:tc>
       </w:tr>
       <w:tr>
-        <w:tblPrEx>
-          <w:tblCellMar>
-            <w:top w:w="0" w:type="dxa"/>
-            <w:bottom w:w="0" w:type="dxa"/>
-          </w:tblCellMar>
-        </w:tblPrEx>
         <w:tc>
           <w:tcPr>
             <w:tcW w:w="2200" w:type="dxa"/>
@@ -10702,12 +8503,6 @@
         </w:tc>
       </w:tr>
       <w:tr>
-        <w:tblPrEx>
-          <w:tblCellMar>
-            <w:top w:w="0" w:type="dxa"/>
-            <w:bottom w:w="0" w:type="dxa"/>
-          </w:tblCellMar>
-        </w:tblPrEx>
         <w:tc>
           <w:tcPr>
             <w:tcW w:w="2200" w:type="dxa"/>
@@ -10764,12 +8559,6 @@
         </w:tc>
       </w:tr>
       <w:tr>
-        <w:tblPrEx>
-          <w:tblCellMar>
-            <w:top w:w="0" w:type="dxa"/>
-            <w:bottom w:w="0" w:type="dxa"/>
-          </w:tblCellMar>
-        </w:tblPrEx>
         <w:tc>
           <w:tcPr>
             <w:tcW w:w="2200" w:type="dxa"/>
@@ -10826,12 +8615,6 @@
         </w:tc>
       </w:tr>
       <w:tr>
-        <w:tblPrEx>
-          <w:tblCellMar>
-            <w:top w:w="0" w:type="dxa"/>
-            <w:bottom w:w="0" w:type="dxa"/>
-          </w:tblCellMar>
-        </w:tblPrEx>
         <w:tc>
           <w:tcPr>
             <w:tcW w:w="2200" w:type="dxa"/>
@@ -10888,12 +8671,6 @@
         </w:tc>
       </w:tr>
       <w:tr>
-        <w:tblPrEx>
-          <w:tblCellMar>
-            <w:top w:w="0" w:type="dxa"/>
-            <w:bottom w:w="0" w:type="dxa"/>
-          </w:tblCellMar>
-        </w:tblPrEx>
         <w:tc>
           <w:tcPr>
             <w:tcW w:w="2200" w:type="dxa"/>
@@ -10950,12 +8727,6 @@
         </w:tc>
       </w:tr>
       <w:tr>
-        <w:tblPrEx>
-          <w:tblCellMar>
-            <w:top w:w="0" w:type="dxa"/>
-            <w:bottom w:w="0" w:type="dxa"/>
-          </w:tblCellMar>
-        </w:tblPrEx>
         <w:tc>
           <w:tcPr>
             <w:tcW w:w="2200" w:type="dxa"/>
@@ -11012,12 +8783,6 @@
         </w:tc>
       </w:tr>
       <w:tr>
-        <w:tblPrEx>
-          <w:tblCellMar>
-            <w:top w:w="0" w:type="dxa"/>
-            <w:bottom w:w="0" w:type="dxa"/>
-          </w:tblCellMar>
-        </w:tblPrEx>
         <w:tc>
           <w:tcPr>
             <w:tcW w:w="2200" w:type="dxa"/>
@@ -11108,12 +8873,6 @@
         <w:gridCol w:w="6826"/>
       </w:tblGrid>
       <w:tr>
-        <w:tblPrEx>
-          <w:tblCellMar>
-            <w:top w:w="0" w:type="dxa"/>
-            <w:bottom w:w="0" w:type="dxa"/>
-          </w:tblCellMar>
-        </w:tblPrEx>
         <w:tc>
           <w:tcPr>
             <w:tcW w:w="2200" w:type="dxa"/>
@@ -11176,12 +8935,6 @@
         </w:tc>
       </w:tr>
       <w:tr>
-        <w:tblPrEx>
-          <w:tblCellMar>
-            <w:top w:w="0" w:type="dxa"/>
-            <w:bottom w:w="0" w:type="dxa"/>
-          </w:tblCellMar>
-        </w:tblPrEx>
         <w:tc>
           <w:tcPr>
             <w:tcW w:w="2200" w:type="dxa"/>
@@ -11238,12 +8991,6 @@
         </w:tc>
       </w:tr>
       <w:tr>
-        <w:tblPrEx>
-          <w:tblCellMar>
-            <w:top w:w="0" w:type="dxa"/>
-            <w:bottom w:w="0" w:type="dxa"/>
-          </w:tblCellMar>
-        </w:tblPrEx>
         <w:tc>
           <w:tcPr>
             <w:tcW w:w="2200" w:type="dxa"/>
@@ -11301,12 +9048,6 @@
         </w:tc>
       </w:tr>
       <w:tr>
-        <w:tblPrEx>
-          <w:tblCellMar>
-            <w:top w:w="0" w:type="dxa"/>
-            <w:bottom w:w="0" w:type="dxa"/>
-          </w:tblCellMar>
-        </w:tblPrEx>
         <w:tc>
           <w:tcPr>
             <w:tcW w:w="2200" w:type="dxa"/>
@@ -11363,12 +9104,6 @@
         </w:tc>
       </w:tr>
       <w:tr>
-        <w:tblPrEx>
-          <w:tblCellMar>
-            <w:top w:w="0" w:type="dxa"/>
-            <w:bottom w:w="0" w:type="dxa"/>
-          </w:tblCellMar>
-        </w:tblPrEx>
         <w:tc>
           <w:tcPr>
             <w:tcW w:w="2200" w:type="dxa"/>
@@ -11425,12 +9160,6 @@
         </w:tc>
       </w:tr>
       <w:tr>
-        <w:tblPrEx>
-          <w:tblCellMar>
-            <w:top w:w="0" w:type="dxa"/>
-            <w:bottom w:w="0" w:type="dxa"/>
-          </w:tblCellMar>
-        </w:tblPrEx>
         <w:tc>
           <w:tcPr>
             <w:tcW w:w="2200" w:type="dxa"/>
@@ -11487,12 +9216,6 @@
         </w:tc>
       </w:tr>
       <w:tr>
-        <w:tblPrEx>
-          <w:tblCellMar>
-            <w:top w:w="0" w:type="dxa"/>
-            <w:bottom w:w="0" w:type="dxa"/>
-          </w:tblCellMar>
-        </w:tblPrEx>
         <w:tc>
           <w:tcPr>
             <w:tcW w:w="2200" w:type="dxa"/>
@@ -11549,12 +9272,6 @@
         </w:tc>
       </w:tr>
       <w:tr>
-        <w:tblPrEx>
-          <w:tblCellMar>
-            <w:top w:w="0" w:type="dxa"/>
-            <w:bottom w:w="0" w:type="dxa"/>
-          </w:tblCellMar>
-        </w:tblPrEx>
         <w:tc>
           <w:tcPr>
             <w:tcW w:w="2200" w:type="dxa"/>
@@ -11611,12 +9328,6 @@
         </w:tc>
       </w:tr>
       <w:tr>
-        <w:tblPrEx>
-          <w:tblCellMar>
-            <w:top w:w="0" w:type="dxa"/>
-            <w:bottom w:w="0" w:type="dxa"/>
-          </w:tblCellMar>
-        </w:tblPrEx>
         <w:tc>
           <w:tcPr>
             <w:tcW w:w="2200" w:type="dxa"/>
@@ -11673,12 +9384,6 @@
         </w:tc>
       </w:tr>
       <w:tr>
-        <w:tblPrEx>
-          <w:tblCellMar>
-            <w:top w:w="0" w:type="dxa"/>
-            <w:bottom w:w="0" w:type="dxa"/>
-          </w:tblCellMar>
-        </w:tblPrEx>
         <w:tc>
           <w:tcPr>
             <w:tcW w:w="2200" w:type="dxa"/>
@@ -11769,12 +9474,6 @@
         <w:gridCol w:w="6826"/>
       </w:tblGrid>
       <w:tr>
-        <w:tblPrEx>
-          <w:tblCellMar>
-            <w:top w:w="0" w:type="dxa"/>
-            <w:bottom w:w="0" w:type="dxa"/>
-          </w:tblCellMar>
-        </w:tblPrEx>
         <w:tc>
           <w:tcPr>
             <w:tcW w:w="2200" w:type="dxa"/>
@@ -11837,12 +9536,6 @@
         </w:tc>
       </w:tr>
       <w:tr>
-        <w:tblPrEx>
-          <w:tblCellMar>
-            <w:top w:w="0" w:type="dxa"/>
-            <w:bottom w:w="0" w:type="dxa"/>
-          </w:tblCellMar>
-        </w:tblPrEx>
         <w:tc>
           <w:tcPr>
             <w:tcW w:w="2200" w:type="dxa"/>
@@ -11899,12 +9592,6 @@
         </w:tc>
       </w:tr>
       <w:tr>
-        <w:tblPrEx>
-          <w:tblCellMar>
-            <w:top w:w="0" w:type="dxa"/>
-            <w:bottom w:w="0" w:type="dxa"/>
-          </w:tblCellMar>
-        </w:tblPrEx>
         <w:tc>
           <w:tcPr>
             <w:tcW w:w="2200" w:type="dxa"/>
@@ -11961,12 +9648,6 @@
         </w:tc>
       </w:tr>
       <w:tr>
-        <w:tblPrEx>
-          <w:tblCellMar>
-            <w:top w:w="0" w:type="dxa"/>
-            <w:bottom w:w="0" w:type="dxa"/>
-          </w:tblCellMar>
-        </w:tblPrEx>
         <w:tc>
           <w:tcPr>
             <w:tcW w:w="2200" w:type="dxa"/>
@@ -12023,12 +9704,6 @@
         </w:tc>
       </w:tr>
       <w:tr>
-        <w:tblPrEx>
-          <w:tblCellMar>
-            <w:top w:w="0" w:type="dxa"/>
-            <w:bottom w:w="0" w:type="dxa"/>
-          </w:tblCellMar>
-        </w:tblPrEx>
         <w:tc>
           <w:tcPr>
             <w:tcW w:w="2200" w:type="dxa"/>
@@ -12085,12 +9760,6 @@
         </w:tc>
       </w:tr>
       <w:tr>
-        <w:tblPrEx>
-          <w:tblCellMar>
-            <w:top w:w="0" w:type="dxa"/>
-            <w:bottom w:w="0" w:type="dxa"/>
-          </w:tblCellMar>
-        </w:tblPrEx>
         <w:tc>
           <w:tcPr>
             <w:tcW w:w="2200" w:type="dxa"/>
@@ -12147,12 +9816,6 @@
         </w:tc>
       </w:tr>
       <w:tr>
-        <w:tblPrEx>
-          <w:tblCellMar>
-            <w:top w:w="0" w:type="dxa"/>
-            <w:bottom w:w="0" w:type="dxa"/>
-          </w:tblCellMar>
-        </w:tblPrEx>
         <w:tc>
           <w:tcPr>
             <w:tcW w:w="2200" w:type="dxa"/>
@@ -12209,12 +9872,6 @@
         </w:tc>
       </w:tr>
       <w:tr>
-        <w:tblPrEx>
-          <w:tblCellMar>
-            <w:top w:w="0" w:type="dxa"/>
-            <w:bottom w:w="0" w:type="dxa"/>
-          </w:tblCellMar>
-        </w:tblPrEx>
         <w:tc>
           <w:tcPr>
             <w:tcW w:w="2200" w:type="dxa"/>
@@ -12271,12 +9928,6 @@
         </w:tc>
       </w:tr>
       <w:tr>
-        <w:tblPrEx>
-          <w:tblCellMar>
-            <w:top w:w="0" w:type="dxa"/>
-            <w:bottom w:w="0" w:type="dxa"/>
-          </w:tblCellMar>
-        </w:tblPrEx>
         <w:tc>
           <w:tcPr>
             <w:tcW w:w="2200" w:type="dxa"/>
@@ -12333,12 +9984,6 @@
         </w:tc>
       </w:tr>
       <w:tr>
-        <w:tblPrEx>
-          <w:tblCellMar>
-            <w:top w:w="0" w:type="dxa"/>
-            <w:bottom w:w="0" w:type="dxa"/>
-          </w:tblCellMar>
-        </w:tblPrEx>
         <w:tc>
           <w:tcPr>
             <w:tcW w:w="2200" w:type="dxa"/>
@@ -12429,12 +10074,6 @@
         <w:gridCol w:w="6826"/>
       </w:tblGrid>
       <w:tr>
-        <w:tblPrEx>
-          <w:tblCellMar>
-            <w:top w:w="0" w:type="dxa"/>
-            <w:bottom w:w="0" w:type="dxa"/>
-          </w:tblCellMar>
-        </w:tblPrEx>
         <w:tc>
           <w:tcPr>
             <w:tcW w:w="2200" w:type="dxa"/>
@@ -12497,12 +10136,6 @@
         </w:tc>
       </w:tr>
       <w:tr>
-        <w:tblPrEx>
-          <w:tblCellMar>
-            <w:top w:w="0" w:type="dxa"/>
-            <w:bottom w:w="0" w:type="dxa"/>
-          </w:tblCellMar>
-        </w:tblPrEx>
         <w:tc>
           <w:tcPr>
             <w:tcW w:w="2200" w:type="dxa"/>
@@ -12559,12 +10192,6 @@
         </w:tc>
       </w:tr>
       <w:tr>
-        <w:tblPrEx>
-          <w:tblCellMar>
-            <w:top w:w="0" w:type="dxa"/>
-            <w:bottom w:w="0" w:type="dxa"/>
-          </w:tblCellMar>
-        </w:tblPrEx>
         <w:tc>
           <w:tcPr>
             <w:tcW w:w="2200" w:type="dxa"/>
@@ -12621,12 +10248,6 @@
         </w:tc>
       </w:tr>
       <w:tr>
-        <w:tblPrEx>
-          <w:tblCellMar>
-            <w:top w:w="0" w:type="dxa"/>
-            <w:bottom w:w="0" w:type="dxa"/>
-          </w:tblCellMar>
-        </w:tblPrEx>
         <w:tc>
           <w:tcPr>
             <w:tcW w:w="2200" w:type="dxa"/>
@@ -12683,12 +10304,6 @@
         </w:tc>
       </w:tr>
       <w:tr>
-        <w:tblPrEx>
-          <w:tblCellMar>
-            <w:top w:w="0" w:type="dxa"/>
-            <w:bottom w:w="0" w:type="dxa"/>
-          </w:tblCellMar>
-        </w:tblPrEx>
         <w:tc>
           <w:tcPr>
             <w:tcW w:w="2200" w:type="dxa"/>
@@ -12745,12 +10360,6 @@
         </w:tc>
       </w:tr>
       <w:tr>
-        <w:tblPrEx>
-          <w:tblCellMar>
-            <w:top w:w="0" w:type="dxa"/>
-            <w:bottom w:w="0" w:type="dxa"/>
-          </w:tblCellMar>
-        </w:tblPrEx>
         <w:tc>
           <w:tcPr>
             <w:tcW w:w="2200" w:type="dxa"/>
@@ -12807,12 +10416,6 @@
         </w:tc>
       </w:tr>
       <w:tr>
-        <w:tblPrEx>
-          <w:tblCellMar>
-            <w:top w:w="0" w:type="dxa"/>
-            <w:bottom w:w="0" w:type="dxa"/>
-          </w:tblCellMar>
-        </w:tblPrEx>
         <w:tc>
           <w:tcPr>
             <w:tcW w:w="2200" w:type="dxa"/>
@@ -12869,12 +10472,6 @@
         </w:tc>
       </w:tr>
       <w:tr>
-        <w:tblPrEx>
-          <w:tblCellMar>
-            <w:top w:w="0" w:type="dxa"/>
-            <w:bottom w:w="0" w:type="dxa"/>
-          </w:tblCellMar>
-        </w:tblPrEx>
         <w:tc>
           <w:tcPr>
             <w:tcW w:w="2200" w:type="dxa"/>
@@ -12931,12 +10528,6 @@
         </w:tc>
       </w:tr>
       <w:tr>
-        <w:tblPrEx>
-          <w:tblCellMar>
-            <w:top w:w="0" w:type="dxa"/>
-            <w:bottom w:w="0" w:type="dxa"/>
-          </w:tblCellMar>
-        </w:tblPrEx>
         <w:tc>
           <w:tcPr>
             <w:tcW w:w="2200" w:type="dxa"/>
@@ -12993,12 +10584,6 @@
         </w:tc>
       </w:tr>
       <w:tr>
-        <w:tblPrEx>
-          <w:tblCellMar>
-            <w:top w:w="0" w:type="dxa"/>
-            <w:bottom w:w="0" w:type="dxa"/>
-          </w:tblCellMar>
-        </w:tblPrEx>
         <w:tc>
           <w:tcPr>
             <w:tcW w:w="2200" w:type="dxa"/>
@@ -13089,12 +10674,6 @@
         <w:gridCol w:w="6826"/>
       </w:tblGrid>
       <w:tr>
-        <w:tblPrEx>
-          <w:tblCellMar>
-            <w:top w:w="0" w:type="dxa"/>
-            <w:bottom w:w="0" w:type="dxa"/>
-          </w:tblCellMar>
-        </w:tblPrEx>
         <w:tc>
           <w:tcPr>
             <w:tcW w:w="2200" w:type="dxa"/>
@@ -13157,12 +10736,6 @@
         </w:tc>
       </w:tr>
       <w:tr>
-        <w:tblPrEx>
-          <w:tblCellMar>
-            <w:top w:w="0" w:type="dxa"/>
-            <w:bottom w:w="0" w:type="dxa"/>
-          </w:tblCellMar>
-        </w:tblPrEx>
         <w:tc>
           <w:tcPr>
             <w:tcW w:w="2200" w:type="dxa"/>
@@ -13219,12 +10792,6 @@
         </w:tc>
       </w:tr>
       <w:tr>
-        <w:tblPrEx>
-          <w:tblCellMar>
-            <w:top w:w="0" w:type="dxa"/>
-            <w:bottom w:w="0" w:type="dxa"/>
-          </w:tblCellMar>
-        </w:tblPrEx>
         <w:tc>
           <w:tcPr>
             <w:tcW w:w="2200" w:type="dxa"/>
@@ -13281,12 +10848,6 @@
         </w:tc>
       </w:tr>
       <w:tr>
-        <w:tblPrEx>
-          <w:tblCellMar>
-            <w:top w:w="0" w:type="dxa"/>
-            <w:bottom w:w="0" w:type="dxa"/>
-          </w:tblCellMar>
-        </w:tblPrEx>
         <w:tc>
           <w:tcPr>
             <w:tcW w:w="2200" w:type="dxa"/>
@@ -13343,12 +10904,6 @@
         </w:tc>
       </w:tr>
       <w:tr>
-        <w:tblPrEx>
-          <w:tblCellMar>
-            <w:top w:w="0" w:type="dxa"/>
-            <w:bottom w:w="0" w:type="dxa"/>
-          </w:tblCellMar>
-        </w:tblPrEx>
         <w:tc>
           <w:tcPr>
             <w:tcW w:w="2200" w:type="dxa"/>
@@ -13405,12 +10960,6 @@
         </w:tc>
       </w:tr>
       <w:tr>
-        <w:tblPrEx>
-          <w:tblCellMar>
-            <w:top w:w="0" w:type="dxa"/>
-            <w:bottom w:w="0" w:type="dxa"/>
-          </w:tblCellMar>
-        </w:tblPrEx>
         <w:tc>
           <w:tcPr>
             <w:tcW w:w="2200" w:type="dxa"/>
@@ -13467,12 +11016,6 @@
         </w:tc>
       </w:tr>
       <w:tr>
-        <w:tblPrEx>
-          <w:tblCellMar>
-            <w:top w:w="0" w:type="dxa"/>
-            <w:bottom w:w="0" w:type="dxa"/>
-          </w:tblCellMar>
-        </w:tblPrEx>
         <w:tc>
           <w:tcPr>
             <w:tcW w:w="2200" w:type="dxa"/>
@@ -13529,12 +11072,6 @@
         </w:tc>
       </w:tr>
       <w:tr>
-        <w:tblPrEx>
-          <w:tblCellMar>
-            <w:top w:w="0" w:type="dxa"/>
-            <w:bottom w:w="0" w:type="dxa"/>
-          </w:tblCellMar>
-        </w:tblPrEx>
         <w:tc>
           <w:tcPr>
             <w:tcW w:w="2200" w:type="dxa"/>
@@ -13591,12 +11128,6 @@
         </w:tc>
       </w:tr>
       <w:tr>
-        <w:tblPrEx>
-          <w:tblCellMar>
-            <w:top w:w="0" w:type="dxa"/>
-            <w:bottom w:w="0" w:type="dxa"/>
-          </w:tblCellMar>
-        </w:tblPrEx>
         <w:tc>
           <w:tcPr>
             <w:tcW w:w="2200" w:type="dxa"/>
@@ -13653,12 +11184,6 @@
         </w:tc>
       </w:tr>
       <w:tr>
-        <w:tblPrEx>
-          <w:tblCellMar>
-            <w:top w:w="0" w:type="dxa"/>
-            <w:bottom w:w="0" w:type="dxa"/>
-          </w:tblCellMar>
-        </w:tblPrEx>
         <w:tc>
           <w:tcPr>
             <w:tcW w:w="2200" w:type="dxa"/>
@@ -13749,12 +11274,6 @@
         <w:gridCol w:w="6826"/>
       </w:tblGrid>
       <w:tr>
-        <w:tblPrEx>
-          <w:tblCellMar>
-            <w:top w:w="0" w:type="dxa"/>
-            <w:bottom w:w="0" w:type="dxa"/>
-          </w:tblCellMar>
-        </w:tblPrEx>
         <w:tc>
           <w:tcPr>
             <w:tcW w:w="2200" w:type="dxa"/>
@@ -13817,12 +11336,6 @@
         </w:tc>
       </w:tr>
       <w:tr>
-        <w:tblPrEx>
-          <w:tblCellMar>
-            <w:top w:w="0" w:type="dxa"/>
-            <w:bottom w:w="0" w:type="dxa"/>
-          </w:tblCellMar>
-        </w:tblPrEx>
         <w:tc>
           <w:tcPr>
             <w:tcW w:w="2200" w:type="dxa"/>
@@ -13879,12 +11392,6 @@
         </w:tc>
       </w:tr>
       <w:tr>
-        <w:tblPrEx>
-          <w:tblCellMar>
-            <w:top w:w="0" w:type="dxa"/>
-            <w:bottom w:w="0" w:type="dxa"/>
-          </w:tblCellMar>
-        </w:tblPrEx>
         <w:tc>
           <w:tcPr>
             <w:tcW w:w="2200" w:type="dxa"/>
@@ -13941,12 +11448,6 @@
         </w:tc>
       </w:tr>
       <w:tr>
-        <w:tblPrEx>
-          <w:tblCellMar>
-            <w:top w:w="0" w:type="dxa"/>
-            <w:bottom w:w="0" w:type="dxa"/>
-          </w:tblCellMar>
-        </w:tblPrEx>
         <w:tc>
           <w:tcPr>
             <w:tcW w:w="2200" w:type="dxa"/>
@@ -14003,12 +11504,6 @@
         </w:tc>
       </w:tr>
       <w:tr>
-        <w:tblPrEx>
-          <w:tblCellMar>
-            <w:top w:w="0" w:type="dxa"/>
-            <w:bottom w:w="0" w:type="dxa"/>
-          </w:tblCellMar>
-        </w:tblPrEx>
         <w:tc>
           <w:tcPr>
             <w:tcW w:w="2200" w:type="dxa"/>
@@ -14065,12 +11560,6 @@
         </w:tc>
       </w:tr>
       <w:tr>
-        <w:tblPrEx>
-          <w:tblCellMar>
-            <w:top w:w="0" w:type="dxa"/>
-            <w:bottom w:w="0" w:type="dxa"/>
-          </w:tblCellMar>
-        </w:tblPrEx>
         <w:tc>
           <w:tcPr>
             <w:tcW w:w="2200" w:type="dxa"/>
@@ -14127,12 +11616,6 @@
         </w:tc>
       </w:tr>
       <w:tr>
-        <w:tblPrEx>
-          <w:tblCellMar>
-            <w:top w:w="0" w:type="dxa"/>
-            <w:bottom w:w="0" w:type="dxa"/>
-          </w:tblCellMar>
-        </w:tblPrEx>
         <w:tc>
           <w:tcPr>
             <w:tcW w:w="2200" w:type="dxa"/>
@@ -14189,12 +11672,6 @@
         </w:tc>
       </w:tr>
       <w:tr>
-        <w:tblPrEx>
-          <w:tblCellMar>
-            <w:top w:w="0" w:type="dxa"/>
-            <w:bottom w:w="0" w:type="dxa"/>
-          </w:tblCellMar>
-        </w:tblPrEx>
         <w:tc>
           <w:tcPr>
             <w:tcW w:w="2200" w:type="dxa"/>
@@ -14251,12 +11728,6 @@
         </w:tc>
       </w:tr>
       <w:tr>
-        <w:tblPrEx>
-          <w:tblCellMar>
-            <w:top w:w="0" w:type="dxa"/>
-            <w:bottom w:w="0" w:type="dxa"/>
-          </w:tblCellMar>
-        </w:tblPrEx>
         <w:tc>
           <w:tcPr>
             <w:tcW w:w="2200" w:type="dxa"/>
@@ -14313,12 +11784,6 @@
         </w:tc>
       </w:tr>
       <w:tr>
-        <w:tblPrEx>
-          <w:tblCellMar>
-            <w:top w:w="0" w:type="dxa"/>
-            <w:bottom w:w="0" w:type="dxa"/>
-          </w:tblCellMar>
-        </w:tblPrEx>
         <w:tc>
           <w:tcPr>
             <w:tcW w:w="2200" w:type="dxa"/>
@@ -14417,12 +11882,6 @@
         <w:gridCol w:w="6826"/>
       </w:tblGrid>
       <w:tr>
-        <w:tblPrEx>
-          <w:tblCellMar>
-            <w:top w:w="0" w:type="dxa"/>
-            <w:bottom w:w="0" w:type="dxa"/>
-          </w:tblCellMar>
-        </w:tblPrEx>
         <w:tc>
           <w:tcPr>
             <w:tcW w:w="2200" w:type="dxa"/>
@@ -14485,12 +11944,6 @@
         </w:tc>
       </w:tr>
       <w:tr>
-        <w:tblPrEx>
-          <w:tblCellMar>
-            <w:top w:w="0" w:type="dxa"/>
-            <w:bottom w:w="0" w:type="dxa"/>
-          </w:tblCellMar>
-        </w:tblPrEx>
         <w:tc>
           <w:tcPr>
             <w:tcW w:w="2200" w:type="dxa"/>
@@ -14547,12 +12000,6 @@
         </w:tc>
       </w:tr>
       <w:tr>
-        <w:tblPrEx>
-          <w:tblCellMar>
-            <w:top w:w="0" w:type="dxa"/>
-            <w:bottom w:w="0" w:type="dxa"/>
-          </w:tblCellMar>
-        </w:tblPrEx>
         <w:tc>
           <w:tcPr>
             <w:tcW w:w="2200" w:type="dxa"/>
@@ -14609,12 +12056,6 @@
         </w:tc>
       </w:tr>
       <w:tr>
-        <w:tblPrEx>
-          <w:tblCellMar>
-            <w:top w:w="0" w:type="dxa"/>
-            <w:bottom w:w="0" w:type="dxa"/>
-          </w:tblCellMar>
-        </w:tblPrEx>
         <w:tc>
           <w:tcPr>
             <w:tcW w:w="2200" w:type="dxa"/>
@@ -14671,12 +12112,6 @@
         </w:tc>
       </w:tr>
       <w:tr>
-        <w:tblPrEx>
-          <w:tblCellMar>
-            <w:top w:w="0" w:type="dxa"/>
-            <w:bottom w:w="0" w:type="dxa"/>
-          </w:tblCellMar>
-        </w:tblPrEx>
         <w:tc>
           <w:tcPr>
             <w:tcW w:w="2200" w:type="dxa"/>
@@ -14734,12 +12169,6 @@
         </w:tc>
       </w:tr>
       <w:tr>
-        <w:tblPrEx>
-          <w:tblCellMar>
-            <w:top w:w="0" w:type="dxa"/>
-            <w:bottom w:w="0" w:type="dxa"/>
-          </w:tblCellMar>
-        </w:tblPrEx>
         <w:tc>
           <w:tcPr>
             <w:tcW w:w="2200" w:type="dxa"/>
@@ -14796,12 +12225,6 @@
         </w:tc>
       </w:tr>
       <w:tr>
-        <w:tblPrEx>
-          <w:tblCellMar>
-            <w:top w:w="0" w:type="dxa"/>
-            <w:bottom w:w="0" w:type="dxa"/>
-          </w:tblCellMar>
-        </w:tblPrEx>
         <w:tc>
           <w:tcPr>
             <w:tcW w:w="2200" w:type="dxa"/>
@@ -14858,12 +12281,6 @@
         </w:tc>
       </w:tr>
       <w:tr>
-        <w:tblPrEx>
-          <w:tblCellMar>
-            <w:top w:w="0" w:type="dxa"/>
-            <w:bottom w:w="0" w:type="dxa"/>
-          </w:tblCellMar>
-        </w:tblPrEx>
         <w:tc>
           <w:tcPr>
             <w:tcW w:w="2200" w:type="dxa"/>
@@ -14920,12 +12337,6 @@
         </w:tc>
       </w:tr>
       <w:tr>
-        <w:tblPrEx>
-          <w:tblCellMar>
-            <w:top w:w="0" w:type="dxa"/>
-            <w:bottom w:w="0" w:type="dxa"/>
-          </w:tblCellMar>
-        </w:tblPrEx>
         <w:tc>
           <w:tcPr>
             <w:tcW w:w="2200" w:type="dxa"/>
@@ -14982,12 +12393,6 @@
         </w:tc>
       </w:tr>
       <w:tr>
-        <w:tblPrEx>
-          <w:tblCellMar>
-            <w:top w:w="0" w:type="dxa"/>
-            <w:bottom w:w="0" w:type="dxa"/>
-          </w:tblCellMar>
-        </w:tblPrEx>
         <w:tc>
           <w:tcPr>
             <w:tcW w:w="2200" w:type="dxa"/>
@@ -15086,12 +12491,6 @@
         <w:gridCol w:w="6826"/>
       </w:tblGrid>
       <w:tr>
-        <w:tblPrEx>
-          <w:tblCellMar>
-            <w:top w:w="0" w:type="dxa"/>
-            <w:bottom w:w="0" w:type="dxa"/>
-          </w:tblCellMar>
-        </w:tblPrEx>
         <w:tc>
           <w:tcPr>
             <w:tcW w:w="2200" w:type="dxa"/>
@@ -15154,12 +12553,6 @@
         </w:tc>
       </w:tr>
       <w:tr>
-        <w:tblPrEx>
-          <w:tblCellMar>
-            <w:top w:w="0" w:type="dxa"/>
-            <w:bottom w:w="0" w:type="dxa"/>
-          </w:tblCellMar>
-        </w:tblPrEx>
         <w:tc>
           <w:tcPr>
             <w:tcW w:w="2200" w:type="dxa"/>
@@ -15216,12 +12609,6 @@
         </w:tc>
       </w:tr>
       <w:tr>
-        <w:tblPrEx>
-          <w:tblCellMar>
-            <w:top w:w="0" w:type="dxa"/>
-            <w:bottom w:w="0" w:type="dxa"/>
-          </w:tblCellMar>
-        </w:tblPrEx>
         <w:tc>
           <w:tcPr>
             <w:tcW w:w="2200" w:type="dxa"/>
@@ -15278,12 +12665,6 @@
         </w:tc>
       </w:tr>
       <w:tr>
-        <w:tblPrEx>
-          <w:tblCellMar>
-            <w:top w:w="0" w:type="dxa"/>
-            <w:bottom w:w="0" w:type="dxa"/>
-          </w:tblCellMar>
-        </w:tblPrEx>
         <w:tc>
           <w:tcPr>
             <w:tcW w:w="2200" w:type="dxa"/>
@@ -15340,12 +12721,6 @@
         </w:tc>
       </w:tr>
       <w:tr>
-        <w:tblPrEx>
-          <w:tblCellMar>
-            <w:top w:w="0" w:type="dxa"/>
-            <w:bottom w:w="0" w:type="dxa"/>
-          </w:tblCellMar>
-        </w:tblPrEx>
         <w:tc>
           <w:tcPr>
             <w:tcW w:w="2200" w:type="dxa"/>
@@ -15402,12 +12777,6 @@
         </w:tc>
       </w:tr>
       <w:tr>
-        <w:tblPrEx>
-          <w:tblCellMar>
-            <w:top w:w="0" w:type="dxa"/>
-            <w:bottom w:w="0" w:type="dxa"/>
-          </w:tblCellMar>
-        </w:tblPrEx>
         <w:tc>
           <w:tcPr>
             <w:tcW w:w="2200" w:type="dxa"/>
@@ -15464,12 +12833,6 @@
         </w:tc>
       </w:tr>
       <w:tr>
-        <w:tblPrEx>
-          <w:tblCellMar>
-            <w:top w:w="0" w:type="dxa"/>
-            <w:bottom w:w="0" w:type="dxa"/>
-          </w:tblCellMar>
-        </w:tblPrEx>
         <w:tc>
           <w:tcPr>
             <w:tcW w:w="2200" w:type="dxa"/>
@@ -15526,12 +12889,6 @@
         </w:tc>
       </w:tr>
       <w:tr>
-        <w:tblPrEx>
-          <w:tblCellMar>
-            <w:top w:w="0" w:type="dxa"/>
-            <w:bottom w:w="0" w:type="dxa"/>
-          </w:tblCellMar>
-        </w:tblPrEx>
         <w:tc>
           <w:tcPr>
             <w:tcW w:w="2200" w:type="dxa"/>
@@ -15588,12 +12945,6 @@
         </w:tc>
       </w:tr>
       <w:tr>
-        <w:tblPrEx>
-          <w:tblCellMar>
-            <w:top w:w="0" w:type="dxa"/>
-            <w:bottom w:w="0" w:type="dxa"/>
-          </w:tblCellMar>
-        </w:tblPrEx>
         <w:tc>
           <w:tcPr>
             <w:tcW w:w="2200" w:type="dxa"/>
@@ -15650,12 +13001,6 @@
         </w:tc>
       </w:tr>
       <w:tr>
-        <w:tblPrEx>
-          <w:tblCellMar>
-            <w:top w:w="0" w:type="dxa"/>
-            <w:bottom w:w="0" w:type="dxa"/>
-          </w:tblCellMar>
-        </w:tblPrEx>
         <w:tc>
           <w:tcPr>
             <w:tcW w:w="2200" w:type="dxa"/>
@@ -17414,20 +14759,8 @@
           <w:sz w:val="18"/>
           <w:szCs w:val="18"/>
         </w:rPr>
-        <w:t>Tic Tac Toe - Project Documentation | Jack Baxter | github.com/</w:t>
+        <w:t>Tic Tac Toe - Project Documentation | Jack Baxter | github.com/BaxterJack</w:t>
       </w:r>
-      <w:proofErr w:type="spellStart"/>
-      <w:r>
-        <w:rPr>
-          <w:i/>
-          <w:iCs/>
-          <w:color w:val="888888"/>
-          <w:sz w:val="18"/>
-          <w:szCs w:val="18"/>
-        </w:rPr>
-        <w:t>BaxterJack</w:t>
-      </w:r>
-      <w:proofErr w:type="spellEnd"/>
     </w:p>
     <w:sectPr>
       <w:pgSz w:w="11906" w:h="16838"/>

</xml_diff>

<commit_message>
Add main menu system with level transition and series win detection
- Created TTTMenuGameMode C++ class with GameInstance reference
- Created MainMenu level with BP_MenuGameMode
- Built WBP_MenuUI with game mode and series length selection
- Implemented SetNumRoundsPanelVisibility, SetGameVSMode, SetNumWins
- Added Start Game button with Open Level transition
- Fixed GetGameInstance naming conflict in TTTMenuGameMode
- Fixed LIVECODING type prefix with full rebuild
- Fixed parameter shadowing with In prefix convention
- Verified series win detection working with CheckSeriesWin
- Updated project documentation
</commit_message>
<xml_diff>
--- a/docs/TicTacToe_Project_Log.docx
+++ b/docs/TicTacToe_Project_Log.docx
@@ -834,7 +834,23 @@
         <w:spacing w:after="120"/>
       </w:pPr>
       <w:r>
-        <w:t>Core game logic (grid state, win/draw detection, turn management) will be implemented in C++ Actor and GameMode classes. UI elements (board display, turn indicator, result screen) will be handled using Unreal's UMG system via Blueprints, with Blueprint-to-C++ communication via exposed UPROPERTY and UFUNCTION macros.</w:t>
+        <w:t xml:space="preserve">Core game logic (grid state, win/draw detection, turn management) will be implemented in C++ Actor and </w:t>
+      </w:r>
+      <w:proofErr w:type="spellStart"/>
+      <w:r>
+        <w:t>GameMode</w:t>
+      </w:r>
+      <w:proofErr w:type="spellEnd"/>
+      <w:r>
+        <w:t xml:space="preserve"> classes. UI elements (board display, turn indicator, result screen) will be handled using </w:t>
+      </w:r>
+      <w:proofErr w:type="spellStart"/>
+      <w:r>
+        <w:t>Unreal's</w:t>
+      </w:r>
+      <w:proofErr w:type="spellEnd"/>
+      <w:r>
+        <w:t xml:space="preserve"> UMG system via Blueprints, with Blueprint-to-C++ communication via exposed UPROPERTY and UFUNCTION macros.</w:t>
       </w:r>
     </w:p>
     <w:p>
@@ -966,7 +982,7 @@
       <w:tr>
         <w:tc>
           <w:tcPr>
-            <w:tcW w:w="1392" w:type="dxa"/>
+            <w:tcW w:w="1304" w:type="dxa"/>
             <w:tcBorders>
               <w:top w:val="single" w:sz="1" w:space="0" w:color="CCCCCC"/>
               <w:left w:val="single" w:sz="1" w:space="0" w:color="CCCCCC"/>
@@ -996,7 +1012,7 @@
         </w:tc>
         <w:tc>
           <w:tcPr>
-            <w:tcW w:w="4692" w:type="dxa"/>
+            <w:tcW w:w="4458" w:type="dxa"/>
             <w:tcBorders>
               <w:top w:val="single" w:sz="1" w:space="0" w:color="CCCCCC"/>
               <w:left w:val="single" w:sz="1" w:space="0" w:color="CCCCCC"/>
@@ -1026,7 +1042,7 @@
         </w:tc>
         <w:tc>
           <w:tcPr>
-            <w:tcW w:w="2942" w:type="dxa"/>
+            <w:tcW w:w="3264" w:type="dxa"/>
             <w:tcBorders>
               <w:top w:val="single" w:sz="1" w:space="0" w:color="CCCCCC"/>
               <w:left w:val="single" w:sz="1" w:space="0" w:color="CCCCCC"/>
@@ -1058,7 +1074,7 @@
       <w:tr>
         <w:tc>
           <w:tcPr>
-            <w:tcW w:w="1392" w:type="dxa"/>
+            <w:tcW w:w="1304" w:type="dxa"/>
             <w:tcBorders>
               <w:top w:val="single" w:sz="1" w:space="0" w:color="CCCCCC"/>
               <w:left w:val="single" w:sz="1" w:space="0" w:color="CCCCCC"/>
@@ -1085,7 +1101,7 @@
         </w:tc>
         <w:tc>
           <w:tcPr>
-            <w:tcW w:w="4692" w:type="dxa"/>
+            <w:tcW w:w="4458" w:type="dxa"/>
             <w:tcBorders>
               <w:top w:val="single" w:sz="1" w:space="0" w:color="CCCCCC"/>
               <w:left w:val="single" w:sz="1" w:space="0" w:color="CCCCCC"/>
@@ -1106,13 +1122,29 @@
                 <w:sz w:val="20"/>
                 <w:szCs w:val="20"/>
               </w:rPr>
-              <w:t>Project setup. Created UE5 C++ project. Set up GitHub repository with Unreal .gitignore. Cleaned default level, deleted landscape. Set up Content folder structure (Maps, Blueprints, UI, Assets, Materials).</w:t>
-            </w:r>
-          </w:p>
-        </w:tc>
-        <w:tc>
-          <w:tcPr>
-            <w:tcW w:w="2942" w:type="dxa"/>
+              <w:t>Project setup. Created UE5 C++ project. Set up GitHub repository with Unreal .</w:t>
+            </w:r>
+            <w:proofErr w:type="spellStart"/>
+            <w:r>
+              <w:rPr>
+                <w:sz w:val="20"/>
+                <w:szCs w:val="20"/>
+              </w:rPr>
+              <w:t>gitignore</w:t>
+            </w:r>
+            <w:proofErr w:type="spellEnd"/>
+            <w:r>
+              <w:rPr>
+                <w:sz w:val="20"/>
+                <w:szCs w:val="20"/>
+              </w:rPr>
+              <w:t>. Cleaned default level, deleted landscape. Set up Content folder structure (Maps, Blueprints, UI, Assets, Materials).</w:t>
+            </w:r>
+          </w:p>
+        </w:tc>
+        <w:tc>
+          <w:tcPr>
+            <w:tcW w:w="3264" w:type="dxa"/>
             <w:tcBorders>
               <w:top w:val="single" w:sz="1" w:space="0" w:color="CCCCCC"/>
               <w:left w:val="single" w:sz="1" w:space="0" w:color="CCCCCC"/>
@@ -1141,7 +1173,7 @@
       <w:tr>
         <w:tc>
           <w:tcPr>
-            <w:tcW w:w="1392" w:type="dxa"/>
+            <w:tcW w:w="1304" w:type="dxa"/>
             <w:tcBorders>
               <w:top w:val="single" w:sz="1" w:space="0" w:color="CCCCCC"/>
               <w:left w:val="single" w:sz="1" w:space="0" w:color="CCCCCC"/>
@@ -1168,7 +1200,7 @@
         </w:tc>
         <w:tc>
           <w:tcPr>
-            <w:tcW w:w="4692" w:type="dxa"/>
+            <w:tcW w:w="4458" w:type="dxa"/>
             <w:tcBorders>
               <w:top w:val="single" w:sz="1" w:space="0" w:color="CCCCCC"/>
               <w:left w:val="single" w:sz="1" w:space="0" w:color="CCCCCC"/>
@@ -1189,13 +1221,61 @@
                 <w:sz w:val="20"/>
                 <w:szCs w:val="20"/>
               </w:rPr>
-              <w:t>Built board visuals using basic shapes. Created 9-square board blueprint (BP_BoardPiece) with Element0-Element8 as individual cuboid Static Mesh Components in a 3x3 grid. Created BP_PieceX (blue cross, two scaled cuboids) and BP_PieceO (red cylinder).</w:t>
-            </w:r>
-          </w:p>
-        </w:tc>
-        <w:tc>
-          <w:tcPr>
-            <w:tcW w:w="2942" w:type="dxa"/>
+              <w:t>Built board visuals using basic shapes. Created 9-square board blueprint (</w:t>
+            </w:r>
+            <w:proofErr w:type="spellStart"/>
+            <w:r>
+              <w:rPr>
+                <w:sz w:val="20"/>
+                <w:szCs w:val="20"/>
+              </w:rPr>
+              <w:t>BP_BoardPiece</w:t>
+            </w:r>
+            <w:proofErr w:type="spellEnd"/>
+            <w:r>
+              <w:rPr>
+                <w:sz w:val="20"/>
+                <w:szCs w:val="20"/>
+              </w:rPr>
+              <w:t xml:space="preserve">) with Element0-Element8 as individual cuboid Static Mesh Components in a 3x3 grid. Created </w:t>
+            </w:r>
+            <w:proofErr w:type="spellStart"/>
+            <w:r>
+              <w:rPr>
+                <w:sz w:val="20"/>
+                <w:szCs w:val="20"/>
+              </w:rPr>
+              <w:t>BP_PieceX</w:t>
+            </w:r>
+            <w:proofErr w:type="spellEnd"/>
+            <w:r>
+              <w:rPr>
+                <w:sz w:val="20"/>
+                <w:szCs w:val="20"/>
+              </w:rPr>
+              <w:t xml:space="preserve"> (blue cross, two scaled cuboids) and </w:t>
+            </w:r>
+            <w:proofErr w:type="spellStart"/>
+            <w:r>
+              <w:rPr>
+                <w:sz w:val="20"/>
+                <w:szCs w:val="20"/>
+              </w:rPr>
+              <w:t>BP_PieceO</w:t>
+            </w:r>
+            <w:proofErr w:type="spellEnd"/>
+            <w:r>
+              <w:rPr>
+                <w:sz w:val="20"/>
+                <w:szCs w:val="20"/>
+              </w:rPr>
+              <w:t xml:space="preserve"> (red cylinder).</w:t>
+            </w:r>
+          </w:p>
+        </w:tc>
+        <w:tc>
+          <w:tcPr>
+            <w:tcW w:w="3264" w:type="dxa"/>
             <w:tcBorders>
               <w:top w:val="single" w:sz="1" w:space="0" w:color="CCCCCC"/>
               <w:left w:val="single" w:sz="1" w:space="0" w:color="CCCCCC"/>
@@ -1224,7 +1304,7 @@
       <w:tr>
         <w:tc>
           <w:tcPr>
-            <w:tcW w:w="1392" w:type="dxa"/>
+            <w:tcW w:w="1304" w:type="dxa"/>
             <w:tcBorders>
               <w:top w:val="single" w:sz="1" w:space="0" w:color="CCCCCC"/>
               <w:left w:val="single" w:sz="1" w:space="0" w:color="CCCCCC"/>
@@ -1251,7 +1331,7 @@
         </w:tc>
         <w:tc>
           <w:tcPr>
-            <w:tcW w:w="4692" w:type="dxa"/>
+            <w:tcW w:w="4458" w:type="dxa"/>
             <w:tcBorders>
               <w:top w:val="single" w:sz="1" w:space="0" w:color="CCCCCC"/>
               <w:left w:val="single" w:sz="1" w:space="0" w:color="CCCCCC"/>
@@ -1272,13 +1352,61 @@
                 <w:sz w:val="20"/>
                 <w:szCs w:val="20"/>
               </w:rPr>
-              <w:t>Created TicTacToeGameMode C++ class. Implemented full game logic: 9-element TArray grid, turn management, win condition detection across all 8 patterns (3 rows, 3 columns, 2 diagonals), draw detection, RestartGame function.</w:t>
-            </w:r>
-          </w:p>
-        </w:tc>
-        <w:tc>
-          <w:tcPr>
-            <w:tcW w:w="2942" w:type="dxa"/>
+              <w:t xml:space="preserve">Created </w:t>
+            </w:r>
+            <w:proofErr w:type="spellStart"/>
+            <w:r>
+              <w:rPr>
+                <w:sz w:val="20"/>
+                <w:szCs w:val="20"/>
+              </w:rPr>
+              <w:t>TicTacToeGameMode</w:t>
+            </w:r>
+            <w:proofErr w:type="spellEnd"/>
+            <w:r>
+              <w:rPr>
+                <w:sz w:val="20"/>
+                <w:szCs w:val="20"/>
+              </w:rPr>
+              <w:t xml:space="preserve"> C++ class. Implemented full game logic: 9-element </w:t>
+            </w:r>
+            <w:proofErr w:type="spellStart"/>
+            <w:r>
+              <w:rPr>
+                <w:sz w:val="20"/>
+                <w:szCs w:val="20"/>
+              </w:rPr>
+              <w:t>TArray</w:t>
+            </w:r>
+            <w:proofErr w:type="spellEnd"/>
+            <w:r>
+              <w:rPr>
+                <w:sz w:val="20"/>
+                <w:szCs w:val="20"/>
+              </w:rPr>
+              <w:t xml:space="preserve"> grid, turn management, win condition detection across all 8 patterns (3 rows, 3 columns, 2 diagonals), draw detection, </w:t>
+            </w:r>
+            <w:proofErr w:type="spellStart"/>
+            <w:r>
+              <w:rPr>
+                <w:sz w:val="20"/>
+                <w:szCs w:val="20"/>
+              </w:rPr>
+              <w:t>RestartGame</w:t>
+            </w:r>
+            <w:proofErr w:type="spellEnd"/>
+            <w:r>
+              <w:rPr>
+                <w:sz w:val="20"/>
+                <w:szCs w:val="20"/>
+              </w:rPr>
+              <w:t xml:space="preserve"> function.</w:t>
+            </w:r>
+          </w:p>
+        </w:tc>
+        <w:tc>
+          <w:tcPr>
+            <w:tcW w:w="3264" w:type="dxa"/>
             <w:tcBorders>
               <w:top w:val="single" w:sz="1" w:space="0" w:color="CCCCCC"/>
               <w:left w:val="single" w:sz="1" w:space="0" w:color="CCCCCC"/>
@@ -1307,7 +1435,7 @@
       <w:tr>
         <w:tc>
           <w:tcPr>
-            <w:tcW w:w="1392" w:type="dxa"/>
+            <w:tcW w:w="1304" w:type="dxa"/>
             <w:tcBorders>
               <w:top w:val="single" w:sz="1" w:space="0" w:color="CCCCCC"/>
               <w:left w:val="single" w:sz="1" w:space="0" w:color="CCCCCC"/>
@@ -1334,7 +1462,7 @@
         </w:tc>
         <w:tc>
           <w:tcPr>
-            <w:tcW w:w="4692" w:type="dxa"/>
+            <w:tcW w:w="4458" w:type="dxa"/>
             <w:tcBorders>
               <w:top w:val="single" w:sz="1" w:space="0" w:color="CCCCCC"/>
               <w:left w:val="single" w:sz="1" w:space="0" w:color="CCCCCC"/>
@@ -1355,13 +1483,109 @@
                 <w:sz w:val="20"/>
                 <w:szCs w:val="20"/>
               </w:rPr>
-              <w:t>Created BoardActor C++ class. Implemented GetBoardSpaces() to find and sort all 9 Static Mesh Components alphabetically, ensuring Element0=index 0 through Element8=index 8. Implemented GetSquareLocation(), SpawnPieceAtSquare(), ClearBoard(), and GameMode reference caching.</w:t>
-            </w:r>
-          </w:p>
-        </w:tc>
-        <w:tc>
-          <w:tcPr>
-            <w:tcW w:w="2942" w:type="dxa"/>
+              <w:t xml:space="preserve">Created </w:t>
+            </w:r>
+            <w:proofErr w:type="spellStart"/>
+            <w:r>
+              <w:rPr>
+                <w:sz w:val="20"/>
+                <w:szCs w:val="20"/>
+              </w:rPr>
+              <w:t>BoardActor</w:t>
+            </w:r>
+            <w:proofErr w:type="spellEnd"/>
+            <w:r>
+              <w:rPr>
+                <w:sz w:val="20"/>
+                <w:szCs w:val="20"/>
+              </w:rPr>
+              <w:t xml:space="preserve"> C++ class. Implemented </w:t>
+            </w:r>
+            <w:proofErr w:type="spellStart"/>
+            <w:r>
+              <w:rPr>
+                <w:sz w:val="20"/>
+                <w:szCs w:val="20"/>
+              </w:rPr>
+              <w:t>GetBoardSpaces</w:t>
+            </w:r>
+            <w:proofErr w:type="spellEnd"/>
+            <w:r>
+              <w:rPr>
+                <w:sz w:val="20"/>
+                <w:szCs w:val="20"/>
+              </w:rPr>
+              <w:t xml:space="preserve">() to find and sort all 9 Static Mesh Components alphabetically, ensuring Element0=index 0 through Element8=index 8. Implemented </w:t>
+            </w:r>
+            <w:proofErr w:type="spellStart"/>
+            <w:r>
+              <w:rPr>
+                <w:sz w:val="20"/>
+                <w:szCs w:val="20"/>
+              </w:rPr>
+              <w:t>GetSquareLocation</w:t>
+            </w:r>
+            <w:proofErr w:type="spellEnd"/>
+            <w:r>
+              <w:rPr>
+                <w:sz w:val="20"/>
+                <w:szCs w:val="20"/>
+              </w:rPr>
+              <w:t xml:space="preserve">(), </w:t>
+            </w:r>
+            <w:proofErr w:type="spellStart"/>
+            <w:r>
+              <w:rPr>
+                <w:sz w:val="20"/>
+                <w:szCs w:val="20"/>
+              </w:rPr>
+              <w:t>SpawnPieceAtSquare</w:t>
+            </w:r>
+            <w:proofErr w:type="spellEnd"/>
+            <w:r>
+              <w:rPr>
+                <w:sz w:val="20"/>
+                <w:szCs w:val="20"/>
+              </w:rPr>
+              <w:t xml:space="preserve">(), </w:t>
+            </w:r>
+            <w:proofErr w:type="spellStart"/>
+            <w:r>
+              <w:rPr>
+                <w:sz w:val="20"/>
+                <w:szCs w:val="20"/>
+              </w:rPr>
+              <w:t>ClearBoard</w:t>
+            </w:r>
+            <w:proofErr w:type="spellEnd"/>
+            <w:r>
+              <w:rPr>
+                <w:sz w:val="20"/>
+                <w:szCs w:val="20"/>
+              </w:rPr>
+              <w:t xml:space="preserve">(), and </w:t>
+            </w:r>
+            <w:proofErr w:type="spellStart"/>
+            <w:r>
+              <w:rPr>
+                <w:sz w:val="20"/>
+                <w:szCs w:val="20"/>
+              </w:rPr>
+              <w:t>GameMode</w:t>
+            </w:r>
+            <w:proofErr w:type="spellEnd"/>
+            <w:r>
+              <w:rPr>
+                <w:sz w:val="20"/>
+                <w:szCs w:val="20"/>
+              </w:rPr>
+              <w:t xml:space="preserve"> reference caching.</w:t>
+            </w:r>
+          </w:p>
+        </w:tc>
+        <w:tc>
+          <w:tcPr>
+            <w:tcW w:w="3264" w:type="dxa"/>
             <w:tcBorders>
               <w:top w:val="single" w:sz="1" w:space="0" w:color="CCCCCC"/>
               <w:left w:val="single" w:sz="1" w:space="0" w:color="CCCCCC"/>
@@ -1377,20 +1601,61 @@
             </w:tcMar>
           </w:tcPr>
           <w:p>
-            <w:r>
-              <w:rPr>
-                <w:sz w:val="20"/>
-                <w:szCs w:val="20"/>
-              </w:rPr>
-              <w:t>GetComponents() returned components in wrong order. Fixed using TArray Sort with a lambda comparing component names alphabetically. Circular dependency error fixed using forward declaration in GameMode header.</w:t>
-            </w:r>
-          </w:p>
-        </w:tc>
-      </w:tr>
-      <w:tr>
-        <w:tc>
-          <w:tcPr>
-            <w:tcW w:w="1392" w:type="dxa"/>
+            <w:proofErr w:type="spellStart"/>
+            <w:r>
+              <w:rPr>
+                <w:sz w:val="20"/>
+                <w:szCs w:val="20"/>
+              </w:rPr>
+              <w:t>GetComponents</w:t>
+            </w:r>
+            <w:proofErr w:type="spellEnd"/>
+            <w:r>
+              <w:rPr>
+                <w:sz w:val="20"/>
+                <w:szCs w:val="20"/>
+              </w:rPr>
+              <w:t xml:space="preserve">() returned components in wrong order. Fixed using </w:t>
+            </w:r>
+            <w:proofErr w:type="spellStart"/>
+            <w:r>
+              <w:rPr>
+                <w:sz w:val="20"/>
+                <w:szCs w:val="20"/>
+              </w:rPr>
+              <w:t>TArray</w:t>
+            </w:r>
+            <w:proofErr w:type="spellEnd"/>
+            <w:r>
+              <w:rPr>
+                <w:sz w:val="20"/>
+                <w:szCs w:val="20"/>
+              </w:rPr>
+              <w:t xml:space="preserve"> Sort with a lambda comparing component names alphabetically. Circular dependency error fixed using forward declaration in </w:t>
+            </w:r>
+            <w:proofErr w:type="spellStart"/>
+            <w:r>
+              <w:rPr>
+                <w:sz w:val="20"/>
+                <w:szCs w:val="20"/>
+              </w:rPr>
+              <w:t>GameMode</w:t>
+            </w:r>
+            <w:proofErr w:type="spellEnd"/>
+            <w:r>
+              <w:rPr>
+                <w:sz w:val="20"/>
+                <w:szCs w:val="20"/>
+              </w:rPr>
+              <w:t xml:space="preserve"> header.</w:t>
+            </w:r>
+          </w:p>
+        </w:tc>
+      </w:tr>
+      <w:tr>
+        <w:tc>
+          <w:tcPr>
+            <w:tcW w:w="1304" w:type="dxa"/>
             <w:tcBorders>
               <w:top w:val="single" w:sz="1" w:space="0" w:color="CCCCCC"/>
               <w:left w:val="single" w:sz="1" w:space="0" w:color="CCCCCC"/>
@@ -1417,7 +1682,7 @@
         </w:tc>
         <w:tc>
           <w:tcPr>
-            <w:tcW w:w="4692" w:type="dxa"/>
+            <w:tcW w:w="4458" w:type="dxa"/>
             <w:tcBorders>
               <w:top w:val="single" w:sz="1" w:space="0" w:color="CCCCCC"/>
               <w:left w:val="single" w:sz="1" w:space="0" w:color="CCCCCC"/>
@@ -1438,13 +1703,77 @@
                 <w:sz w:val="20"/>
                 <w:szCs w:val="20"/>
               </w:rPr>
-              <w:t>Wired up Blueprint input on BP_BoardPiece. Added OnClicked events for all 9 elements, each calling OnSquareClicked with the correct index. Enabled click and touch events on PlayerController via C++.</w:t>
-            </w:r>
-          </w:p>
-        </w:tc>
-        <w:tc>
-          <w:tcPr>
-            <w:tcW w:w="2942" w:type="dxa"/>
+              <w:t xml:space="preserve">Wired up Blueprint input on </w:t>
+            </w:r>
+            <w:proofErr w:type="spellStart"/>
+            <w:r>
+              <w:rPr>
+                <w:sz w:val="20"/>
+                <w:szCs w:val="20"/>
+              </w:rPr>
+              <w:t>BP_BoardPiece</w:t>
+            </w:r>
+            <w:proofErr w:type="spellEnd"/>
+            <w:r>
+              <w:rPr>
+                <w:sz w:val="20"/>
+                <w:szCs w:val="20"/>
+              </w:rPr>
+              <w:t xml:space="preserve">. Added </w:t>
+            </w:r>
+            <w:proofErr w:type="spellStart"/>
+            <w:r>
+              <w:rPr>
+                <w:sz w:val="20"/>
+                <w:szCs w:val="20"/>
+              </w:rPr>
+              <w:t>OnClicked</w:t>
+            </w:r>
+            <w:proofErr w:type="spellEnd"/>
+            <w:r>
+              <w:rPr>
+                <w:sz w:val="20"/>
+                <w:szCs w:val="20"/>
+              </w:rPr>
+              <w:t xml:space="preserve"> events for all 9 elements, each calling </w:t>
+            </w:r>
+            <w:proofErr w:type="spellStart"/>
+            <w:r>
+              <w:rPr>
+                <w:sz w:val="20"/>
+                <w:szCs w:val="20"/>
+              </w:rPr>
+              <w:t>OnSquareClicked</w:t>
+            </w:r>
+            <w:proofErr w:type="spellEnd"/>
+            <w:r>
+              <w:rPr>
+                <w:sz w:val="20"/>
+                <w:szCs w:val="20"/>
+              </w:rPr>
+              <w:t xml:space="preserve"> with the correct index. Enabled click and touch events on </w:t>
+            </w:r>
+            <w:proofErr w:type="spellStart"/>
+            <w:r>
+              <w:rPr>
+                <w:sz w:val="20"/>
+                <w:szCs w:val="20"/>
+              </w:rPr>
+              <w:t>PlayerController</w:t>
+            </w:r>
+            <w:proofErr w:type="spellEnd"/>
+            <w:r>
+              <w:rPr>
+                <w:sz w:val="20"/>
+                <w:szCs w:val="20"/>
+              </w:rPr>
+              <w:t xml:space="preserve"> via C++.</w:t>
+            </w:r>
+          </w:p>
+        </w:tc>
+        <w:tc>
+          <w:tcPr>
+            <w:tcW w:w="3264" w:type="dxa"/>
             <w:tcBorders>
               <w:top w:val="single" w:sz="1" w:space="0" w:color="CCCCCC"/>
               <w:left w:val="single" w:sz="1" w:space="0" w:color="CCCCCC"/>
@@ -1465,15 +1794,95 @@
                 <w:sz w:val="20"/>
                 <w:szCs w:val="20"/>
               </w:rPr>
-              <w:t>Mouse was moving camera instead of registering clicks. Fixed by setting input mode to GameAndUI and enabling bEnableClickEvents, bEnableTouchEvents, bEnableMouseOverEvents on the PlayerController.</w:t>
-            </w:r>
-          </w:p>
-        </w:tc>
-      </w:tr>
-      <w:tr>
-        <w:tc>
-          <w:tcPr>
-            <w:tcW w:w="1392" w:type="dxa"/>
+              <w:t xml:space="preserve">Mouse was moving camera instead of registering clicks. Fixed by setting input mode to </w:t>
+            </w:r>
+            <w:proofErr w:type="spellStart"/>
+            <w:r>
+              <w:rPr>
+                <w:sz w:val="20"/>
+                <w:szCs w:val="20"/>
+              </w:rPr>
+              <w:t>GameAndUI</w:t>
+            </w:r>
+            <w:proofErr w:type="spellEnd"/>
+            <w:r>
+              <w:rPr>
+                <w:sz w:val="20"/>
+                <w:szCs w:val="20"/>
+              </w:rPr>
+              <w:t xml:space="preserve"> and enabling </w:t>
+            </w:r>
+            <w:proofErr w:type="spellStart"/>
+            <w:r>
+              <w:rPr>
+                <w:sz w:val="20"/>
+                <w:szCs w:val="20"/>
+              </w:rPr>
+              <w:t>bEnableClickEvents</w:t>
+            </w:r>
+            <w:proofErr w:type="spellEnd"/>
+            <w:r>
+              <w:rPr>
+                <w:sz w:val="20"/>
+                <w:szCs w:val="20"/>
+              </w:rPr>
+              <w:t xml:space="preserve">, </w:t>
+            </w:r>
+            <w:proofErr w:type="spellStart"/>
+            <w:r>
+              <w:rPr>
+                <w:sz w:val="20"/>
+                <w:szCs w:val="20"/>
+              </w:rPr>
+              <w:t>bEnableTouchEvents</w:t>
+            </w:r>
+            <w:proofErr w:type="spellEnd"/>
+            <w:r>
+              <w:rPr>
+                <w:sz w:val="20"/>
+                <w:szCs w:val="20"/>
+              </w:rPr>
+              <w:t xml:space="preserve">, </w:t>
+            </w:r>
+            <w:proofErr w:type="spellStart"/>
+            <w:r>
+              <w:rPr>
+                <w:sz w:val="20"/>
+                <w:szCs w:val="20"/>
+              </w:rPr>
+              <w:t>bEnableMouseOverEvents</w:t>
+            </w:r>
+            <w:proofErr w:type="spellEnd"/>
+            <w:r>
+              <w:rPr>
+                <w:sz w:val="20"/>
+                <w:szCs w:val="20"/>
+              </w:rPr>
+              <w:t xml:space="preserve"> on the </w:t>
+            </w:r>
+            <w:proofErr w:type="spellStart"/>
+            <w:r>
+              <w:rPr>
+                <w:sz w:val="20"/>
+                <w:szCs w:val="20"/>
+              </w:rPr>
+              <w:t>PlayerController</w:t>
+            </w:r>
+            <w:proofErr w:type="spellEnd"/>
+            <w:r>
+              <w:rPr>
+                <w:sz w:val="20"/>
+                <w:szCs w:val="20"/>
+              </w:rPr>
+              <w:t>.</w:t>
+            </w:r>
+          </w:p>
+        </w:tc>
+      </w:tr>
+      <w:tr>
+        <w:tc>
+          <w:tcPr>
+            <w:tcW w:w="1304" w:type="dxa"/>
             <w:tcBorders>
               <w:top w:val="single" w:sz="1" w:space="0" w:color="CCCCCC"/>
               <w:left w:val="single" w:sz="1" w:space="0" w:color="CCCCCC"/>
@@ -1500,7 +1909,7 @@
         </w:tc>
         <w:tc>
           <w:tcPr>
-            <w:tcW w:w="4692" w:type="dxa"/>
+            <w:tcW w:w="4458" w:type="dxa"/>
             <w:tcBorders>
               <w:top w:val="single" w:sz="1" w:space="0" w:color="CCCCCC"/>
               <w:left w:val="single" w:sz="1" w:space="0" w:color="CCCCCC"/>
@@ -1521,13 +1930,77 @@
                 <w:sz w:val="20"/>
                 <w:szCs w:val="20"/>
               </w:rPr>
-              <w:t>Set up fixed top-down camera. Placed CameraActor in level at -90 pitch. Added SetCameraSettings() to GameMode. Refactored BeginPlay into separate functions for cleaner code. Verified win and draw conditions working correctly end to end.</w:t>
-            </w:r>
-          </w:p>
-        </w:tc>
-        <w:tc>
-          <w:tcPr>
-            <w:tcW w:w="2942" w:type="dxa"/>
+              <w:t xml:space="preserve">Set up fixed top-down camera. Placed </w:t>
+            </w:r>
+            <w:proofErr w:type="spellStart"/>
+            <w:r>
+              <w:rPr>
+                <w:sz w:val="20"/>
+                <w:szCs w:val="20"/>
+              </w:rPr>
+              <w:t>CameraActor</w:t>
+            </w:r>
+            <w:proofErr w:type="spellEnd"/>
+            <w:r>
+              <w:rPr>
+                <w:sz w:val="20"/>
+                <w:szCs w:val="20"/>
+              </w:rPr>
+              <w:t xml:space="preserve"> in level at -90 pitch. Added </w:t>
+            </w:r>
+            <w:proofErr w:type="spellStart"/>
+            <w:r>
+              <w:rPr>
+                <w:sz w:val="20"/>
+                <w:szCs w:val="20"/>
+              </w:rPr>
+              <w:t>SetCameraSettings</w:t>
+            </w:r>
+            <w:proofErr w:type="spellEnd"/>
+            <w:r>
+              <w:rPr>
+                <w:sz w:val="20"/>
+                <w:szCs w:val="20"/>
+              </w:rPr>
+              <w:t xml:space="preserve">() to </w:t>
+            </w:r>
+            <w:proofErr w:type="spellStart"/>
+            <w:r>
+              <w:rPr>
+                <w:sz w:val="20"/>
+                <w:szCs w:val="20"/>
+              </w:rPr>
+              <w:t>GameMode</w:t>
+            </w:r>
+            <w:proofErr w:type="spellEnd"/>
+            <w:r>
+              <w:rPr>
+                <w:sz w:val="20"/>
+                <w:szCs w:val="20"/>
+              </w:rPr>
+              <w:t xml:space="preserve">. Refactored </w:t>
+            </w:r>
+            <w:proofErr w:type="spellStart"/>
+            <w:r>
+              <w:rPr>
+                <w:sz w:val="20"/>
+                <w:szCs w:val="20"/>
+              </w:rPr>
+              <w:t>BeginPlay</w:t>
+            </w:r>
+            <w:proofErr w:type="spellEnd"/>
+            <w:r>
+              <w:rPr>
+                <w:sz w:val="20"/>
+                <w:szCs w:val="20"/>
+              </w:rPr>
+              <w:t xml:space="preserve"> into separate functions for cleaner code. Verified win and draw conditions working correctly end to end.</w:t>
+            </w:r>
+          </w:p>
+        </w:tc>
+        <w:tc>
+          <w:tcPr>
+            <w:tcW w:w="3264" w:type="dxa"/>
             <w:tcBorders>
               <w:top w:val="single" w:sz="1" w:space="0" w:color="CCCCCC"/>
               <w:left w:val="single" w:sz="1" w:space="0" w:color="CCCCCC"/>
@@ -1556,7 +2029,7 @@
       <w:tr>
         <w:tc>
           <w:tcPr>
-            <w:tcW w:w="1392" w:type="dxa"/>
+            <w:tcW w:w="1304" w:type="dxa"/>
             <w:tcBorders>
               <w:top w:val="single" w:sz="1" w:space="0" w:color="CCCCCC"/>
               <w:left w:val="single" w:sz="1" w:space="0" w:color="CCCCCC"/>
@@ -1583,7 +2056,7 @@
         </w:tc>
         <w:tc>
           <w:tcPr>
-            <w:tcW w:w="4692" w:type="dxa"/>
+            <w:tcW w:w="4458" w:type="dxa"/>
             <w:tcBorders>
               <w:top w:val="single" w:sz="1" w:space="0" w:color="CCCCCC"/>
               <w:left w:val="single" w:sz="1" w:space="0" w:color="CCCCCC"/>
@@ -1604,13 +2077,109 @@
                 <w:sz w:val="20"/>
                 <w:szCs w:val="20"/>
               </w:rPr>
-              <w:t>Created WBP_GameUI widget. Added TurnText (top), ResultText (centre), and RestartButton (bottom). Set ResultText and RestartButton visibility to Hidden by default. Began wiring UI logic in Blueprint Event Graph.</w:t>
-            </w:r>
-          </w:p>
-        </w:tc>
-        <w:tc>
-          <w:tcPr>
-            <w:tcW w:w="2942" w:type="dxa"/>
+              <w:t xml:space="preserve">Created </w:t>
+            </w:r>
+            <w:proofErr w:type="spellStart"/>
+            <w:r>
+              <w:rPr>
+                <w:sz w:val="20"/>
+                <w:szCs w:val="20"/>
+              </w:rPr>
+              <w:t>WBP_GameUI</w:t>
+            </w:r>
+            <w:proofErr w:type="spellEnd"/>
+            <w:r>
+              <w:rPr>
+                <w:sz w:val="20"/>
+                <w:szCs w:val="20"/>
+              </w:rPr>
+              <w:t xml:space="preserve"> widget. Added </w:t>
+            </w:r>
+            <w:proofErr w:type="spellStart"/>
+            <w:r>
+              <w:rPr>
+                <w:sz w:val="20"/>
+                <w:szCs w:val="20"/>
+              </w:rPr>
+              <w:t>TurnText</w:t>
+            </w:r>
+            <w:proofErr w:type="spellEnd"/>
+            <w:r>
+              <w:rPr>
+                <w:sz w:val="20"/>
+                <w:szCs w:val="20"/>
+              </w:rPr>
+              <w:t xml:space="preserve"> (top), </w:t>
+            </w:r>
+            <w:proofErr w:type="spellStart"/>
+            <w:r>
+              <w:rPr>
+                <w:sz w:val="20"/>
+                <w:szCs w:val="20"/>
+              </w:rPr>
+              <w:t>ResultText</w:t>
+            </w:r>
+            <w:proofErr w:type="spellEnd"/>
+            <w:r>
+              <w:rPr>
+                <w:sz w:val="20"/>
+                <w:szCs w:val="20"/>
+              </w:rPr>
+              <w:t xml:space="preserve"> (centre), and </w:t>
+            </w:r>
+            <w:proofErr w:type="spellStart"/>
+            <w:r>
+              <w:rPr>
+                <w:sz w:val="20"/>
+                <w:szCs w:val="20"/>
+              </w:rPr>
+              <w:t>RestartButton</w:t>
+            </w:r>
+            <w:proofErr w:type="spellEnd"/>
+            <w:r>
+              <w:rPr>
+                <w:sz w:val="20"/>
+                <w:szCs w:val="20"/>
+              </w:rPr>
+              <w:t xml:space="preserve"> (bottom). Set </w:t>
+            </w:r>
+            <w:proofErr w:type="spellStart"/>
+            <w:r>
+              <w:rPr>
+                <w:sz w:val="20"/>
+                <w:szCs w:val="20"/>
+              </w:rPr>
+              <w:t>ResultText</w:t>
+            </w:r>
+            <w:proofErr w:type="spellEnd"/>
+            <w:r>
+              <w:rPr>
+                <w:sz w:val="20"/>
+                <w:szCs w:val="20"/>
+              </w:rPr>
+              <w:t xml:space="preserve"> and </w:t>
+            </w:r>
+            <w:proofErr w:type="spellStart"/>
+            <w:r>
+              <w:rPr>
+                <w:sz w:val="20"/>
+                <w:szCs w:val="20"/>
+              </w:rPr>
+              <w:t>RestartButton</w:t>
+            </w:r>
+            <w:proofErr w:type="spellEnd"/>
+            <w:r>
+              <w:rPr>
+                <w:sz w:val="20"/>
+                <w:szCs w:val="20"/>
+              </w:rPr>
+              <w:t xml:space="preserve"> visibility to Hidden by default. Began wiring UI logic in Blueprint Event Graph.</w:t>
+            </w:r>
+          </w:p>
+        </w:tc>
+        <w:tc>
+          <w:tcPr>
+            <w:tcW w:w="3264" w:type="dxa"/>
             <w:tcBorders>
               <w:top w:val="single" w:sz="1" w:space="0" w:color="CCCCCC"/>
               <w:left w:val="single" w:sz="1" w:space="0" w:color="CCCCCC"/>
@@ -1639,7 +2208,7 @@
       <w:tr>
         <w:tc>
           <w:tcPr>
-            <w:tcW w:w="1392" w:type="dxa"/>
+            <w:tcW w:w="1304" w:type="dxa"/>
             <w:tcBorders>
               <w:top w:val="single" w:sz="1" w:space="0" w:color="CCCCCC"/>
               <w:left w:val="single" w:sz="1" w:space="0" w:color="CCCCCC"/>
@@ -1667,7 +2236,7 @@
         </w:tc>
         <w:tc>
           <w:tcPr>
-            <w:tcW w:w="4692" w:type="dxa"/>
+            <w:tcW w:w="4458" w:type="dxa"/>
             <w:tcBorders>
               <w:top w:val="single" w:sz="1" w:space="0" w:color="CCCCCC"/>
               <w:left w:val="single" w:sz="1" w:space="0" w:color="CCCCCC"/>
@@ -1688,13 +2257,157 @@
                 <w:sz w:val="20"/>
                 <w:szCs w:val="20"/>
               </w:rPr>
-              <w:t>Resumed project after a break. Added UMG module dependency to TicTacToe.Build.cs to resolve linker errors for UUserWidget. Added GameUIClass (TSubclassOf&lt;UUserWidget&gt;) and GameUIInstance (UUserWidget*) to GameMode header. Implemented SetupUI() in C++ to create and add widget to viewport.</w:t>
-            </w:r>
-          </w:p>
-        </w:tc>
-        <w:tc>
-          <w:tcPr>
-            <w:tcW w:w="2942" w:type="dxa"/>
+              <w:t xml:space="preserve">Resumed project after a break. Added UMG module dependency to </w:t>
+            </w:r>
+            <w:proofErr w:type="spellStart"/>
+            <w:r>
+              <w:rPr>
+                <w:sz w:val="20"/>
+                <w:szCs w:val="20"/>
+              </w:rPr>
+              <w:t>TicTacToe.Build.cs</w:t>
+            </w:r>
+            <w:proofErr w:type="spellEnd"/>
+            <w:r>
+              <w:rPr>
+                <w:sz w:val="20"/>
+                <w:szCs w:val="20"/>
+              </w:rPr>
+              <w:t xml:space="preserve"> to resolve linker errors for </w:t>
+            </w:r>
+            <w:proofErr w:type="spellStart"/>
+            <w:r>
+              <w:rPr>
+                <w:sz w:val="20"/>
+                <w:szCs w:val="20"/>
+              </w:rPr>
+              <w:t>UUserWidget</w:t>
+            </w:r>
+            <w:proofErr w:type="spellEnd"/>
+            <w:r>
+              <w:rPr>
+                <w:sz w:val="20"/>
+                <w:szCs w:val="20"/>
+              </w:rPr>
+              <w:t xml:space="preserve">. Added </w:t>
+            </w:r>
+            <w:proofErr w:type="spellStart"/>
+            <w:r>
+              <w:rPr>
+                <w:sz w:val="20"/>
+                <w:szCs w:val="20"/>
+              </w:rPr>
+              <w:t>GameUIClass</w:t>
+            </w:r>
+            <w:proofErr w:type="spellEnd"/>
+            <w:r>
+              <w:rPr>
+                <w:sz w:val="20"/>
+                <w:szCs w:val="20"/>
+              </w:rPr>
+              <w:t xml:space="preserve"> (</w:t>
+            </w:r>
+            <w:proofErr w:type="spellStart"/>
+            <w:r>
+              <w:rPr>
+                <w:sz w:val="20"/>
+                <w:szCs w:val="20"/>
+              </w:rPr>
+              <w:t>TSubclassOf</w:t>
+            </w:r>
+            <w:proofErr w:type="spellEnd"/>
+            <w:r>
+              <w:rPr>
+                <w:sz w:val="20"/>
+                <w:szCs w:val="20"/>
+              </w:rPr>
+              <w:t>&lt;</w:t>
+            </w:r>
+            <w:proofErr w:type="spellStart"/>
+            <w:r>
+              <w:rPr>
+                <w:sz w:val="20"/>
+                <w:szCs w:val="20"/>
+              </w:rPr>
+              <w:t>UUserWidget</w:t>
+            </w:r>
+            <w:proofErr w:type="spellEnd"/>
+            <w:r>
+              <w:rPr>
+                <w:sz w:val="20"/>
+                <w:szCs w:val="20"/>
+              </w:rPr>
+              <w:t xml:space="preserve">&gt;) and </w:t>
+            </w:r>
+            <w:proofErr w:type="spellStart"/>
+            <w:r>
+              <w:rPr>
+                <w:sz w:val="20"/>
+                <w:szCs w:val="20"/>
+              </w:rPr>
+              <w:t>GameUIInstance</w:t>
+            </w:r>
+            <w:proofErr w:type="spellEnd"/>
+            <w:r>
+              <w:rPr>
+                <w:sz w:val="20"/>
+                <w:szCs w:val="20"/>
+              </w:rPr>
+              <w:t xml:space="preserve"> (</w:t>
+            </w:r>
+            <w:proofErr w:type="spellStart"/>
+            <w:r>
+              <w:rPr>
+                <w:sz w:val="20"/>
+                <w:szCs w:val="20"/>
+              </w:rPr>
+              <w:t>UUserWidget</w:t>
+            </w:r>
+            <w:proofErr w:type="spellEnd"/>
+            <w:r>
+              <w:rPr>
+                <w:sz w:val="20"/>
+                <w:szCs w:val="20"/>
+              </w:rPr>
+              <w:t xml:space="preserve">*) to </w:t>
+            </w:r>
+            <w:proofErr w:type="spellStart"/>
+            <w:r>
+              <w:rPr>
+                <w:sz w:val="20"/>
+                <w:szCs w:val="20"/>
+              </w:rPr>
+              <w:t>GameMode</w:t>
+            </w:r>
+            <w:proofErr w:type="spellEnd"/>
+            <w:r>
+              <w:rPr>
+                <w:sz w:val="20"/>
+                <w:szCs w:val="20"/>
+              </w:rPr>
+              <w:t xml:space="preserve"> header. Implemented </w:t>
+            </w:r>
+            <w:proofErr w:type="spellStart"/>
+            <w:r>
+              <w:rPr>
+                <w:sz w:val="20"/>
+                <w:szCs w:val="20"/>
+              </w:rPr>
+              <w:t>SetupUI</w:t>
+            </w:r>
+            <w:proofErr w:type="spellEnd"/>
+            <w:r>
+              <w:rPr>
+                <w:sz w:val="20"/>
+                <w:szCs w:val="20"/>
+              </w:rPr>
+              <w:t>() in C++ to create and add widget to viewport.</w:t>
+            </w:r>
+          </w:p>
+        </w:tc>
+        <w:tc>
+          <w:tcPr>
+            <w:tcW w:w="3264" w:type="dxa"/>
             <w:tcBorders>
               <w:top w:val="single" w:sz="1" w:space="0" w:color="CCCCCC"/>
               <w:left w:val="single" w:sz="1" w:space="0" w:color="CCCCCC"/>
@@ -1715,15 +2428,111 @@
                 <w:sz w:val="20"/>
                 <w:szCs w:val="20"/>
               </w:rPr>
-              <w:t>LNK2019 linker errors for UUserWidget — fixed by adding UMG to PublicDependencyModuleNames in Build.cs. GameUIClass not visible in Project Settings — resolved by creating BP_TicTacToeGameMode Blueprint and setting it as default GameMode.</w:t>
-            </w:r>
-          </w:p>
-        </w:tc>
-      </w:tr>
-      <w:tr>
-        <w:tc>
-          <w:tcPr>
-            <w:tcW w:w="1392" w:type="dxa"/>
+              <w:t xml:space="preserve">LNK2019 linker errors for </w:t>
+            </w:r>
+            <w:proofErr w:type="spellStart"/>
+            <w:r>
+              <w:rPr>
+                <w:sz w:val="20"/>
+                <w:szCs w:val="20"/>
+              </w:rPr>
+              <w:t>UUserWidget</w:t>
+            </w:r>
+            <w:proofErr w:type="spellEnd"/>
+            <w:r>
+              <w:rPr>
+                <w:sz w:val="20"/>
+                <w:szCs w:val="20"/>
+              </w:rPr>
+              <w:t xml:space="preserve"> — fixed by adding UMG to </w:t>
+            </w:r>
+            <w:proofErr w:type="spellStart"/>
+            <w:r>
+              <w:rPr>
+                <w:sz w:val="20"/>
+                <w:szCs w:val="20"/>
+              </w:rPr>
+              <w:t>PublicDependencyModuleNames</w:t>
+            </w:r>
+            <w:proofErr w:type="spellEnd"/>
+            <w:r>
+              <w:rPr>
+                <w:sz w:val="20"/>
+                <w:szCs w:val="20"/>
+              </w:rPr>
+              <w:t xml:space="preserve"> in </w:t>
+            </w:r>
+            <w:proofErr w:type="spellStart"/>
+            <w:r>
+              <w:rPr>
+                <w:sz w:val="20"/>
+                <w:szCs w:val="20"/>
+              </w:rPr>
+              <w:t>Build.cs</w:t>
+            </w:r>
+            <w:proofErr w:type="spellEnd"/>
+            <w:r>
+              <w:rPr>
+                <w:sz w:val="20"/>
+                <w:szCs w:val="20"/>
+              </w:rPr>
+              <w:t xml:space="preserve">. </w:t>
+            </w:r>
+            <w:proofErr w:type="spellStart"/>
+            <w:r>
+              <w:rPr>
+                <w:sz w:val="20"/>
+                <w:szCs w:val="20"/>
+              </w:rPr>
+              <w:t>GameUIClass</w:t>
+            </w:r>
+            <w:proofErr w:type="spellEnd"/>
+            <w:r>
+              <w:rPr>
+                <w:sz w:val="20"/>
+                <w:szCs w:val="20"/>
+              </w:rPr>
+              <w:t xml:space="preserve"> not visible in Project Settings — resolved by creating </w:t>
+            </w:r>
+            <w:proofErr w:type="spellStart"/>
+            <w:r>
+              <w:rPr>
+                <w:sz w:val="20"/>
+                <w:szCs w:val="20"/>
+              </w:rPr>
+              <w:t>BP_TicTacToeGameMode</w:t>
+            </w:r>
+            <w:proofErr w:type="spellEnd"/>
+            <w:r>
+              <w:rPr>
+                <w:sz w:val="20"/>
+                <w:szCs w:val="20"/>
+              </w:rPr>
+              <w:t xml:space="preserve"> Blueprint and setting it as default </w:t>
+            </w:r>
+            <w:proofErr w:type="spellStart"/>
+            <w:r>
+              <w:rPr>
+                <w:sz w:val="20"/>
+                <w:szCs w:val="20"/>
+              </w:rPr>
+              <w:t>GameMode</w:t>
+            </w:r>
+            <w:proofErr w:type="spellEnd"/>
+            <w:r>
+              <w:rPr>
+                <w:sz w:val="20"/>
+                <w:szCs w:val="20"/>
+              </w:rPr>
+              <w:t>.</w:t>
+            </w:r>
+          </w:p>
+        </w:tc>
+      </w:tr>
+      <w:tr>
+        <w:tc>
+          <w:tcPr>
+            <w:tcW w:w="1304" w:type="dxa"/>
             <w:tcBorders>
               <w:top w:val="single" w:sz="1" w:space="0" w:color="CCCCCC"/>
               <w:left w:val="single" w:sz="1" w:space="0" w:color="CCCCCC"/>
@@ -1750,7 +2559,7 @@
         </w:tc>
         <w:tc>
           <w:tcPr>
-            <w:tcW w:w="4692" w:type="dxa"/>
+            <w:tcW w:w="4458" w:type="dxa"/>
             <w:tcBorders>
               <w:top w:val="single" w:sz="1" w:space="0" w:color="CCCCCC"/>
               <w:left w:val="single" w:sz="1" w:space="0" w:color="CCCCCC"/>
@@ -1771,13 +2580,77 @@
                 <w:sz w:val="20"/>
                 <w:szCs w:val="20"/>
               </w:rPr>
-              <w:t>Refactored widget creation from C++ to Blueprint. Widget now created entirely in BP_TicTacToeGameMode BeginPlay using Create Widget node, added to viewport, and stored as typed GameUI variable. This eliminated timing issues with GameUIInstance being null when Blueprint tried to access it.</w:t>
-            </w:r>
-          </w:p>
-        </w:tc>
-        <w:tc>
-          <w:tcPr>
-            <w:tcW w:w="2942" w:type="dxa"/>
+              <w:t xml:space="preserve">Refactored widget creation from C++ to Blueprint. Widget now created entirely in </w:t>
+            </w:r>
+            <w:proofErr w:type="spellStart"/>
+            <w:r>
+              <w:rPr>
+                <w:sz w:val="20"/>
+                <w:szCs w:val="20"/>
+              </w:rPr>
+              <w:t>BP_TicTacToeGameMode</w:t>
+            </w:r>
+            <w:proofErr w:type="spellEnd"/>
+            <w:r>
+              <w:rPr>
+                <w:sz w:val="20"/>
+                <w:szCs w:val="20"/>
+              </w:rPr>
+              <w:t xml:space="preserve"> </w:t>
+            </w:r>
+            <w:proofErr w:type="spellStart"/>
+            <w:r>
+              <w:rPr>
+                <w:sz w:val="20"/>
+                <w:szCs w:val="20"/>
+              </w:rPr>
+              <w:t>BeginPlay</w:t>
+            </w:r>
+            <w:proofErr w:type="spellEnd"/>
+            <w:r>
+              <w:rPr>
+                <w:sz w:val="20"/>
+                <w:szCs w:val="20"/>
+              </w:rPr>
+              <w:t xml:space="preserve"> using Create Widget node, added to viewport, and stored as typed </w:t>
+            </w:r>
+            <w:proofErr w:type="spellStart"/>
+            <w:r>
+              <w:rPr>
+                <w:sz w:val="20"/>
+                <w:szCs w:val="20"/>
+              </w:rPr>
+              <w:t>GameUI</w:t>
+            </w:r>
+            <w:proofErr w:type="spellEnd"/>
+            <w:r>
+              <w:rPr>
+                <w:sz w:val="20"/>
+                <w:szCs w:val="20"/>
+              </w:rPr>
+              <w:t xml:space="preserve"> variable. This eliminated timing issues with </w:t>
+            </w:r>
+            <w:proofErr w:type="spellStart"/>
+            <w:r>
+              <w:rPr>
+                <w:sz w:val="20"/>
+                <w:szCs w:val="20"/>
+              </w:rPr>
+              <w:t>GameUIInstance</w:t>
+            </w:r>
+            <w:proofErr w:type="spellEnd"/>
+            <w:r>
+              <w:rPr>
+                <w:sz w:val="20"/>
+                <w:szCs w:val="20"/>
+              </w:rPr>
+              <w:t xml:space="preserve"> being null when Blueprint tried to access it.</w:t>
+            </w:r>
+          </w:p>
+        </w:tc>
+        <w:tc>
+          <w:tcPr>
+            <w:tcW w:w="3264" w:type="dxa"/>
             <w:tcBorders>
               <w:top w:val="single" w:sz="1" w:space="0" w:color="CCCCCC"/>
               <w:left w:val="single" w:sz="1" w:space="0" w:color="CCCCCC"/>
@@ -1798,15 +2671,79 @@
                 <w:sz w:val="20"/>
                 <w:szCs w:val="20"/>
               </w:rPr>
-              <w:t>Cast from GameUIInstance to WBP_GameUI was failing due to timing — C++ SetupUI had not yet run when Blueprint BeginPlay tried to access it. Solved by moving widget creation entirely to Blueprint, removing the C++ dependency.</w:t>
-            </w:r>
-          </w:p>
-        </w:tc>
-      </w:tr>
-      <w:tr>
-        <w:tc>
-          <w:tcPr>
-            <w:tcW w:w="1392" w:type="dxa"/>
+              <w:t xml:space="preserve">Cast from </w:t>
+            </w:r>
+            <w:proofErr w:type="spellStart"/>
+            <w:r>
+              <w:rPr>
+                <w:sz w:val="20"/>
+                <w:szCs w:val="20"/>
+              </w:rPr>
+              <w:t>GameUIInstance</w:t>
+            </w:r>
+            <w:proofErr w:type="spellEnd"/>
+            <w:r>
+              <w:rPr>
+                <w:sz w:val="20"/>
+                <w:szCs w:val="20"/>
+              </w:rPr>
+              <w:t xml:space="preserve"> to </w:t>
+            </w:r>
+            <w:proofErr w:type="spellStart"/>
+            <w:r>
+              <w:rPr>
+                <w:sz w:val="20"/>
+                <w:szCs w:val="20"/>
+              </w:rPr>
+              <w:t>WBP_GameUI</w:t>
+            </w:r>
+            <w:proofErr w:type="spellEnd"/>
+            <w:r>
+              <w:rPr>
+                <w:sz w:val="20"/>
+                <w:szCs w:val="20"/>
+              </w:rPr>
+              <w:t xml:space="preserve"> was failing due to timing — C++ </w:t>
+            </w:r>
+            <w:proofErr w:type="spellStart"/>
+            <w:r>
+              <w:rPr>
+                <w:sz w:val="20"/>
+                <w:szCs w:val="20"/>
+              </w:rPr>
+              <w:t>SetupUI</w:t>
+            </w:r>
+            <w:proofErr w:type="spellEnd"/>
+            <w:r>
+              <w:rPr>
+                <w:sz w:val="20"/>
+                <w:szCs w:val="20"/>
+              </w:rPr>
+              <w:t xml:space="preserve"> had not yet run when Blueprint </w:t>
+            </w:r>
+            <w:proofErr w:type="spellStart"/>
+            <w:r>
+              <w:rPr>
+                <w:sz w:val="20"/>
+                <w:szCs w:val="20"/>
+              </w:rPr>
+              <w:t>BeginPlay</w:t>
+            </w:r>
+            <w:proofErr w:type="spellEnd"/>
+            <w:r>
+              <w:rPr>
+                <w:sz w:val="20"/>
+                <w:szCs w:val="20"/>
+              </w:rPr>
+              <w:t xml:space="preserve"> tried to access it. Solved by moving widget creation entirely to Blueprint, removing the C++ dependency.</w:t>
+            </w:r>
+          </w:p>
+        </w:tc>
+      </w:tr>
+      <w:tr>
+        <w:tc>
+          <w:tcPr>
+            <w:tcW w:w="1304" w:type="dxa"/>
             <w:tcBorders>
               <w:top w:val="single" w:sz="1" w:space="0" w:color="CCCCCC"/>
               <w:left w:val="single" w:sz="1" w:space="0" w:color="CCCCCC"/>
@@ -1833,7 +2770,7 @@
         </w:tc>
         <w:tc>
           <w:tcPr>
-            <w:tcW w:w="4692" w:type="dxa"/>
+            <w:tcW w:w="4458" w:type="dxa"/>
             <w:tcBorders>
               <w:top w:val="single" w:sz="1" w:space="0" w:color="CCCCCC"/>
               <w:left w:val="single" w:sz="1" w:space="0" w:color="CCCCCC"/>
@@ -1854,13 +2791,125 @@
                 <w:sz w:val="20"/>
                 <w:szCs w:val="20"/>
               </w:rPr>
-              <w:t xml:space="preserve">Implemented BlueprintImplementableEvent functions in GameMode: UpdateTurnDisplay(Player), UpdateGameOverDisplay(WinningPlayer), UpdateRestartDisplay(). These replace the earlier OnGameStateChanged approach with more specific, data-driven events. </w:t>
-            </w:r>
-          </w:p>
-        </w:tc>
-        <w:tc>
-          <w:tcPr>
-            <w:tcW w:w="2942" w:type="dxa"/>
+              <w:t xml:space="preserve">Implemented </w:t>
+            </w:r>
+            <w:proofErr w:type="spellStart"/>
+            <w:r>
+              <w:rPr>
+                <w:sz w:val="20"/>
+                <w:szCs w:val="20"/>
+              </w:rPr>
+              <w:t>BlueprintImplementableEvent</w:t>
+            </w:r>
+            <w:proofErr w:type="spellEnd"/>
+            <w:r>
+              <w:rPr>
+                <w:sz w:val="20"/>
+                <w:szCs w:val="20"/>
+              </w:rPr>
+              <w:t xml:space="preserve"> functions in </w:t>
+            </w:r>
+            <w:proofErr w:type="spellStart"/>
+            <w:r>
+              <w:rPr>
+                <w:sz w:val="20"/>
+                <w:szCs w:val="20"/>
+              </w:rPr>
+              <w:t>GameMode</w:t>
+            </w:r>
+            <w:proofErr w:type="spellEnd"/>
+            <w:r>
+              <w:rPr>
+                <w:sz w:val="20"/>
+                <w:szCs w:val="20"/>
+              </w:rPr>
+              <w:t xml:space="preserve">: </w:t>
+            </w:r>
+            <w:proofErr w:type="spellStart"/>
+            <w:r>
+              <w:rPr>
+                <w:sz w:val="20"/>
+                <w:szCs w:val="20"/>
+              </w:rPr>
+              <w:t>UpdateTurnDisplay</w:t>
+            </w:r>
+            <w:proofErr w:type="spellEnd"/>
+            <w:r>
+              <w:rPr>
+                <w:sz w:val="20"/>
+                <w:szCs w:val="20"/>
+              </w:rPr>
+              <w:t xml:space="preserve">(Player), </w:t>
+            </w:r>
+            <w:proofErr w:type="spellStart"/>
+            <w:r>
+              <w:rPr>
+                <w:sz w:val="20"/>
+                <w:szCs w:val="20"/>
+              </w:rPr>
+              <w:t>UpdateGameOverDisplay</w:t>
+            </w:r>
+            <w:proofErr w:type="spellEnd"/>
+            <w:r>
+              <w:rPr>
+                <w:sz w:val="20"/>
+                <w:szCs w:val="20"/>
+              </w:rPr>
+              <w:t>(</w:t>
+            </w:r>
+            <w:proofErr w:type="spellStart"/>
+            <w:r>
+              <w:rPr>
+                <w:sz w:val="20"/>
+                <w:szCs w:val="20"/>
+              </w:rPr>
+              <w:t>WinningPlayer</w:t>
+            </w:r>
+            <w:proofErr w:type="spellEnd"/>
+            <w:r>
+              <w:rPr>
+                <w:sz w:val="20"/>
+                <w:szCs w:val="20"/>
+              </w:rPr>
+              <w:t xml:space="preserve">), </w:t>
+            </w:r>
+            <w:proofErr w:type="spellStart"/>
+            <w:r>
+              <w:rPr>
+                <w:sz w:val="20"/>
+                <w:szCs w:val="20"/>
+              </w:rPr>
+              <w:t>UpdateRestartDisplay</w:t>
+            </w:r>
+            <w:proofErr w:type="spellEnd"/>
+            <w:r>
+              <w:rPr>
+                <w:sz w:val="20"/>
+                <w:szCs w:val="20"/>
+              </w:rPr>
+              <w:t xml:space="preserve">(). These replace the earlier </w:t>
+            </w:r>
+            <w:proofErr w:type="spellStart"/>
+            <w:r>
+              <w:rPr>
+                <w:sz w:val="20"/>
+                <w:szCs w:val="20"/>
+              </w:rPr>
+              <w:t>OnGameStateChanged</w:t>
+            </w:r>
+            <w:proofErr w:type="spellEnd"/>
+            <w:r>
+              <w:rPr>
+                <w:sz w:val="20"/>
+                <w:szCs w:val="20"/>
+              </w:rPr>
+              <w:t xml:space="preserve"> approach with more specific, data-driven events. </w:t>
+            </w:r>
+          </w:p>
+        </w:tc>
+        <w:tc>
+          <w:tcPr>
+            <w:tcW w:w="3264" w:type="dxa"/>
             <w:tcBorders>
               <w:top w:val="single" w:sz="1" w:space="0" w:color="CCCCCC"/>
               <w:left w:val="single" w:sz="1" w:space="0" w:color="CCCCCC"/>
@@ -1876,20 +2925,45 @@
             </w:tcMar>
           </w:tcPr>
           <w:p>
-            <w:r>
-              <w:rPr>
-                <w:sz w:val="20"/>
-                <w:szCs w:val="20"/>
-              </w:rPr>
-              <w:t>OnGameStateChanged approach was too generic and caused confusion about where to implement it. Replaced with three specific functions that push data directly to the widget rather than having the widget pull from the GameMode.</w:t>
-            </w:r>
-          </w:p>
-        </w:tc>
-      </w:tr>
-      <w:tr>
-        <w:tc>
-          <w:tcPr>
-            <w:tcW w:w="1392" w:type="dxa"/>
+            <w:proofErr w:type="spellStart"/>
+            <w:r>
+              <w:rPr>
+                <w:sz w:val="20"/>
+                <w:szCs w:val="20"/>
+              </w:rPr>
+              <w:t>OnGameStateChanged</w:t>
+            </w:r>
+            <w:proofErr w:type="spellEnd"/>
+            <w:r>
+              <w:rPr>
+                <w:sz w:val="20"/>
+                <w:szCs w:val="20"/>
+              </w:rPr>
+              <w:t xml:space="preserve"> approach was too generic and caused confusion about where to implement it. Replaced with three specific functions that push data directly to the widget rather than having the widget pull from the </w:t>
+            </w:r>
+            <w:proofErr w:type="spellStart"/>
+            <w:r>
+              <w:rPr>
+                <w:sz w:val="20"/>
+                <w:szCs w:val="20"/>
+              </w:rPr>
+              <w:t>GameMode</w:t>
+            </w:r>
+            <w:proofErr w:type="spellEnd"/>
+            <w:r>
+              <w:rPr>
+                <w:sz w:val="20"/>
+                <w:szCs w:val="20"/>
+              </w:rPr>
+              <w:t>.</w:t>
+            </w:r>
+          </w:p>
+        </w:tc>
+      </w:tr>
+      <w:tr>
+        <w:tc>
+          <w:tcPr>
+            <w:tcW w:w="1304" w:type="dxa"/>
             <w:tcBorders>
               <w:top w:val="single" w:sz="1" w:space="0" w:color="CCCCCC"/>
               <w:left w:val="single" w:sz="1" w:space="0" w:color="CCCCCC"/>
@@ -1916,7 +2990,7 @@
         </w:tc>
         <w:tc>
           <w:tcPr>
-            <w:tcW w:w="4692" w:type="dxa"/>
+            <w:tcW w:w="4458" w:type="dxa"/>
             <w:tcBorders>
               <w:top w:val="single" w:sz="1" w:space="0" w:color="CCCCCC"/>
               <w:left w:val="single" w:sz="1" w:space="0" w:color="CCCCCC"/>
@@ -1937,13 +3011,141 @@
                 <w:sz w:val="20"/>
                 <w:szCs w:val="20"/>
               </w:rPr>
-              <w:t>Created public functions in WBP_GameUI: SetTurnText(Player), ShowGameOver(Winner), ResetDisplay(). Each function encapsulates widget element updates, keeping internal variables private. Implemented UpdateTurnDisplay in BP_TicTacToeGameMode, wiring it to call SetTurnText on the GameUI variable. Verified TurnText updates correctly when squares are clicked and on game start. TC_TTT_008 passed.</w:t>
-            </w:r>
-          </w:p>
-        </w:tc>
-        <w:tc>
-          <w:tcPr>
-            <w:tcW w:w="2942" w:type="dxa"/>
+              <w:t xml:space="preserve">Created public functions in </w:t>
+            </w:r>
+            <w:proofErr w:type="spellStart"/>
+            <w:r>
+              <w:rPr>
+                <w:sz w:val="20"/>
+                <w:szCs w:val="20"/>
+              </w:rPr>
+              <w:t>WBP_GameUI</w:t>
+            </w:r>
+            <w:proofErr w:type="spellEnd"/>
+            <w:r>
+              <w:rPr>
+                <w:sz w:val="20"/>
+                <w:szCs w:val="20"/>
+              </w:rPr>
+              <w:t xml:space="preserve">: </w:t>
+            </w:r>
+            <w:proofErr w:type="spellStart"/>
+            <w:r>
+              <w:rPr>
+                <w:sz w:val="20"/>
+                <w:szCs w:val="20"/>
+              </w:rPr>
+              <w:t>SetTurnText</w:t>
+            </w:r>
+            <w:proofErr w:type="spellEnd"/>
+            <w:r>
+              <w:rPr>
+                <w:sz w:val="20"/>
+                <w:szCs w:val="20"/>
+              </w:rPr>
+              <w:t xml:space="preserve">(Player), </w:t>
+            </w:r>
+            <w:proofErr w:type="spellStart"/>
+            <w:r>
+              <w:rPr>
+                <w:sz w:val="20"/>
+                <w:szCs w:val="20"/>
+              </w:rPr>
+              <w:t>ShowGameOver</w:t>
+            </w:r>
+            <w:proofErr w:type="spellEnd"/>
+            <w:r>
+              <w:rPr>
+                <w:sz w:val="20"/>
+                <w:szCs w:val="20"/>
+              </w:rPr>
+              <w:t xml:space="preserve">(Winner), ResetDisplay(). Each function encapsulates widget element updates, keeping internal variables private. Implemented </w:t>
+            </w:r>
+            <w:proofErr w:type="spellStart"/>
+            <w:r>
+              <w:rPr>
+                <w:sz w:val="20"/>
+                <w:szCs w:val="20"/>
+              </w:rPr>
+              <w:t>UpdateTurnDisplay</w:t>
+            </w:r>
+            <w:proofErr w:type="spellEnd"/>
+            <w:r>
+              <w:rPr>
+                <w:sz w:val="20"/>
+                <w:szCs w:val="20"/>
+              </w:rPr>
+              <w:t xml:space="preserve"> in </w:t>
+            </w:r>
+            <w:proofErr w:type="spellStart"/>
+            <w:r>
+              <w:rPr>
+                <w:sz w:val="20"/>
+                <w:szCs w:val="20"/>
+              </w:rPr>
+              <w:t>BP_TicTacToeGameMode</w:t>
+            </w:r>
+            <w:proofErr w:type="spellEnd"/>
+            <w:r>
+              <w:rPr>
+                <w:sz w:val="20"/>
+                <w:szCs w:val="20"/>
+              </w:rPr>
+              <w:t xml:space="preserve">, wiring it to call </w:t>
+            </w:r>
+            <w:proofErr w:type="spellStart"/>
+            <w:r>
+              <w:rPr>
+                <w:sz w:val="20"/>
+                <w:szCs w:val="20"/>
+              </w:rPr>
+              <w:t>SetTurnText</w:t>
+            </w:r>
+            <w:proofErr w:type="spellEnd"/>
+            <w:r>
+              <w:rPr>
+                <w:sz w:val="20"/>
+                <w:szCs w:val="20"/>
+              </w:rPr>
+              <w:t xml:space="preserve"> on the </w:t>
+            </w:r>
+            <w:proofErr w:type="spellStart"/>
+            <w:r>
+              <w:rPr>
+                <w:sz w:val="20"/>
+                <w:szCs w:val="20"/>
+              </w:rPr>
+              <w:t>GameUI</w:t>
+            </w:r>
+            <w:proofErr w:type="spellEnd"/>
+            <w:r>
+              <w:rPr>
+                <w:sz w:val="20"/>
+                <w:szCs w:val="20"/>
+              </w:rPr>
+              <w:t xml:space="preserve"> variable. Verified </w:t>
+            </w:r>
+            <w:proofErr w:type="spellStart"/>
+            <w:r>
+              <w:rPr>
+                <w:sz w:val="20"/>
+                <w:szCs w:val="20"/>
+              </w:rPr>
+              <w:t>TurnText</w:t>
+            </w:r>
+            <w:proofErr w:type="spellEnd"/>
+            <w:r>
+              <w:rPr>
+                <w:sz w:val="20"/>
+                <w:szCs w:val="20"/>
+              </w:rPr>
+              <w:t xml:space="preserve"> updates correctly when squares are clicked and on game start. TC_TTT_008 passed.</w:t>
+            </w:r>
+          </w:p>
+        </w:tc>
+        <w:tc>
+          <w:tcPr>
+            <w:tcW w:w="3264" w:type="dxa"/>
             <w:tcBorders>
               <w:top w:val="single" w:sz="1" w:space="0" w:color="CCCCCC"/>
               <w:left w:val="single" w:sz="1" w:space="0" w:color="CCCCCC"/>
@@ -1964,15 +3166,63 @@
                 <w:sz w:val="20"/>
                 <w:szCs w:val="20"/>
               </w:rPr>
-              <w:t>Text element in UMG was a simple Text widget rather than Text Block, causing Set Text node to be unavailable initially. Resolved by dragging off the variable pin directly rather than searching from empty graph space. Widget variables (TurnText, ResultText, RestartButton) needed to be accessed via public functions rather than direct variable access from outside the widget.</w:t>
-            </w:r>
-          </w:p>
-        </w:tc>
-      </w:tr>
-      <w:tr>
-        <w:tc>
-          <w:tcPr>
-            <w:tcW w:w="1392" w:type="dxa"/>
+              <w:t>Text element in UMG was a simple Text widget rather than Text Block, causing Set Text node to be unavailable initially. Resolved by dragging off the variable pin directly rather than searching from empty graph space. Widget variables (</w:t>
+            </w:r>
+            <w:proofErr w:type="spellStart"/>
+            <w:r>
+              <w:rPr>
+                <w:sz w:val="20"/>
+                <w:szCs w:val="20"/>
+              </w:rPr>
+              <w:t>TurnText</w:t>
+            </w:r>
+            <w:proofErr w:type="spellEnd"/>
+            <w:r>
+              <w:rPr>
+                <w:sz w:val="20"/>
+                <w:szCs w:val="20"/>
+              </w:rPr>
+              <w:t xml:space="preserve">, </w:t>
+            </w:r>
+            <w:proofErr w:type="spellStart"/>
+            <w:r>
+              <w:rPr>
+                <w:sz w:val="20"/>
+                <w:szCs w:val="20"/>
+              </w:rPr>
+              <w:t>ResultText</w:t>
+            </w:r>
+            <w:proofErr w:type="spellEnd"/>
+            <w:r>
+              <w:rPr>
+                <w:sz w:val="20"/>
+                <w:szCs w:val="20"/>
+              </w:rPr>
+              <w:t xml:space="preserve">, </w:t>
+            </w:r>
+            <w:proofErr w:type="spellStart"/>
+            <w:r>
+              <w:rPr>
+                <w:sz w:val="20"/>
+                <w:szCs w:val="20"/>
+              </w:rPr>
+              <w:t>RestartButton</w:t>
+            </w:r>
+            <w:proofErr w:type="spellEnd"/>
+            <w:r>
+              <w:rPr>
+                <w:sz w:val="20"/>
+                <w:szCs w:val="20"/>
+              </w:rPr>
+              <w:t>) needed to be accessed via public functions rather than direct variable access from outside the widget.</w:t>
+            </w:r>
+          </w:p>
+        </w:tc>
+      </w:tr>
+      <w:tr>
+        <w:tc>
+          <w:tcPr>
+            <w:tcW w:w="1304" w:type="dxa"/>
             <w:tcBorders>
               <w:top w:val="single" w:sz="1" w:space="0" w:color="CCCCCC"/>
               <w:left w:val="single" w:sz="1" w:space="0" w:color="CCCCCC"/>
@@ -2004,7 +3254,7 @@
         </w:tc>
         <w:tc>
           <w:tcPr>
-            <w:tcW w:w="4692" w:type="dxa"/>
+            <w:tcW w:w="4458" w:type="dxa"/>
             <w:tcBorders>
               <w:top w:val="single" w:sz="1" w:space="0" w:color="CCCCCC"/>
               <w:left w:val="single" w:sz="1" w:space="0" w:color="CCCCCC"/>
@@ -2030,13 +3280,189 @@
                 <w:sz w:val="20"/>
                 <w:szCs w:val="20"/>
               </w:rPr>
-              <w:t>Completed UI system. Implemented ShowGameOver and ResetDisplay functions in WBP_GameUI. Wired UpdateGameOverDisplay and UpdateRestartDisplay events in BP_TicTacToeGameMode. Added RestartButton OnClicked calling RestartGame. Renamed SetTurnText to SetTurnTextCurrentPlayer and added SetTurnTextRestartGame showing "Another Round?" on game over. Full end to end game loop tested.</w:t>
-            </w:r>
-          </w:p>
-        </w:tc>
-        <w:tc>
-          <w:tcPr>
-            <w:tcW w:w="2942" w:type="dxa"/>
+              <w:t xml:space="preserve">Completed UI system. Implemented </w:t>
+            </w:r>
+            <w:proofErr w:type="spellStart"/>
+            <w:r>
+              <w:rPr>
+                <w:sz w:val="20"/>
+                <w:szCs w:val="20"/>
+              </w:rPr>
+              <w:t>ShowGameOver</w:t>
+            </w:r>
+            <w:proofErr w:type="spellEnd"/>
+            <w:r>
+              <w:rPr>
+                <w:sz w:val="20"/>
+                <w:szCs w:val="20"/>
+              </w:rPr>
+              <w:t xml:space="preserve"> and ResetDisplay functions in </w:t>
+            </w:r>
+            <w:proofErr w:type="spellStart"/>
+            <w:r>
+              <w:rPr>
+                <w:sz w:val="20"/>
+                <w:szCs w:val="20"/>
+              </w:rPr>
+              <w:t>WBP_GameUI</w:t>
+            </w:r>
+            <w:proofErr w:type="spellEnd"/>
+            <w:r>
+              <w:rPr>
+                <w:sz w:val="20"/>
+                <w:szCs w:val="20"/>
+              </w:rPr>
+              <w:t xml:space="preserve">. Wired </w:t>
+            </w:r>
+            <w:proofErr w:type="spellStart"/>
+            <w:r>
+              <w:rPr>
+                <w:sz w:val="20"/>
+                <w:szCs w:val="20"/>
+              </w:rPr>
+              <w:t>UpdateGameOverDisplay</w:t>
+            </w:r>
+            <w:proofErr w:type="spellEnd"/>
+            <w:r>
+              <w:rPr>
+                <w:sz w:val="20"/>
+                <w:szCs w:val="20"/>
+              </w:rPr>
+              <w:t xml:space="preserve"> and </w:t>
+            </w:r>
+            <w:proofErr w:type="spellStart"/>
+            <w:r>
+              <w:rPr>
+                <w:sz w:val="20"/>
+                <w:szCs w:val="20"/>
+              </w:rPr>
+              <w:t>UpdateRestartDisplay</w:t>
+            </w:r>
+            <w:proofErr w:type="spellEnd"/>
+            <w:r>
+              <w:rPr>
+                <w:sz w:val="20"/>
+                <w:szCs w:val="20"/>
+              </w:rPr>
+              <w:t xml:space="preserve"> events in </w:t>
+            </w:r>
+            <w:proofErr w:type="spellStart"/>
+            <w:r>
+              <w:rPr>
+                <w:sz w:val="20"/>
+                <w:szCs w:val="20"/>
+              </w:rPr>
+              <w:t>BP_TicTacToeGameMode</w:t>
+            </w:r>
+            <w:proofErr w:type="spellEnd"/>
+            <w:r>
+              <w:rPr>
+                <w:sz w:val="20"/>
+                <w:szCs w:val="20"/>
+              </w:rPr>
+              <w:t xml:space="preserve">. Added </w:t>
+            </w:r>
+            <w:proofErr w:type="spellStart"/>
+            <w:r>
+              <w:rPr>
+                <w:sz w:val="20"/>
+                <w:szCs w:val="20"/>
+              </w:rPr>
+              <w:t>RestartButton</w:t>
+            </w:r>
+            <w:proofErr w:type="spellEnd"/>
+            <w:r>
+              <w:rPr>
+                <w:sz w:val="20"/>
+                <w:szCs w:val="20"/>
+              </w:rPr>
+              <w:t xml:space="preserve"> </w:t>
+            </w:r>
+            <w:proofErr w:type="spellStart"/>
+            <w:r>
+              <w:rPr>
+                <w:sz w:val="20"/>
+                <w:szCs w:val="20"/>
+              </w:rPr>
+              <w:t>OnClicked</w:t>
+            </w:r>
+            <w:proofErr w:type="spellEnd"/>
+            <w:r>
+              <w:rPr>
+                <w:sz w:val="20"/>
+                <w:szCs w:val="20"/>
+              </w:rPr>
+              <w:t xml:space="preserve"> calling </w:t>
+            </w:r>
+            <w:proofErr w:type="spellStart"/>
+            <w:r>
+              <w:rPr>
+                <w:sz w:val="20"/>
+                <w:szCs w:val="20"/>
+              </w:rPr>
+              <w:t>RestartGame</w:t>
+            </w:r>
+            <w:proofErr w:type="spellEnd"/>
+            <w:r>
+              <w:rPr>
+                <w:sz w:val="20"/>
+                <w:szCs w:val="20"/>
+              </w:rPr>
+              <w:t xml:space="preserve">. Renamed </w:t>
+            </w:r>
+            <w:proofErr w:type="spellStart"/>
+            <w:r>
+              <w:rPr>
+                <w:sz w:val="20"/>
+                <w:szCs w:val="20"/>
+              </w:rPr>
+              <w:t>SetTurnText</w:t>
+            </w:r>
+            <w:proofErr w:type="spellEnd"/>
+            <w:r>
+              <w:rPr>
+                <w:sz w:val="20"/>
+                <w:szCs w:val="20"/>
+              </w:rPr>
+              <w:t xml:space="preserve"> to </w:t>
+            </w:r>
+            <w:proofErr w:type="spellStart"/>
+            <w:r>
+              <w:rPr>
+                <w:sz w:val="20"/>
+                <w:szCs w:val="20"/>
+              </w:rPr>
+              <w:t>SetTurnTextCurrentPlayer</w:t>
+            </w:r>
+            <w:proofErr w:type="spellEnd"/>
+            <w:r>
+              <w:rPr>
+                <w:sz w:val="20"/>
+                <w:szCs w:val="20"/>
+              </w:rPr>
+              <w:t xml:space="preserve"> and added </w:t>
+            </w:r>
+            <w:proofErr w:type="spellStart"/>
+            <w:r>
+              <w:rPr>
+                <w:sz w:val="20"/>
+                <w:szCs w:val="20"/>
+              </w:rPr>
+              <w:t>SetTurnTextRestartGame</w:t>
+            </w:r>
+            <w:proofErr w:type="spellEnd"/>
+            <w:r>
+              <w:rPr>
+                <w:sz w:val="20"/>
+                <w:szCs w:val="20"/>
+              </w:rPr>
+              <w:t xml:space="preserve"> showing "Another Round?" on game over. Full end to end game loop tested.</w:t>
+            </w:r>
+          </w:p>
+        </w:tc>
+        <w:tc>
+          <w:tcPr>
+            <w:tcW w:w="3264" w:type="dxa"/>
             <w:tcBorders>
               <w:top w:val="single" w:sz="1" w:space="0" w:color="CCCCCC"/>
               <w:left w:val="single" w:sz="1" w:space="0" w:color="CCCCCC"/>
@@ -2070,7 +3496,7 @@
       <w:tr>
         <w:tc>
           <w:tcPr>
-            <w:tcW w:w="1392" w:type="dxa"/>
+            <w:tcW w:w="1304" w:type="dxa"/>
             <w:tcBorders>
               <w:top w:val="single" w:sz="1" w:space="0" w:color="CCCCCC"/>
               <w:left w:val="single" w:sz="1" w:space="0" w:color="CCCCCC"/>
@@ -2103,7 +3529,7 @@
         </w:tc>
         <w:tc>
           <w:tcPr>
-            <w:tcW w:w="4692" w:type="dxa"/>
+            <w:tcW w:w="4458" w:type="dxa"/>
             <w:tcBorders>
               <w:top w:val="single" w:sz="1" w:space="0" w:color="CCCCCC"/>
               <w:left w:val="single" w:sz="1" w:space="0" w:color="CCCCCC"/>
@@ -2130,13 +3556,93 @@
                 <w:sz w:val="20"/>
                 <w:szCs w:val="20"/>
               </w:rPr>
-              <w:t>Refactored UI text update logic into a reusable SetTextAndColour function in WBP_GameUI, taking a string, text widget reference, and colour as parameters. Applied across ShowGameOver, SetTurnTextCurrentPlayer, and SetTurnTextRestartGame to eliminate duplicated nodes.</w:t>
-            </w:r>
-          </w:p>
-        </w:tc>
-        <w:tc>
-          <w:tcPr>
-            <w:tcW w:w="2942" w:type="dxa"/>
+              <w:t xml:space="preserve">Refactored UI text update logic into a reusable </w:t>
+            </w:r>
+            <w:proofErr w:type="spellStart"/>
+            <w:r>
+              <w:rPr>
+                <w:sz w:val="20"/>
+                <w:szCs w:val="20"/>
+              </w:rPr>
+              <w:t>SetTextAndColour</w:t>
+            </w:r>
+            <w:proofErr w:type="spellEnd"/>
+            <w:r>
+              <w:rPr>
+                <w:sz w:val="20"/>
+                <w:szCs w:val="20"/>
+              </w:rPr>
+              <w:t xml:space="preserve"> function in </w:t>
+            </w:r>
+            <w:proofErr w:type="spellStart"/>
+            <w:r>
+              <w:rPr>
+                <w:sz w:val="20"/>
+                <w:szCs w:val="20"/>
+              </w:rPr>
+              <w:t>WBP_GameUI</w:t>
+            </w:r>
+            <w:proofErr w:type="spellEnd"/>
+            <w:r>
+              <w:rPr>
+                <w:sz w:val="20"/>
+                <w:szCs w:val="20"/>
+              </w:rPr>
+              <w:t xml:space="preserve">, taking a string, text widget reference, and colour as parameters. Applied across </w:t>
+            </w:r>
+            <w:proofErr w:type="spellStart"/>
+            <w:r>
+              <w:rPr>
+                <w:sz w:val="20"/>
+                <w:szCs w:val="20"/>
+              </w:rPr>
+              <w:t>ShowGameOver</w:t>
+            </w:r>
+            <w:proofErr w:type="spellEnd"/>
+            <w:r>
+              <w:rPr>
+                <w:sz w:val="20"/>
+                <w:szCs w:val="20"/>
+              </w:rPr>
+              <w:t xml:space="preserve">, </w:t>
+            </w:r>
+            <w:proofErr w:type="spellStart"/>
+            <w:r>
+              <w:rPr>
+                <w:sz w:val="20"/>
+                <w:szCs w:val="20"/>
+              </w:rPr>
+              <w:t>SetTurnTextCurrentPlayer</w:t>
+            </w:r>
+            <w:proofErr w:type="spellEnd"/>
+            <w:r>
+              <w:rPr>
+                <w:sz w:val="20"/>
+                <w:szCs w:val="20"/>
+              </w:rPr>
+              <w:t xml:space="preserve">, and </w:t>
+            </w:r>
+            <w:proofErr w:type="spellStart"/>
+            <w:r>
+              <w:rPr>
+                <w:sz w:val="20"/>
+                <w:szCs w:val="20"/>
+              </w:rPr>
+              <w:t>SetTurnTextRestartGame</w:t>
+            </w:r>
+            <w:proofErr w:type="spellEnd"/>
+            <w:r>
+              <w:rPr>
+                <w:sz w:val="20"/>
+                <w:szCs w:val="20"/>
+              </w:rPr>
+              <w:t xml:space="preserve"> to eliminate duplicated nodes.</w:t>
+            </w:r>
+          </w:p>
+        </w:tc>
+        <w:tc>
+          <w:tcPr>
+            <w:tcW w:w="3264" w:type="dxa"/>
             <w:tcBorders>
               <w:top w:val="single" w:sz="1" w:space="0" w:color="CCCCCC"/>
               <w:left w:val="single" w:sz="1" w:space="0" w:color="CCCCCC"/>
@@ -2171,7 +3677,7 @@
       <w:tr>
         <w:tc>
           <w:tcPr>
-            <w:tcW w:w="1392" w:type="dxa"/>
+            <w:tcW w:w="1304" w:type="dxa"/>
             <w:tcBorders>
               <w:top w:val="single" w:sz="1" w:space="0" w:color="CCCCCC"/>
               <w:left w:val="single" w:sz="1" w:space="0" w:color="CCCCCC"/>
@@ -2204,7 +3710,7 @@
         </w:tc>
         <w:tc>
           <w:tcPr>
-            <w:tcW w:w="4692" w:type="dxa"/>
+            <w:tcW w:w="4458" w:type="dxa"/>
             <w:tcBorders>
               <w:top w:val="single" w:sz="1" w:space="0" w:color="CCCCCC"/>
               <w:left w:val="single" w:sz="1" w:space="0" w:color="CCCCCC"/>
@@ -2230,13 +3736,157 @@
                 <w:sz w:val="20"/>
                 <w:szCs w:val="20"/>
               </w:rPr>
-              <w:t>Added score tracking system to TicTacToeGameMode. Implemented PlayerOneScore and PlayerTwoScore as BlueprintReadOnly int32 variables. Added UpdatePlayersScore(winner), ResetPlayerScores(), and DetermineStartingPlayer() functions. Score increments correctly on win, unchanged on draw. Implemented UpdateScoreDisplay BlueprintImplementableEvent to update UI on score change.</w:t>
-            </w:r>
-          </w:p>
-        </w:tc>
-        <w:tc>
-          <w:tcPr>
-            <w:tcW w:w="2942" w:type="dxa"/>
+              <w:t xml:space="preserve">Added score tracking system to </w:t>
+            </w:r>
+            <w:proofErr w:type="spellStart"/>
+            <w:r>
+              <w:rPr>
+                <w:sz w:val="20"/>
+                <w:szCs w:val="20"/>
+              </w:rPr>
+              <w:t>TicTacToeGameMode</w:t>
+            </w:r>
+            <w:proofErr w:type="spellEnd"/>
+            <w:r>
+              <w:rPr>
+                <w:sz w:val="20"/>
+                <w:szCs w:val="20"/>
+              </w:rPr>
+              <w:t xml:space="preserve">. Implemented </w:t>
+            </w:r>
+            <w:proofErr w:type="spellStart"/>
+            <w:r>
+              <w:rPr>
+                <w:sz w:val="20"/>
+                <w:szCs w:val="20"/>
+              </w:rPr>
+              <w:t>PlayerOneScore</w:t>
+            </w:r>
+            <w:proofErr w:type="spellEnd"/>
+            <w:r>
+              <w:rPr>
+                <w:sz w:val="20"/>
+                <w:szCs w:val="20"/>
+              </w:rPr>
+              <w:t xml:space="preserve"> and </w:t>
+            </w:r>
+            <w:proofErr w:type="spellStart"/>
+            <w:r>
+              <w:rPr>
+                <w:sz w:val="20"/>
+                <w:szCs w:val="20"/>
+              </w:rPr>
+              <w:t>PlayerTwoScore</w:t>
+            </w:r>
+            <w:proofErr w:type="spellEnd"/>
+            <w:r>
+              <w:rPr>
+                <w:sz w:val="20"/>
+                <w:szCs w:val="20"/>
+              </w:rPr>
+              <w:t xml:space="preserve"> as </w:t>
+            </w:r>
+            <w:proofErr w:type="spellStart"/>
+            <w:r>
+              <w:rPr>
+                <w:sz w:val="20"/>
+                <w:szCs w:val="20"/>
+              </w:rPr>
+              <w:t>BlueprintReadOnly</w:t>
+            </w:r>
+            <w:proofErr w:type="spellEnd"/>
+            <w:r>
+              <w:rPr>
+                <w:sz w:val="20"/>
+                <w:szCs w:val="20"/>
+              </w:rPr>
+              <w:t xml:space="preserve"> int32 variables. Added </w:t>
+            </w:r>
+            <w:proofErr w:type="spellStart"/>
+            <w:r>
+              <w:rPr>
+                <w:sz w:val="20"/>
+                <w:szCs w:val="20"/>
+              </w:rPr>
+              <w:t>UpdatePlayersScore</w:t>
+            </w:r>
+            <w:proofErr w:type="spellEnd"/>
+            <w:r>
+              <w:rPr>
+                <w:sz w:val="20"/>
+                <w:szCs w:val="20"/>
+              </w:rPr>
+              <w:t xml:space="preserve">(winner), </w:t>
+            </w:r>
+            <w:proofErr w:type="spellStart"/>
+            <w:r>
+              <w:rPr>
+                <w:sz w:val="20"/>
+                <w:szCs w:val="20"/>
+              </w:rPr>
+              <w:t>ResetPlayerScores</w:t>
+            </w:r>
+            <w:proofErr w:type="spellEnd"/>
+            <w:r>
+              <w:rPr>
+                <w:sz w:val="20"/>
+                <w:szCs w:val="20"/>
+              </w:rPr>
+              <w:t xml:space="preserve">(), and </w:t>
+            </w:r>
+            <w:proofErr w:type="spellStart"/>
+            <w:r>
+              <w:rPr>
+                <w:sz w:val="20"/>
+                <w:szCs w:val="20"/>
+              </w:rPr>
+              <w:t>DetermineStartingPlayer</w:t>
+            </w:r>
+            <w:proofErr w:type="spellEnd"/>
+            <w:r>
+              <w:rPr>
+                <w:sz w:val="20"/>
+                <w:szCs w:val="20"/>
+              </w:rPr>
+              <w:t xml:space="preserve">() functions. Score increments correctly on win, unchanged on draw. Implemented </w:t>
+            </w:r>
+            <w:proofErr w:type="spellStart"/>
+            <w:r>
+              <w:rPr>
+                <w:sz w:val="20"/>
+                <w:szCs w:val="20"/>
+              </w:rPr>
+              <w:t>UpdateScoreDisplay</w:t>
+            </w:r>
+            <w:proofErr w:type="spellEnd"/>
+            <w:r>
+              <w:rPr>
+                <w:sz w:val="20"/>
+                <w:szCs w:val="20"/>
+              </w:rPr>
+              <w:t xml:space="preserve"> </w:t>
+            </w:r>
+            <w:proofErr w:type="spellStart"/>
+            <w:r>
+              <w:rPr>
+                <w:sz w:val="20"/>
+                <w:szCs w:val="20"/>
+              </w:rPr>
+              <w:t>BlueprintImplementableEvent</w:t>
+            </w:r>
+            <w:proofErr w:type="spellEnd"/>
+            <w:r>
+              <w:rPr>
+                <w:sz w:val="20"/>
+                <w:szCs w:val="20"/>
+              </w:rPr>
+              <w:t xml:space="preserve"> to update UI on score change.</w:t>
+            </w:r>
+          </w:p>
+        </w:tc>
+        <w:tc>
+          <w:tcPr>
+            <w:tcW w:w="3264" w:type="dxa"/>
             <w:tcBorders>
               <w:top w:val="single" w:sz="1" w:space="0" w:color="CCCCCC"/>
               <w:left w:val="single" w:sz="1" w:space="0" w:color="CCCCCC"/>
@@ -2270,7 +3920,7 @@
       <w:tr>
         <w:tc>
           <w:tcPr>
-            <w:tcW w:w="1392" w:type="dxa"/>
+            <w:tcW w:w="1304" w:type="dxa"/>
             <w:tcBorders>
               <w:top w:val="single" w:sz="1" w:space="0" w:color="CCCCCC"/>
               <w:left w:val="single" w:sz="1" w:space="0" w:color="CCCCCC"/>
@@ -2303,7 +3953,7 @@
         </w:tc>
         <w:tc>
           <w:tcPr>
-            <w:tcW w:w="4692" w:type="dxa"/>
+            <w:tcW w:w="4458" w:type="dxa"/>
             <w:tcBorders>
               <w:top w:val="single" w:sz="1" w:space="0" w:color="CCCCCC"/>
               <w:left w:val="single" w:sz="1" w:space="0" w:color="CCCCCC"/>
@@ -2330,13 +3980,141 @@
                 <w:sz w:val="20"/>
                 <w:szCs w:val="20"/>
               </w:rPr>
-              <w:t>Implemented alternating starting player logic. Loser of previous round goes first next round. Draw or first round uses FMath::RandRange(1,2) for random starting player. DetermineStartingPlayer() called inside InitialiseGrid(). Fixed RestartGame() passing DetermineStartingPlayer() twice — simplified to pass CurrentPlayer since InitialiseGrid already sets it correctly.</w:t>
-            </w:r>
-          </w:p>
-        </w:tc>
-        <w:tc>
-          <w:tcPr>
-            <w:tcW w:w="2942" w:type="dxa"/>
+              <w:t xml:space="preserve">Implemented alternating starting player logic. Loser of previous round goes first next round. Draw or first round uses </w:t>
+            </w:r>
+            <w:proofErr w:type="spellStart"/>
+            <w:r>
+              <w:rPr>
+                <w:sz w:val="20"/>
+                <w:szCs w:val="20"/>
+              </w:rPr>
+              <w:t>FMath</w:t>
+            </w:r>
+            <w:proofErr w:type="spellEnd"/>
+            <w:r>
+              <w:rPr>
+                <w:sz w:val="20"/>
+                <w:szCs w:val="20"/>
+              </w:rPr>
+              <w:t>::</w:t>
+            </w:r>
+            <w:proofErr w:type="spellStart"/>
+            <w:r>
+              <w:rPr>
+                <w:sz w:val="20"/>
+                <w:szCs w:val="20"/>
+              </w:rPr>
+              <w:t>RandRange</w:t>
+            </w:r>
+            <w:proofErr w:type="spellEnd"/>
+            <w:r>
+              <w:rPr>
+                <w:sz w:val="20"/>
+                <w:szCs w:val="20"/>
+              </w:rPr>
+              <w:t xml:space="preserve">(1,2) for random starting player. </w:t>
+            </w:r>
+            <w:proofErr w:type="spellStart"/>
+            <w:r>
+              <w:rPr>
+                <w:sz w:val="20"/>
+                <w:szCs w:val="20"/>
+              </w:rPr>
+              <w:t>DetermineStartingPlayer</w:t>
+            </w:r>
+            <w:proofErr w:type="spellEnd"/>
+            <w:r>
+              <w:rPr>
+                <w:sz w:val="20"/>
+                <w:szCs w:val="20"/>
+              </w:rPr>
+              <w:t xml:space="preserve">() called inside </w:t>
+            </w:r>
+            <w:proofErr w:type="spellStart"/>
+            <w:r>
+              <w:rPr>
+                <w:sz w:val="20"/>
+                <w:szCs w:val="20"/>
+              </w:rPr>
+              <w:t>InitialiseGrid</w:t>
+            </w:r>
+            <w:proofErr w:type="spellEnd"/>
+            <w:r>
+              <w:rPr>
+                <w:sz w:val="20"/>
+                <w:szCs w:val="20"/>
+              </w:rPr>
+              <w:t xml:space="preserve">(). Fixed </w:t>
+            </w:r>
+            <w:proofErr w:type="spellStart"/>
+            <w:r>
+              <w:rPr>
+                <w:sz w:val="20"/>
+                <w:szCs w:val="20"/>
+              </w:rPr>
+              <w:t>RestartGame</w:t>
+            </w:r>
+            <w:proofErr w:type="spellEnd"/>
+            <w:r>
+              <w:rPr>
+                <w:sz w:val="20"/>
+                <w:szCs w:val="20"/>
+              </w:rPr>
+              <w:t xml:space="preserve">() passing </w:t>
+            </w:r>
+            <w:proofErr w:type="spellStart"/>
+            <w:r>
+              <w:rPr>
+                <w:sz w:val="20"/>
+                <w:szCs w:val="20"/>
+              </w:rPr>
+              <w:t>DetermineStartingPlayer</w:t>
+            </w:r>
+            <w:proofErr w:type="spellEnd"/>
+            <w:r>
+              <w:rPr>
+                <w:sz w:val="20"/>
+                <w:szCs w:val="20"/>
+              </w:rPr>
+              <w:t xml:space="preserve">() twice — simplified to pass </w:t>
+            </w:r>
+            <w:proofErr w:type="spellStart"/>
+            <w:r>
+              <w:rPr>
+                <w:sz w:val="20"/>
+                <w:szCs w:val="20"/>
+              </w:rPr>
+              <w:t>CurrentPlayer</w:t>
+            </w:r>
+            <w:proofErr w:type="spellEnd"/>
+            <w:r>
+              <w:rPr>
+                <w:sz w:val="20"/>
+                <w:szCs w:val="20"/>
+              </w:rPr>
+              <w:t xml:space="preserve"> since </w:t>
+            </w:r>
+            <w:proofErr w:type="spellStart"/>
+            <w:r>
+              <w:rPr>
+                <w:sz w:val="20"/>
+                <w:szCs w:val="20"/>
+              </w:rPr>
+              <w:t>InitialiseGrid</w:t>
+            </w:r>
+            <w:proofErr w:type="spellEnd"/>
+            <w:r>
+              <w:rPr>
+                <w:sz w:val="20"/>
+                <w:szCs w:val="20"/>
+              </w:rPr>
+              <w:t xml:space="preserve"> already sets it correctly.</w:t>
+            </w:r>
+          </w:p>
+        </w:tc>
+        <w:tc>
+          <w:tcPr>
+            <w:tcW w:w="3264" w:type="dxa"/>
             <w:tcBorders>
               <w:top w:val="single" w:sz="1" w:space="0" w:color="CCCCCC"/>
               <w:left w:val="single" w:sz="1" w:space="0" w:color="CCCCCC"/>
@@ -2358,20 +4136,157 @@
                 <w:szCs w:val="20"/>
               </w:rPr>
             </w:pPr>
-            <w:r>
-              <w:rPr>
-                <w:sz w:val="20"/>
-                <w:szCs w:val="20"/>
-              </w:rPr>
-              <w:t>TurnText showing 0 on game start instead of correct starting player. Root cause identified as Super::BeginPlay() triggering Blueprint BeginPlay before InitialiseGrid() had run. Fixed by moving Winner = 0 and InitialiseGrid() to before Super::BeginPlay() in C++ BeginPlay, ensuring CurrentPlayer is correctly set before Blueprint reads it. Delay node removed from Blueprint BeginPlay.</w:t>
-            </w:r>
-          </w:p>
-        </w:tc>
-      </w:tr>
-      <w:tr>
-        <w:tc>
-          <w:tcPr>
-            <w:tcW w:w="1392" w:type="dxa"/>
+            <w:proofErr w:type="spellStart"/>
+            <w:r>
+              <w:rPr>
+                <w:sz w:val="20"/>
+                <w:szCs w:val="20"/>
+              </w:rPr>
+              <w:t>TurnText</w:t>
+            </w:r>
+            <w:proofErr w:type="spellEnd"/>
+            <w:r>
+              <w:rPr>
+                <w:sz w:val="20"/>
+                <w:szCs w:val="20"/>
+              </w:rPr>
+              <w:t xml:space="preserve"> showing 0 on game start instead of correct starting player. Root cause identified as Super::</w:t>
+            </w:r>
+            <w:proofErr w:type="spellStart"/>
+            <w:r>
+              <w:rPr>
+                <w:sz w:val="20"/>
+                <w:szCs w:val="20"/>
+              </w:rPr>
+              <w:t>BeginPlay</w:t>
+            </w:r>
+            <w:proofErr w:type="spellEnd"/>
+            <w:r>
+              <w:rPr>
+                <w:sz w:val="20"/>
+                <w:szCs w:val="20"/>
+              </w:rPr>
+              <w:t xml:space="preserve">() triggering Blueprint </w:t>
+            </w:r>
+            <w:proofErr w:type="spellStart"/>
+            <w:r>
+              <w:rPr>
+                <w:sz w:val="20"/>
+                <w:szCs w:val="20"/>
+              </w:rPr>
+              <w:t>BeginPlay</w:t>
+            </w:r>
+            <w:proofErr w:type="spellEnd"/>
+            <w:r>
+              <w:rPr>
+                <w:sz w:val="20"/>
+                <w:szCs w:val="20"/>
+              </w:rPr>
+              <w:t xml:space="preserve"> before </w:t>
+            </w:r>
+            <w:proofErr w:type="spellStart"/>
+            <w:r>
+              <w:rPr>
+                <w:sz w:val="20"/>
+                <w:szCs w:val="20"/>
+              </w:rPr>
+              <w:t>InitialiseGrid</w:t>
+            </w:r>
+            <w:proofErr w:type="spellEnd"/>
+            <w:r>
+              <w:rPr>
+                <w:sz w:val="20"/>
+                <w:szCs w:val="20"/>
+              </w:rPr>
+              <w:t xml:space="preserve">() had run. Fixed by moving Winner = 0 and </w:t>
+            </w:r>
+            <w:proofErr w:type="spellStart"/>
+            <w:r>
+              <w:rPr>
+                <w:sz w:val="20"/>
+                <w:szCs w:val="20"/>
+              </w:rPr>
+              <w:t>InitialiseGrid</w:t>
+            </w:r>
+            <w:proofErr w:type="spellEnd"/>
+            <w:r>
+              <w:rPr>
+                <w:sz w:val="20"/>
+                <w:szCs w:val="20"/>
+              </w:rPr>
+              <w:t>() to before Super::</w:t>
+            </w:r>
+            <w:proofErr w:type="spellStart"/>
+            <w:r>
+              <w:rPr>
+                <w:sz w:val="20"/>
+                <w:szCs w:val="20"/>
+              </w:rPr>
+              <w:t>BeginPlay</w:t>
+            </w:r>
+            <w:proofErr w:type="spellEnd"/>
+            <w:r>
+              <w:rPr>
+                <w:sz w:val="20"/>
+                <w:szCs w:val="20"/>
+              </w:rPr>
+              <w:t xml:space="preserve">() in C++ </w:t>
+            </w:r>
+            <w:proofErr w:type="spellStart"/>
+            <w:r>
+              <w:rPr>
+                <w:sz w:val="20"/>
+                <w:szCs w:val="20"/>
+              </w:rPr>
+              <w:t>BeginPlay</w:t>
+            </w:r>
+            <w:proofErr w:type="spellEnd"/>
+            <w:r>
+              <w:rPr>
+                <w:sz w:val="20"/>
+                <w:szCs w:val="20"/>
+              </w:rPr>
+              <w:t xml:space="preserve">, ensuring </w:t>
+            </w:r>
+            <w:proofErr w:type="spellStart"/>
+            <w:r>
+              <w:rPr>
+                <w:sz w:val="20"/>
+                <w:szCs w:val="20"/>
+              </w:rPr>
+              <w:t>CurrentPlayer</w:t>
+            </w:r>
+            <w:proofErr w:type="spellEnd"/>
+            <w:r>
+              <w:rPr>
+                <w:sz w:val="20"/>
+                <w:szCs w:val="20"/>
+              </w:rPr>
+              <w:t xml:space="preserve"> is correctly set before Blueprint reads it. Delay node removed from Blueprint </w:t>
+            </w:r>
+            <w:proofErr w:type="spellStart"/>
+            <w:r>
+              <w:rPr>
+                <w:sz w:val="20"/>
+                <w:szCs w:val="20"/>
+              </w:rPr>
+              <w:t>BeginPlay</w:t>
+            </w:r>
+            <w:proofErr w:type="spellEnd"/>
+            <w:r>
+              <w:rPr>
+                <w:sz w:val="20"/>
+                <w:szCs w:val="20"/>
+              </w:rPr>
+              <w:t>.</w:t>
+            </w:r>
+          </w:p>
+        </w:tc>
+      </w:tr>
+      <w:tr>
+        <w:tc>
+          <w:tcPr>
+            <w:tcW w:w="1304" w:type="dxa"/>
             <w:tcBorders>
               <w:top w:val="single" w:sz="1" w:space="0" w:color="CCCCCC"/>
               <w:left w:val="single" w:sz="1" w:space="0" w:color="CCCCCC"/>
@@ -2403,7 +4318,7 @@
         </w:tc>
         <w:tc>
           <w:tcPr>
-            <w:tcW w:w="4692" w:type="dxa"/>
+            <w:tcW w:w="4458" w:type="dxa"/>
             <w:tcBorders>
               <w:top w:val="single" w:sz="1" w:space="0" w:color="CCCCCC"/>
               <w:left w:val="single" w:sz="1" w:space="0" w:color="CCCCCC"/>
@@ -2429,13 +4344,397 @@
                 <w:sz w:val="20"/>
                 <w:szCs w:val="20"/>
               </w:rPr>
-              <w:t>Created three new C++ classes as part of architecture refactor: UTTTGameInstance (inheriting UGameInstance), ATTTGameStateBase (inheriting AGameStateBase), and ATTTPlayerState (inheriting APlayerState). Added EGameModeChoice enum to TTTGameInstance with TwoPlayer and VsAI options. TTTGameInstance stores PlayerOneName, PlayerTwoName, SeriesLength and GameModeChoice. TTTGameStateBase stores PlayerOneScore and PlayerTwoScore with UpdateScore(PlayerNumber) and ResetPlayerScores() functions. TTTPlayerState stores DisplayName with SetName() function</w:t>
-            </w:r>
-          </w:p>
-        </w:tc>
-        <w:tc>
-          <w:tcPr>
-            <w:tcW w:w="2942" w:type="dxa"/>
+              <w:t xml:space="preserve">Created three new C++ classes as part of architecture refactor: </w:t>
+            </w:r>
+            <w:proofErr w:type="spellStart"/>
+            <w:r>
+              <w:rPr>
+                <w:sz w:val="20"/>
+                <w:szCs w:val="20"/>
+              </w:rPr>
+              <w:t>UTTTGameInstance</w:t>
+            </w:r>
+            <w:proofErr w:type="spellEnd"/>
+            <w:r>
+              <w:rPr>
+                <w:sz w:val="20"/>
+                <w:szCs w:val="20"/>
+              </w:rPr>
+              <w:t xml:space="preserve"> (inheriting </w:t>
+            </w:r>
+            <w:proofErr w:type="spellStart"/>
+            <w:r>
+              <w:rPr>
+                <w:sz w:val="20"/>
+                <w:szCs w:val="20"/>
+              </w:rPr>
+              <w:t>UGameInstance</w:t>
+            </w:r>
+            <w:proofErr w:type="spellEnd"/>
+            <w:r>
+              <w:rPr>
+                <w:sz w:val="20"/>
+                <w:szCs w:val="20"/>
+              </w:rPr>
+              <w:t xml:space="preserve">), </w:t>
+            </w:r>
+            <w:proofErr w:type="spellStart"/>
+            <w:r>
+              <w:rPr>
+                <w:sz w:val="20"/>
+                <w:szCs w:val="20"/>
+              </w:rPr>
+              <w:t>ATTTGameStateBase</w:t>
+            </w:r>
+            <w:proofErr w:type="spellEnd"/>
+            <w:r>
+              <w:rPr>
+                <w:sz w:val="20"/>
+                <w:szCs w:val="20"/>
+              </w:rPr>
+              <w:t xml:space="preserve"> (inheriting </w:t>
+            </w:r>
+            <w:proofErr w:type="spellStart"/>
+            <w:r>
+              <w:rPr>
+                <w:sz w:val="20"/>
+                <w:szCs w:val="20"/>
+              </w:rPr>
+              <w:t>AGameStateBase</w:t>
+            </w:r>
+            <w:proofErr w:type="spellEnd"/>
+            <w:r>
+              <w:rPr>
+                <w:sz w:val="20"/>
+                <w:szCs w:val="20"/>
+              </w:rPr>
+              <w:t xml:space="preserve">), and </w:t>
+            </w:r>
+            <w:proofErr w:type="spellStart"/>
+            <w:r>
+              <w:rPr>
+                <w:sz w:val="20"/>
+                <w:szCs w:val="20"/>
+              </w:rPr>
+              <w:t>ATTTPlayerState</w:t>
+            </w:r>
+            <w:proofErr w:type="spellEnd"/>
+            <w:r>
+              <w:rPr>
+                <w:sz w:val="20"/>
+                <w:szCs w:val="20"/>
+              </w:rPr>
+              <w:t xml:space="preserve"> (inheriting </w:t>
+            </w:r>
+            <w:proofErr w:type="spellStart"/>
+            <w:r>
+              <w:rPr>
+                <w:sz w:val="20"/>
+                <w:szCs w:val="20"/>
+              </w:rPr>
+              <w:t>APlayerState</w:t>
+            </w:r>
+            <w:proofErr w:type="spellEnd"/>
+            <w:r>
+              <w:rPr>
+                <w:sz w:val="20"/>
+                <w:szCs w:val="20"/>
+              </w:rPr>
+              <w:t xml:space="preserve">). Added </w:t>
+            </w:r>
+            <w:proofErr w:type="spellStart"/>
+            <w:r>
+              <w:rPr>
+                <w:sz w:val="20"/>
+                <w:szCs w:val="20"/>
+              </w:rPr>
+              <w:t>EGameModeChoice</w:t>
+            </w:r>
+            <w:proofErr w:type="spellEnd"/>
+            <w:r>
+              <w:rPr>
+                <w:sz w:val="20"/>
+                <w:szCs w:val="20"/>
+              </w:rPr>
+              <w:t xml:space="preserve"> </w:t>
+            </w:r>
+            <w:proofErr w:type="spellStart"/>
+            <w:r>
+              <w:rPr>
+                <w:sz w:val="20"/>
+                <w:szCs w:val="20"/>
+              </w:rPr>
+              <w:t>enum</w:t>
+            </w:r>
+            <w:proofErr w:type="spellEnd"/>
+            <w:r>
+              <w:rPr>
+                <w:sz w:val="20"/>
+                <w:szCs w:val="20"/>
+              </w:rPr>
+              <w:t xml:space="preserve"> to </w:t>
+            </w:r>
+            <w:proofErr w:type="spellStart"/>
+            <w:r>
+              <w:rPr>
+                <w:sz w:val="20"/>
+                <w:szCs w:val="20"/>
+              </w:rPr>
+              <w:t>TTTGameInstance</w:t>
+            </w:r>
+            <w:proofErr w:type="spellEnd"/>
+            <w:r>
+              <w:rPr>
+                <w:sz w:val="20"/>
+                <w:szCs w:val="20"/>
+              </w:rPr>
+              <w:t xml:space="preserve"> with </w:t>
+            </w:r>
+            <w:proofErr w:type="spellStart"/>
+            <w:r>
+              <w:rPr>
+                <w:sz w:val="20"/>
+                <w:szCs w:val="20"/>
+              </w:rPr>
+              <w:t>TwoPlayer</w:t>
+            </w:r>
+            <w:proofErr w:type="spellEnd"/>
+            <w:r>
+              <w:rPr>
+                <w:sz w:val="20"/>
+                <w:szCs w:val="20"/>
+              </w:rPr>
+              <w:t xml:space="preserve"> and </w:t>
+            </w:r>
+            <w:proofErr w:type="spellStart"/>
+            <w:r>
+              <w:rPr>
+                <w:sz w:val="20"/>
+                <w:szCs w:val="20"/>
+              </w:rPr>
+              <w:t>VsAI</w:t>
+            </w:r>
+            <w:proofErr w:type="spellEnd"/>
+            <w:r>
+              <w:rPr>
+                <w:sz w:val="20"/>
+                <w:szCs w:val="20"/>
+              </w:rPr>
+              <w:t xml:space="preserve"> options. </w:t>
+            </w:r>
+            <w:proofErr w:type="spellStart"/>
+            <w:r>
+              <w:rPr>
+                <w:sz w:val="20"/>
+                <w:szCs w:val="20"/>
+              </w:rPr>
+              <w:t>TTTGameInstance</w:t>
+            </w:r>
+            <w:proofErr w:type="spellEnd"/>
+            <w:r>
+              <w:rPr>
+                <w:sz w:val="20"/>
+                <w:szCs w:val="20"/>
+              </w:rPr>
+              <w:t xml:space="preserve"> stores </w:t>
+            </w:r>
+            <w:proofErr w:type="spellStart"/>
+            <w:r>
+              <w:rPr>
+                <w:sz w:val="20"/>
+                <w:szCs w:val="20"/>
+              </w:rPr>
+              <w:t>PlayerOneName</w:t>
+            </w:r>
+            <w:proofErr w:type="spellEnd"/>
+            <w:r>
+              <w:rPr>
+                <w:sz w:val="20"/>
+                <w:szCs w:val="20"/>
+              </w:rPr>
+              <w:t xml:space="preserve">, </w:t>
+            </w:r>
+            <w:proofErr w:type="spellStart"/>
+            <w:r>
+              <w:rPr>
+                <w:sz w:val="20"/>
+                <w:szCs w:val="20"/>
+              </w:rPr>
+              <w:t>PlayerTwoName</w:t>
+            </w:r>
+            <w:proofErr w:type="spellEnd"/>
+            <w:r>
+              <w:rPr>
+                <w:sz w:val="20"/>
+                <w:szCs w:val="20"/>
+              </w:rPr>
+              <w:t xml:space="preserve">, </w:t>
+            </w:r>
+            <w:proofErr w:type="spellStart"/>
+            <w:r>
+              <w:rPr>
+                <w:sz w:val="20"/>
+                <w:szCs w:val="20"/>
+              </w:rPr>
+              <w:t>SeriesLength</w:t>
+            </w:r>
+            <w:proofErr w:type="spellEnd"/>
+            <w:r>
+              <w:rPr>
+                <w:sz w:val="20"/>
+                <w:szCs w:val="20"/>
+              </w:rPr>
+              <w:t xml:space="preserve"> and </w:t>
+            </w:r>
+            <w:proofErr w:type="spellStart"/>
+            <w:r>
+              <w:rPr>
+                <w:sz w:val="20"/>
+                <w:szCs w:val="20"/>
+              </w:rPr>
+              <w:t>GameModeChoice</w:t>
+            </w:r>
+            <w:proofErr w:type="spellEnd"/>
+            <w:r>
+              <w:rPr>
+                <w:sz w:val="20"/>
+                <w:szCs w:val="20"/>
+              </w:rPr>
+              <w:t xml:space="preserve">. </w:t>
+            </w:r>
+            <w:proofErr w:type="spellStart"/>
+            <w:r>
+              <w:rPr>
+                <w:sz w:val="20"/>
+                <w:szCs w:val="20"/>
+              </w:rPr>
+              <w:t>TTTGameStateBase</w:t>
+            </w:r>
+            <w:proofErr w:type="spellEnd"/>
+            <w:r>
+              <w:rPr>
+                <w:sz w:val="20"/>
+                <w:szCs w:val="20"/>
+              </w:rPr>
+              <w:t xml:space="preserve"> stores </w:t>
+            </w:r>
+            <w:proofErr w:type="spellStart"/>
+            <w:r>
+              <w:rPr>
+                <w:sz w:val="20"/>
+                <w:szCs w:val="20"/>
+              </w:rPr>
+              <w:t>PlayerOneScore</w:t>
+            </w:r>
+            <w:proofErr w:type="spellEnd"/>
+            <w:r>
+              <w:rPr>
+                <w:sz w:val="20"/>
+                <w:szCs w:val="20"/>
+              </w:rPr>
+              <w:t xml:space="preserve"> and </w:t>
+            </w:r>
+            <w:proofErr w:type="spellStart"/>
+            <w:r>
+              <w:rPr>
+                <w:sz w:val="20"/>
+                <w:szCs w:val="20"/>
+              </w:rPr>
+              <w:t>PlayerTwoScore</w:t>
+            </w:r>
+            <w:proofErr w:type="spellEnd"/>
+            <w:r>
+              <w:rPr>
+                <w:sz w:val="20"/>
+                <w:szCs w:val="20"/>
+              </w:rPr>
+              <w:t xml:space="preserve"> with </w:t>
+            </w:r>
+            <w:proofErr w:type="spellStart"/>
+            <w:r>
+              <w:rPr>
+                <w:sz w:val="20"/>
+                <w:szCs w:val="20"/>
+              </w:rPr>
+              <w:t>UpdateScore</w:t>
+            </w:r>
+            <w:proofErr w:type="spellEnd"/>
+            <w:r>
+              <w:rPr>
+                <w:sz w:val="20"/>
+                <w:szCs w:val="20"/>
+              </w:rPr>
+              <w:t>(</w:t>
+            </w:r>
+            <w:proofErr w:type="spellStart"/>
+            <w:r>
+              <w:rPr>
+                <w:sz w:val="20"/>
+                <w:szCs w:val="20"/>
+              </w:rPr>
+              <w:t>PlayerNumber</w:t>
+            </w:r>
+            <w:proofErr w:type="spellEnd"/>
+            <w:r>
+              <w:rPr>
+                <w:sz w:val="20"/>
+                <w:szCs w:val="20"/>
+              </w:rPr>
+              <w:t xml:space="preserve">) and </w:t>
+            </w:r>
+            <w:proofErr w:type="spellStart"/>
+            <w:r>
+              <w:rPr>
+                <w:sz w:val="20"/>
+                <w:szCs w:val="20"/>
+              </w:rPr>
+              <w:t>ResetPlayerScores</w:t>
+            </w:r>
+            <w:proofErr w:type="spellEnd"/>
+            <w:r>
+              <w:rPr>
+                <w:sz w:val="20"/>
+                <w:szCs w:val="20"/>
+              </w:rPr>
+              <w:t xml:space="preserve">() functions. </w:t>
+            </w:r>
+            <w:proofErr w:type="spellStart"/>
+            <w:r>
+              <w:rPr>
+                <w:sz w:val="20"/>
+                <w:szCs w:val="20"/>
+              </w:rPr>
+              <w:t>TTTPlayerState</w:t>
+            </w:r>
+            <w:proofErr w:type="spellEnd"/>
+            <w:r>
+              <w:rPr>
+                <w:sz w:val="20"/>
+                <w:szCs w:val="20"/>
+              </w:rPr>
+              <w:t xml:space="preserve"> stores DisplayName with </w:t>
+            </w:r>
+            <w:proofErr w:type="spellStart"/>
+            <w:r>
+              <w:rPr>
+                <w:sz w:val="20"/>
+                <w:szCs w:val="20"/>
+              </w:rPr>
+              <w:t>SetName</w:t>
+            </w:r>
+            <w:proofErr w:type="spellEnd"/>
+            <w:r>
+              <w:rPr>
+                <w:sz w:val="20"/>
+                <w:szCs w:val="20"/>
+              </w:rPr>
+              <w:t>() function</w:t>
+            </w:r>
+          </w:p>
+        </w:tc>
+        <w:tc>
+          <w:tcPr>
+            <w:tcW w:w="3264" w:type="dxa"/>
             <w:tcBorders>
               <w:top w:val="single" w:sz="1" w:space="0" w:color="CCCCCC"/>
               <w:left w:val="single" w:sz="1" w:space="0" w:color="CCCCCC"/>
@@ -2469,7 +4768,7 @@
       <w:tr>
         <w:tc>
           <w:tcPr>
-            <w:tcW w:w="1392" w:type="dxa"/>
+            <w:tcW w:w="1304" w:type="dxa"/>
             <w:tcBorders>
               <w:top w:val="single" w:sz="1" w:space="0" w:color="CCCCCC"/>
               <w:left w:val="single" w:sz="1" w:space="0" w:color="CCCCCC"/>
@@ -2502,7 +4801,7 @@
         </w:tc>
         <w:tc>
           <w:tcPr>
-            <w:tcW w:w="4692" w:type="dxa"/>
+            <w:tcW w:w="4458" w:type="dxa"/>
             <w:tcBorders>
               <w:top w:val="single" w:sz="1" w:space="0" w:color="CCCCCC"/>
               <w:left w:val="single" w:sz="1" w:space="0" w:color="CCCCCC"/>
@@ -2529,13 +4828,285 @@
                 <w:sz w:val="20"/>
                 <w:szCs w:val="20"/>
               </w:rPr>
-              <w:t>Refactored score logic out of TicTacToeGameMode into TTTGameStateBase. Removed PlayerOneScore, PlayerTwoScore, UpdatePlayersScore() and ResetPlayerScores() from GameMode. Added TTTGameState cached pointer to GameMode, populated via SetGameState() called after Super::BeginPlay(). Updated UpdatePlayersScore() to call TTTGameState-&gt;UpdateScore(winner) and pass scores directly to UpdateScoreDisplay BlueprintImplementableEvent. Updated UpdateScoreDisplay signature to take P1Score and P2Score as parameters.</w:t>
-            </w:r>
-          </w:p>
-        </w:tc>
-        <w:tc>
-          <w:tcPr>
-            <w:tcW w:w="2942" w:type="dxa"/>
+              <w:t xml:space="preserve">Refactored score logic out of </w:t>
+            </w:r>
+            <w:proofErr w:type="spellStart"/>
+            <w:r>
+              <w:rPr>
+                <w:sz w:val="20"/>
+                <w:szCs w:val="20"/>
+              </w:rPr>
+              <w:t>TicTacToeGameMode</w:t>
+            </w:r>
+            <w:proofErr w:type="spellEnd"/>
+            <w:r>
+              <w:rPr>
+                <w:sz w:val="20"/>
+                <w:szCs w:val="20"/>
+              </w:rPr>
+              <w:t xml:space="preserve"> into </w:t>
+            </w:r>
+            <w:proofErr w:type="spellStart"/>
+            <w:r>
+              <w:rPr>
+                <w:sz w:val="20"/>
+                <w:szCs w:val="20"/>
+              </w:rPr>
+              <w:t>TTTGameStateBase</w:t>
+            </w:r>
+            <w:proofErr w:type="spellEnd"/>
+            <w:r>
+              <w:rPr>
+                <w:sz w:val="20"/>
+                <w:szCs w:val="20"/>
+              </w:rPr>
+              <w:t xml:space="preserve">. Removed </w:t>
+            </w:r>
+            <w:proofErr w:type="spellStart"/>
+            <w:r>
+              <w:rPr>
+                <w:sz w:val="20"/>
+                <w:szCs w:val="20"/>
+              </w:rPr>
+              <w:t>PlayerOneScore</w:t>
+            </w:r>
+            <w:proofErr w:type="spellEnd"/>
+            <w:r>
+              <w:rPr>
+                <w:sz w:val="20"/>
+                <w:szCs w:val="20"/>
+              </w:rPr>
+              <w:t xml:space="preserve">, </w:t>
+            </w:r>
+            <w:proofErr w:type="spellStart"/>
+            <w:r>
+              <w:rPr>
+                <w:sz w:val="20"/>
+                <w:szCs w:val="20"/>
+              </w:rPr>
+              <w:t>PlayerTwoScore</w:t>
+            </w:r>
+            <w:proofErr w:type="spellEnd"/>
+            <w:r>
+              <w:rPr>
+                <w:sz w:val="20"/>
+                <w:szCs w:val="20"/>
+              </w:rPr>
+              <w:t xml:space="preserve">, </w:t>
+            </w:r>
+            <w:proofErr w:type="spellStart"/>
+            <w:r>
+              <w:rPr>
+                <w:sz w:val="20"/>
+                <w:szCs w:val="20"/>
+              </w:rPr>
+              <w:t>UpdatePlayersScore</w:t>
+            </w:r>
+            <w:proofErr w:type="spellEnd"/>
+            <w:r>
+              <w:rPr>
+                <w:sz w:val="20"/>
+                <w:szCs w:val="20"/>
+              </w:rPr>
+              <w:t xml:space="preserve">() and </w:t>
+            </w:r>
+            <w:proofErr w:type="spellStart"/>
+            <w:r>
+              <w:rPr>
+                <w:sz w:val="20"/>
+                <w:szCs w:val="20"/>
+              </w:rPr>
+              <w:t>ResetPlayerScores</w:t>
+            </w:r>
+            <w:proofErr w:type="spellEnd"/>
+            <w:r>
+              <w:rPr>
+                <w:sz w:val="20"/>
+                <w:szCs w:val="20"/>
+              </w:rPr>
+              <w:t xml:space="preserve">() from </w:t>
+            </w:r>
+            <w:proofErr w:type="spellStart"/>
+            <w:r>
+              <w:rPr>
+                <w:sz w:val="20"/>
+                <w:szCs w:val="20"/>
+              </w:rPr>
+              <w:t>GameMode</w:t>
+            </w:r>
+            <w:proofErr w:type="spellEnd"/>
+            <w:r>
+              <w:rPr>
+                <w:sz w:val="20"/>
+                <w:szCs w:val="20"/>
+              </w:rPr>
+              <w:t xml:space="preserve">. Added </w:t>
+            </w:r>
+            <w:proofErr w:type="spellStart"/>
+            <w:r>
+              <w:rPr>
+                <w:sz w:val="20"/>
+                <w:szCs w:val="20"/>
+              </w:rPr>
+              <w:t>TTTGameState</w:t>
+            </w:r>
+            <w:proofErr w:type="spellEnd"/>
+            <w:r>
+              <w:rPr>
+                <w:sz w:val="20"/>
+                <w:szCs w:val="20"/>
+              </w:rPr>
+              <w:t xml:space="preserve"> cached pointer to </w:t>
+            </w:r>
+            <w:proofErr w:type="spellStart"/>
+            <w:r>
+              <w:rPr>
+                <w:sz w:val="20"/>
+                <w:szCs w:val="20"/>
+              </w:rPr>
+              <w:t>GameMode</w:t>
+            </w:r>
+            <w:proofErr w:type="spellEnd"/>
+            <w:r>
+              <w:rPr>
+                <w:sz w:val="20"/>
+                <w:szCs w:val="20"/>
+              </w:rPr>
+              <w:t xml:space="preserve">, populated via </w:t>
+            </w:r>
+            <w:proofErr w:type="spellStart"/>
+            <w:r>
+              <w:rPr>
+                <w:sz w:val="20"/>
+                <w:szCs w:val="20"/>
+              </w:rPr>
+              <w:t>SetGameState</w:t>
+            </w:r>
+            <w:proofErr w:type="spellEnd"/>
+            <w:r>
+              <w:rPr>
+                <w:sz w:val="20"/>
+                <w:szCs w:val="20"/>
+              </w:rPr>
+              <w:t>() called after Super::</w:t>
+            </w:r>
+            <w:proofErr w:type="spellStart"/>
+            <w:r>
+              <w:rPr>
+                <w:sz w:val="20"/>
+                <w:szCs w:val="20"/>
+              </w:rPr>
+              <w:t>BeginPlay</w:t>
+            </w:r>
+            <w:proofErr w:type="spellEnd"/>
+            <w:r>
+              <w:rPr>
+                <w:sz w:val="20"/>
+                <w:szCs w:val="20"/>
+              </w:rPr>
+              <w:t xml:space="preserve">(). Updated </w:t>
+            </w:r>
+            <w:proofErr w:type="spellStart"/>
+            <w:r>
+              <w:rPr>
+                <w:sz w:val="20"/>
+                <w:szCs w:val="20"/>
+              </w:rPr>
+              <w:t>UpdatePlayersScore</w:t>
+            </w:r>
+            <w:proofErr w:type="spellEnd"/>
+            <w:r>
+              <w:rPr>
+                <w:sz w:val="20"/>
+                <w:szCs w:val="20"/>
+              </w:rPr>
+              <w:t xml:space="preserve">() to call </w:t>
+            </w:r>
+            <w:proofErr w:type="spellStart"/>
+            <w:r>
+              <w:rPr>
+                <w:sz w:val="20"/>
+                <w:szCs w:val="20"/>
+              </w:rPr>
+              <w:t>TTTGameState</w:t>
+            </w:r>
+            <w:proofErr w:type="spellEnd"/>
+            <w:r>
+              <w:rPr>
+                <w:sz w:val="20"/>
+                <w:szCs w:val="20"/>
+              </w:rPr>
+              <w:t>-&gt;</w:t>
+            </w:r>
+            <w:proofErr w:type="spellStart"/>
+            <w:r>
+              <w:rPr>
+                <w:sz w:val="20"/>
+                <w:szCs w:val="20"/>
+              </w:rPr>
+              <w:t>UpdateScore</w:t>
+            </w:r>
+            <w:proofErr w:type="spellEnd"/>
+            <w:r>
+              <w:rPr>
+                <w:sz w:val="20"/>
+                <w:szCs w:val="20"/>
+              </w:rPr>
+              <w:t xml:space="preserve">(winner) and pass scores directly to </w:t>
+            </w:r>
+            <w:proofErr w:type="spellStart"/>
+            <w:r>
+              <w:rPr>
+                <w:sz w:val="20"/>
+                <w:szCs w:val="20"/>
+              </w:rPr>
+              <w:t>UpdateScoreDisplay</w:t>
+            </w:r>
+            <w:proofErr w:type="spellEnd"/>
+            <w:r>
+              <w:rPr>
+                <w:sz w:val="20"/>
+                <w:szCs w:val="20"/>
+              </w:rPr>
+              <w:t xml:space="preserve"> </w:t>
+            </w:r>
+            <w:proofErr w:type="spellStart"/>
+            <w:r>
+              <w:rPr>
+                <w:sz w:val="20"/>
+                <w:szCs w:val="20"/>
+              </w:rPr>
+              <w:t>BlueprintImplementableEvent</w:t>
+            </w:r>
+            <w:proofErr w:type="spellEnd"/>
+            <w:r>
+              <w:rPr>
+                <w:sz w:val="20"/>
+                <w:szCs w:val="20"/>
+              </w:rPr>
+              <w:t xml:space="preserve">. Updated </w:t>
+            </w:r>
+            <w:proofErr w:type="spellStart"/>
+            <w:r>
+              <w:rPr>
+                <w:sz w:val="20"/>
+                <w:szCs w:val="20"/>
+              </w:rPr>
+              <w:t>UpdateScoreDisplay</w:t>
+            </w:r>
+            <w:proofErr w:type="spellEnd"/>
+            <w:r>
+              <w:rPr>
+                <w:sz w:val="20"/>
+                <w:szCs w:val="20"/>
+              </w:rPr>
+              <w:t xml:space="preserve"> signature to take P1Score and P2Score as parameters.</w:t>
+            </w:r>
+          </w:p>
+        </w:tc>
+        <w:tc>
+          <w:tcPr>
+            <w:tcW w:w="3264" w:type="dxa"/>
             <w:tcBorders>
               <w:top w:val="single" w:sz="1" w:space="0" w:color="CCCCCC"/>
               <w:left w:val="single" w:sz="1" w:space="0" w:color="CCCCCC"/>
@@ -2562,15 +5133,175 @@
                 <w:sz w:val="20"/>
                 <w:szCs w:val="20"/>
               </w:rPr>
-              <w:t>Unreal crash on game over — EXCEPTION_ACCESS_VIOLATION in ATTTGameStateBase::UpdateScore(). Root cause: SetGameState() was implemented but never called in BeginPlay, leaving TTTGameState as null. Fixed by adding SetGameState() call after Super::BeginPlay(). BP_TicTacToeGameMode Game State Class and Player State Class settings reset to defaults after recompile — manually reassigned TTTGameStateBase and TTTPlayerState in Class Defaults. Noted as recurring issue to check after significant compiles.</w:t>
-            </w:r>
-          </w:p>
-        </w:tc>
-      </w:tr>
-      <w:tr>
-        <w:tc>
-          <w:tcPr>
-            <w:tcW w:w="1392" w:type="dxa"/>
+              <w:t xml:space="preserve">Unreal crash on game over — EXCEPTION_ACCESS_VIOLATION in </w:t>
+            </w:r>
+            <w:proofErr w:type="spellStart"/>
+            <w:r>
+              <w:rPr>
+                <w:sz w:val="20"/>
+                <w:szCs w:val="20"/>
+              </w:rPr>
+              <w:t>ATTTGameStateBase</w:t>
+            </w:r>
+            <w:proofErr w:type="spellEnd"/>
+            <w:r>
+              <w:rPr>
+                <w:sz w:val="20"/>
+                <w:szCs w:val="20"/>
+              </w:rPr>
+              <w:t>::</w:t>
+            </w:r>
+            <w:proofErr w:type="spellStart"/>
+            <w:r>
+              <w:rPr>
+                <w:sz w:val="20"/>
+                <w:szCs w:val="20"/>
+              </w:rPr>
+              <w:t>UpdateScore</w:t>
+            </w:r>
+            <w:proofErr w:type="spellEnd"/>
+            <w:r>
+              <w:rPr>
+                <w:sz w:val="20"/>
+                <w:szCs w:val="20"/>
+              </w:rPr>
+              <w:t xml:space="preserve">(). Root cause: </w:t>
+            </w:r>
+            <w:proofErr w:type="spellStart"/>
+            <w:r>
+              <w:rPr>
+                <w:sz w:val="20"/>
+                <w:szCs w:val="20"/>
+              </w:rPr>
+              <w:t>SetGameState</w:t>
+            </w:r>
+            <w:proofErr w:type="spellEnd"/>
+            <w:r>
+              <w:rPr>
+                <w:sz w:val="20"/>
+                <w:szCs w:val="20"/>
+              </w:rPr>
+              <w:t xml:space="preserve">() was implemented but never called in </w:t>
+            </w:r>
+            <w:proofErr w:type="spellStart"/>
+            <w:r>
+              <w:rPr>
+                <w:sz w:val="20"/>
+                <w:szCs w:val="20"/>
+              </w:rPr>
+              <w:t>BeginPlay</w:t>
+            </w:r>
+            <w:proofErr w:type="spellEnd"/>
+            <w:r>
+              <w:rPr>
+                <w:sz w:val="20"/>
+                <w:szCs w:val="20"/>
+              </w:rPr>
+              <w:t xml:space="preserve">, leaving </w:t>
+            </w:r>
+            <w:proofErr w:type="spellStart"/>
+            <w:r>
+              <w:rPr>
+                <w:sz w:val="20"/>
+                <w:szCs w:val="20"/>
+              </w:rPr>
+              <w:t>TTTGameState</w:t>
+            </w:r>
+            <w:proofErr w:type="spellEnd"/>
+            <w:r>
+              <w:rPr>
+                <w:sz w:val="20"/>
+                <w:szCs w:val="20"/>
+              </w:rPr>
+              <w:t xml:space="preserve"> as null. Fixed by adding </w:t>
+            </w:r>
+            <w:proofErr w:type="spellStart"/>
+            <w:r>
+              <w:rPr>
+                <w:sz w:val="20"/>
+                <w:szCs w:val="20"/>
+              </w:rPr>
+              <w:t>SetGameState</w:t>
+            </w:r>
+            <w:proofErr w:type="spellEnd"/>
+            <w:r>
+              <w:rPr>
+                <w:sz w:val="20"/>
+                <w:szCs w:val="20"/>
+              </w:rPr>
+              <w:t>() call after Super::</w:t>
+            </w:r>
+            <w:proofErr w:type="spellStart"/>
+            <w:r>
+              <w:rPr>
+                <w:sz w:val="20"/>
+                <w:szCs w:val="20"/>
+              </w:rPr>
+              <w:t>BeginPlay</w:t>
+            </w:r>
+            <w:proofErr w:type="spellEnd"/>
+            <w:r>
+              <w:rPr>
+                <w:sz w:val="20"/>
+                <w:szCs w:val="20"/>
+              </w:rPr>
+              <w:t xml:space="preserve">(). </w:t>
+            </w:r>
+            <w:proofErr w:type="spellStart"/>
+            <w:r>
+              <w:rPr>
+                <w:sz w:val="20"/>
+                <w:szCs w:val="20"/>
+              </w:rPr>
+              <w:t>BP_TicTacToeGameMode</w:t>
+            </w:r>
+            <w:proofErr w:type="spellEnd"/>
+            <w:r>
+              <w:rPr>
+                <w:sz w:val="20"/>
+                <w:szCs w:val="20"/>
+              </w:rPr>
+              <w:t xml:space="preserve"> Game State Class and Player State Class settings reset to defaults after recompile — manually reassigned </w:t>
+            </w:r>
+            <w:proofErr w:type="spellStart"/>
+            <w:r>
+              <w:rPr>
+                <w:sz w:val="20"/>
+                <w:szCs w:val="20"/>
+              </w:rPr>
+              <w:t>TTTGameStateBase</w:t>
+            </w:r>
+            <w:proofErr w:type="spellEnd"/>
+            <w:r>
+              <w:rPr>
+                <w:sz w:val="20"/>
+                <w:szCs w:val="20"/>
+              </w:rPr>
+              <w:t xml:space="preserve"> and </w:t>
+            </w:r>
+            <w:proofErr w:type="spellStart"/>
+            <w:r>
+              <w:rPr>
+                <w:sz w:val="20"/>
+                <w:szCs w:val="20"/>
+              </w:rPr>
+              <w:t>TTTPlayerState</w:t>
+            </w:r>
+            <w:proofErr w:type="spellEnd"/>
+            <w:r>
+              <w:rPr>
+                <w:sz w:val="20"/>
+                <w:szCs w:val="20"/>
+              </w:rPr>
+              <w:t xml:space="preserve"> in Class Defaults. Noted as recurring issue to check after significant compiles.</w:t>
+            </w:r>
+          </w:p>
+        </w:tc>
+      </w:tr>
+      <w:tr>
+        <w:tc>
+          <w:tcPr>
+            <w:tcW w:w="1304" w:type="dxa"/>
             <w:tcBorders>
               <w:top w:val="single" w:sz="1" w:space="0" w:color="CCCCCC"/>
               <w:left w:val="single" w:sz="1" w:space="0" w:color="CCCCCC"/>
@@ -2603,7 +5334,7 @@
         </w:tc>
         <w:tc>
           <w:tcPr>
-            <w:tcW w:w="4692" w:type="dxa"/>
+            <w:tcW w:w="4458" w:type="dxa"/>
             <w:tcBorders>
               <w:top w:val="single" w:sz="1" w:space="0" w:color="CCCCCC"/>
               <w:left w:val="single" w:sz="1" w:space="0" w:color="CCCCCC"/>
@@ -2629,13 +5360,141 @@
                 <w:sz w:val="20"/>
                 <w:szCs w:val="20"/>
               </w:rPr>
-              <w:t>Added UTTTGameInstance cached pointer to GameMode, populated via SetGameInstance() called before Super::BeginPlay() since GameInstance exists for the entire application lifetime. Added UPROPERTY() to both TTTGameState and TTTGameInstance cached pointers to prevent Unreal garbage collector destroying objects while pointers still held references. Registered TTTGameInstance as Game Instance Class in Project Settings Maps and Modes.</w:t>
-            </w:r>
-          </w:p>
-        </w:tc>
-        <w:tc>
-          <w:tcPr>
-            <w:tcW w:w="2942" w:type="dxa"/>
+              <w:t xml:space="preserve">Added </w:t>
+            </w:r>
+            <w:proofErr w:type="spellStart"/>
+            <w:r>
+              <w:rPr>
+                <w:sz w:val="20"/>
+                <w:szCs w:val="20"/>
+              </w:rPr>
+              <w:t>UTTTGameInstance</w:t>
+            </w:r>
+            <w:proofErr w:type="spellEnd"/>
+            <w:r>
+              <w:rPr>
+                <w:sz w:val="20"/>
+                <w:szCs w:val="20"/>
+              </w:rPr>
+              <w:t xml:space="preserve"> cached pointer to </w:t>
+            </w:r>
+            <w:proofErr w:type="spellStart"/>
+            <w:r>
+              <w:rPr>
+                <w:sz w:val="20"/>
+                <w:szCs w:val="20"/>
+              </w:rPr>
+              <w:t>GameMode</w:t>
+            </w:r>
+            <w:proofErr w:type="spellEnd"/>
+            <w:r>
+              <w:rPr>
+                <w:sz w:val="20"/>
+                <w:szCs w:val="20"/>
+              </w:rPr>
+              <w:t xml:space="preserve">, populated via </w:t>
+            </w:r>
+            <w:proofErr w:type="spellStart"/>
+            <w:r>
+              <w:rPr>
+                <w:sz w:val="20"/>
+                <w:szCs w:val="20"/>
+              </w:rPr>
+              <w:t>SetGameInstance</w:t>
+            </w:r>
+            <w:proofErr w:type="spellEnd"/>
+            <w:r>
+              <w:rPr>
+                <w:sz w:val="20"/>
+                <w:szCs w:val="20"/>
+              </w:rPr>
+              <w:t>() called before Super::</w:t>
+            </w:r>
+            <w:proofErr w:type="spellStart"/>
+            <w:r>
+              <w:rPr>
+                <w:sz w:val="20"/>
+                <w:szCs w:val="20"/>
+              </w:rPr>
+              <w:t>BeginPlay</w:t>
+            </w:r>
+            <w:proofErr w:type="spellEnd"/>
+            <w:r>
+              <w:rPr>
+                <w:sz w:val="20"/>
+                <w:szCs w:val="20"/>
+              </w:rPr>
+              <w:t xml:space="preserve">() since </w:t>
+            </w:r>
+            <w:proofErr w:type="spellStart"/>
+            <w:r>
+              <w:rPr>
+                <w:sz w:val="20"/>
+                <w:szCs w:val="20"/>
+              </w:rPr>
+              <w:t>GameInstance</w:t>
+            </w:r>
+            <w:proofErr w:type="spellEnd"/>
+            <w:r>
+              <w:rPr>
+                <w:sz w:val="20"/>
+                <w:szCs w:val="20"/>
+              </w:rPr>
+              <w:t xml:space="preserve"> exists for the entire application lifetime. Added UPROPERTY() to both </w:t>
+            </w:r>
+            <w:proofErr w:type="spellStart"/>
+            <w:r>
+              <w:rPr>
+                <w:sz w:val="20"/>
+                <w:szCs w:val="20"/>
+              </w:rPr>
+              <w:t>TTTGameState</w:t>
+            </w:r>
+            <w:proofErr w:type="spellEnd"/>
+            <w:r>
+              <w:rPr>
+                <w:sz w:val="20"/>
+                <w:szCs w:val="20"/>
+              </w:rPr>
+              <w:t xml:space="preserve"> and </w:t>
+            </w:r>
+            <w:proofErr w:type="spellStart"/>
+            <w:r>
+              <w:rPr>
+                <w:sz w:val="20"/>
+                <w:szCs w:val="20"/>
+              </w:rPr>
+              <w:t>TTTGameInstance</w:t>
+            </w:r>
+            <w:proofErr w:type="spellEnd"/>
+            <w:r>
+              <w:rPr>
+                <w:sz w:val="20"/>
+                <w:szCs w:val="20"/>
+              </w:rPr>
+              <w:t xml:space="preserve"> cached pointers to prevent Unreal garbage collector destroying objects while pointers still held references. Registered </w:t>
+            </w:r>
+            <w:proofErr w:type="spellStart"/>
+            <w:r>
+              <w:rPr>
+                <w:sz w:val="20"/>
+                <w:szCs w:val="20"/>
+              </w:rPr>
+              <w:t>TTTGameInstance</w:t>
+            </w:r>
+            <w:proofErr w:type="spellEnd"/>
+            <w:r>
+              <w:rPr>
+                <w:sz w:val="20"/>
+                <w:szCs w:val="20"/>
+              </w:rPr>
+              <w:t xml:space="preserve"> as Game Instance Class in Project Settings Maps and Modes.</w:t>
+            </w:r>
+          </w:p>
+        </w:tc>
+        <w:tc>
+          <w:tcPr>
+            <w:tcW w:w="3264" w:type="dxa"/>
             <w:tcBorders>
               <w:top w:val="single" w:sz="1" w:space="0" w:color="CCCCCC"/>
               <w:left w:val="single" w:sz="1" w:space="0" w:color="CCCCCC"/>
@@ -2662,6 +5521,417 @@
                 <w:szCs w:val="20"/>
               </w:rPr>
               <w:t>n/a</w:t>
+            </w:r>
+          </w:p>
+        </w:tc>
+      </w:tr>
+      <w:tr>
+        <w:tc>
+          <w:tcPr>
+            <w:tcW w:w="1304" w:type="dxa"/>
+            <w:tcBorders>
+              <w:top w:val="single" w:sz="1" w:space="0" w:color="CCCCCC"/>
+              <w:left w:val="single" w:sz="1" w:space="0" w:color="CCCCCC"/>
+              <w:bottom w:val="single" w:sz="1" w:space="0" w:color="CCCCCC"/>
+              <w:right w:val="single" w:sz="1" w:space="0" w:color="CCCCCC"/>
+            </w:tcBorders>
+            <w:tcMar>
+              <w:top w:w="80" w:type="dxa"/>
+              <w:left w:w="120" w:type="dxa"/>
+              <w:bottom w:w="80" w:type="dxa"/>
+              <w:right w:w="120" w:type="dxa"/>
+            </w:tcMar>
+          </w:tcPr>
+          <w:p>
+            <w:pPr>
+              <w:rPr>
+                <w:sz w:val="20"/>
+                <w:szCs w:val="20"/>
+              </w:rPr>
+            </w:pPr>
+            <w:r>
+              <w:rPr>
+                <w:sz w:val="20"/>
+                <w:szCs w:val="20"/>
+              </w:rPr>
+              <w:t>19/08/26</w:t>
+            </w:r>
+          </w:p>
+        </w:tc>
+        <w:tc>
+          <w:tcPr>
+            <w:tcW w:w="4458" w:type="dxa"/>
+            <w:tcBorders>
+              <w:top w:val="single" w:sz="1" w:space="0" w:color="CCCCCC"/>
+              <w:left w:val="single" w:sz="1" w:space="0" w:color="CCCCCC"/>
+              <w:bottom w:val="single" w:sz="1" w:space="0" w:color="CCCCCC"/>
+              <w:right w:val="single" w:sz="1" w:space="0" w:color="CCCCCC"/>
+            </w:tcBorders>
+            <w:tcMar>
+              <w:top w:w="80" w:type="dxa"/>
+              <w:left w:w="120" w:type="dxa"/>
+              <w:bottom w:w="80" w:type="dxa"/>
+              <w:right w:w="120" w:type="dxa"/>
+            </w:tcMar>
+          </w:tcPr>
+          <w:p>
+            <w:pPr>
+              <w:rPr>
+                <w:sz w:val="20"/>
+                <w:szCs w:val="20"/>
+              </w:rPr>
+            </w:pPr>
+            <w:r>
+              <w:rPr>
+                <w:sz w:val="20"/>
+                <w:szCs w:val="20"/>
+              </w:rPr>
+              <w:t xml:space="preserve">Created </w:t>
+            </w:r>
+            <w:proofErr w:type="spellStart"/>
+            <w:r>
+              <w:rPr>
+                <w:sz w:val="20"/>
+                <w:szCs w:val="20"/>
+              </w:rPr>
+              <w:t>TTTMenuGameMode</w:t>
+            </w:r>
+            <w:proofErr w:type="spellEnd"/>
+            <w:r>
+              <w:rPr>
+                <w:sz w:val="20"/>
+                <w:szCs w:val="20"/>
+              </w:rPr>
+              <w:t xml:space="preserve"> C++ class with </w:t>
+            </w:r>
+            <w:proofErr w:type="spellStart"/>
+            <w:r>
+              <w:rPr>
+                <w:sz w:val="20"/>
+                <w:szCs w:val="20"/>
+              </w:rPr>
+              <w:t>SetTTTGameInstance</w:t>
+            </w:r>
+            <w:proofErr w:type="spellEnd"/>
+            <w:r>
+              <w:rPr>
+                <w:sz w:val="20"/>
+                <w:szCs w:val="20"/>
+              </w:rPr>
+              <w:t xml:space="preserve">() and </w:t>
+            </w:r>
+            <w:proofErr w:type="spellStart"/>
+            <w:r>
+              <w:rPr>
+                <w:sz w:val="20"/>
+                <w:szCs w:val="20"/>
+              </w:rPr>
+              <w:t>GetTTTGameInstance</w:t>
+            </w:r>
+            <w:proofErr w:type="spellEnd"/>
+            <w:r>
+              <w:rPr>
+                <w:sz w:val="20"/>
+                <w:szCs w:val="20"/>
+              </w:rPr>
+              <w:t xml:space="preserve">() functions. Created </w:t>
+            </w:r>
+            <w:proofErr w:type="spellStart"/>
+            <w:r>
+              <w:rPr>
+                <w:sz w:val="20"/>
+                <w:szCs w:val="20"/>
+              </w:rPr>
+              <w:t>MainMenu</w:t>
+            </w:r>
+            <w:proofErr w:type="spellEnd"/>
+            <w:r>
+              <w:rPr>
+                <w:sz w:val="20"/>
+                <w:szCs w:val="20"/>
+              </w:rPr>
+              <w:t xml:space="preserve"> level with </w:t>
+            </w:r>
+            <w:proofErr w:type="spellStart"/>
+            <w:r>
+              <w:rPr>
+                <w:sz w:val="20"/>
+                <w:szCs w:val="20"/>
+              </w:rPr>
+              <w:t>BP_MenuGameMode</w:t>
+            </w:r>
+            <w:proofErr w:type="spellEnd"/>
+            <w:r>
+              <w:rPr>
+                <w:sz w:val="20"/>
+                <w:szCs w:val="20"/>
+              </w:rPr>
+              <w:t xml:space="preserve"> Blueprint. Built </w:t>
+            </w:r>
+            <w:proofErr w:type="spellStart"/>
+            <w:r>
+              <w:rPr>
+                <w:sz w:val="20"/>
+                <w:szCs w:val="20"/>
+              </w:rPr>
+              <w:t>WBP_MenuUI</w:t>
+            </w:r>
+            <w:proofErr w:type="spellEnd"/>
+            <w:r>
+              <w:rPr>
+                <w:sz w:val="20"/>
+                <w:szCs w:val="20"/>
+              </w:rPr>
+              <w:t xml:space="preserve"> widget with Human vs Human, Human vs AI, Options, Exit buttons and </w:t>
+            </w:r>
+            <w:proofErr w:type="spellStart"/>
+            <w:r>
+              <w:rPr>
+                <w:sz w:val="20"/>
+                <w:szCs w:val="20"/>
+              </w:rPr>
+              <w:t>Num_Rounds_Panel</w:t>
+            </w:r>
+            <w:proofErr w:type="spellEnd"/>
+            <w:r>
+              <w:rPr>
+                <w:sz w:val="20"/>
+                <w:szCs w:val="20"/>
+              </w:rPr>
+              <w:t xml:space="preserve"> containing 1, 3 and 5 wins buttons. Implemented </w:t>
+            </w:r>
+            <w:proofErr w:type="spellStart"/>
+            <w:r>
+              <w:rPr>
+                <w:sz w:val="20"/>
+                <w:szCs w:val="20"/>
+              </w:rPr>
+              <w:t>SetNumRoundsPanelVisibility</w:t>
+            </w:r>
+            <w:proofErr w:type="spellEnd"/>
+            <w:r>
+              <w:rPr>
+                <w:sz w:val="20"/>
+                <w:szCs w:val="20"/>
+              </w:rPr>
+              <w:t xml:space="preserve">, </w:t>
+            </w:r>
+            <w:proofErr w:type="spellStart"/>
+            <w:r>
+              <w:rPr>
+                <w:sz w:val="20"/>
+                <w:szCs w:val="20"/>
+              </w:rPr>
+              <w:t>SetGameVSMode</w:t>
+            </w:r>
+            <w:proofErr w:type="spellEnd"/>
+            <w:r>
+              <w:rPr>
+                <w:sz w:val="20"/>
+                <w:szCs w:val="20"/>
+              </w:rPr>
+              <w:t xml:space="preserve"> and </w:t>
+            </w:r>
+            <w:proofErr w:type="spellStart"/>
+            <w:r>
+              <w:rPr>
+                <w:sz w:val="20"/>
+                <w:szCs w:val="20"/>
+              </w:rPr>
+              <w:t>SetNumWins</w:t>
+            </w:r>
+            <w:proofErr w:type="spellEnd"/>
+            <w:r>
+              <w:rPr>
+                <w:sz w:val="20"/>
+                <w:szCs w:val="20"/>
+              </w:rPr>
+              <w:t xml:space="preserve"> functions in </w:t>
+            </w:r>
+            <w:proofErr w:type="spellStart"/>
+            <w:r>
+              <w:rPr>
+                <w:sz w:val="20"/>
+                <w:szCs w:val="20"/>
+              </w:rPr>
+              <w:t>WBP_MenuUI</w:t>
+            </w:r>
+            <w:proofErr w:type="spellEnd"/>
+            <w:r>
+              <w:rPr>
+                <w:sz w:val="20"/>
+                <w:szCs w:val="20"/>
+              </w:rPr>
+              <w:t xml:space="preserve">. Wired all buttons to store selections in </w:t>
+            </w:r>
+            <w:proofErr w:type="spellStart"/>
+            <w:r>
+              <w:rPr>
+                <w:sz w:val="20"/>
+                <w:szCs w:val="20"/>
+              </w:rPr>
+              <w:t>UTTTGameInstance</w:t>
+            </w:r>
+            <w:proofErr w:type="spellEnd"/>
+            <w:r>
+              <w:rPr>
+                <w:sz w:val="20"/>
+                <w:szCs w:val="20"/>
+              </w:rPr>
+              <w:t xml:space="preserve">. Added Start Game button loading the game level via Open Level by Name. Verified level transition works correctly and </w:t>
+            </w:r>
+            <w:proofErr w:type="spellStart"/>
+            <w:r>
+              <w:rPr>
+                <w:sz w:val="20"/>
+                <w:szCs w:val="20"/>
+              </w:rPr>
+              <w:t>GameMode</w:t>
+            </w:r>
+            <w:proofErr w:type="spellEnd"/>
+            <w:r>
+              <w:rPr>
+                <w:sz w:val="20"/>
+                <w:szCs w:val="20"/>
+              </w:rPr>
+              <w:t xml:space="preserve"> switches automatically via World Settings Game Mode Override. </w:t>
+            </w:r>
+            <w:proofErr w:type="spellStart"/>
+            <w:r>
+              <w:rPr>
+                <w:sz w:val="20"/>
+                <w:szCs w:val="20"/>
+              </w:rPr>
+              <w:t>CheckSeriesWin</w:t>
+            </w:r>
+            <w:proofErr w:type="spellEnd"/>
+            <w:r>
+              <w:rPr>
+                <w:sz w:val="20"/>
+                <w:szCs w:val="20"/>
+              </w:rPr>
+              <w:t xml:space="preserve"> logic in </w:t>
+            </w:r>
+            <w:proofErr w:type="spellStart"/>
+            <w:r>
+              <w:rPr>
+                <w:sz w:val="20"/>
+                <w:szCs w:val="20"/>
+              </w:rPr>
+              <w:t>HandleSquareSelected</w:t>
+            </w:r>
+            <w:proofErr w:type="spellEnd"/>
+            <w:r>
+              <w:rPr>
+                <w:sz w:val="20"/>
+                <w:szCs w:val="20"/>
+              </w:rPr>
+              <w:t xml:space="preserve"> — series win detection confirmed working correctly with selected number of wins.</w:t>
+            </w:r>
+          </w:p>
+        </w:tc>
+        <w:tc>
+          <w:tcPr>
+            <w:tcW w:w="3264" w:type="dxa"/>
+            <w:tcBorders>
+              <w:top w:val="single" w:sz="1" w:space="0" w:color="CCCCCC"/>
+              <w:left w:val="single" w:sz="1" w:space="0" w:color="CCCCCC"/>
+              <w:bottom w:val="single" w:sz="1" w:space="0" w:color="CCCCCC"/>
+              <w:right w:val="single" w:sz="1" w:space="0" w:color="CCCCCC"/>
+            </w:tcBorders>
+            <w:tcMar>
+              <w:top w:w="80" w:type="dxa"/>
+              <w:left w:w="120" w:type="dxa"/>
+              <w:bottom w:w="80" w:type="dxa"/>
+              <w:right w:w="120" w:type="dxa"/>
+            </w:tcMar>
+          </w:tcPr>
+          <w:p>
+            <w:pPr>
+              <w:rPr>
+                <w:sz w:val="20"/>
+                <w:szCs w:val="20"/>
+              </w:rPr>
+            </w:pPr>
+            <w:proofErr w:type="spellStart"/>
+            <w:r>
+              <w:rPr>
+                <w:sz w:val="20"/>
+                <w:szCs w:val="20"/>
+              </w:rPr>
+              <w:t>GetGameInstance</w:t>
+            </w:r>
+            <w:proofErr w:type="spellEnd"/>
+            <w:r>
+              <w:rPr>
+                <w:sz w:val="20"/>
+                <w:szCs w:val="20"/>
+              </w:rPr>
+              <w:t xml:space="preserve">() naming conflict in </w:t>
+            </w:r>
+            <w:proofErr w:type="spellStart"/>
+            <w:r>
+              <w:rPr>
+                <w:sz w:val="20"/>
+                <w:szCs w:val="20"/>
+              </w:rPr>
+              <w:t>TTTMenuGameMode</w:t>
+            </w:r>
+            <w:proofErr w:type="spellEnd"/>
+            <w:r>
+              <w:rPr>
+                <w:sz w:val="20"/>
+                <w:szCs w:val="20"/>
+              </w:rPr>
+              <w:t xml:space="preserve"> — function name clashed with parent class built-in. Renamed to </w:t>
+            </w:r>
+            <w:proofErr w:type="spellStart"/>
+            <w:r>
+              <w:rPr>
+                <w:sz w:val="20"/>
+                <w:szCs w:val="20"/>
+              </w:rPr>
+              <w:t>GetTTTGameInstance</w:t>
+            </w:r>
+            <w:proofErr w:type="spellEnd"/>
+            <w:r>
+              <w:rPr>
+                <w:sz w:val="20"/>
+                <w:szCs w:val="20"/>
+              </w:rPr>
+              <w:t xml:space="preserve">(). LIVECODING prefix appearing on Blueprint type references after Live Coding recompile — fixed by full close and rebuild cycle. </w:t>
+            </w:r>
+            <w:proofErr w:type="spellStart"/>
+            <w:r>
+              <w:rPr>
+                <w:sz w:val="20"/>
+                <w:szCs w:val="20"/>
+              </w:rPr>
+              <w:t>SetVSGameModeChoice</w:t>
+            </w:r>
+            <w:proofErr w:type="spellEnd"/>
+            <w:r>
+              <w:rPr>
+                <w:sz w:val="20"/>
+                <w:szCs w:val="20"/>
+              </w:rPr>
+              <w:t xml:space="preserve"> parameter shadowing error from Unreal Header Tool — fixed by renaming parameter with In prefix convention (</w:t>
+            </w:r>
+            <w:proofErr w:type="spellStart"/>
+            <w:r>
+              <w:rPr>
+                <w:sz w:val="20"/>
+                <w:szCs w:val="20"/>
+              </w:rPr>
+              <w:t>InGameModeChoice</w:t>
+            </w:r>
+            <w:proofErr w:type="spellEnd"/>
+            <w:r>
+              <w:rPr>
+                <w:sz w:val="20"/>
+                <w:szCs w:val="20"/>
+              </w:rPr>
+              <w:t>). Game Mode not switching on level change — resolved by setting Game Mode Override in World Settings on the game level rather than trying to switch manually.</w:t>
             </w:r>
           </w:p>
         </w:tc>
@@ -2802,6 +6072,7 @@
         <w:spacing w:after="120"/>
       </w:pPr>
       <w:r>
+        <w:lastRenderedPageBreak/>
         <w:t>A test case FAILS if any deviation is observed, however minor, and a corresponding bug report must be raised.</w:t>
       </w:r>
     </w:p>
@@ -14759,8 +18030,20 @@
           <w:sz w:val="18"/>
           <w:szCs w:val="18"/>
         </w:rPr>
-        <w:t>Tic Tac Toe - Project Documentation | Jack Baxter | github.com/BaxterJack</w:t>
+        <w:t>Tic Tac Toe - Project Documentation | Jack Baxter | github.com/</w:t>
       </w:r>
+      <w:proofErr w:type="spellStart"/>
+      <w:r>
+        <w:rPr>
+          <w:i/>
+          <w:iCs/>
+          <w:color w:val="888888"/>
+          <w:sz w:val="18"/>
+          <w:szCs w:val="18"/>
+        </w:rPr>
+        <w:t>BaxterJack</w:t>
+      </w:r>
+      <w:proofErr w:type="spellEnd"/>
     </w:p>
     <w:sectPr>
       <w:pgSz w:w="11906" w:h="16838"/>

</xml_diff>

<commit_message>
Implement Impossible AI using Minimax algorithm
- Created UTTT_AI_Impossible with full Minimax implementation
- IsTerminal checks all 8 win patterns and detects full board draw
- MiniMax recursively evaluates all possible game states
- Scores: AI win = +10 minus depth, opponent win = -10 plus depth, draw = 0
- Depth penalty encourages faster wins and slower losses
- BestScore correctly initialised for maximising and minimising players
</commit_message>
<xml_diff>
--- a/docs/TicTacToe_Project_Log.docx
+++ b/docs/TicTacToe_Project_Log.docx
@@ -9091,6 +9091,13 @@
                 <w:szCs w:val="20"/>
               </w:rPr>
             </w:pPr>
+            <w:r>
+              <w:rPr>
+                <w:sz w:val="20"/>
+                <w:szCs w:val="20"/>
+              </w:rPr>
+              <w:t>2/09/26</w:t>
+            </w:r>
           </w:p>
         </w:tc>
         <w:tc>
@@ -9116,6 +9123,117 @@
                 <w:szCs w:val="20"/>
               </w:rPr>
             </w:pPr>
+            <w:r>
+              <w:rPr>
+                <w:sz w:val="20"/>
+                <w:szCs w:val="20"/>
+              </w:rPr>
+              <w:t xml:space="preserve">Implemented </w:t>
+            </w:r>
+            <w:proofErr w:type="spellStart"/>
+            <w:r>
+              <w:rPr>
+                <w:sz w:val="20"/>
+                <w:szCs w:val="20"/>
+              </w:rPr>
+              <w:t>UTTT_AI_Impossible</w:t>
+            </w:r>
+            <w:proofErr w:type="spellEnd"/>
+            <w:r>
+              <w:rPr>
+                <w:sz w:val="20"/>
+                <w:szCs w:val="20"/>
+              </w:rPr>
+              <w:t xml:space="preserve"> using the Minimax algorithm. Created </w:t>
+            </w:r>
+            <w:proofErr w:type="spellStart"/>
+            <w:r>
+              <w:rPr>
+                <w:sz w:val="20"/>
+                <w:szCs w:val="20"/>
+              </w:rPr>
+              <w:t>IsTerminal</w:t>
+            </w:r>
+            <w:proofErr w:type="spellEnd"/>
+            <w:r>
+              <w:rPr>
+                <w:sz w:val="20"/>
+                <w:szCs w:val="20"/>
+              </w:rPr>
+              <w:t xml:space="preserve">() function that checks all 8 win patterns and uses </w:t>
+            </w:r>
+            <w:proofErr w:type="spellStart"/>
+            <w:r>
+              <w:rPr>
+                <w:sz w:val="20"/>
+                <w:szCs w:val="20"/>
+              </w:rPr>
+              <w:t>GridProduct</w:t>
+            </w:r>
+            <w:proofErr w:type="spellEnd"/>
+            <w:r>
+              <w:rPr>
+                <w:sz w:val="20"/>
+                <w:szCs w:val="20"/>
+              </w:rPr>
+              <w:t xml:space="preserve"> to detect full board draw condition — reuses the win pattern loop to accumulate grid product without a separate loop. Created </w:t>
+            </w:r>
+            <w:proofErr w:type="spellStart"/>
+            <w:r>
+              <w:rPr>
+                <w:sz w:val="20"/>
+                <w:szCs w:val="20"/>
+              </w:rPr>
+              <w:t>MiniMax</w:t>
+            </w:r>
+            <w:proofErr w:type="spellEnd"/>
+            <w:r>
+              <w:rPr>
+                <w:sz w:val="20"/>
+                <w:szCs w:val="20"/>
+              </w:rPr>
+              <w:t xml:space="preserve">() recursive function taking a grid copy, depth, current player and AI player number. Terminal states scored as +10 minus depth for AI win, -10 plus depth for opponent win, 0 for draw. Depth penalty/bonus encourages faster wins and slower losses. </w:t>
+            </w:r>
+            <w:proofErr w:type="spellStart"/>
+            <w:r>
+              <w:rPr>
+                <w:sz w:val="20"/>
+                <w:szCs w:val="20"/>
+              </w:rPr>
+              <w:t>bIsMaximising</w:t>
+            </w:r>
+            <w:proofErr w:type="spellEnd"/>
+            <w:r>
+              <w:rPr>
+                <w:sz w:val="20"/>
+                <w:szCs w:val="20"/>
+              </w:rPr>
+              <w:t xml:space="preserve"> determined by comparing current player to AI player number. </w:t>
+            </w:r>
+            <w:proofErr w:type="spellStart"/>
+            <w:r>
+              <w:rPr>
+                <w:sz w:val="20"/>
+                <w:szCs w:val="20"/>
+              </w:rPr>
+              <w:t>BestScore</w:t>
+            </w:r>
+            <w:proofErr w:type="spellEnd"/>
+            <w:r>
+              <w:rPr>
+                <w:sz w:val="20"/>
+                <w:szCs w:val="20"/>
+              </w:rPr>
+              <w:t xml:space="preserve"> </w:t>
+            </w:r>
+            <w:r>
+              <w:rPr>
+                <w:sz w:val="20"/>
+                <w:szCs w:val="20"/>
+              </w:rPr>
+              <w:lastRenderedPageBreak/>
+              <w:t>initialised to -1000 for maximising and +1000 for minimising. Each recursive call passes depth + 1 and swapped player. Move undone after each recursive call by resetting grid square to 0.</w:t>
+            </w:r>
           </w:p>
         </w:tc>
         <w:tc>
@@ -9141,6 +9259,143 @@
                 <w:szCs w:val="20"/>
               </w:rPr>
             </w:pPr>
+            <w:r>
+              <w:rPr>
+                <w:sz w:val="20"/>
+                <w:szCs w:val="20"/>
+              </w:rPr>
+              <w:lastRenderedPageBreak/>
+              <w:t xml:space="preserve">Initial </w:t>
+            </w:r>
+            <w:proofErr w:type="spellStart"/>
+            <w:r>
+              <w:rPr>
+                <w:sz w:val="20"/>
+                <w:szCs w:val="20"/>
+              </w:rPr>
+              <w:t>ChooseMove</w:t>
+            </w:r>
+            <w:proofErr w:type="spellEnd"/>
+            <w:r>
+              <w:rPr>
+                <w:sz w:val="20"/>
+                <w:szCs w:val="20"/>
+              </w:rPr>
+              <w:t xml:space="preserve"> was calling </w:t>
+            </w:r>
+            <w:proofErr w:type="spellStart"/>
+            <w:r>
+              <w:rPr>
+                <w:sz w:val="20"/>
+                <w:szCs w:val="20"/>
+              </w:rPr>
+              <w:t>MiniMax</w:t>
+            </w:r>
+            <w:proofErr w:type="spellEnd"/>
+            <w:r>
+              <w:rPr>
+                <w:sz w:val="20"/>
+                <w:szCs w:val="20"/>
+              </w:rPr>
+              <w:t xml:space="preserve"> without making the proposed move first — </w:t>
+            </w:r>
+            <w:proofErr w:type="spellStart"/>
+            <w:r>
+              <w:rPr>
+                <w:sz w:val="20"/>
+                <w:szCs w:val="20"/>
+              </w:rPr>
+              <w:t>every</w:t>
+            </w:r>
+            <w:proofErr w:type="spellEnd"/>
+            <w:r>
+              <w:rPr>
+                <w:sz w:val="20"/>
+                <w:szCs w:val="20"/>
+              </w:rPr>
+              <w:t xml:space="preserve"> empty square received identical scores since the board was never modified. Fixed by creating a </w:t>
+            </w:r>
+            <w:proofErr w:type="spellStart"/>
+            <w:r>
+              <w:rPr>
+                <w:sz w:val="20"/>
+                <w:szCs w:val="20"/>
+              </w:rPr>
+              <w:t>GridCopy</w:t>
+            </w:r>
+            <w:proofErr w:type="spellEnd"/>
+            <w:r>
+              <w:rPr>
+                <w:sz w:val="20"/>
+                <w:szCs w:val="20"/>
+              </w:rPr>
+              <w:t xml:space="preserve">, placing the piece at square </w:t>
+            </w:r>
+            <w:proofErr w:type="spellStart"/>
+            <w:r>
+              <w:rPr>
+                <w:sz w:val="20"/>
+                <w:szCs w:val="20"/>
+              </w:rPr>
+              <w:t>i</w:t>
+            </w:r>
+            <w:proofErr w:type="spellEnd"/>
+            <w:r>
+              <w:rPr>
+                <w:sz w:val="20"/>
+                <w:szCs w:val="20"/>
+              </w:rPr>
+              <w:t xml:space="preserve">, then calling </w:t>
+            </w:r>
+            <w:proofErr w:type="spellStart"/>
+            <w:r>
+              <w:rPr>
+                <w:sz w:val="20"/>
+                <w:szCs w:val="20"/>
+              </w:rPr>
+              <w:t>MiniMax</w:t>
+            </w:r>
+            <w:proofErr w:type="spellEnd"/>
+            <w:r>
+              <w:rPr>
+                <w:sz w:val="20"/>
+                <w:szCs w:val="20"/>
+              </w:rPr>
+              <w:t xml:space="preserve"> with depth 1 and opponent as current player. </w:t>
+            </w:r>
+            <w:proofErr w:type="spellStart"/>
+            <w:r>
+              <w:rPr>
+                <w:sz w:val="20"/>
+                <w:szCs w:val="20"/>
+              </w:rPr>
+              <w:t>InAiPlayerNumber</w:t>
+            </w:r>
+            <w:proofErr w:type="spellEnd"/>
+            <w:r>
+              <w:rPr>
+                <w:sz w:val="20"/>
+                <w:szCs w:val="20"/>
+              </w:rPr>
+              <w:t xml:space="preserve"> was passed by reference unnecessarily — changed to pass by value. Terminal score was hardcoded for Player 2 as AI — fixed to use </w:t>
+            </w:r>
+            <w:proofErr w:type="spellStart"/>
+            <w:r>
+              <w:rPr>
+                <w:sz w:val="20"/>
+                <w:szCs w:val="20"/>
+              </w:rPr>
+              <w:lastRenderedPageBreak/>
+              <w:t>InAiPlayerNumber</w:t>
+            </w:r>
+            <w:proofErr w:type="spellEnd"/>
+            <w:r>
+              <w:rPr>
+                <w:sz w:val="20"/>
+                <w:szCs w:val="20"/>
+              </w:rPr>
+              <w:t xml:space="preserve"> comparison so AI works correctly as either player. Impossible AI confirmed working — cannot be beaten with optimal play, wins against poor play.</w:t>
+            </w:r>
           </w:p>
         </w:tc>
       </w:tr>

</xml_diff>